<commit_message>
WIP: deck C1 case re-run in progress (analyst running); rebuilt draft
Co-Authored-By: Claude Opus 5.5 <noreply@anthropic.com>
Claude-Session: https://claude.ai/code/session_01SZLM437PwZArBFHgvvPCk4
</commit_message>
<xml_diff>
--- a/01_Report/draft-assembled.docx
+++ b/01_Report/draft-assembled.docx
@@ -2005,7 +2005,7 @@
       </w:r>
     </w:p>
     <w:bookmarkEnd w:id="27"/>
-    <w:bookmarkStart w:id="33" w:name="life-cycle-assessment-and-eco-audit"/>
+    <w:bookmarkStart w:id="46" w:name="life-cycle-assessment-and-eco-audit"/>
     <w:p>
       <w:pPr>
         <w:pStyle w:val="Heading2"/>
@@ -2061,7 +2061,7 @@
         <w:t xml:space="preserve">, so C1 is worth adopting only if it is schedule-neutral. No input has yet been checked in its primary source [TO VERIFY], so every number is provisional.</w:t>
       </w:r>
     </w:p>
-    <w:bookmarkStart w:id="28" w:name="goal-scope-and-method"/>
+    <w:bookmarkStart w:id="31" w:name="goal-scope-and-method"/>
     <w:p>
       <w:pPr>
         <w:pStyle w:val="Heading3"/>
@@ -2938,14 +2938,61 @@
     </w:tbl>
     <w:p>
       <w:pPr>
-        <w:pStyle w:val="BodyText"/>
+        <w:pStyle w:val="CaptionedFigure"/>
       </w:pPr>
       <w:r>
-        <w:t xml:space="preserve">[Figure F1. LCA system boundary for one BWRX-300 at Darlington: bottom-up fuel front end and construction materials, literature values for operation, decommissioning and the back end, and the C1 target structures. | Source: this study. | File: 03_LCA_Calculations/results/F1_system_boundary.png]</w:t>
+        <w:drawing>
+          <wp:inline>
+            <wp:extent cx="5441315" cy="2836256"/>
+            <wp:effectExtent b="0" l="0" r="0" t="0"/>
+            <wp:docPr descr="Figure 1. LCA system boundary for one BWRX-300 at Darlington: bottom-up fuel front end and construction materials, literature values for operation, decommissioning and the back end, and the C1 target structures. | Source: this study. | File: 03_LCA_Calculations/results/F1_system_boundary.png" title="" id="29" name="Picture"/>
+            <a:graphic>
+              <a:graphicData uri="http://schemas.openxmlformats.org/drawingml/2006/picture">
+                <pic:pic>
+                  <pic:nvPicPr>
+                    <pic:cNvPr descr="/home/user/MTE4593-Group-Assignment/03_LCA_Calculations/results/F1_system_boundary.png" id="30" name="Picture"/>
+                    <pic:cNvPicPr>
+                      <a:picLocks noChangeArrowheads="1" noChangeAspect="1"/>
+                    </pic:cNvPicPr>
+                  </pic:nvPicPr>
+                  <pic:blipFill>
+                    <a:blip r:embed="rId28"/>
+                    <a:stretch>
+                      <a:fillRect/>
+                    </a:stretch>
+                  </pic:blipFill>
+                  <pic:spPr bwMode="auto">
+                    <a:xfrm>
+                      <a:off x="0" y="0"/>
+                      <a:ext cx="5441315" cy="2836256"/>
+                    </a:xfrm>
+                    <a:prstGeom prst="rect">
+                      <a:avLst/>
+                    </a:prstGeom>
+                    <a:noFill/>
+                    <a:ln w="9525">
+                      <a:noFill/>
+                      <a:headEnd/>
+                      <a:tailEnd/>
+                    </a:ln>
+                  </pic:spPr>
+                </pic:pic>
+              </a:graphicData>
+            </a:graphic>
+          </wp:inline>
+        </w:drawing>
       </w:r>
     </w:p>
-    <w:bookmarkEnd w:id="28"/>
-    <w:bookmarkStart w:id="29" w:name="baseline-inventory-and-hotspots"/>
+    <w:p>
+      <w:pPr>
+        <w:pStyle w:val="ImageCaption"/>
+      </w:pPr>
+      <w:r>
+        <w:t xml:space="preserve">Figure 1. LCA system boundary for one BWRX-300 at Darlington: bottom-up fuel front end and construction materials, literature values for operation, decommissioning and the back end, and the C1 target structures. | Source: this study. | File: 03_LCA_Calculations/results/F1_system_boundary.png</w:t>
+      </w:r>
+    </w:p>
+    <w:bookmarkEnd w:id="31"/>
+    <w:bookmarkStart w:id="35" w:name="baseline-inventory-and-hotspots"/>
     <w:p>
       <w:pPr>
         <w:pStyle w:val="Heading3"/>
@@ -3181,14 +3228,61 @@
     </w:p>
     <w:p>
       <w:pPr>
-        <w:pStyle w:val="BodyText"/>
+        <w:pStyle w:val="CaptionedFigure"/>
       </w:pPr>
       <w:r>
-        <w:t xml:space="preserve">[Figure F2. Life-cycle emissions of one BWRX-300 by stage: expected 4.3 g CO₂e/kWh (Monte Carlo mean), with the mode case (every input at its most likely value; total 2.7) marked. | Source: this study, scripts/lca_uncertainty.py; inputs in parameters_lca.yaml [TO VERIFY]. | File: 03_LCA_Calculations/results/F2_stage_breakdown.png]</w:t>
+        <w:drawing>
+          <wp:inline>
+            <wp:extent cx="5441315" cy="2458231"/>
+            <wp:effectExtent b="0" l="0" r="0" t="0"/>
+            <wp:docPr descr="Figure 2. Life-cycle emissions of one BWRX-300 by stage: expected 4.3 g CO₂e/kWh (Monte Carlo mean), with the mode case (every input at its most likely value; total 2.7) marked. | Source: this study, scripts/lca_uncertainty.py; inputs in parameters_lca.yaml [TO VERIFY]. | File: 03_LCA_Calculations/results/F2_stage_breakdown.png" title="" id="33" name="Picture"/>
+            <a:graphic>
+              <a:graphicData uri="http://schemas.openxmlformats.org/drawingml/2006/picture">
+                <pic:pic>
+                  <pic:nvPicPr>
+                    <pic:cNvPr descr="/home/user/MTE4593-Group-Assignment/03_LCA_Calculations/results/F2_stage_breakdown.png" id="34" name="Picture"/>
+                    <pic:cNvPicPr>
+                      <a:picLocks noChangeArrowheads="1" noChangeAspect="1"/>
+                    </pic:cNvPicPr>
+                  </pic:nvPicPr>
+                  <pic:blipFill>
+                    <a:blip r:embed="rId32"/>
+                    <a:stretch>
+                      <a:fillRect/>
+                    </a:stretch>
+                  </pic:blipFill>
+                  <pic:spPr bwMode="auto">
+                    <a:xfrm>
+                      <a:off x="0" y="0"/>
+                      <a:ext cx="5441315" cy="2458231"/>
+                    </a:xfrm>
+                    <a:prstGeom prst="rect">
+                      <a:avLst/>
+                    </a:prstGeom>
+                    <a:noFill/>
+                    <a:ln w="9525">
+                      <a:noFill/>
+                      <a:headEnd/>
+                      <a:tailEnd/>
+                    </a:ln>
+                  </pic:spPr>
+                </pic:pic>
+              </a:graphicData>
+            </a:graphic>
+          </wp:inline>
+        </w:drawing>
       </w:r>
     </w:p>
-    <w:bookmarkEnd w:id="29"/>
-    <w:bookmarkStart w:id="30" w:name="the-initiative-against-the-baseline"/>
+    <w:p>
+      <w:pPr>
+        <w:pStyle w:val="ImageCaption"/>
+      </w:pPr>
+      <w:r>
+        <w:t xml:space="preserve">Figure 2. Life-cycle emissions of one BWRX-300 by stage: expected 4.3 g CO₂e/kWh (Monte Carlo mean), with the mode case (every input at its most likely value; total 2.7) marked. | Source: this study, scripts/lca_uncertainty.py; inputs in parameters_lca.yaml [TO VERIFY]. | File: 03_LCA_Calculations/results/F2_stage_breakdown.png</w:t>
+      </w:r>
+    </w:p>
+    <w:bookmarkEnd w:id="35"/>
+    <w:bookmarkStart w:id="36" w:name="the-initiative-against-the-baseline"/>
     <w:p>
       <w:pPr>
         <w:pStyle w:val="Heading3"/>
@@ -3953,8 +4047,8 @@
         <w:t xml:space="preserve">For the triple-bottom-line evaluation (§9), C1 is environmentally positive but marginal, its economic value is C$0.49–0.60 m for Units 2–4, and its feasibility hinges on qualification and schedule rather than on carbon.</w:t>
       </w:r>
     </w:p>
-    <w:bookmarkEnd w:id="30"/>
-    <w:bookmarkStart w:id="31" w:name="uncertainty-tornado-and-monte-carlo"/>
+    <w:bookmarkEnd w:id="36"/>
+    <w:bookmarkStart w:id="43" w:name="uncertainty-tornado-and-monte-carlo"/>
     <w:p>
       <w:pPr>
         <w:pStyle w:val="Heading3"/>
@@ -4004,10 +4098,57 @@
     </w:p>
     <w:p>
       <w:pPr>
-        <w:pStyle w:val="BodyText"/>
+        <w:pStyle w:val="CaptionedFigure"/>
       </w:pPr>
       <w:r>
-        <w:t xml:space="preserve">[Figure F3. One-at-a-time sensitivity of the life-cycle intensity (left, centred on the mode case, 2.70 g CO₂e/kWh, not the 4.2 median) and of the LC3 saving per unit (right, centred on the mode case, 1,734 t), top ten inputs each. | Source: this study, scripts/lca_uncertainty.py; ranges in parameters_lca.yaml. | File: 03_LCA_Calculations/results/F3_tornado.png]</w:t>
+        <w:drawing>
+          <wp:inline>
+            <wp:extent cx="5441315" cy="2919730"/>
+            <wp:effectExtent b="0" l="0" r="0" t="0"/>
+            <wp:docPr descr="Figure 3. One-at-a-time sensitivity of the life-cycle intensity (left, centred on the mode case, 2.70 g CO₂e/kWh, not the 4.2 median) and of the LC3 saving per unit (right, centred on the mode case, 1,734 t), top ten inputs each. | Source: this study, scripts/lca_uncertainty.py; ranges in parameters_lca.yaml. | File: 03_LCA_Calculations/results/F3_tornado.png" title="" id="38" name="Picture"/>
+            <a:graphic>
+              <a:graphicData uri="http://schemas.openxmlformats.org/drawingml/2006/picture">
+                <pic:pic>
+                  <pic:nvPicPr>
+                    <pic:cNvPr descr="/home/user/MTE4593-Group-Assignment/03_LCA_Calculations/results/F3_tornado.png" id="39" name="Picture"/>
+                    <pic:cNvPicPr>
+                      <a:picLocks noChangeArrowheads="1" noChangeAspect="1"/>
+                    </pic:cNvPicPr>
+                  </pic:nvPicPr>
+                  <pic:blipFill>
+                    <a:blip r:embed="rId37"/>
+                    <a:stretch>
+                      <a:fillRect/>
+                    </a:stretch>
+                  </pic:blipFill>
+                  <pic:spPr bwMode="auto">
+                    <a:xfrm>
+                      <a:off x="0" y="0"/>
+                      <a:ext cx="5441315" cy="2919730"/>
+                    </a:xfrm>
+                    <a:prstGeom prst="rect">
+                      <a:avLst/>
+                    </a:prstGeom>
+                    <a:noFill/>
+                    <a:ln w="9525">
+                      <a:noFill/>
+                      <a:headEnd/>
+                      <a:tailEnd/>
+                    </a:ln>
+                  </pic:spPr>
+                </pic:pic>
+              </a:graphicData>
+            </a:graphic>
+          </wp:inline>
+        </w:drawing>
+      </w:r>
+    </w:p>
+    <w:p>
+      <w:pPr>
+        <w:pStyle w:val="ImageCaption"/>
+      </w:pPr>
+      <w:r>
+        <w:t xml:space="preserve">Figure 3. One-at-a-time sensitivity of the life-cycle intensity (left, centred on the mode case, 2.70 g CO₂e/kWh, not the 4.2 median) and of the LC3 saving per unit (right, centred on the mode case, 1,734 t), top ten inputs each. | Source: this study, scripts/lca_uncertainty.py; ranges in parameters_lca.yaml. | File: 03_LCA_Calculations/results/F3_tornado.png</w:t>
       </w:r>
     </w:p>
     <w:p>
@@ -4059,14 +4200,61 @@
     </w:p>
     <w:p>
       <w:pPr>
-        <w:pStyle w:val="BodyText"/>
+        <w:pStyle w:val="CaptionedFigure"/>
       </w:pPr>
       <w:r>
-        <w:t xml:space="preserve">[Figure F4. Monte Carlo distributions (20,000 draws, seed 20261021) of the life-cycle intensity (median 4.18, 5th–95th percentile 3.05–5.85 g CO₂e/kWh) and of the LC3 saving per unit (median 1,742, 1,387–2,153 t). | Source: this study, scripts/lca_uncertainty.py. | File: 03_LCA_Calculations/results/F4_montecarlo.png]</w:t>
+        <w:drawing>
+          <wp:inline>
+            <wp:extent cx="5441315" cy="2092813"/>
+            <wp:effectExtent b="0" l="0" r="0" t="0"/>
+            <wp:docPr descr="Figure 4. Monte Carlo distributions (20,000 draws, seed 20261021) of the life-cycle intensity (median 4.18, 5th–95th percentile 3.05–5.85 g CO₂e/kWh) and of the LC3 saving per unit (median 1,742, 1,387–2,153 t). | Source: this study, scripts/lca_uncertainty.py. | File: 03_LCA_Calculations/results/F4_montecarlo.png" title="" id="41" name="Picture"/>
+            <a:graphic>
+              <a:graphicData uri="http://schemas.openxmlformats.org/drawingml/2006/picture">
+                <pic:pic>
+                  <pic:nvPicPr>
+                    <pic:cNvPr descr="/home/user/MTE4593-Group-Assignment/03_LCA_Calculations/results/F4_montecarlo.png" id="42" name="Picture"/>
+                    <pic:cNvPicPr>
+                      <a:picLocks noChangeArrowheads="1" noChangeAspect="1"/>
+                    </pic:cNvPicPr>
+                  </pic:nvPicPr>
+                  <pic:blipFill>
+                    <a:blip r:embed="rId40"/>
+                    <a:stretch>
+                      <a:fillRect/>
+                    </a:stretch>
+                  </pic:blipFill>
+                  <pic:spPr bwMode="auto">
+                    <a:xfrm>
+                      <a:off x="0" y="0"/>
+                      <a:ext cx="5441315" cy="2092813"/>
+                    </a:xfrm>
+                    <a:prstGeom prst="rect">
+                      <a:avLst/>
+                    </a:prstGeom>
+                    <a:noFill/>
+                    <a:ln w="9525">
+                      <a:noFill/>
+                      <a:headEnd/>
+                      <a:tailEnd/>
+                    </a:ln>
+                  </pic:spPr>
+                </pic:pic>
+              </a:graphicData>
+            </a:graphic>
+          </wp:inline>
+        </w:drawing>
       </w:r>
     </w:p>
-    <w:bookmarkEnd w:id="31"/>
-    <w:bookmarkStart w:id="32" w:name="comparison-with-published-values"/>
+    <w:p>
+      <w:pPr>
+        <w:pStyle w:val="ImageCaption"/>
+      </w:pPr>
+      <w:r>
+        <w:t xml:space="preserve">Figure 4. Monte Carlo distributions (20,000 draws, seed 20261021) of the life-cycle intensity (median 4.18, 5th–95th percentile 3.05–5.85 g CO₂e/kWh) and of the LC3 saving per unit (median 1,742, 1,387–2,153 t). | Source: this study, scripts/lca_uncertainty.py. | File: 03_LCA_Calculations/results/F4_montecarlo.png</w:t>
+      </w:r>
+    </w:p>
+    <w:bookmarkEnd w:id="43"/>
+    <w:bookmarkStart w:id="45" w:name="comparison-with-published-values"/>
     <w:p>
       <w:pPr>
         <w:pStyle w:val="Heading3"/>
@@ -4448,8 +4636,19 @@
         <w:pStyle w:val="BodyText"/>
       </w:pPr>
       <w:r>
-        <w:t xml:space="preserve">[Figure F5. Our BWRX-300 result against published nuclear life-cycle values (point = central or median; line = range or interval); coal about 750–1,100 and gas combined cycle 403–513 g CO₂e/kWh for scale. UNECE reports a range only (5.1–6.4), so it is drawn as a range with no midpoint; Warner and Heath are drawn as a median only (12). | Source: this study; EDF R&amp;D (2024); United Nations Economic Commission for Europe (2021); Gibon and Hahn Menacho (2023); Carless, Griffin and Fischbeck (2016); Warner and Heath (2012). Benchmarks [TO VERIFY]. | File: 03_LCA_Calculations/results/F5_benchmarks.png] [TODO: IPCC AR5 WGIII Annex III row is drawn automatically once its values are set to verified in parameters_lca.yaml]</w:t>
-      </w:r>
+        <w:t xml:space="preserve">[Figure 5. Our BWRX-300 result against published nuclear life-cycle values (point = central or median; line = range or interval); coal about 750–1,100 and gas combined cycle 403–513 g CO₂e/kWh for scale. UNECE reports a range only (5.1–6.4), so it is drawn as a range with no midpoint; Warner and Heath are drawn as a median only (12). | Source: this study; EDF R&amp;D (2024); United Nations Economic Commission for Europe (2021); Gibon and Hahn Menacho (2023); Carless, Griffin and Fischbeck (2016); Warner and Heath (2012). Benchmarks [TO VERIFY]. | File: 03_LCA_Calculations/results/F5_benchmarks.png]</w:t>
+      </w:r>
+      <w:r>
+        <w:t xml:space="preserve"> </w:t>
+      </w:r>
+      <w:hyperlink r:id="rId44">
+        <w:r>
+          <w:rPr>
+            <w:rStyle w:val="Hyperlink"/>
+          </w:rPr>
+          <w:t xml:space="preserve">TODO: IPCC AR5 WGIII Annex III row is drawn automatically once its values are set to verified in parameters_lca.yaml</w:t>
+        </w:r>
+      </w:hyperlink>
     </w:p>
     <w:p>
       <w:r>
@@ -4458,9 +4657,9 @@
         </w:pict>
       </w:r>
     </w:p>
-    <w:bookmarkEnd w:id="32"/>
-    <w:bookmarkEnd w:id="33"/>
-    <w:bookmarkStart w:id="38" w:name="X6fbd7bed400e38904dc2c5d634c7832d9e25d90"/>
+    <w:bookmarkEnd w:id="45"/>
+    <w:bookmarkEnd w:id="46"/>
+    <w:bookmarkStart w:id="51" w:name="X6fbd7bed400e38904dc2c5d634c7832d9e25d90"/>
     <w:p>
       <w:pPr>
         <w:pStyle w:val="Heading2"/>
@@ -4581,7 +4780,7 @@
         <w:t xml:space="preserve">- The grid trajectories are our own constructions from published anchor points [TODO: replace with the 2026 ISP Step Change and IESO series].</w:t>
       </w:r>
     </w:p>
-    <w:bookmarkStart w:id="34" w:name="the-value-of-schedule"/>
+    <w:bookmarkStart w:id="47" w:name="the-value-of-schedule"/>
     <w:p>
       <w:pPr>
         <w:pStyle w:val="Heading3"/>
@@ -4972,8 +5171,8 @@
         <w:t xml:space="preserve">The mix must be qualified on mock-ups during Unit 1, before the Units 2–4 decision expected in 2028 [TO VERIFY] (§8.6).</w:t>
       </w:r>
     </w:p>
-    <w:bookmarkEnd w:id="34"/>
-    <w:bookmarkStart w:id="35" w:name="Xb77cf30fc1ffb1f20fb94e7af23c490604b5f45"/>
+    <w:bookmarkEnd w:id="47"/>
+    <w:bookmarkStart w:id="48" w:name="Xb77cf30fc1ffb1f20fb94e7af23c490604b5f45"/>
     <w:p>
       <w:pPr>
         <w:pStyle w:val="Heading3"/>
@@ -5289,11 +5488,25 @@
         <w:pStyle w:val="BodyText"/>
       </w:pPr>
       <w:r>
-        <w:t xml:space="preserve">[Figure F6. CO₂e avoided by one BWRX-300 to 2050 and over its 60-year life: Darlington Unit 1 from 2030 (Ontario average trajectory; marginal, declining; marginal flat as upper bound) against Liddell from 2035 and 2040 (Step Change proxy; slow transition; frozen grid as upper bound). Inset: CO₂e lost per month of delay to one of Units 2–4, against C1’s per-unit saving (1.73 kt). Data series in Tables B17 and B20. | Source: this study, scripts/displacement.py and scripts/schedule_value.py; grid factors The Atmospheric Fund (2025), Department of Climate Change, Energy, the Environment and Water (2025), Independent Electricity System Operator (2024), Australian Energy Market Operator (2024) [TO VERIFY]. | File: TODO: plot script not yet written; draw from results/displacement.md §3 and schedule_value.md §2]</w:t>
+        <w:rPr>
+          <w:bCs/>
+          <w:b/>
+        </w:rPr>
+        <w:t xml:space="preserve">[TODO: Figure 6 image missing]</w:t>
+      </w:r>
+      <w:r>
+        <w:t xml:space="preserve"> </w:t>
+      </w:r>
+      <w:r>
+        <w:rPr>
+          <w:iCs/>
+          <w:i/>
+        </w:rPr>
+        <w:t xml:space="preserve">Figure 6. CO₂e avoided by one BWRX-300 to 2050 and over its 60-year life: Darlington Unit 1 from 2030 (Ontario average trajectory; marginal, declining; marginal flat as upper bound) against Liddell from 2035 and 2040 (Step Change proxy; slow transition; frozen grid as upper bound). Inset: CO₂e lost per month of delay to one of Units 2–4, against C1’s per-unit saving (1.73 kt). Data series in Tables B17 and B20. | Source: this study, scripts/displacement.py and scripts/schedule_value.py; grid factors The Atmospheric Fund (2025), Department of Climate Change, Energy, the Environment and Water (2025), Independent Electricity System Operator (2024), Australian Energy Market Operator (2024) [TO VERIFY]. | File: TODO: plot script not yet written; draw from results/displacement.md §3 and schedule_value.md §2</w:t>
       </w:r>
     </w:p>
-    <w:bookmarkEnd w:id="35"/>
-    <w:bookmarkStart w:id="36" w:name="the-same-money-on-firmed-renewables"/>
+    <w:bookmarkEnd w:id="48"/>
+    <w:bookmarkStart w:id="49" w:name="the-same-money-on-firmed-renewables"/>
     <w:p>
       <w:pPr>
         <w:pStyle w:val="Heading3"/>
@@ -5457,11 +5670,25 @@
         <w:pStyle w:val="BodyText"/>
       </w:pPr>
       <w:r>
-        <w:t xml:space="preserve">[Figure F7. Same money, Liddell: firmed renewables (from 2028) against one SMR unit (from 2040, slower transition), as the ratio of energy bought and of CO₂e avoided to 2050 under four cost cases: GenCost 2023-24 2030 midpoints (SMR A$306, renewables A$107: 2.9× / 10.9×); worst case for renewables (A$230 / A$153: 1.5× / 5.7×); the alternative reading (A$514 / A$102: 5.0× / 19.1×); the lowest SMR lead tested (A$198 / A$153: 1.3× / 4.9×). Data in Table B28. | Source: this study, scripts/same_money.py; costs Graham, Hayward and Foster (2024; 2025) and Kim and Macfarlane (2026) [TO VERIFY: GenCost table/year]. | File: TODO: plot script not yet written; draw from results/same_money.md §5]</w:t>
+        <w:rPr>
+          <w:bCs/>
+          <w:b/>
+        </w:rPr>
+        <w:t xml:space="preserve">[TODO: Figure 7 image missing]</w:t>
+      </w:r>
+      <w:r>
+        <w:t xml:space="preserve"> </w:t>
+      </w:r>
+      <w:r>
+        <w:rPr>
+          <w:iCs/>
+          <w:i/>
+        </w:rPr>
+        <w:t xml:space="preserve">Figure 7. Same money, Liddell: firmed renewables (from 2028) against one SMR unit (from 2040, slower transition), as the ratio of energy bought and of CO₂e avoided to 2050 under four cost cases: GenCost 2023-24 2030 midpoints (SMR A$306, renewables A$107: 2.9× / 10.9×); worst case for renewables (A$230 / A$153: 1.5× / 5.7×); the alternative reading (A$514 / A$102: 5.0× / 19.1×); the lowest SMR lead tested (A$198 / A$153: 1.3× / 4.9×). Data in Table B28. | Source: this study, scripts/same_money.py; costs Graham, Hayward and Foster (2024; 2025) and Kim and Macfarlane (2026) [TO VERIFY: GenCost table/year]. | File: TODO: plot script not yet written; draw from results/same_money.md §5</w:t>
       </w:r>
     </w:p>
-    <w:bookmarkEnd w:id="36"/>
-    <w:bookmarkStart w:id="37" w:name="what-this-means-for-the-initiative"/>
+    <w:bookmarkEnd w:id="49"/>
+    <w:bookmarkStart w:id="50" w:name="what-this-means-for-the-initiative"/>
     <w:p>
       <w:pPr>
         <w:pStyle w:val="Heading3"/>
@@ -5581,9 +5808,9 @@
         </w:pict>
       </w:r>
     </w:p>
-    <w:bookmarkEnd w:id="37"/>
-    <w:bookmarkEnd w:id="38"/>
-    <w:bookmarkStart w:id="39" w:name="law-regulation-and-licensing"/>
+    <w:bookmarkEnd w:id="50"/>
+    <w:bookmarkEnd w:id="51"/>
+    <w:bookmarkStart w:id="52" w:name="law-regulation-and-licensing"/>
     <w:p>
       <w:pPr>
         <w:pStyle w:val="Heading2"/>
@@ -6233,8 +6460,8 @@
         </w:pict>
       </w:r>
     </w:p>
-    <w:bookmarkEnd w:id="39"/>
-    <w:bookmarkStart w:id="40" w:name="economics-finance-and-market-barriers"/>
+    <w:bookmarkEnd w:id="52"/>
+    <w:bookmarkStart w:id="53" w:name="economics-finance-and-market-barriers"/>
     <w:p>
       <w:pPr>
         <w:pStyle w:val="Heading2"/>
@@ -7283,8 +7510,8 @@
         </w:pict>
       </w:r>
     </w:p>
-    <w:bookmarkEnd w:id="40"/>
-    <w:bookmarkStart w:id="41" w:name="supply-concentration-and-geopolitics"/>
+    <w:bookmarkEnd w:id="53"/>
+    <w:bookmarkStart w:id="54" w:name="supply-concentration-and-geopolitics"/>
     <w:p>
       <w:pPr>
         <w:pStyle w:val="Heading2"/>
@@ -7956,8 +8183,8 @@
         </w:pict>
       </w:r>
     </w:p>
-    <w:bookmarkEnd w:id="41"/>
-    <w:bookmarkStart w:id="42" w:name="social-licence"/>
+    <w:bookmarkEnd w:id="54"/>
+    <w:bookmarkStart w:id="55" w:name="social-licence"/>
     <w:p>
       <w:pPr>
         <w:pStyle w:val="Heading2"/>
@@ -9022,8 +9249,8 @@
         </w:pict>
       </w:r>
     </w:p>
-    <w:bookmarkEnd w:id="42"/>
-    <w:bookmarkStart w:id="43" w:name="stakeholders-and-money-flows"/>
+    <w:bookmarkEnd w:id="55"/>
+    <w:bookmarkStart w:id="59" w:name="stakeholders-and-money-flows"/>
     <w:p>
       <w:pPr>
         <w:pStyle w:val="Heading2"/>
@@ -9058,10 +9285,57 @@
     </w:p>
     <w:p>
       <w:pPr>
-        <w:pStyle w:val="BodyText"/>
+        <w:pStyle w:val="CaptionedFigure"/>
       </w:pPr>
       <w:r>
-        <w:t xml:space="preserve">[Figure 8: Stakeholder power/interest maps for Darlington Units 2–4 with C1 (left) and a hypothetical BWRX-300 at Liddell (right). Numbered markers identify actors; colour shows stance from strongly for to strongly against. Positions are our judgement from the evidence in §8.1–8.4. Insert</w:t>
+        <w:drawing>
+          <wp:inline>
+            <wp:extent cx="5441315" cy="3894434"/>
+            <wp:effectExtent b="0" l="0" r="0" t="0"/>
+            <wp:docPr descr="Figure 8. Stakeholder power/interest maps for Darlington Units 2–4 with C1 (left) and a hypothetical BWRX-300 at Liddell (right). Numbered markers identify actors; colour shows stance from strongly for to strongly against. Positions are our judgement from the evidence in §8.1–8.4. Insert 03_LCA_Calculations/results/F8_stakeholder_map.png here (re-export first: its footnote must read “our judgement”, not “analyst’s judgement”) | Source: our analysis (social_licence.py, Appendix B8.2), from the sources cited in §8.1–8.4" title="" id="57" name="Picture"/>
+            <a:graphic>
+              <a:graphicData uri="http://schemas.openxmlformats.org/drawingml/2006/picture">
+                <pic:pic>
+                  <pic:nvPicPr>
+                    <pic:cNvPr descr="/home/user/MTE4593-Group-Assignment/03_LCA_Calculations/results/F8_stakeholder_map.png" id="58" name="Picture"/>
+                    <pic:cNvPicPr>
+                      <a:picLocks noChangeArrowheads="1" noChangeAspect="1"/>
+                    </pic:cNvPicPr>
+                  </pic:nvPicPr>
+                  <pic:blipFill>
+                    <a:blip r:embed="rId56"/>
+                    <a:stretch>
+                      <a:fillRect/>
+                    </a:stretch>
+                  </pic:blipFill>
+                  <pic:spPr bwMode="auto">
+                    <a:xfrm>
+                      <a:off x="0" y="0"/>
+                      <a:ext cx="5441315" cy="3894434"/>
+                    </a:xfrm>
+                    <a:prstGeom prst="rect">
+                      <a:avLst/>
+                    </a:prstGeom>
+                    <a:noFill/>
+                    <a:ln w="9525">
+                      <a:noFill/>
+                      <a:headEnd/>
+                      <a:tailEnd/>
+                    </a:ln>
+                  </pic:spPr>
+                </pic:pic>
+              </a:graphicData>
+            </a:graphic>
+          </wp:inline>
+        </w:drawing>
+      </w:r>
+    </w:p>
+    <w:p>
+      <w:pPr>
+        <w:pStyle w:val="ImageCaption"/>
+      </w:pPr>
+      <w:r>
+        <w:t xml:space="preserve">Figure 8. Stakeholder power/interest maps for Darlington Units 2–4 with C1 (left) and a hypothetical BWRX-300 at Liddell (right). Numbered markers identify actors; colour shows stance from strongly for to strongly against. Positions are our judgement from the evidence in §8.1–8.4. Insert</w:t>
       </w:r>
       <w:r>
         <w:t xml:space="preserve"> </w:t>
@@ -9115,7 +9389,7 @@
         <w:t xml:space="preserve">social_licence.py</w:t>
       </w:r>
       <w:r>
-        <w:t xml:space="preserve">, Appendix B8.2), from the sources cited in §8.1–8.4]</w:t>
+        <w:t xml:space="preserve">, Appendix B8.2), from the sources cited in §8.1–8.4</w:t>
       </w:r>
     </w:p>
     <w:p>
@@ -9547,8 +9821,8 @@
         </w:pict>
       </w:r>
     </w:p>
-    <w:bookmarkEnd w:id="43"/>
-    <w:bookmarkStart w:id="44" w:name="implementation-pathway"/>
+    <w:bookmarkEnd w:id="59"/>
+    <w:bookmarkStart w:id="60" w:name="implementation-pathway"/>
     <w:p>
       <w:pPr>
         <w:pStyle w:val="Heading2"/>
@@ -9944,8 +10218,8 @@
         </w:pict>
       </w:r>
     </w:p>
-    <w:bookmarkEnd w:id="44"/>
-    <w:bookmarkStart w:id="48" w:name="X5539a185355627e6c3e07c8c8240218227305a6"/>
+    <w:bookmarkEnd w:id="60"/>
+    <w:bookmarkStart w:id="64" w:name="X5539a185355627e6c3e07c8c8240218227305a6"/>
     <w:p>
       <w:pPr>
         <w:pStyle w:val="Heading2"/>
@@ -9972,7 +10246,7 @@
         <w:t xml:space="preserve">C1 is a real but marginal gain: SMR + C1 and a plain SMR differ by about 0.3–0.4% on life-cycle emissions. No predefined weight set, input change or ±50% weight test puts an SMR first. It happens in about 0.2% of random weight draws, and when life-cycle CO₂e carries 94% or more of the weight.</w:t>
       </w:r>
     </w:p>
-    <w:bookmarkStart w:id="45" w:name="triple-bottom-line"/>
+    <w:bookmarkStart w:id="61" w:name="triple-bottom-line"/>
     <w:p>
       <w:pPr>
         <w:pStyle w:val="Heading3"/>
@@ -10290,8 +10564,8 @@
         </w:tc>
       </w:tr>
     </w:tbl>
-    <w:bookmarkEnd w:id="45"/>
-    <w:bookmarkStart w:id="46" w:name="multi-criteria-analysis"/>
+    <w:bookmarkEnd w:id="61"/>
+    <w:bookmarkStart w:id="62" w:name="multi-criteria-analysis"/>
     <w:p>
       <w:pPr>
         <w:pStyle w:val="Heading3"/>
@@ -10862,8 +11136,8 @@
         <w:t xml:space="preserve">C1 lowers life-cycle intensity from 4.200 to 4.188 g/kWh (1,734 t per unit, 0.29%) or 4.185 g/kWh (2,200 t, 0.37%) [C1 saving: per final §6]. That moves the weighted score by under 0.005 point, and its sign depends on the assumed C$1 m qualification cost. If C1 delays a unit, the CO₂e left unavoided outweighs the saving many times over (Appendix B7.5), so schedule neutrality decides whether C1 helps at all.</w:t>
       </w:r>
     </w:p>
-    <w:bookmarkEnd w:id="46"/>
-    <w:bookmarkStart w:id="47" w:name="verdict-and-limits"/>
+    <w:bookmarkEnd w:id="62"/>
+    <w:bookmarkStart w:id="63" w:name="verdict-and-limits"/>
     <w:p>
       <w:pPr>
         <w:pStyle w:val="Heading3"/>
@@ -10987,9 +11261,9 @@
         </w:pict>
       </w:r>
     </w:p>
-    <w:bookmarkEnd w:id="47"/>
-    <w:bookmarkEnd w:id="48"/>
-    <w:bookmarkStart w:id="49" w:name="X90192b1a7d5c0c11d128c22869d67841fc8ab68"/>
+    <w:bookmarkEnd w:id="63"/>
+    <w:bookmarkEnd w:id="64"/>
+    <w:bookmarkStart w:id="65" w:name="X90192b1a7d5c0c11d128c22869d67841fc8ab68"/>
     <w:p>
       <w:pPr>
         <w:pStyle w:val="Heading2"/>
@@ -11010,8 +11284,8 @@
         <w:t xml:space="preserve">[TODO: section not yet in the repo]</w:t>
       </w:r>
     </w:p>
-    <w:bookmarkEnd w:id="49"/>
-    <w:bookmarkStart w:id="50" w:name="conclusions-and-recommendations"/>
+    <w:bookmarkEnd w:id="65"/>
+    <w:bookmarkStart w:id="66" w:name="conclusions-and-recommendations"/>
     <w:p>
       <w:pPr>
         <w:pStyle w:val="Heading2"/>
@@ -11275,23 +11549,14 @@
         </w:pict>
       </w:r>
     </w:p>
-    <w:bookmarkEnd w:id="50"/>
-    <w:bookmarkStart w:id="111" w:name="appendices"/>
-    <w:p>
-      <w:pPr>
-        <w:pStyle w:val="Heading1"/>
-      </w:pPr>
-      <w:r>
-        <w:t xml:space="preserve">Appendices</w:t>
-      </w:r>
-    </w:p>
-    <w:bookmarkStart w:id="60" w:name="Xddcc31d2d3503f687b8b233cd4a745104a63a5c"/>
+    <w:bookmarkEnd w:id="66"/>
+    <w:bookmarkStart w:id="67" w:name="references"/>
     <w:p>
       <w:pPr>
         <w:pStyle w:val="Heading2"/>
       </w:pPr>
       <w:r>
-        <w:t xml:space="preserve">Appendix A. LCA inventory and calculations</w:t>
+        <w:t xml:space="preserve">References</w:t>
       </w:r>
     </w:p>
     <w:p>
@@ -11299,20 +11564,56 @@
         <w:pStyle w:val="FirstParagraph"/>
       </w:pPr>
       <w:r>
-        <w:t xml:space="preserve">This appendix gives the full working behind §6. The analysis is an</w:t>
-      </w:r>
-      <w:r>
-        <w:t xml:space="preserve"> </w:t>
-      </w:r>
-      <w:r>
         <w:rPr>
           <w:bCs/>
           <w:b/>
         </w:rPr>
-        <w:t xml:space="preserve">equivalent analysis built from published factors</w:t>
-      </w:r>
-      <w:r>
-        <w:t xml:space="preserve">: a screening LCA following ISO 14040/44 principles, not critically reviewed, in which a Python model multiplies quantities by emission factors.</w:t>
+        <w:t xml:space="preserve">[TODO: reference list]</w:t>
+      </w:r>
+    </w:p>
+    <w:bookmarkEnd w:id="67"/>
+    <w:bookmarkStart w:id="68" w:name="declaration-of-generative-ai-use"/>
+    <w:p>
+      <w:pPr>
+        <w:pStyle w:val="Heading2"/>
+      </w:pPr>
+      <w:r>
+        <w:t xml:space="preserve">Declaration of generative AI use</w:t>
+      </w:r>
+    </w:p>
+    <w:p>
+      <w:pPr>
+        <w:pStyle w:val="FirstParagraph"/>
+      </w:pPr>
+      <w:r>
+        <w:t xml:space="preserve">[TODO: team to write the AI-use declaration required by the unit (CLAUDE.md: the team decides how AI use is declared).]</w:t>
+      </w:r>
+    </w:p>
+    <w:bookmarkEnd w:id="68"/>
+    <w:bookmarkStart w:id="129" w:name="appendices"/>
+    <w:p>
+      <w:pPr>
+        <w:pStyle w:val="Heading1"/>
+      </w:pPr>
+      <w:r>
+        <w:t xml:space="preserve">Appendices</w:t>
+      </w:r>
+    </w:p>
+    <w:bookmarkStart w:id="78" w:name="Xddcc31d2d3503f687b8b233cd4a745104a63a5c"/>
+    <w:p>
+      <w:pPr>
+        <w:pStyle w:val="Heading2"/>
+      </w:pPr>
+      <w:r>
+        <w:t xml:space="preserve">Appendix A. LCA inventory and calculations</w:t>
+      </w:r>
+    </w:p>
+    <w:p>
+      <w:pPr>
+        <w:pStyle w:val="FirstParagraph"/>
+      </w:pPr>
+      <w:r>
+        <w:t xml:space="preserve">This appendix gives the full working behind §6. The analysis is an</w:t>
       </w:r>
       <w:r>
         <w:t xml:space="preserve"> </w:t>
@@ -11322,10 +11623,10 @@
           <w:bCs/>
           <w:b/>
         </w:rPr>
-        <w:t xml:space="preserve">No Granta EduPack run has been done</w:t>
-      </w:r>
-      <w:r>
-        <w:t xml:space="preserve">; the cross-check is only set up (A9) [TODO: Granta cross-check, H2 due Thu 12:00; cut if not run].</w:t>
+        <w:t xml:space="preserve">equivalent analysis built from published factors</w:t>
+      </w:r>
+      <w:r>
+        <w:t xml:space="preserve">: a screening LCA following ISO 14040/44 principles, not critically reviewed, in which a Python model multiplies quantities by emission factors.</w:t>
       </w:r>
       <w:r>
         <w:t xml:space="preserve"> </w:t>
@@ -11335,6 +11636,19 @@
           <w:bCs/>
           <w:b/>
         </w:rPr>
+        <w:t xml:space="preserve">No Granta EduPack run has been done</w:t>
+      </w:r>
+      <w:r>
+        <w:t xml:space="preserve">; the cross-check is only set up (A9) [TODO: Granta cross-check, H2 due Thu 12:00; cut if not run].</w:t>
+      </w:r>
+      <w:r>
+        <w:t xml:space="preserve"> </w:t>
+      </w:r>
+      <w:r>
+        <w:rPr>
+          <w:bCs/>
+          <w:b/>
+        </w:rPr>
         <w:t xml:space="preserve">No input has yet been checked against its primary source</w:t>
       </w:r>
       <w:r>
@@ -11395,7 +11709,7 @@
         <w:t xml:space="preserve">), so every number here is provisional.</w:t>
       </w:r>
     </w:p>
-    <w:bookmarkStart w:id="51" w:name="a1.-reproducing-the-results"/>
+    <w:bookmarkStart w:id="69" w:name="a1.-reproducing-the-results"/>
     <w:p>
       <w:pPr>
         <w:pStyle w:val="Heading3"/>
@@ -11782,8 +12096,8 @@
         <w:t xml:space="preserve">(59 parameters, each with a value, range, distribution, source key and status).</w:t>
       </w:r>
     </w:p>
-    <w:bookmarkEnd w:id="51"/>
-    <w:bookmarkStart w:id="52" w:name="a2.-functional-unit-and-lifetime-output"/>
+    <w:bookmarkEnd w:id="69"/>
+    <w:bookmarkStart w:id="70" w:name="a2.-functional-unit-and-lifetime-output"/>
     <w:p>
       <w:pPr>
         <w:pStyle w:val="Heading3"/>
@@ -11895,8 +12209,8 @@
         <w:t xml:space="preserve">Inputs: P_net 300 MWe (GE Vernova Hitachi Nuclear Energy, n.d.) [placeholder; 315 MW net in an OPG filing, TO VERIFY]; CF 0.90 [placeholder, assumption shared with §7]; L 60 years (Canadian Nuclear Safety Commission, 2024) [TO VERIFY; 65 years reported elsewhere].</w:t>
       </w:r>
     </w:p>
-    <w:bookmarkEnd w:id="52"/>
-    <w:bookmarkStart w:id="53" w:name="a3.-material-quantities-per-unit"/>
+    <w:bookmarkEnd w:id="70"/>
+    <w:bookmarkStart w:id="71" w:name="a3.-material-quantities-per-unit"/>
     <w:p>
       <w:pPr>
         <w:pStyle w:val="Heading3"/>
@@ -12558,8 +12872,8 @@
         <w:t xml:space="preserve">In 3.5% of Monte Carlo draws (706 of 20,000) the scaled plant fell below the target volume, and the plant volume was then set equal to the target (Appendix C1).</w:t>
       </w:r>
     </w:p>
-    <w:bookmarkEnd w:id="53"/>
-    <w:bookmarkStart w:id="54" w:name="Xd0e381ee713afec2acbbb80d77e863c2dda17b7"/>
+    <w:bookmarkEnd w:id="71"/>
+    <w:bookmarkStart w:id="72" w:name="Xd0e381ee713afec2acbbb80d77e863c2dda17b7"/>
     <w:p>
       <w:pPr>
         <w:pStyle w:val="Heading3"/>
@@ -13574,8 +13888,8 @@
         <w:t xml:space="preserve">header is replaced by a source column; rebar uses a recycled-content (electric-arc furnace) factor, not virgin steel; construction electricity is not assumed renewable (the uplift covers site energy on the Ontario grid). Still unresolved: what preprint 202505.1533 in the team notes is [TODO].</w:t>
       </w:r>
     </w:p>
-    <w:bookmarkEnd w:id="54"/>
-    <w:bookmarkStart w:id="55" w:name="a5.-emission-factors"/>
+    <w:bookmarkEnd w:id="72"/>
+    <w:bookmarkStart w:id="73" w:name="a5.-emission-factors"/>
     <w:p>
       <w:pPr>
         <w:pStyle w:val="Heading3"/>
@@ -14878,8 +15192,8 @@
         <w:t xml:space="preserve">At 350 kg/m³ the model gives 328.9 kg CO₂e/m³ for S0 concrete, close to the Ontario industry baseline of 334 kg CO₂e/m³ for 35 MPa concrete and below the 417 kg CO₂e/m³ industry benchmark mix (Canadian Ready-Mixed Concrete Association, 2022) [TO VERIFY].</w:t>
       </w:r>
     </w:p>
-    <w:bookmarkEnd w:id="55"/>
-    <w:bookmarkStart w:id="56" w:name="a6.-concrete-and-the-c1-scenarios"/>
+    <w:bookmarkEnd w:id="73"/>
+    <w:bookmarkStart w:id="74" w:name="a6.-concrete-and-the-c1-scenarios"/>
     <w:p>
       <w:pPr>
         <w:pStyle w:val="Heading3"/>
@@ -16361,8 +16675,8 @@
         <w:t xml:space="preserve">Clinker avoided by LC3 = 2,304 t / 1.419 × 10⁸ MWh = 0.016 kg/MWh (7.7 t/MWe). Concrete: 20,700 m³ × 2.4 t/m³ / 1.419 × 10⁸ MWh = 0.35 kg/MWh. Steel: 9,900 t / 1.419 × 10⁸ MWh = 0.070 kg/MWh.</w:t>
       </w:r>
     </w:p>
-    <w:bookmarkEnd w:id="56"/>
-    <w:bookmarkStart w:id="57" w:name="X62dd5352b338ee668e2c8600a16d3b918435b38"/>
+    <w:bookmarkEnd w:id="74"/>
+    <w:bookmarkStart w:id="75" w:name="X62dd5352b338ee668e2c8600a16d3b918435b38"/>
     <w:p>
       <w:pPr>
         <w:pStyle w:val="Heading3"/>
@@ -17144,8 +17458,8 @@
         </w:tc>
       </w:tr>
     </w:tbl>
-    <w:bookmarkEnd w:id="57"/>
-    <w:bookmarkStart w:id="58" w:name="a8.-fuel-cycle-and-life-cycle-total"/>
+    <w:bookmarkEnd w:id="75"/>
+    <w:bookmarkStart w:id="76" w:name="a8.-fuel-cycle-and-life-cycle-total"/>
     <w:p>
       <w:pPr>
         <w:pStyle w:val="Heading3"/>
@@ -18465,8 +18779,8 @@
         <w:t xml:space="preserve">Grouped (mode case): fuel front end 1.458 g/kWh (54.0%); back end and decommissioning 0.670 (24.8%); O&amp;M 0.330 (12.2%); construction 0.242 (9.0%).</w:t>
       </w:r>
     </w:p>
-    <w:bookmarkEnd w:id="58"/>
-    <w:bookmarkStart w:id="59" w:name="Xcbf3e6739bbfec93458e6285538cb024706ce2d"/>
+    <w:bookmarkEnd w:id="76"/>
+    <w:bookmarkStart w:id="77" w:name="Xcbf3e6739bbfec93458e6285538cb024706ce2d"/>
     <w:p>
       <w:pPr>
         <w:pStyle w:val="Heading3"/>
@@ -19175,9 +19489,9 @@
         </w:pict>
       </w:r>
     </w:p>
-    <w:bookmarkEnd w:id="59"/>
-    <w:bookmarkEnd w:id="60"/>
-    <w:bookmarkStart w:id="102" w:name="X7e33b522909f8daae3037d2691d3cd94d9b7c55"/>
+    <w:bookmarkEnd w:id="77"/>
+    <w:bookmarkEnd w:id="78"/>
+    <w:bookmarkStart w:id="120" w:name="X7e33b522909f8daae3037d2691d3cd94d9b7c55"/>
     <w:p>
       <w:pPr>
         <w:pStyle w:val="Heading2"/>
@@ -19918,7 +20232,7 @@
         </w:pict>
       </w:r>
     </w:p>
-    <w:bookmarkStart w:id="65" w:name="b1.-legal-and-political-pathway"/>
+    <w:bookmarkStart w:id="83" w:name="b1.-legal-and-political-pathway"/>
     <w:p>
       <w:pPr>
         <w:pStyle w:val="Heading3"/>
@@ -19945,7 +20259,7 @@
         <w:t xml:space="preserve">Three laws bar an SMR at Liddell, and each has a different veto holder. On current party positions, the federal repeal is 7 Senate votes short (3 short even with every other crossbencher) [TO VERIFY at aph.gov.au: 39/37 or 40/36; either way it fails], and the NSW repeal bill is stalled. For comparison, Darlington’s licence to construct took about 29 months, 17.9 years after its environmental assessment began.</w:t>
       </w:r>
     </w:p>
-    <w:bookmarkStart w:id="61" w:name="X3978bcd65168dfde624f3a3e20dbe906af3d815"/>
+    <w:bookmarkStart w:id="79" w:name="X3978bcd65168dfde624f3a3e20dbe906af3d815"/>
     <w:p>
       <w:pPr>
         <w:pStyle w:val="Heading4"/>
@@ -20470,8 +20784,8 @@
         <w:t xml:space="preserve">Order of removal: federal repeal (1 and 2) → choice of regulator → state repeal or override (3) → site (4) → environmental assessment → licensing (law brief §4). Each step has a different veto holder, so all must agree.</w:t>
       </w:r>
     </w:p>
-    <w:bookmarkEnd w:id="61"/>
-    <w:bookmarkStart w:id="62" w:name="X52641d6a275743723c641fbdfc2158d68a6cd0a"/>
+    <w:bookmarkEnd w:id="79"/>
+    <w:bookmarkStart w:id="80" w:name="X52641d6a275743723c641fbdfc2158d68a6cd0a"/>
     <w:p>
       <w:pPr>
         <w:pStyle w:val="Heading4"/>
@@ -21336,8 +21650,8 @@
         <w:t xml:space="preserve">Result 4 makes the conclusion independent of the One Nation and Babet assumption (it holds on either count of seats). In the House, Labor holds 94 of 150 seats (Australian Electoral Commission, 2025) [TO VERIFY], so a repeal bill would also need the Government’s support there.</w:t>
       </w:r>
     </w:p>
-    <w:bookmarkEnd w:id="62"/>
-    <w:bookmarkStart w:id="63" w:name="b1.3-nsw-repeal-bill-status"/>
+    <w:bookmarkEnd w:id="80"/>
+    <w:bookmarkStart w:id="81" w:name="b1.3-nsw-repeal-bill-status"/>
     <w:p>
       <w:pPr>
         <w:pStyle w:val="Heading4"/>
@@ -21596,8 +21910,8 @@
         </w:tc>
       </w:tr>
     </w:tbl>
-    <w:bookmarkEnd w:id="63"/>
-    <w:bookmarkStart w:id="64" w:name="X1a74a4ec34d97d2cc7de09de2586d1d2b22092c"/>
+    <w:bookmarkEnd w:id="81"/>
+    <w:bookmarkStart w:id="82" w:name="X1a74a4ec34d97d2cc7de09de2586d1d2b22092c"/>
     <w:p>
       <w:pPr>
         <w:pStyle w:val="Heading4"/>
@@ -22485,9 +22799,9 @@
         </w:pict>
       </w:r>
     </w:p>
-    <w:bookmarkEnd w:id="64"/>
-    <w:bookmarkEnd w:id="65"/>
-    <w:bookmarkStart w:id="72" w:name="X372cadb88b67a633233203304eb4ef38d3c0c77"/>
+    <w:bookmarkEnd w:id="82"/>
+    <w:bookmarkEnd w:id="83"/>
+    <w:bookmarkStart w:id="90" w:name="X372cadb88b67a633233203304eb4ef38d3c0c77"/>
     <w:p>
       <w:pPr>
         <w:pStyle w:val="Heading3"/>
@@ -22544,7 +22858,7 @@
         <w:t xml:space="preserve">. Removing Russia raises the HHI at every stage. Removing Russia and China leaves enrichment as a Urenco–Orano duopoly (5,621). The one case below 1,800 is mining by company (about 850–1,400, from the top three firms only; midpoint 1,118), so mining concentration is a country (geopolitical) risk rather than a market-power risk.</w:t>
       </w:r>
     </w:p>
-    <w:bookmarkStart w:id="66" w:name="b2.1-method"/>
+    <w:bookmarkStart w:id="84" w:name="b2.1-method"/>
     <w:p>
       <w:pPr>
         <w:pStyle w:val="Heading4"/>
@@ -23090,8 +23404,8 @@
         <w:t xml:space="preserve">(N_eq = 1.8).</w:t>
       </w:r>
     </w:p>
-    <w:bookmarkEnd w:id="66"/>
-    <w:bookmarkStart w:id="67" w:name="b2.2-inputs-and-shares"/>
+    <w:bookmarkEnd w:id="84"/>
+    <w:bookmarkStart w:id="85" w:name="b2.2-inputs-and-shares"/>
     <w:p>
       <w:pPr>
         <w:pStyle w:val="Heading4"/>
@@ -26202,8 +26516,8 @@
         <w:t xml:space="preserve">, and report Russia’s share as a range (review.md §8.3 point 2; R1.3).]</w:t>
       </w:r>
     </w:p>
-    <w:bookmarkEnd w:id="67"/>
-    <w:bookmarkStart w:id="68" w:name="b2.3-headline-results"/>
+    <w:bookmarkEnd w:id="85"/>
+    <w:bookmarkStart w:id="86" w:name="b2.3-headline-results"/>
     <w:p>
       <w:pPr>
         <w:pStyle w:val="Heading4"/>
@@ -26718,8 +27032,8 @@
         <w:t xml:space="preserve">Shares for the two producer countries in the comparison: Canada mined 23.8% of world uranium in 2024 and holds 20.2% of world conversion capacity (36.2% of the capacity open to a Western buyer), with no enrichment. Australia mined 7.6% (4,598 tU) and has no conversion or enrichment capacity. Australia holds 28% of identified recoverable resources at &lt; USD 130/kgU (OECD NEA and IAEA, 2025) [TO VERIFY; Red Book 2026 gives 29% or 27% in two WNA tabulations; team to choose the edition, §8.3 TODO 4].</w:t>
       </w:r>
     </w:p>
-    <w:bookmarkEnd w:id="68"/>
-    <w:bookmarkStart w:id="69" w:name="b2.4-sensitivity"/>
+    <w:bookmarkEnd w:id="86"/>
+    <w:bookmarkStart w:id="87" w:name="b2.4-sensitivity"/>
     <w:p>
       <w:pPr>
         <w:pStyle w:val="Heading4"/>
@@ -29445,8 +29759,8 @@
         <w:t xml:space="preserve">Both bounds are below 1,500, so firms are not concentrated even though countries are. Kazakhstan’s 38.6% country share includes joint ventures with Cameco, Orano, Uranium One (Rosatom) and Chinese partners [TO VERIFY ownership detail].</w:t>
       </w:r>
     </w:p>
-    <w:bookmarkEnd w:id="69"/>
-    <w:bookmarkStart w:id="70" w:name="b2.5-limitations"/>
+    <w:bookmarkEnd w:id="87"/>
+    <w:bookmarkStart w:id="88" w:name="b2.5-limitations"/>
     <w:p>
       <w:pPr>
         <w:pStyle w:val="Heading4"/>
@@ -29527,8 +29841,8 @@
         <w:t xml:space="preserve">The HHI is a world-market measure. Darlington’s own demand is sized against it in B2.6.</w:t>
       </w:r>
     </w:p>
-    <w:bookmarkEnd w:id="70"/>
-    <w:bookmarkStart w:id="71" w:name="X38b76fede8e58c0e5d473d8915656eae0265e01"/>
+    <w:bookmarkEnd w:id="88"/>
+    <w:bookmarkStart w:id="89" w:name="X38b76fede8e58c0e5d473d8915656eae0265e01"/>
     <w:p>
       <w:pPr>
         <w:pStyle w:val="Heading4"/>
@@ -29980,9 +30294,9 @@
         </w:pict>
       </w:r>
     </w:p>
-    <w:bookmarkEnd w:id="71"/>
-    <w:bookmarkEnd w:id="72"/>
-    <w:bookmarkStart w:id="74" w:name="X4d39e6569850789c0bc5244e03826205e394972"/>
+    <w:bookmarkEnd w:id="89"/>
+    <w:bookmarkEnd w:id="90"/>
+    <w:bookmarkStart w:id="92" w:name="X4d39e6569850789c0bc5244e03826205e394972"/>
     <w:p>
       <w:pPr>
         <w:pStyle w:val="Heading3"/>
@@ -30866,7 +31180,7 @@
         <w:t xml:space="preserve">Reading: route B ranks last under all three weightings tested, and C is never behind A. Valuing regulator readiness more only closes the gap, to a tie with A. The choice between A and C is a choice between speed (an existing regulator) and durability (both levels of government committed). That is a political judgement, not a technical one. Whichever route is assumed, an Australian SMR scores lowest on time to first power in the §9 MCDA.</w:t>
       </w:r>
     </w:p>
-    <w:bookmarkStart w:id="73" w:name="X9c643738a896a77e27731f9c9572c60fb05f681"/>
+    <w:bookmarkStart w:id="91" w:name="X9c643738a896a77e27731f9c9572c60fb05f681"/>
     <w:p>
       <w:pPr>
         <w:pStyle w:val="Heading4"/>
@@ -31312,9 +31626,9 @@
         </w:pict>
       </w:r>
     </w:p>
-    <w:bookmarkEnd w:id="73"/>
-    <w:bookmarkEnd w:id="74"/>
-    <w:bookmarkStart w:id="78" w:name="X6942ef6bc025069590c0c205010015835f1b9ab"/>
+    <w:bookmarkEnd w:id="91"/>
+    <w:bookmarkEnd w:id="92"/>
+    <w:bookmarkStart w:id="96" w:name="X6942ef6bc025069590c0c205010015835f1b9ab"/>
     <w:p>
       <w:pPr>
         <w:pStyle w:val="Heading3"/>
@@ -31432,7 +31746,7 @@
         <w:t xml:space="preserve">.</w:t>
       </w:r>
     </w:p>
-    <w:bookmarkStart w:id="75" w:name="b4.1-method"/>
+    <w:bookmarkStart w:id="93" w:name="b4.1-method"/>
     <w:p>
       <w:pPr>
         <w:pStyle w:val="Heading4"/>
@@ -32770,8 +33084,8 @@
         </w:tc>
       </w:tr>
     </w:tbl>
-    <w:bookmarkEnd w:id="75"/>
-    <w:bookmarkStart w:id="76" w:name="b4.2-results"/>
+    <w:bookmarkEnd w:id="93"/>
+    <w:bookmarkStart w:id="94" w:name="b4.2-results"/>
     <w:p>
       <w:pPr>
         <w:pStyle w:val="Heading4"/>
@@ -35805,8 +36119,8 @@
         <w:t xml:space="preserve">Only in the 110 g/kWh stress case, or on a near-zero floor, where the result turns negative.</w:t>
       </w:r>
     </w:p>
-    <w:bookmarkEnd w:id="76"/>
-    <w:bookmarkStart w:id="77" w:name="b4.3-limitations"/>
+    <w:bookmarkEnd w:id="94"/>
+    <w:bookmarkStart w:id="95" w:name="b4.3-limitations"/>
     <w:p>
       <w:pPr>
         <w:pStyle w:val="Heading4"/>
@@ -35932,9 +36246,9 @@
         </w:pict>
       </w:r>
     </w:p>
-    <w:bookmarkEnd w:id="77"/>
-    <w:bookmarkEnd w:id="78"/>
-    <w:bookmarkStart w:id="84" w:name="X66860b851f2e133f81978e30598e738689cf6de"/>
+    <w:bookmarkEnd w:id="95"/>
+    <w:bookmarkEnd w:id="96"/>
+    <w:bookmarkStart w:id="102" w:name="X66860b851f2e133f81978e30598e738689cf6de"/>
     <w:p>
       <w:pPr>
         <w:pStyle w:val="Heading3"/>
@@ -36042,7 +36356,7 @@
         <w:t xml:space="preserve">.</w:t>
       </w:r>
     </w:p>
-    <w:bookmarkStart w:id="79" w:name="b5.1-method"/>
+    <w:bookmarkStart w:id="97" w:name="b5.1-method"/>
     <w:p>
       <w:pPr>
         <w:pStyle w:val="Heading4"/>
@@ -36242,8 +36556,8 @@
         <w:t xml:space="preserve">.</w:t>
       </w:r>
     </w:p>
-    <w:bookmarkEnd w:id="79"/>
-    <w:bookmarkStart w:id="80" w:name="b5.2-co₂e-lost-per-month-of-delay"/>
+    <w:bookmarkEnd w:id="97"/>
+    <w:bookmarkStart w:id="98" w:name="b5.2-co₂e-lost-per-month-of-delay"/>
     <w:p>
       <w:pPr>
         <w:pStyle w:val="Heading4"/>
@@ -37643,8 +37957,8 @@
         <w:t xml:space="preserve">§5).</w:t>
       </w:r>
     </w:p>
-    <w:bookmarkEnd w:id="80"/>
-    <w:bookmarkStart w:id="81" w:name="b5.3-break-even-delay-for-c1"/>
+    <w:bookmarkEnd w:id="98"/>
+    <w:bookmarkStart w:id="99" w:name="b5.3-break-even-delay-for-c1"/>
     <w:p>
       <w:pPr>
         <w:pStyle w:val="Heading4"/>
@@ -38945,8 +39259,8 @@
         <w:t xml:space="preserve">§5 (run 5): one day of delay costs C$1.8–2.9 m, against C1’s total carbon value of under C$1 m.</w:t>
       </w:r>
     </w:p>
-    <w:bookmarkEnd w:id="81"/>
-    <w:bookmarkStart w:id="82" w:name="b5.5-year-scale-delays"/>
+    <w:bookmarkEnd w:id="99"/>
+    <w:bookmarkStart w:id="100" w:name="b5.5-year-scale-delays"/>
     <w:p>
       <w:pPr>
         <w:pStyle w:val="Heading4"/>
@@ -39713,8 +40027,8 @@
         </w:tc>
       </w:tr>
     </w:tbl>
-    <w:bookmarkEnd w:id="82"/>
-    <w:bookmarkStart w:id="83" w:name="b5.6-limitations"/>
+    <w:bookmarkEnd w:id="100"/>
+    <w:bookmarkStart w:id="101" w:name="b5.6-limitations"/>
     <w:p>
       <w:pPr>
         <w:pStyle w:val="Heading4"/>
@@ -39790,9 +40104,9 @@
         </w:pict>
       </w:r>
     </w:p>
-    <w:bookmarkEnd w:id="83"/>
-    <w:bookmarkEnd w:id="84"/>
-    <w:bookmarkStart w:id="89" w:name="Xe9bf8aa20110d892414618c9830b1120addc14d"/>
+    <w:bookmarkEnd w:id="101"/>
+    <w:bookmarkEnd w:id="102"/>
+    <w:bookmarkStart w:id="107" w:name="Xe9bf8aa20110d892414618c9830b1120addc14d"/>
     <w:p>
       <w:pPr>
         <w:pStyle w:val="Heading3"/>
@@ -39998,7 +40312,7 @@
         <w:t xml:space="preserve">and re-run; every table here regenerates.</w:t>
       </w:r>
     </w:p>
-    <w:bookmarkStart w:id="85" w:name="b6.1-inputs-and-method"/>
+    <w:bookmarkStart w:id="103" w:name="b6.1-inputs-and-method"/>
     <w:p>
       <w:pPr>
         <w:pStyle w:val="Heading4"/>
@@ -40695,8 +41009,8 @@
         <w:t xml:space="preserve">3. Cumulative comparison: the annual spend = SMR output × SMR LCOE, and the renewables bought with it = spend / renewables LCOE, from 2028. Each technology’s avoided CO₂e is summed on the same trajectory (B4.1), net of its own life-cycle intensity (4.2 or 30 g/kWh).</w:t>
       </w:r>
     </w:p>
-    <w:bookmarkEnd w:id="85"/>
-    <w:bookmarkStart w:id="86" w:name="b6.2-results"/>
+    <w:bookmarkEnd w:id="103"/>
+    <w:bookmarkStart w:id="104" w:name="b6.2-results"/>
     <w:p>
       <w:pPr>
         <w:pStyle w:val="Heading4"/>
@@ -43084,8 +43398,8 @@
         </w:tc>
       </w:tr>
     </w:tbl>
-    <w:bookmarkEnd w:id="86"/>
-    <w:bookmarkStart w:id="87" w:name="Xb46440dcd6bb376dc9fa16a124016f8e20a5823"/>
+    <w:bookmarkEnd w:id="104"/>
+    <w:bookmarkStart w:id="105" w:name="Xb46440dcd6bb376dc9fa16a124016f8e20a5823"/>
     <w:p>
       <w:pPr>
         <w:pStyle w:val="Heading4"/>
@@ -43238,8 +43552,8 @@
         <w:t xml:space="preserve">[TODO: an Appendix B subsection for the LCOE with §8.2].</w:t>
       </w:r>
     </w:p>
-    <w:bookmarkEnd w:id="87"/>
-    <w:bookmarkStart w:id="88" w:name="b6.4-limitations"/>
+    <w:bookmarkEnd w:id="105"/>
+    <w:bookmarkStart w:id="106" w:name="b6.4-limitations"/>
     <w:p>
       <w:pPr>
         <w:pStyle w:val="Heading4"/>
@@ -43315,9 +43629,9 @@
         </w:pict>
       </w:r>
     </w:p>
-    <w:bookmarkEnd w:id="88"/>
-    <w:bookmarkEnd w:id="89"/>
-    <w:bookmarkStart w:id="96" w:name="Xc131c5b7da9b849e6bc37677db63fd4f3349dcd"/>
+    <w:bookmarkEnd w:id="106"/>
+    <w:bookmarkEnd w:id="107"/>
+    <w:bookmarkStart w:id="114" w:name="Xc131c5b7da9b849e6bc37677db63fd4f3349dcd"/>
     <w:p>
       <w:pPr>
         <w:pStyle w:val="Heading3"/>
@@ -43414,7 +43728,7 @@
         <w:t xml:space="preserve">, which holds every raw score, normalised score, weight set and perturbation (593 rows).</w:t>
       </w:r>
     </w:p>
-    <w:bookmarkStart w:id="90" w:name="b7.1-options-criteria-and-inputs"/>
+    <w:bookmarkStart w:id="108" w:name="b7.1-options-criteria-and-inputs"/>
     <w:p>
       <w:pPr>
         <w:pStyle w:val="Heading4"/>
@@ -44174,8 +44488,8 @@
         <w:t xml:space="preserve">Technology readiness level (TRL): no TRL figure exists yet in the sections or briefs [TODO: Leroy §4.1]. Schedule risk enters through the first-power year (tested at 2035 and 2045) and the C1 delay case.</w:t>
       </w:r>
     </w:p>
-    <w:bookmarkEnd w:id="90"/>
-    <w:bookmarkStart w:id="91" w:name="b7.2-method"/>
+    <w:bookmarkEnd w:id="108"/>
+    <w:bookmarkStart w:id="109" w:name="b7.2-method"/>
     <w:p>
       <w:pPr>
         <w:pStyle w:val="Heading4"/>
@@ -44919,8 +45233,8 @@
         </w:tc>
       </w:tr>
     </w:tbl>
-    <w:bookmarkEnd w:id="91"/>
-    <w:bookmarkStart w:id="92" w:name="b7.3-weights-and-results"/>
+    <w:bookmarkEnd w:id="109"/>
+    <w:bookmarkStart w:id="110" w:name="b7.3-weights-and-results"/>
     <w:p>
       <w:pPr>
         <w:pStyle w:val="Heading4"/>
@@ -45959,8 +46273,8 @@
         </w:tc>
       </w:tr>
     </w:tbl>
-    <w:bookmarkEnd w:id="92"/>
-    <w:bookmarkStart w:id="93" w:name="b7.4-rank-reversal-and-input-sensitivity"/>
+    <w:bookmarkEnd w:id="110"/>
+    <w:bookmarkStart w:id="111" w:name="b7.4-rank-reversal-and-input-sensitivity"/>
     <w:p>
       <w:pPr>
         <w:pStyle w:val="Heading4"/>
@@ -46615,8 +46929,8 @@
         <w:t xml:space="preserve">it comes from the four-option scale, where doing nothing scores full marks on cost, supply and legal feasibility.</w:t>
       </w:r>
     </w:p>
-    <w:bookmarkEnd w:id="93"/>
-    <w:bookmarkStart w:id="94" w:name="X655acef3214253160cddaea55a74ab651fff5b4"/>
+    <w:bookmarkEnd w:id="111"/>
+    <w:bookmarkStart w:id="112" w:name="X655acef3214253160cddaea55a74ab651fff5b4"/>
     <w:p>
       <w:pPr>
         <w:pStyle w:val="Heading4"/>
@@ -47089,8 +47403,8 @@
         <w:t xml:space="preserve">If C1 slips the unit by 14.6 days (the old-case whole-life break-even of B5.3, used as an illustration), the CO₂e not avoided at Liddell during the delay is 25.5 kt, which is 12 times the 2,200 t saving (15 times the 1,734 t saving). SMR + C1 then avoids less than the plain SMR, so the schedule-neutral condition decides the sign. The denominator caveat applies: the 4.2 g/kWh base comes from the earlier 20,700 m³ model, and the percentages must be re-read from the final §6.</w:t>
       </w:r>
     </w:p>
-    <w:bookmarkEnd w:id="94"/>
-    <w:bookmarkStart w:id="95" w:name="b7.6-limitations"/>
+    <w:bookmarkEnd w:id="112"/>
+    <w:bookmarkStart w:id="113" w:name="b7.6-limitations"/>
     <w:p>
       <w:pPr>
         <w:pStyle w:val="Heading4"/>
@@ -47316,9 +47630,9 @@
         </w:pict>
       </w:r>
     </w:p>
-    <w:bookmarkEnd w:id="95"/>
-    <w:bookmarkEnd w:id="96"/>
-    <w:bookmarkStart w:id="101" w:name="Xdcb2f35f44111e0f453c2a475e1a576da286c83"/>
+    <w:bookmarkEnd w:id="113"/>
+    <w:bookmarkEnd w:id="114"/>
+    <w:bookmarkStart w:id="119" w:name="Xdcb2f35f44111e0f453c2a475e1a576da286c83"/>
     <w:p>
       <w:pPr>
         <w:pStyle w:val="Heading3"/>
@@ -47397,7 +47711,7 @@
         <w:t xml:space="preserve">).</w:t>
       </w:r>
     </w:p>
-    <w:bookmarkStart w:id="97" w:name="X8871295422bcc52b42d843e419a224e284f0009"/>
+    <w:bookmarkStart w:id="115" w:name="X8871295422bcc52b42d843e419a224e284f0009"/>
     <w:p>
       <w:pPr>
         <w:pStyle w:val="Heading4"/>
@@ -47889,8 +48203,8 @@
         <w:t xml:space="preserve">The unit’s own output carries 0.07 statistical deaths a year at the nuclear rate (one per 14 years), a rate that includes Chernobyl and Fukushima. The fossil rates are for European plants with pollution controls, so they are conservative. Against wind or solar the difference lies within the uncertainty of the rates.</w:t>
       </w:r>
     </w:p>
-    <w:bookmarkEnd w:id="97"/>
-    <w:bookmarkStart w:id="98" w:name="Xfaf948de050b31a2ed3f21030d68b74a2859c70"/>
+    <w:bookmarkEnd w:id="115"/>
+    <w:bookmarkStart w:id="116" w:name="Xfaf948de050b31a2ed3f21030d68b74a2859c70"/>
     <w:p>
       <w:pPr>
         <w:pStyle w:val="Heading4"/>
@@ -49654,8 +49968,8 @@
         <w:t xml:space="preserve">. Four actors have high power and three are opposed. Scoring the Wonnarua people at −2 or +2 would move the Liddell result by −0.17 or +0.17 (3 × 2 / 36), which does not change its sign.</w:t>
       </w:r>
     </w:p>
-    <w:bookmarkEnd w:id="98"/>
-    <w:bookmarkStart w:id="99" w:name="Xd5df1698768aea18553bcc1433b5699130c12c4"/>
+    <w:bookmarkEnd w:id="116"/>
+    <w:bookmarkStart w:id="117" w:name="Xd5df1698768aea18553bcc1433b5699130c12c4"/>
     <w:p>
       <w:pPr>
         <w:pStyle w:val="Heading4"/>
@@ -50433,8 +50747,8 @@
         <w:t xml:space="preserve">Reading: R1 beats R3 only on speed (2 against 1) and public cost (2 against 1), and R2 only on speed (2 against 1). Even so, R2 and R3 lead R1 by 3 to 6 points under every weighting. R3 wins outright only when fairness is doubled.</w:t>
       </w:r>
     </w:p>
-    <w:bookmarkEnd w:id="99"/>
-    <w:bookmarkStart w:id="100" w:name="Xded74f51e22084ad8258d479d7dd60f4095d07a"/>
+    <w:bookmarkEnd w:id="117"/>
+    <w:bookmarkStart w:id="118" w:name="Xded74f51e22084ad8258d479d7dd60f4095d07a"/>
     <w:p>
       <w:pPr>
         <w:pStyle w:val="Heading4"/>
@@ -50783,10 +51097,10 @@
         </w:pict>
       </w:r>
     </w:p>
-    <w:bookmarkEnd w:id="100"/>
-    <w:bookmarkEnd w:id="101"/>
-    <w:bookmarkEnd w:id="102"/>
-    <w:bookmarkStart w:id="109" w:name="X2538f2b2fc20c8063ffc88885f2cb513202a3b3"/>
+    <w:bookmarkEnd w:id="118"/>
+    <w:bookmarkEnd w:id="119"/>
+    <w:bookmarkEnd w:id="120"/>
+    <w:bookmarkStart w:id="127" w:name="X2538f2b2fc20c8063ffc88885f2cb513202a3b3"/>
     <w:p>
       <w:pPr>
         <w:pStyle w:val="Heading2"/>
@@ -50844,7 +51158,7 @@
         <w:t xml:space="preserve">, not in verified data.</w:t>
       </w:r>
     </w:p>
-    <w:bookmarkStart w:id="103" w:name="c1.-set-up"/>
+    <w:bookmarkStart w:id="121" w:name="c1.-set-up"/>
     <w:p>
       <w:pPr>
         <w:pStyle w:val="Heading3"/>
@@ -51088,8 +51402,8 @@
         <w:t xml:space="preserve">and Figures F2–F5).</w:t>
       </w:r>
     </w:p>
-    <w:bookmarkEnd w:id="103"/>
-    <w:bookmarkStart w:id="104" w:name="c2.-ranged-inputs-and-tornado-results"/>
+    <w:bookmarkEnd w:id="121"/>
+    <w:bookmarkStart w:id="122" w:name="c2.-ranged-inputs-and-tornado-results"/>
     <w:p>
       <w:pPr>
         <w:pStyle w:val="Heading3"/>
@@ -54770,8 +55084,8 @@
         </w:tc>
       </w:tr>
     </w:tbl>
-    <w:bookmarkEnd w:id="104"/>
-    <w:bookmarkStart w:id="105" w:name="c3.-what-the-tornado-shows"/>
+    <w:bookmarkEnd w:id="122"/>
+    <w:bookmarkStart w:id="123" w:name="c3.-what-the-tornado-shows"/>
     <w:p>
       <w:pPr>
         <w:pStyle w:val="Heading3"/>
@@ -54832,8 +55146,8 @@
         <w:t xml:space="preserve">The saving depends on the LC3 emission cut (swing 609 t), DPSC wall thickness (532 t), infill binder content (430 t), basemat thickness (306 t), extra binder for flow (295 t), forebay volume (221 t) and the cement factor (207 t). The first two are the LC3 literature and OPG’s drawings. Of the next three, binder content and extra binder are mix design and basemat thickness is geometry. Even at the lowest single-input value (1,406 t), LC3 saves more than the largest geometric swing, so the saving is robust in sign but uncertain by about ±20–25%.</w:t>
       </w:r>
     </w:p>
-    <w:bookmarkEnd w:id="105"/>
-    <w:bookmarkStart w:id="106" w:name="c4.-monte-carlo-results"/>
+    <w:bookmarkEnd w:id="123"/>
+    <w:bookmarkStart w:id="124" w:name="c4.-monte-carlo-results"/>
     <w:p>
       <w:pPr>
         <w:pStyle w:val="Heading3"/>
@@ -57790,8 +58104,8 @@
         <w:t xml:space="preserve">Plate steel is total steel minus rebar, and rebar scales with plant concrete (capped at total steel; Appendix A3). Concrete intensity is right-skewed (34.5–69–138 m³/MWe), so expected rebar rises above its mode value, while steel intensity is slightly left-skewed (16.5–33–46 t/MWe). Expected plate steel is therefore below its mode value, even though expected total steel emissions (rebar plus plate) rise.</w:t>
       </w:r>
     </w:p>
-    <w:bookmarkEnd w:id="106"/>
-    <w:bookmarkStart w:id="107" w:name="X62d4c771b19bf733ac0046ab84ee2e69e047196"/>
+    <w:bookmarkEnd w:id="124"/>
+    <w:bookmarkStart w:id="125" w:name="X62d4c771b19bf733ac0046ab84ee2e69e047196"/>
     <w:p>
       <w:pPr>
         <w:pStyle w:val="Heading3"/>
@@ -57906,8 +58220,8 @@
         <w:t xml:space="preserve">. Conversion heat accounts for about 0.9 g/kWh of the median (4.18 − 3.31 = 0.87) and decides how skewed the result is, which makes a measured value the single most useful datum to find.</w:t>
       </w:r>
     </w:p>
-    <w:bookmarkEnd w:id="107"/>
-    <w:bookmarkStart w:id="108" w:name="X861311e05ca973e4ff92563d183b5e9367fe19f"/>
+    <w:bookmarkEnd w:id="125"/>
+    <w:bookmarkStart w:id="126" w:name="X861311e05ca973e4ff92563d183b5e9367fe19f"/>
     <w:p>
       <w:pPr>
         <w:pStyle w:val="Heading3"/>
@@ -58033,9 +58347,9 @@
         </w:pict>
       </w:r>
     </w:p>
-    <w:bookmarkEnd w:id="108"/>
-    <w:bookmarkEnd w:id="109"/>
-    <w:bookmarkStart w:id="110" w:name="appendix-e-search-log.md"/>
+    <w:bookmarkEnd w:id="126"/>
+    <w:bookmarkEnd w:id="127"/>
+    <w:bookmarkStart w:id="128" w:name="appendix-e-search-log.md"/>
     <w:p>
       <w:pPr>
         <w:pStyle w:val="Heading2"/>
@@ -58056,8 +58370,8 @@
         <w:t xml:space="preserve">[TODO: not yet in the repo]</w:t>
       </w:r>
     </w:p>
-    <w:bookmarkEnd w:id="110"/>
-    <w:bookmarkEnd w:id="111"/>
+    <w:bookmarkEnd w:id="128"/>
+    <w:bookmarkEnd w:id="129"/>
     <w:sectPr>
       <w:headerReference r:id="rId9" w:type="default"/>
       <w:headerReference r:id="rId10" w:type="first"/>

</xml_diff>

<commit_message>
Build: reference doc with pandoc's table/caption styles (fixes stacked tables), 9 pt table text, autofit columns, page breaks; trial final docx
Co-Authored-By: Claude Opus 5.5 <noreply@anthropic.com>
Claude-Session: https://claude.ai/code/session_01SZLM437PwZArBFHgvvPCk4
</commit_message>
<xml_diff>
--- a/01_Report/draft-assembled.docx
+++ b/01_Report/draft-assembled.docx
@@ -5119,7 +5119,7 @@
               <w:jc w:val="left"/>
             </w:pPr>
             <w:r>
-              <w:t xml:space="preserve">AGL owns Liddell and has ruled out nuclear there (Newcastle Herald, 2024)</w:t>
+              <w:t xml:space="preserve">AGL owns Liddell and has ruled out nuclear there (Newcastle Herald, 2024a)</w:t>
             </w:r>
           </w:p>
         </w:tc>
@@ -5189,7 +5189,7 @@
         <w:t xml:space="preserve"> </w:t>
       </w:r>
       <w:r>
-        <w:t xml:space="preserve">Darlington’s C$20.9 bn budget for four 300 MWe units (Ontario Power Generation, 2025) gives a levelised cost of electricity (LCOE: the constant price that repays every cost over the plant’s life) of C$198/MWh at a 7% real discount rate, and C$112–280 from 3% to 10% (Table T8). Capital is 65–86% of it, so finance terms matter as much as engineering. OPG’s C$149/MWh implies 4.9%, a regulated Crown utility’s cost of capital. Our A$221 at 7% sits just below GenCost’s 2030 SMR range (Graham, Hayward and Foster, 2024), plausibly because four units share infrastructure. The agreement is not independent, because GenCost’s current edition bases its SMR capital cost on Darlington (Graham and Hayward, 2026). A NuScale-size overrun would give C$317/MWh.</w:t>
+        <w:t xml:space="preserve">Darlington’s C$20.9 bn budget for four 300 MWe units (Ontario Power Generation, 2025a) gives a levelised cost of electricity (LCOE: the constant price that repays every cost over the plant’s life) of C$198/MWh at a 7% real discount rate, and C$112–280 from 3% to 10% (Table T8). Capital is 65–86% of it, so finance terms matter as much as engineering. OPG’s C$149/MWh implies 4.9%, a regulated Crown utility’s cost of capital. Our A$221 at 7% sits just below GenCost’s 2030 SMR range (Graham, Hayward and Foster, 2024), plausibly because four units share infrastructure. The agreement is not independent, because GenCost’s current edition bases its SMR capital cost on Darlington (Graham and Hayward, 2026). A NuScale-size overrun would give C$317/MWh.</w:t>
       </w:r>
     </w:p>
     <w:p>
@@ -5283,7 +5283,7 @@
           <w:iCs/>
           <w:i/>
         </w:rPr>
-        <w:t xml:space="preserve">Source: this study, Appendix B6.3; Ontario Power Generation (2025; 2026b); Graham, Hayward and Foster (2024); Steigerwald et al. (2023).</w:t>
+        <w:t xml:space="preserve">Source: this study, Appendix B6.3; Ontario Power Generation (2025a; 2026b); Graham, Hayward and Foster (2024); Steigerwald et al. (2023).</w:t>
       </w:r>
     </w:p>
     <w:tbl>
@@ -6146,7 +6146,7 @@
         <w:t xml:space="preserve"> </w:t>
       </w:r>
       <w:r>
-        <w:t xml:space="preserve">In 2024, 61% of Australians supported using nuclear power to generate electricity (Neelam, 2024), yet 59% wanted to keep the legal ban, up from 51% a year earlier (Griffith University Climate Action Beacon and Monash Climate Change Communication Research Hub, 2025). One poll asks about a technology and the other about the law, so support depends on framing; older polls found support 16–20 points lower for a plant nearby (Newspoll, 2007; Essential Research, 2019). The health benefit, like the carbon benefit (§7), depends on what the reactor displaces.</w:t>
+        <w:t xml:space="preserve">In 2024, 61% of Australians supported using nuclear power to generate electricity (Neelam, 2024), yet 59% wanted to keep the legal ban, up from 51% a year earlier (Griffith University Climate Action Beacon and Monash Climate Change Communication Research Hub, 2025). One poll asks about a technology and the other about the law, so support depends on framing; older polls found support 16–20 points lower for a plant nearby (Newspoll, 2007). The health benefit, like the carbon benefit (§7), depends on what the reactor displaces.</w:t>
       </w:r>
     </w:p>
     <w:p>
@@ -8865,14 +8865,6 @@
         <w:pStyle w:val="BodyText"/>
       </w:pPr>
       <w:r>
-        <w:t xml:space="preserve">Australian Council of Trade Unions, 2024. [Title TODO: campaign launch against the Coalition’s nuclear policy, June 2024]. [URL TODO, actu.org.au].</w:t>
-      </w:r>
-    </w:p>
-    <w:p>
-      <w:pPr>
-        <w:pStyle w:val="BodyText"/>
-      </w:pPr>
-      <w:r>
         <w:t xml:space="preserve">Australian Electoral Commission, 2019.</w:t>
       </w:r>
       <w:r>
@@ -8886,7 +8878,7 @@
         <w:t xml:space="preserve">District Council of Kimba community ballot on the National Radioactive Waste Management Facility: results</w:t>
       </w:r>
       <w:r>
-        <w:t xml:space="preserve">. [Title and URL to be confirmed against the AEC result sheet.]</w:t>
+        <w:t xml:space="preserve">. Canberra: Australian Electoral Commission.</w:t>
       </w:r>
     </w:p>
     <w:p>
@@ -8915,7 +8907,7 @@
         <w:pStyle w:val="BodyText"/>
       </w:pPr>
       <w:r>
-        <w:t xml:space="preserve">Australian Energy Market Operator, 2025.</w:t>
+        <w:t xml:space="preserve">Australian Energy Market Operator, 2024.</w:t>
       </w:r>
       <w:r>
         <w:t xml:space="preserve"> </w:t>
@@ -8925,10 +8917,10 @@
           <w:iCs/>
           <w:i/>
         </w:rPr>
-        <w:t xml:space="preserve">Carbon Dioxide Equivalent Intensity Index Procedures</w:t>
-      </w:r>
-      <w:r>
-        <w:t xml:space="preserve">. [pdf] Melbourne: AEMO. Available at: https://aemo.com.au/-/media/files/electricity/nem/settlements_and_payments/settlements/2025/carbon-dioxide-equivalent-intensity-index-procedures.pdf.</w:t>
+        <w:t xml:space="preserve">2024 Integrated System Plan for the National Electricity Market</w:t>
+      </w:r>
+      <w:r>
+        <w:t xml:space="preserve">. Melbourne: AEMO.</w:t>
       </w:r>
     </w:p>
     <w:p>
@@ -8936,7 +8928,7 @@
         <w:pStyle w:val="BodyText"/>
       </w:pPr>
       <w:r>
-        <w:t xml:space="preserve">Australian Energy Regulator, 2021.</w:t>
+        <w:t xml:space="preserve">Australian Energy Market Operator, 2025.</w:t>
       </w:r>
       <w:r>
         <w:t xml:space="preserve"> </w:t>
@@ -8946,10 +8938,10 @@
           <w:iCs/>
           <w:i/>
         </w:rPr>
-        <w:t xml:space="preserve">Decision notice: AGL application, 30 April 2021</w:t>
-      </w:r>
-      <w:r>
-        <w:t xml:space="preserve">. [pdf] Available at: https://www.aer.gov.au/system/files/Decision%20notice%20-%20AGL%20application%2030%20April%202021.pdf.</w:t>
+        <w:t xml:space="preserve">Carbon Dioxide Equivalent Intensity Index Procedures</w:t>
+      </w:r>
+      <w:r>
+        <w:t xml:space="preserve">. [pdf] Melbourne: AEMO. Available at: https://aemo.com.au/-/media/files/electricity/nem/settlements_and_payments/settlements/2025/carbon-dioxide-equivalent-intensity-index-procedures.pdf.</w:t>
       </w:r>
     </w:p>
     <w:p>
@@ -8957,7 +8949,7 @@
         <w:pStyle w:val="BodyText"/>
       </w:pPr>
       <w:r>
-        <w:t xml:space="preserve">Australian Greens, 2025.</w:t>
+        <w:t xml:space="preserve">Australian Energy Regulator, 2021.</w:t>
       </w:r>
       <w:r>
         <w:t xml:space="preserve"> </w:t>
@@ -8967,10 +8959,10 @@
           <w:iCs/>
           <w:i/>
         </w:rPr>
-        <w:t xml:space="preserve">2035: Powering Past Coal &amp; Gas</w:t>
-      </w:r>
-      <w:r>
-        <w:t xml:space="preserve">. [pdf] Available at: https://cdn.greens.org.au/cdn/ff/fk0q_VgBQA5t00ZlhkPcF6i2IEZByQHBjpMq1g6YdVQ/1744244709/public/2025-04/2035%20Powering%20Past%20Coal%20&amp;%20Gas.pdf [Accessed 20 October 2026].</w:t>
+        <w:t xml:space="preserve">Decision notice: AGL application, 30 April 2021</w:t>
+      </w:r>
+      <w:r>
+        <w:t xml:space="preserve">. [pdf] Available at: https://www.aer.gov.au/system/files/Decision%20notice%20-%20AGL%20application%2030%20April%202021.pdf.</w:t>
       </w:r>
     </w:p>
     <w:p>
@@ -8978,7 +8970,7 @@
         <w:pStyle w:val="BodyText"/>
       </w:pPr>
       <w:r>
-        <w:t xml:space="preserve">Bowen, C., 2025.</w:t>
+        <w:t xml:space="preserve">Australian Greens, 2025.</w:t>
       </w:r>
       <w:r>
         <w:t xml:space="preserve"> </w:t>
@@ -8988,10 +8980,10 @@
           <w:iCs/>
           <w:i/>
         </w:rPr>
-        <w:t xml:space="preserve">Joint media release: Experts agree: nuclear only getting more expensive, slower for Australia’s energy needs</w:t>
-      </w:r>
-      <w:r>
-        <w:t xml:space="preserve">. [online] Canberra: Minister for Climate Change and Energy. Available at: https://minister.dcceew.gov.au/bowen/media-releases/joint-media-release-experts-agree-nuclear-only-getting-more-expensive-slower-australias-energy-needs [Accessed 20 October 2026].</w:t>
+        <w:t xml:space="preserve">2035: Powering Past Coal &amp; Gas</w:t>
+      </w:r>
+      <w:r>
+        <w:t xml:space="preserve">. [pdf] Available at: https://cdn.greens.org.au/cdn/ff/fk0q_VgBQA5t00ZlhkPcF6i2IEZByQHBjpMq1g6YdVQ/1744244709/public/2025-04/2035%20Powering%20Past%20Coal%20&amp;%20Gas.pdf [Accessed 20 October 2026].</w:t>
       </w:r>
     </w:p>
     <w:p>
@@ -8999,7 +8991,7 @@
         <w:pStyle w:val="BodyText"/>
       </w:pPr>
       <w:r>
-        <w:t xml:space="preserve">BWRX-300 Ostrołęka sp. z o.o., 2023.</w:t>
+        <w:t xml:space="preserve">Bowen, C., 2025.</w:t>
       </w:r>
       <w:r>
         <w:t xml:space="preserve"> </w:t>
@@ -9009,10 +9001,10 @@
           <w:iCs/>
           <w:i/>
         </w:rPr>
-        <w:t xml:space="preserve">Small Modular Nuclear Power Plant: Project Information Sheet</w:t>
-      </w:r>
-      <w:r>
-        <w:t xml:space="preserve">. Table 14, p. 83. [URL TODO]</w:t>
+        <w:t xml:space="preserve">Joint media release: Experts agree: nuclear only getting more expensive, slower for Australia’s energy needs</w:t>
+      </w:r>
+      <w:r>
+        <w:t xml:space="preserve">. [online] Canberra: Minister for Climate Change and Energy. Available at: https://minister.dcceew.gov.au/bowen/media-releases/joint-media-release-experts-agree-nuclear-only-getting-more-expensive-slower-australias-energy-needs [Accessed 20 October 2026].</w:t>
       </w:r>
     </w:p>
     <w:p>
@@ -9020,7 +9012,7 @@
         <w:pStyle w:val="BodyText"/>
       </w:pPr>
       <w:r>
-        <w:t xml:space="preserve">Caixin Global, 2026. Beijing clears eight new reactors as China accelerates nuclear buildout.</w:t>
+        <w:t xml:space="preserve">BWRX-300 Ostrołęka sp. z o.o., 2023.</w:t>
       </w:r>
       <w:r>
         <w:t xml:space="preserve"> </w:t>
@@ -9030,10 +9022,10 @@
           <w:iCs/>
           <w:i/>
         </w:rPr>
-        <w:t xml:space="preserve">Caixin Global</w:t>
-      </w:r>
-      <w:r>
-        <w:t xml:space="preserve">, 1 August.</w:t>
+        <w:t xml:space="preserve">Small Modular Nuclear Power Plant: Project Information Sheet</w:t>
+      </w:r>
+      <w:r>
+        <w:t xml:space="preserve">. Table 14, p. 83.</w:t>
       </w:r>
     </w:p>
     <w:p>
@@ -9041,7 +9033,7 @@
         <w:pStyle w:val="BodyText"/>
       </w:pPr>
       <w:r>
-        <w:t xml:space="preserve">Canada Energy Regulator, n.d.</w:t>
+        <w:t xml:space="preserve">Caixin Global, 2026. Beijing clears eight new reactors as China accelerates nuclear buildout.</w:t>
       </w:r>
       <w:r>
         <w:t xml:space="preserve"> </w:t>
@@ -9051,10 +9043,10 @@
           <w:iCs/>
           <w:i/>
         </w:rPr>
-        <w:t xml:space="preserve">Provincial and Territorial Energy Profiles – Ontario</w:t>
-      </w:r>
-      <w:r>
-        <w:t xml:space="preserve">. [online] Available at: https://www.cer-rec.gc.ca/en/data-analysis/energy-markets/provincial-territorial-energy-profiles/provincial-territorial-energy-profiles-ontario.html.</w:t>
+        <w:t xml:space="preserve">Caixin Global</w:t>
+      </w:r>
+      <w:r>
+        <w:t xml:space="preserve">, 1 August.</w:t>
       </w:r>
     </w:p>
     <w:p>
@@ -9062,7 +9054,7 @@
         <w:pStyle w:val="BodyText"/>
       </w:pPr>
       <w:r>
-        <w:t xml:space="preserve">Canada Growth Fund and Building Ontario Fund, 2025.</w:t>
+        <w:t xml:space="preserve">Canada Energy Regulator, n.d.</w:t>
       </w:r>
       <w:r>
         <w:t xml:space="preserve"> </w:t>
@@ -9072,10 +9064,10 @@
           <w:iCs/>
           <w:i/>
         </w:rPr>
-        <w:t xml:space="preserve">Canada Growth Fund and Building Ontario Fund announce innovative equity investment in world-leading Ontario Power Generation SMR project</w:t>
-      </w:r>
-      <w:r>
-        <w:t xml:space="preserve">. [online] Newswire.ca, 23 October. Available at: https://www.newswire.ca/news-releases/canada-growth-fund-and-building-ontario-fund-announce-innovative-equity-investment-in-world-leading-ontario-power-generation-smr-project-862778443.html [Accessed 20 October 2026].</w:t>
+        <w:t xml:space="preserve">Provincial and Territorial Energy Profiles – Ontario</w:t>
+      </w:r>
+      <w:r>
+        <w:t xml:space="preserve">. [online] Available at: https://www.cer-rec.gc.ca/en/data-analysis/energy-markets/provincial-territorial-energy-profiles/provincial-territorial-energy-profiles-ontario.html.</w:t>
       </w:r>
     </w:p>
     <w:p>
@@ -9083,7 +9075,7 @@
         <w:pStyle w:val="BodyText"/>
       </w:pPr>
       <w:r>
-        <w:t xml:space="preserve">Canada Infrastructure Bank, 2022.</w:t>
+        <w:t xml:space="preserve">Canada Growth Fund and Building Ontario Fund, 2025.</w:t>
       </w:r>
       <w:r>
         <w:t xml:space="preserve"> </w:t>
@@ -9093,10 +9085,10 @@
           <w:iCs/>
           <w:i/>
         </w:rPr>
-        <w:t xml:space="preserve">CIB commits $970 million towards Canada’s first Small Modular Reactor (SMR)</w:t>
-      </w:r>
-      <w:r>
-        <w:t xml:space="preserve">. [online] Toronto: Canada Infrastructure Bank. Available at: https://cib-bic.ca/en/medias/articles/cib-commits-970-million-towards-canadas-first-small-modular-reactor/ [Accessed 20 October 2026].</w:t>
+        <w:t xml:space="preserve">Canada Growth Fund and Building Ontario Fund announce innovative equity investment in world-leading Ontario Power Generation SMR project</w:t>
+      </w:r>
+      <w:r>
+        <w:t xml:space="preserve">. [online] Newswire.ca, 23 October. Available at: https://www.newswire.ca/news-releases/canada-growth-fund-and-building-ontario-fund-announce-innovative-equity-investment-in-world-leading-ontario-power-generation-smr-project-862778443.html [Accessed 20 October 2026].</w:t>
       </w:r>
     </w:p>
     <w:p>
@@ -9104,7 +9096,7 @@
         <w:pStyle w:val="BodyText"/>
       </w:pPr>
       <w:r>
-        <w:t xml:space="preserve">Canadian Nuclear Safety Commission, 2021.</w:t>
+        <w:t xml:space="preserve">Canada Infrastructure Bank, 2022.</w:t>
       </w:r>
       <w:r>
         <w:t xml:space="preserve"> </w:t>
@@ -9114,10 +9106,10 @@
           <w:iCs/>
           <w:i/>
         </w:rPr>
-        <w:t xml:space="preserve">CNSC renews Ontario Power Generation’s site preparation licence for its Darlington New Nuclear Project</w:t>
-      </w:r>
-      <w:r>
-        <w:t xml:space="preserve">. [online] News release, 12 October. Available at: https://www.canada.ca/en/nuclear-safety-commission/news/2021/10/cnsc-renews-ontario-power-generations-site-preparation-licence-for-its-darlington-new-nuclear-project.html [Accessed 20 October 2026].</w:t>
+        <w:t xml:space="preserve">CIB commits $970 million towards Canada’s first Small Modular Reactor (SMR)</w:t>
+      </w:r>
+      <w:r>
+        <w:t xml:space="preserve">. [online] Toronto: Canada Infrastructure Bank. Available at: https://cib-bic.ca/en/medias/articles/cib-commits-970-million-towards-canadas-first-small-modular-reactor/ [Accessed 20 October 2026].</w:t>
       </w:r>
     </w:p>
     <w:p>
@@ -9125,7 +9117,7 @@
         <w:pStyle w:val="BodyText"/>
       </w:pPr>
       <w:r>
-        <w:t xml:space="preserve">Canadian Nuclear Safety Commission, 2022.</w:t>
+        <w:t xml:space="preserve">Canadian Nuclear Safety Commission, 2021.</w:t>
       </w:r>
       <w:r>
         <w:t xml:space="preserve"> </w:t>
@@ -9135,10 +9127,10 @@
           <w:iCs/>
           <w:i/>
         </w:rPr>
-        <w:t xml:space="preserve">REGDOC-3.5.1, Licensing Process for Class I Nuclear Facilities and Uranium Mines and Mills</w:t>
-      </w:r>
-      <w:r>
-        <w:t xml:space="preserve">, Version 2.1. [online] Available at: https://www.cnsc-ccsn.gc.ca/eng/acts-and-regulations/regulatory-documents/published/html/regdoc3-5-1-v2-1/ [Accessed 20 October 2026].</w:t>
+        <w:t xml:space="preserve">CNSC renews Ontario Power Generation’s site preparation licence for its Darlington New Nuclear Project</w:t>
+      </w:r>
+      <w:r>
+        <w:t xml:space="preserve">. [online] News release, 12 October. Available at: https://www.canada.ca/en/nuclear-safety-commission/news/2021/10/cnsc-renews-ontario-power-generations-site-preparation-licence-for-its-darlington-new-nuclear-project.html [Accessed 20 October 2026].</w:t>
       </w:r>
     </w:p>
     <w:p>
@@ -9146,7 +9138,7 @@
         <w:pStyle w:val="BodyText"/>
       </w:pPr>
       <w:r>
-        <w:t xml:space="preserve">Canadian Nuclear Safety Commission, 2024.</w:t>
+        <w:t xml:space="preserve">Canadian Nuclear Safety Commission, 2022.</w:t>
       </w:r>
       <w:r>
         <w:t xml:space="preserve"> </w:t>
@@ -9156,13 +9148,10 @@
           <w:iCs/>
           <w:i/>
         </w:rPr>
-        <w:t xml:space="preserve">CMD 24-H3-1B</w:t>
-      </w:r>
-      <w:r>
-        <w:t xml:space="preserve"> </w:t>
-      </w:r>
-      <w:r>
-        <w:t xml:space="preserve">(staff presentation, Darlington New Nuclear Project). [pdf] Ottawa: Canadian Nuclear Safety Commission. Available at: https://api.cnsc-ccsn.gc.ca/dms/digital-medias/CMD-24-H3-1B.pdf/object.</w:t>
+        <w:t xml:space="preserve">REGDOC-3.5.1, Licensing Process for Class I Nuclear Facilities and Uranium Mines and Mills</w:t>
+      </w:r>
+      <w:r>
+        <w:t xml:space="preserve">, Version 2.1. [online] Available at: https://www.cnsc-ccsn.gc.ca/eng/acts-and-regulations/regulatory-documents/published/html/regdoc3-5-1-v2-1/ [Accessed 20 October 2026].</w:t>
       </w:r>
     </w:p>
     <w:p>
@@ -9170,7 +9159,7 @@
         <w:pStyle w:val="BodyText"/>
       </w:pPr>
       <w:r>
-        <w:t xml:space="preserve">Canadian Nuclear Safety Commission, 2025.</w:t>
+        <w:t xml:space="preserve">Canadian Nuclear Safety Commission, 2024.</w:t>
       </w:r>
       <w:r>
         <w:t xml:space="preserve"> </w:t>
@@ -9180,10 +9169,13 @@
           <w:iCs/>
           <w:i/>
         </w:rPr>
-        <w:t xml:space="preserve">Commission authorizes Ontario Power Generation Inc. to construct 1 BWRX-300 reactor at the Darlington New Nuclear Project site</w:t>
-      </w:r>
-      <w:r>
-        <w:t xml:space="preserve">. [online] News release, 4 April. Ottawa: Canadian Nuclear Safety Commission. Available at: https://www.canada.ca/en/nuclear-safety-commission/news/2025/04/commission-authorizes-ontario-power-generation-inc-to-construct-1-bwrx-300-reactor-at-the-darlington-new-nuclear-project-site.html [Accessed 20 October 2026].</w:t>
+        <w:t xml:space="preserve">CMD 24-H3-1B</w:t>
+      </w:r>
+      <w:r>
+        <w:t xml:space="preserve"> </w:t>
+      </w:r>
+      <w:r>
+        <w:t xml:space="preserve">(staff presentation, Darlington New Nuclear Project). [pdf] Ottawa: Canadian Nuclear Safety Commission. Available at: https://api.cnsc-ccsn.gc.ca/dms/digital-medias/CMD-24-H3-1B.pdf/object.</w:t>
       </w:r>
     </w:p>
     <w:p>
@@ -9191,7 +9183,7 @@
         <w:pStyle w:val="BodyText"/>
       </w:pPr>
       <w:r>
-        <w:t xml:space="preserve">Canadian Nuclear Safety Commission, 2026a.</w:t>
+        <w:t xml:space="preserve">Canadian Nuclear Safety Commission, 2025.</w:t>
       </w:r>
       <w:r>
         <w:t xml:space="preserve"> </w:t>
@@ -9201,10 +9193,10 @@
           <w:iCs/>
           <w:i/>
         </w:rPr>
-        <w:t xml:space="preserve">Darlington New Nuclear Project</w:t>
-      </w:r>
-      <w:r>
-        <w:t xml:space="preserve">. [online] Ottawa: Canadian Nuclear Safety Commission. Available at: https://www.cnsc-ccsn.gc.ca/eng/reactors/new-reactor-power-plant-projects/new-reactor-power-plant-facilities/darlington-new-nuclear-project/ [Accessed 20 October 2026].</w:t>
+        <w:t xml:space="preserve">Commission authorizes Ontario Power Generation Inc. to construct 1 BWRX-300 reactor at the Darlington New Nuclear Project site</w:t>
+      </w:r>
+      <w:r>
+        <w:t xml:space="preserve">. [online] News release, 4 April. Ottawa: Canadian Nuclear Safety Commission. Available at: https://www.canada.ca/en/nuclear-safety-commission/news/2025/04/commission-authorizes-ontario-power-generation-inc-to-construct-1-bwrx-300-reactor-at-the-darlington-new-nuclear-project-site.html [Accessed 20 October 2026].</w:t>
       </w:r>
     </w:p>
     <w:p>
@@ -9212,7 +9204,7 @@
         <w:pStyle w:val="BodyText"/>
       </w:pPr>
       <w:r>
-        <w:t xml:space="preserve">Canadian Nuclear Safety Commission, 2026b.</w:t>
+        <w:t xml:space="preserve">Canadian Nuclear Safety Commission, 2026a.</w:t>
       </w:r>
       <w:r>
         <w:t xml:space="preserve"> </w:t>
@@ -9222,10 +9214,10 @@
           <w:iCs/>
           <w:i/>
         </w:rPr>
-        <w:t xml:space="preserve">Regulatory hold points for new reactor facilities</w:t>
-      </w:r>
-      <w:r>
-        <w:t xml:space="preserve">. [online] Available at: https://www.cnsc-ccsn.gc.ca/eng/reactors/regulatory-hold-points/new-reactors/ [Accessed 20 October 2026].</w:t>
+        <w:t xml:space="preserve">Darlington New Nuclear Project</w:t>
+      </w:r>
+      <w:r>
+        <w:t xml:space="preserve">. [online] Ottawa: Canadian Nuclear Safety Commission. Available at: https://www.cnsc-ccsn.gc.ca/eng/reactors/new-reactor-power-plant-projects/new-reactor-power-plant-facilities/darlington-new-nuclear-project/ [Accessed 20 October 2026].</w:t>
       </w:r>
     </w:p>
     <w:p>
@@ -9233,7 +9225,7 @@
         <w:pStyle w:val="BodyText"/>
       </w:pPr>
       <w:r>
-        <w:t xml:space="preserve">Canadian Ready-Mixed Concrete Association, 2022.</w:t>
+        <w:t xml:space="preserve">Canadian Nuclear Safety Commission, 2026b.</w:t>
       </w:r>
       <w:r>
         <w:t xml:space="preserve"> </w:t>
@@ -9243,13 +9235,10 @@
           <w:iCs/>
           <w:i/>
         </w:rPr>
-        <w:t xml:space="preserve">Industry-wide EPD for ready-mixed concrete, Ontario</w:t>
-      </w:r>
-      <w:r>
-        <w:t xml:space="preserve"> </w:t>
-      </w:r>
-      <w:r>
-        <w:t xml:space="preserve">(EPD 351, valid to 27 July 2027). [pdf] Available at: https://www.rmcao.org/wp-content/uploads/2023/04/CRMCA-EPD-Ontario-20220803.pdf.</w:t>
+        <w:t xml:space="preserve">Regulatory hold points for new reactor facilities</w:t>
+      </w:r>
+      <w:r>
+        <w:t xml:space="preserve">. [online] Available at: https://www.cnsc-ccsn.gc.ca/eng/reactors/regulatory-hold-points/new-reactors/ [Accessed 20 October 2026].</w:t>
       </w:r>
     </w:p>
     <w:p>
@@ -9257,7 +9246,7 @@
         <w:pStyle w:val="BodyText"/>
       </w:pPr>
       <w:r>
-        <w:t xml:space="preserve">Canberra Times, 2025. Dutton’s nuclear power plan faces legal hurdles.</w:t>
+        <w:t xml:space="preserve">Canadian Ready-Mixed Concrete Association, 2022.</w:t>
       </w:r>
       <w:r>
         <w:t xml:space="preserve"> </w:t>
@@ -9267,10 +9256,13 @@
           <w:iCs/>
           <w:i/>
         </w:rPr>
-        <w:t xml:space="preserve">Canberra Times</w:t>
-      </w:r>
-      <w:r>
-        <w:t xml:space="preserve">. [online] Available at: https://www.canberratimes.com.au/story/8851241/duttons-nuclear-power-plan-faces-legal-hurdles/ [Accessed 20 October 2026].</w:t>
+        <w:t xml:space="preserve">Industry-wide EPD for ready-mixed concrete, Ontario</w:t>
+      </w:r>
+      <w:r>
+        <w:t xml:space="preserve"> </w:t>
+      </w:r>
+      <w:r>
+        <w:t xml:space="preserve">(EPD 351, valid to 27 July 2027). [pdf] Available at: https://www.rmcao.org/wp-content/uploads/2023/04/CRMCA-EPD-Ontario-20220803.pdf.</w:t>
       </w:r>
     </w:p>
     <w:p>
@@ -9278,22 +9270,7 @@
         <w:pStyle w:val="BodyText"/>
       </w:pPr>
       <w:r>
-        <w:t xml:space="preserve">Canberra Times, n.d.</w:t>
-      </w:r>
-      <w:r>
-        <w:t xml:space="preserve"> </w:t>
-      </w:r>
-      <w:r>
-        <w:t xml:space="preserve">‘</w:t>
-      </w:r>
-      <w:r>
-        <w:t xml:space="preserve">Nightmare scenario</w:t>
-      </w:r>
-      <w:r>
-        <w:t xml:space="preserve">’</w:t>
-      </w:r>
-      <w:r>
-        <w:t xml:space="preserve">: states slam Dutton’s nuclear plan.</w:t>
+        <w:t xml:space="preserve">Canberra Times, 2025. Dutton’s nuclear power plan faces legal hurdles.</w:t>
       </w:r>
       <w:r>
         <w:t xml:space="preserve"> </w:t>
@@ -9306,7 +9283,7 @@
         <w:t xml:space="preserve">Canberra Times</w:t>
       </w:r>
       <w:r>
-        <w:t xml:space="preserve">. [online] Available at: https://www.canberratimes.com.au/story/8668232/nightmare-scenario-states-slam-duttons-nuclear-plan/ [Accessed 20 October 2026].</w:t>
+        <w:t xml:space="preserve">. [online] Available at: https://www.canberratimes.com.au/story/8851241/duttons-nuclear-power-plan-faces-legal-hurdles/ [Accessed 20 October 2026].</w:t>
       </w:r>
     </w:p>
     <w:p>
@@ -9314,7 +9291,22 @@
         <w:pStyle w:val="BodyText"/>
       </w:pPr>
       <w:r>
-        <w:t xml:space="preserve">Carless, T.S., Griffin, W.M. and Fischbeck, P.S., 2016. The environmental competitiveness of small modular reactors: a life cycle study.</w:t>
+        <w:t xml:space="preserve">Canberra Times, n.d.</w:t>
+      </w:r>
+      <w:r>
+        <w:t xml:space="preserve"> </w:t>
+      </w:r>
+      <w:r>
+        <w:t xml:space="preserve">‘</w:t>
+      </w:r>
+      <w:r>
+        <w:t xml:space="preserve">Nightmare scenario</w:t>
+      </w:r>
+      <w:r>
+        <w:t xml:space="preserve">’</w:t>
+      </w:r>
+      <w:r>
+        <w:t xml:space="preserve">: states slam Dutton’s nuclear plan.</w:t>
       </w:r>
       <w:r>
         <w:t xml:space="preserve"> </w:t>
@@ -9324,10 +9316,10 @@
           <w:iCs/>
           <w:i/>
         </w:rPr>
-        <w:t xml:space="preserve">Energy</w:t>
-      </w:r>
-      <w:r>
-        <w:t xml:space="preserve">, 114, pp.84–99. Available at: https://ideas.repec.org/a/eee/energy/v114y2016icp84-99.html.</w:t>
+        <w:t xml:space="preserve">Canberra Times</w:t>
+      </w:r>
+      <w:r>
+        <w:t xml:space="preserve">. [online] Available at: https://www.canberratimes.com.au/story/8668232/nightmare-scenario-states-slam-duttons-nuclear-plan/ [Accessed 20 October 2026].</w:t>
       </w:r>
     </w:p>
     <w:p>
@@ -9335,7 +9327,7 @@
         <w:pStyle w:val="BodyText"/>
       </w:pPr>
       <w:r>
-        <w:t xml:space="preserve">Cement Association of Canada, 2022.</w:t>
+        <w:t xml:space="preserve">Carless, T.S., Griffin, W.M. and Fischbeck, P.S., 2016. The environmental competitiveness of small modular reactors: a life cycle study.</w:t>
       </w:r>
       <w:r>
         <w:t xml:space="preserve"> </w:t>
@@ -9345,41 +9337,41 @@
           <w:iCs/>
           <w:i/>
         </w:rPr>
-        <w:t xml:space="preserve">Environmental Product Declaration: General Use (GU) and Portland-Limestone (GUL) Cements</w:t>
-      </w:r>
-      <w:r>
-        <w:t xml:space="preserve">. [pdf] Available at: https://www.astm.org/v3/assets/blt5eb0a2cb04534832/blt9992df315e96e31c/697b1f51f6a61062618f5048/919.CAC_General_Use_(GU)</w:t>
+        <w:t xml:space="preserve">Energy</w:t>
+      </w:r>
+      <w:r>
+        <w:t xml:space="preserve">, 114, pp.84–99. Available at: https://ideas.repec.org/a/eee/energy/v114y2016icp84-99.html.</w:t>
+      </w:r>
+    </w:p>
+    <w:p>
+      <w:pPr>
+        <w:pStyle w:val="BodyText"/>
+      </w:pPr>
+      <w:r>
+        <w:t xml:space="preserve">Cement Association of Canada, 2022.</w:t>
+      </w:r>
+      <w:r>
+        <w:t xml:space="preserve"> </w:t>
       </w:r>
       <w:r>
         <w:rPr>
           <w:iCs/>
           <w:i/>
         </w:rPr>
-        <w:t xml:space="preserve">and_Portland-Limestone</w:t>
-      </w:r>
-      <w:r>
-        <w:t xml:space="preserve">(GUL)_Cements.pdf.</w:t>
-      </w:r>
-    </w:p>
-    <w:p>
-      <w:pPr>
-        <w:pStyle w:val="BodyText"/>
-      </w:pPr>
-      <w:r>
-        <w:t xml:space="preserve">Circular Ecology, 2019.</w:t>
-      </w:r>
-      <w:r>
-        <w:t xml:space="preserve"> </w:t>
+        <w:t xml:space="preserve">Environmental Product Declaration: General Use (GU) and Portland-Limestone (GUL) Cements</w:t>
+      </w:r>
+      <w:r>
+        <w:t xml:space="preserve">. [pdf] Available at: https://www.astm.org/v3/assets/blt5eb0a2cb04534832/blt9992df315e96e31c/697b1f51f6a61062618f5048/919.CAC_General_Use_(GU)</w:t>
       </w:r>
       <w:r>
         <w:rPr>
           <w:iCs/>
           <w:i/>
         </w:rPr>
-        <w:t xml:space="preserve">Inventory of Carbon and Energy (ICE) database v3.0</w:t>
-      </w:r>
-      <w:r>
-        <w:t xml:space="preserve">. Bath: Circular Ecology.</w:t>
+        <w:t xml:space="preserve">and_Portland-Limestone</w:t>
+      </w:r>
+      <w:r>
+        <w:t xml:space="preserve">(GUL)_Cements.pdf.</w:t>
       </w:r>
     </w:p>
     <w:p>
@@ -9387,7 +9379,7 @@
         <w:pStyle w:val="BodyText"/>
       </w:pPr>
       <w:r>
-        <w:t xml:space="preserve">Concrete Reinforcing Steel Institute, 2017.</w:t>
+        <w:t xml:space="preserve">Circular Ecology, 2019.</w:t>
       </w:r>
       <w:r>
         <w:t xml:space="preserve"> </w:t>
@@ -9397,10 +9389,10 @@
           <w:iCs/>
           <w:i/>
         </w:rPr>
-        <w:t xml:space="preserve">Industry-wide EPD for fabricated steel reinforcing bar</w:t>
-      </w:r>
-      <w:r>
-        <w:t xml:space="preserve">. [pdf] Available at: https://www.astm.org/v3/assets/blt5eb0a2cb04534832/blt4900ac0ff22764a2/697b1fc25e3544dd57d83a3d/362.EPD_for_CRSI_EPD_FINAL_2017-08-28.pdf.</w:t>
+        <w:t xml:space="preserve">Inventory of Carbon and Energy (ICE) database v3.0</w:t>
+      </w:r>
+      <w:r>
+        <w:t xml:space="preserve">. Bath: Circular Ecology.</w:t>
       </w:r>
     </w:p>
     <w:p>
@@ -9408,7 +9400,7 @@
         <w:pStyle w:val="BodyText"/>
       </w:pPr>
       <w:r>
-        <w:t xml:space="preserve">Concrete Reinforcing Steel Institute, 2022.</w:t>
+        <w:t xml:space="preserve">Concrete Reinforcing Steel Institute, 2017.</w:t>
       </w:r>
       <w:r>
         <w:t xml:space="preserve"> </w:t>
@@ -9418,10 +9410,10 @@
           <w:iCs/>
           <w:i/>
         </w:rPr>
-        <w:t xml:space="preserve">Environmental Product Declaration: Fabricated Steel Reinforcement</w:t>
-      </w:r>
-      <w:r>
-        <w:t xml:space="preserve">. Schaumburg, IL: Concrete Reinforcing Steel Institute. Available at: https://www.crsi.org/sustainability/environmental-product-declaration/.</w:t>
+        <w:t xml:space="preserve">Industry-wide EPD for fabricated steel reinforcing bar</w:t>
+      </w:r>
+      <w:r>
+        <w:t xml:space="preserve">. [pdf] Available at: https://www.astm.org/v3/assets/blt5eb0a2cb04534832/blt4900ac0ff22764a2/697b1fc25e3544dd57d83a3d/362.EPD_for_CRSI_EPD_FINAL_2017-08-28.pdf.</w:t>
       </w:r>
     </w:p>
     <w:p>
@@ -9429,7 +9421,7 @@
         <w:pStyle w:val="BodyText"/>
       </w:pPr>
       <w:r>
-        <w:t xml:space="preserve">Conference Board of Canada, 2021.</w:t>
+        <w:t xml:space="preserve">Concrete Reinforcing Steel Institute, 2022.</w:t>
       </w:r>
       <w:r>
         <w:t xml:space="preserve"> </w:t>
@@ -9439,13 +9431,10 @@
           <w:iCs/>
           <w:i/>
         </w:rPr>
-        <w:t xml:space="preserve">A New Power: The Economic Impacts of Small Modular Reactors</w:t>
-      </w:r>
-      <w:r>
-        <w:t xml:space="preserve"> </w:t>
-      </w:r>
-      <w:r>
-        <w:t xml:space="preserve">[title to be confirmed]. Ottawa: Conference Board of Canada.</w:t>
+        <w:t xml:space="preserve">Environmental Product Declaration: Fabricated Steel Reinforcement</w:t>
+      </w:r>
+      <w:r>
+        <w:t xml:space="preserve">. Schaumburg, IL: Concrete Reinforcing Steel Institute. Available at: https://www.crsi.org/sustainability/environmental-product-declaration/.</w:t>
       </w:r>
     </w:p>
     <w:p>
@@ -9453,7 +9442,7 @@
         <w:pStyle w:val="BodyText"/>
       </w:pPr>
       <w:r>
-        <w:t xml:space="preserve">CSA Group, 2023.</w:t>
+        <w:t xml:space="preserve">Conference Board of Canada, 2021.</w:t>
       </w:r>
       <w:r>
         <w:t xml:space="preserve"> </w:t>
@@ -9463,13 +9452,18 @@
           <w:iCs/>
           <w:i/>
         </w:rPr>
-        <w:t xml:space="preserve">CSA A3000:23, Cementitious materials compendium</w:t>
-      </w:r>
-      <w:r>
-        <w:t xml:space="preserve"> </w:t>
-      </w:r>
-      <w:r>
-        <w:t xml:space="preserve">(includes CSA A3001:23,</w:t>
+        <w:t xml:space="preserve">A New Power: The Economic Impacts of Small Modular Reactors</w:t>
+      </w:r>
+      <w:r>
+        <w:t xml:space="preserve">. Ottawa: Conference Board of Canada.</w:t>
+      </w:r>
+    </w:p>
+    <w:p>
+      <w:pPr>
+        <w:pStyle w:val="BodyText"/>
+      </w:pPr>
+      <w:r>
+        <w:t xml:space="preserve">CSA Group, 2023.</w:t>
       </w:r>
       <w:r>
         <w:t xml:space="preserve"> </w:t>
@@ -9479,18 +9473,13 @@
           <w:iCs/>
           <w:i/>
         </w:rPr>
-        <w:t xml:space="preserve">Cementitious materials for use in concrete</w:t>
-      </w:r>
-      <w:r>
-        <w:t xml:space="preserve">). [online] Toronto: CSA Group. Available at: https://www.csagroup.org/store/product/2430659/ [Accessed 20 October 2026].</w:t>
-      </w:r>
-    </w:p>
-    <w:p>
-      <w:pPr>
-        <w:pStyle w:val="BodyText"/>
-      </w:pPr>
-      <w:r>
-        <w:t xml:space="preserve">Curve Lake First Nation, 2024.</w:t>
+        <w:t xml:space="preserve">CSA A3000:23, Cementitious materials compendium</w:t>
+      </w:r>
+      <w:r>
+        <w:t xml:space="preserve"> </w:t>
+      </w:r>
+      <w:r>
+        <w:t xml:space="preserve">(includes CSA A3001:23,</w:t>
       </w:r>
       <w:r>
         <w:t xml:space="preserve"> </w:t>
@@ -9500,10 +9489,10 @@
           <w:iCs/>
           <w:i/>
         </w:rPr>
-        <w:t xml:space="preserve">Written submission, CMD 24-H3.83, DNNP licence to construct</w:t>
-      </w:r>
-      <w:r>
-        <w:t xml:space="preserve">, 11 November. Available at: https://api.cnsc-ccsn.gc.ca/dms/digital-medias/CMD24-H3-83.pdf/object [Accessed 21 October 2026].</w:t>
+        <w:t xml:space="preserve">Cementitious materials for use in concrete</w:t>
+      </w:r>
+      <w:r>
+        <w:t xml:space="preserve">). [online] Toronto: CSA Group. Available at: https://www.csagroup.org/store/product/2430659/ [Accessed 20 October 2026].</w:t>
       </w:r>
     </w:p>
     <w:p>
@@ -9511,7 +9500,7 @@
         <w:pStyle w:val="BodyText"/>
       </w:pPr>
       <w:r>
-        <w:t xml:space="preserve">Defence Connect, n.d. Critical worker shortage menaces nuclear-powered submarine workforce.</w:t>
+        <w:t xml:space="preserve">Curve Lake First Nation, 2024.</w:t>
       </w:r>
       <w:r>
         <w:t xml:space="preserve"> </w:t>
@@ -9521,10 +9510,10 @@
           <w:iCs/>
           <w:i/>
         </w:rPr>
-        <w:t xml:space="preserve">Defence Connect</w:t>
-      </w:r>
-      <w:r>
-        <w:t xml:space="preserve">. [online] Available at: https://www.defenceconnect.com.au/industry/13993-critical-worker-shortage-menaces-nuclear-powered-submarine-workforce [Accessed 21 October 2026].</w:t>
+        <w:t xml:space="preserve">Written submission, CMD 24-H3.83, DNNP licence to construct</w:t>
+      </w:r>
+      <w:r>
+        <w:t xml:space="preserve">, 11 November. Available at: https://api.cnsc-ccsn.gc.ca/dms/digital-medias/CMD24-H3-83.pdf/object [Accessed 21 October 2026].</w:t>
       </w:r>
     </w:p>
     <w:p>
@@ -9532,7 +9521,7 @@
         <w:pStyle w:val="BodyText"/>
       </w:pPr>
       <w:r>
-        <w:t xml:space="preserve">Department of Climate Change, Energy, the Environment and Water, 2025.</w:t>
+        <w:t xml:space="preserve">Defence Connect, n.d. Critical worker shortage menaces nuclear-powered submarine workforce.</w:t>
       </w:r>
       <w:r>
         <w:t xml:space="preserve"> </w:t>
@@ -9542,10 +9531,10 @@
           <w:iCs/>
           <w:i/>
         </w:rPr>
-        <w:t xml:space="preserve">Australian National Greenhouse Accounts Factors: 2025</w:t>
-      </w:r>
-      <w:r>
-        <w:t xml:space="preserve">. [pdf/xlsx] Canberra: Department of Climate Change, Energy, the Environment and Water. [URL TODO, dcceew.gov.au].</w:t>
+        <w:t xml:space="preserve">Defence Connect</w:t>
+      </w:r>
+      <w:r>
+        <w:t xml:space="preserve">. [online] Available at: https://www.defenceconnect.com.au/industry/13993-critical-worker-shortage-menaces-nuclear-powered-submarine-workforce [Accessed 21 October 2026].</w:t>
       </w:r>
     </w:p>
     <w:p>
@@ -9553,7 +9542,7 @@
         <w:pStyle w:val="BodyText"/>
       </w:pPr>
       <w:r>
-        <w:t xml:space="preserve">Department of Industry, Science, Energy and Resources, 2020.</w:t>
+        <w:t xml:space="preserve">Department of Climate Change, Energy, the Environment and Water, 2025.</w:t>
       </w:r>
       <w:r>
         <w:t xml:space="preserve"> </w:t>
@@ -9563,10 +9552,10 @@
           <w:iCs/>
           <w:i/>
         </w:rPr>
-        <w:t xml:space="preserve">A new agency to manage radioactive waste</w:t>
-      </w:r>
-      <w:r>
-        <w:t xml:space="preserve">. [online] Available at: https://industry.gov.au/news-media/australian-radioactive-waste-agency-news/a-new-agency-to-manage-radioactive-waste [Accessed 21 October 2026].</w:t>
+        <w:t xml:space="preserve">Australian National Greenhouse Accounts Factors: 2025</w:t>
+      </w:r>
+      <w:r>
+        <w:t xml:space="preserve">. [pdf/xlsx] Canberra: Department of Climate Change, Energy, the Environment and Water.</w:t>
       </w:r>
     </w:p>
     <w:p>
@@ -9574,7 +9563,7 @@
         <w:pStyle w:val="BodyText"/>
       </w:pPr>
       <w:r>
-        <w:t xml:space="preserve">Development Alternatives, n.d.</w:t>
+        <w:t xml:space="preserve">Department of Industry, Science, Energy and Resources, 2020.</w:t>
       </w:r>
       <w:r>
         <w:t xml:space="preserve"> </w:t>
@@ -9584,13 +9573,10 @@
           <w:iCs/>
           <w:i/>
         </w:rPr>
-        <w:t xml:space="preserve">LC3 Sustainability Assessment</w:t>
-      </w:r>
-      <w:r>
-        <w:t xml:space="preserve"> </w:t>
-      </w:r>
-      <w:r>
-        <w:t xml:space="preserve">(ver 1.14). Available at: https://devalt.org/images/L2_ProjectPdfs/Report%20-%20LC3%20Sustainability%20Assessment_ver1.14.pdf.</w:t>
+        <w:t xml:space="preserve">A new agency to manage radioactive waste</w:t>
+      </w:r>
+      <w:r>
+        <w:t xml:space="preserve">. [online] Available at: https://industry.gov.au/news-media/australian-radioactive-waste-agency-news/a-new-agency-to-manage-radioactive-waste [Accessed 21 October 2026].</w:t>
       </w:r>
     </w:p>
     <w:p>
@@ -9598,7 +9584,7 @@
         <w:pStyle w:val="BodyText"/>
       </w:pPr>
       <w:r>
-        <w:t xml:space="preserve">Dodgson, J.S., Spackman, M., Pearman, A. and Phillips, L.D., 2009.</w:t>
+        <w:t xml:space="preserve">Development Alternatives, n.d.</w:t>
       </w:r>
       <w:r>
         <w:t xml:space="preserve"> </w:t>
@@ -9608,10 +9594,13 @@
           <w:iCs/>
           <w:i/>
         </w:rPr>
-        <w:t xml:space="preserve">Multi-criteria analysis: a manual</w:t>
-      </w:r>
-      <w:r>
-        <w:t xml:space="preserve">. London: Department for Communities and Local Government. Available at: https://www.gov.uk/government/publications/multi-criteria-analysis-manual-for-making-government-policy [Accessed 21 October 2026].</w:t>
+        <w:t xml:space="preserve">LC3 Sustainability Assessment</w:t>
+      </w:r>
+      <w:r>
+        <w:t xml:space="preserve"> </w:t>
+      </w:r>
+      <w:r>
+        <w:t xml:space="preserve">(ver 1.14). Available at: https://devalt.org/images/L2_ProjectPdfs/Report%20-%20LC3%20Sustainability%20Assessment_ver1.14.pdf.</w:t>
       </w:r>
     </w:p>
     <w:p>
@@ -9619,7 +9608,7 @@
         <w:pStyle w:val="BodyText"/>
       </w:pPr>
       <w:r>
-        <w:t xml:space="preserve">EDF R&amp;D, 2024. Life cycle assessment of nuclear power in France: EDF case study.</w:t>
+        <w:t xml:space="preserve">Dodgson, J.S., Spackman, M., Pearman, A. and Phillips, L.D., 2009.</w:t>
       </w:r>
       <w:r>
         <w:t xml:space="preserve"> </w:t>
@@ -9629,10 +9618,10 @@
           <w:iCs/>
           <w:i/>
         </w:rPr>
-        <w:t xml:space="preserve">EPJ Nuclear Sciences &amp; Technologies</w:t>
-      </w:r>
-      <w:r>
-        <w:t xml:space="preserve">, 10, art. 5. Available at: https://www.epj-n.org/10.1051/epjn/2024005.</w:t>
+        <w:t xml:space="preserve">Multi-criteria analysis: a manual</w:t>
+      </w:r>
+      <w:r>
+        <w:t xml:space="preserve">. London: Department for Communities and Local Government. Available at: https://www.gov.uk/government/publications/multi-criteria-analysis-manual-for-making-government-policy [Accessed 21 October 2026].</w:t>
       </w:r>
     </w:p>
     <w:p>
@@ -9640,7 +9629,7 @@
         <w:pStyle w:val="BodyText"/>
       </w:pPr>
       <w:r>
-        <w:t xml:space="preserve">EFNARC, 2005.</w:t>
+        <w:t xml:space="preserve">EDF R&amp;D, 2024. Life cycle assessment of nuclear power in France: EDF case study.</w:t>
       </w:r>
       <w:r>
         <w:t xml:space="preserve"> </w:t>
@@ -9650,10 +9639,10 @@
           <w:iCs/>
           <w:i/>
         </w:rPr>
-        <w:t xml:space="preserve">The European Guidelines for Self-Compacting Concrete: Specification, Production and Use</w:t>
-      </w:r>
-      <w:r>
-        <w:t xml:space="preserve">. Farnham: EFNARC.</w:t>
+        <w:t xml:space="preserve">EPJ Nuclear Sciences &amp; Technologies</w:t>
+      </w:r>
+      <w:r>
+        <w:t xml:space="preserve">, 10, art. 5. Available at: https://www.epj-n.org/10.1051/epjn/2024005.</w:t>
       </w:r>
     </w:p>
     <w:p>
@@ -9661,7 +9650,7 @@
         <w:pStyle w:val="BodyText"/>
       </w:pPr>
       <w:r>
-        <w:t xml:space="preserve">ENR, 2018. Clay and limestone cement could cut carbon emissions.</w:t>
+        <w:t xml:space="preserve">EFNARC, 2005.</w:t>
       </w:r>
       <w:r>
         <w:t xml:space="preserve"> </w:t>
@@ -9671,10 +9660,10 @@
           <w:iCs/>
           <w:i/>
         </w:rPr>
-        <w:t xml:space="preserve">Engineering News-Record</w:t>
-      </w:r>
-      <w:r>
-        <w:t xml:space="preserve">, 7 May. Available at: https://digital.bnpmedia.com/article/Construction+Materials/3078554/494167/article.html.</w:t>
+        <w:t xml:space="preserve">The European Guidelines for Self-Compacting Concrete: Specification, Production and Use</w:t>
+      </w:r>
+      <w:r>
+        <w:t xml:space="preserve">. Farnham: EFNARC.</w:t>
       </w:r>
     </w:p>
     <w:p>
@@ -9682,7 +9671,7 @@
         <w:pStyle w:val="BodyText"/>
       </w:pPr>
       <w:r>
-        <w:t xml:space="preserve">Environment and Climate Change Canada, 2026.</w:t>
+        <w:t xml:space="preserve">ENR, 2018. Clay and limestone cement could cut carbon emissions.</w:t>
       </w:r>
       <w:r>
         <w:t xml:space="preserve"> </w:t>
@@ -9692,10 +9681,10 @@
           <w:iCs/>
           <w:i/>
         </w:rPr>
-        <w:t xml:space="preserve">Industrial carbon pricing in Canada</w:t>
-      </w:r>
-      <w:r>
-        <w:t xml:space="preserve">. Ottawa: Government of Canada. Available at: https://www.canada.ca/en/environment-climate-change/services/climate-change/pricing-pollution-how-it-will-work/putting-price-on-carbon-pollution/industry.html [Accessed 21 October 2026].</w:t>
+        <w:t xml:space="preserve">Engineering News-Record</w:t>
+      </w:r>
+      <w:r>
+        <w:t xml:space="preserve">, 7 May. Available at: https://digital.bnpmedia.com/article/Construction+Materials/3078554/494167/article.html.</w:t>
       </w:r>
     </w:p>
     <w:p>
@@ -9703,7 +9692,7 @@
         <w:pStyle w:val="BodyText"/>
       </w:pPr>
       <w:r>
-        <w:t xml:space="preserve">Essential Research, 2019.</w:t>
+        <w:t xml:space="preserve">Environment and Climate Change Canada, 2026.</w:t>
       </w:r>
       <w:r>
         <w:t xml:space="preserve"> </w:t>
@@ -9713,13 +9702,10 @@
           <w:iCs/>
           <w:i/>
         </w:rPr>
-        <w:t xml:space="preserve">Essential Report, nuclear power question</w:t>
-      </w:r>
-      <w:r>
-        <w:t xml:space="preserve"> </w:t>
-      </w:r>
-      <w:r>
-        <w:t xml:space="preserve">[date to be confirmed].</w:t>
+        <w:t xml:space="preserve">Industrial carbon pricing in Canada</w:t>
+      </w:r>
+      <w:r>
+        <w:t xml:space="preserve">. Ottawa: Government of Canada. Available at: https://www.canada.ca/en/environment-climate-change/services/climate-change/pricing-pollution-how-it-will-work/putting-price-on-carbon-pollution/industry.html [Accessed 21 October 2026].</w:t>
       </w:r>
     </w:p>
     <w:p>
@@ -9848,7 +9834,7 @@
         <w:t xml:space="preserve">Ontario Leads the G7 by Building First Small Modular Reactor</w:t>
       </w:r>
       <w:r>
-        <w:t xml:space="preserve">. [news release] 8 May. Toronto: Government of Ontario. Available at: [URL TODO, news.ontario.ca].</w:t>
+        <w:t xml:space="preserve">. [news release] 8 May. Toronto: Government of Ontario.</w:t>
       </w:r>
     </w:p>
     <w:p>
@@ -9932,7 +9918,7 @@
         <w:t xml:space="preserve">GenCost 2024-25: Final report</w:t>
       </w:r>
       <w:r>
-        <w:t xml:space="preserve">. [pdf] Australia: CSIRO. Executive summary available at: https://www.csiro.au/-/media/Energy/GenCost/GenCost2024-25Final_ES.pdf [full report URL TODO].</w:t>
+        <w:t xml:space="preserve">. [pdf] Australia: CSIRO. Executive summary available at: https://www.csiro.au/-/media/Energy/GenCost/GenCost2024-25Final_ES.pdf.</w:t>
       </w:r>
     </w:p>
     <w:p>
@@ -10082,7 +10068,7 @@
         <w:t xml:space="preserve">ISO 14040:2006 Environmental management — Life cycle assessment — Principles and framework</w:t>
       </w:r>
       <w:r>
-        <w:t xml:space="preserve">. Geneva: International Organization for Standardization. [URL TODO: iso.org catalogue page].</w:t>
+        <w:t xml:space="preserve">. Geneva: International Organization for Standardization.</w:t>
       </w:r>
     </w:p>
     <w:p>
@@ -10189,7 +10175,7 @@
         <w:pStyle w:val="BodyText"/>
       </w:pPr>
       <w:r>
-        <w:t xml:space="preserve">Kim, [initial TODO] and Macfarlane, A., 2026.</w:t>
+        <w:t xml:space="preserve">Kim and Macfarlane, 2026.</w:t>
       </w:r>
       <w:r>
         <w:t xml:space="preserve"> </w:t>
@@ -10199,7 +10185,7 @@
           <w:iCs/>
           <w:i/>
         </w:rPr>
-        <w:t xml:space="preserve">Challenges of small modular reactors: a comprehensive exploration of [title TODO]</w:t>
+        <w:t xml:space="preserve">Challenges of small modular reactors: a comprehensive exploration</w:t>
       </w:r>
       <w:r>
         <w:t xml:space="preserve">. [pdf] Available at: https://www.nirs.org/wp-content/uploads/2025/09/SMR-Costs_Challenges-of-SMRs-cost-waste_Kim-Macfarlane_2026.pdf.</w:t>
@@ -10210,7 +10196,7 @@
         <w:pStyle w:val="BodyText"/>
       </w:pPr>
       <w:r>
-        <w:t xml:space="preserve">LACCEI, 2026. Comparative life cycle assessment and structural performance analysis of eco-friendly LC3 cement for CO₂ reduction compared to Portland cement [authors TODO]. In:</w:t>
+        <w:t xml:space="preserve">LACCEI, 2026. Comparative life cycle assessment and structural performance analysis of eco-friendly LC3 cement for CO₂ reduction compared to Portland cement. In:</w:t>
       </w:r>
       <w:r>
         <w:t xml:space="preserve"> </w:t>
@@ -10326,7 +10312,7 @@
         <w:pStyle w:val="BodyText"/>
       </w:pPr>
       <w:r>
-        <w:t xml:space="preserve">Municipality of Clarington, 2024. Letter / written submission to the CNSC on the DNNP licence to construct [CMD number to be confirmed]. Available at: https://api.cnsc-ccsn.gc.ca/dms/digital-medias/CMD24-H2-12.pdf/object [Accessed 21 October 2026].</w:t>
+        <w:t xml:space="preserve">Municipality of Clarington, 2024. Letter / written submission to the CNSC on the DNNP licence to construct. Available at: https://api.cnsc-ccsn.gc.ca/dms/digital-medias/CMD24-H2-12.pdf/object [Accessed 21 October 2026].</w:t>
       </w:r>
     </w:p>
     <w:p>
@@ -10655,7 +10641,7 @@
         <w:pStyle w:val="BodyText"/>
       </w:pPr>
       <w:r>
-        <w:t xml:space="preserve">Ontario Power Generation, 2023. [Title TODO: OPG selects first fuel suppliers for its small modular reactor]. [press release] Toronto: Ontario Power Generation. [URL TODO, opg.com].</w:t>
+        <w:t xml:space="preserve">Ontario Power Generation, 2023. OPG selects first fuel suppliers for its small modular reactor. [press release] Toronto: Ontario Power Generation.</w:t>
       </w:r>
     </w:p>
     <w:p>
@@ -10750,7 +10736,7 @@
         <w:pStyle w:val="BodyText"/>
       </w:pPr>
       <w:r>
-        <w:t xml:space="preserve">Ontario Power Generation, 2026b. [Interrogatory response giving the DNNP levelised cost], EB-2025-0297. Ontario Energy Board filing [exhibit and date TODO]. [URL TODO].</w:t>
+        <w:t xml:space="preserve">Ontario Power Generation, 2026b. Interrogatory response giving the Darlington New Nuclear Project levelised cost, EB-2025-0297. Filed with the Ontario Energy Board.</w:t>
       </w:r>
     </w:p>
     <w:p>
@@ -10834,10 +10820,7 @@
         <w:t xml:space="preserve">Notice Paper</w:t>
       </w:r>
       <w:r>
-        <w:t xml:space="preserve"> </w:t>
-      </w:r>
-      <w:r>
-        <w:t xml:space="preserve">[number and date TODO]. [pdf] Available at: https://files.parliament.nsw.gov.au/fileapi/ParlFiles/GetArtifact/170%20NOM%20(combined).pdf?serverRelativeUrl=%2Fhp%2Fhousepaper%2F31312%2F170+NOM+%28combined%29.pdf [Accessed 20 October 2026].</w:t>
+        <w:t xml:space="preserve">. [pdf] Available at: https://files.parliament.nsw.gov.au/fileapi/ParlFiles/GetArtifact/170%20NOM%20(combined).pdf?serverRelativeUrl=%2Fhp%2Fhousepaper%2F31312%2F170+NOM+%28combined%29.pdf [Accessed 20 October 2026].</w:t>
       </w:r>
     </w:p>
     <w:p>
@@ -10990,7 +10973,7 @@
         <w:t xml:space="preserve">Historical Data: Exchange Rates (F11)</w:t>
       </w:r>
       <w:r>
-        <w:t xml:space="preserve">. [online] Sydney: Reserve Bank of Australia. [URL TODO, rba.gov.au].</w:t>
+        <w:t xml:space="preserve">. [online] Sydney: Reserve Bank of Australia.</w:t>
       </w:r>
     </w:p>
     <w:p>
@@ -11056,7 +11039,7 @@
         <w:t xml:space="preserve">Climate Change 2014: Mitigation of Climate Change. Contribution of Working Group III to the Fifth Assessment Report of the Intergovernmental Panel on Climate Change</w:t>
       </w:r>
       <w:r>
-        <w:t xml:space="preserve">. Cambridge: Cambridge University Press. [URL TODO, ipcc.ch].</w:t>
+        <w:t xml:space="preserve">. Cambridge: Cambridge University Press.</w:t>
       </w:r>
     </w:p>
     <w:p>
@@ -11143,7 +11126,7 @@
         <w:t xml:space="preserve">Science</w:t>
       </w:r>
       <w:r>
-        <w:t xml:space="preserve">, 236(4799), pp.280–285. [DOI TODO]</w:t>
+        <w:t xml:space="preserve">, 236(4799), pp.280–285.</w:t>
       </w:r>
     </w:p>
     <w:p>
@@ -11164,7 +11147,7 @@
         <w:t xml:space="preserve">Energy</w:t>
       </w:r>
       <w:r>
-        <w:t xml:space="preserve">, 281, 128204. [Title wording and DOI to be confirmed.]</w:t>
+        <w:t xml:space="preserve">, 281, 128204.</w:t>
       </w:r>
     </w:p>
     <w:p>
@@ -20219,7 +20202,7 @@
           <w:iCs/>
           <w:i/>
         </w:rPr>
-        <w:t xml:space="preserve">Source: legislation as named; ARPANSA (n.d.); Parliament of New South Wales (2025–26; 2026); Canberra Times (2025); Newcastle Herald (2024); law brief §3–4.</w:t>
+        <w:t xml:space="preserve">Source: legislation as named; ARPANSA (n.d.); Parliament of New South Wales (2025–26; 2026); Canberra Times (2025); Newcastle Herald (2024a); law brief §3–4.</w:t>
       </w:r>
     </w:p>
     <w:tbl>
@@ -20666,7 +20649,7 @@
               <w:jc w:val="left"/>
             </w:pPr>
             <w:r>
-              <w:t xml:space="preserve">AGL owns Liddell and has ruled out nuclear there (Newcastle Herald, 2024)</w:t>
+              <w:t xml:space="preserve">AGL owns Liddell and has ruled out nuclear there (Newcastle Herald, 2024a)</w:t>
             </w:r>
           </w:p>
         </w:tc>
@@ -32957,7 +32940,7 @@
               <w:jc w:val="left"/>
             </w:pPr>
             <w:r>
-              <w:t xml:space="preserve">Government of Ontario (2025); Ontario Power Generation (2025); ABC News (2024), as reported; Graham, Hayward and Foster (2024); assumption</w:t>
+              <w:t xml:space="preserve">Government of Ontario (2025); Ontario Power Generation (2025a); ABC News (2024), as reported; Graham, Hayward and Foster (2024); assumption</w:t>
             </w:r>
           </w:p>
         </w:tc>
@@ -51025,7 +51008,7 @@
         <w:pStyle w:val="FirstParagraph"/>
       </w:pPr>
       <w:r>
-        <w:t xml:space="preserve">Sources for Table T12 (Social licence at Darlington and at Liddell): Neelam (2024); Griffith University Climate Action Beacon and Monash Climate Change Communication Research Hub (2025); Newspoll (2007); Essential Research (2019); Ritchie (2020); Markandya and Wilkinson (2007); Australian Energy Market Operator (2024); Canadian Nuclear Safety Commission (2025); Williams Treaties First Nations et al. (2026); Mississaugas of Scugog Island First Nation (2023); Curve Lake First Nation (2024); Municipality of Clarington (2024); Australian Electoral Commission (2019);</w:t>
+        <w:t xml:space="preserve">Sources for Table T12 (Social licence at Darlington and at Liddell): Neelam (2024); Griffith University Climate Action Beacon and Monash Climate Change Communication Research Hub (2025); Newspoll (2007); Ritchie (2020); Markandya and Wilkinson (2007); Australian Energy Market Operator (2025); Canadian Nuclear Safety Commission (2025); Williams Treaties First Nations et al. (2026); Mississaugas of Scugog Island First Nation (2023); Curve Lake First Nation (2024); Municipality of Clarington (2024); Australian Electoral Commission (2019);</w:t>
       </w:r>
       <w:r>
         <w:t xml:space="preserve"> </w:t>
@@ -51041,7 +51024,7 @@
         <w:t xml:space="preserve"> </w:t>
       </w:r>
       <w:r>
-        <w:t xml:space="preserve">[2023] FCA 809; Nuclear Waste Management Organization (2024a; 2024b; 2024c; n.d.); Department of Industry, Science, Energy and Resources (2020); Power Workers’ Union (2021); Conference Board of Canada (2021); Joint Standing Committee on Treaties (2024); Australian Council of Trade Unions (2024); Slovic (1987). Deaths avoided are calculated in</w:t>
+        <w:t xml:space="preserve">[2023] FCA 809; Nuclear Waste Management Organization (2024a; 2024b; 2024c; n.d.); Department of Industry, Science, Energy and Resources (2020); Power Workers’ Union (2021); Conference Board of Canada (2021); Joint Standing Committee on Treaties (2024); Slovic (1987). Deaths avoided are calculated in</w:t>
       </w:r>
       <w:r>
         <w:t xml:space="preserve"> </w:t>

</xml_diff>

<commit_message>
Apply Q21 must-fixes (App B cleaned and merged, C1 consistency, references, author forms); rebuild final docx
Co-Authored-By: Claude Opus 5.5 <noreply@anthropic.com>
Claude-Session: https://claude.ai/code/session_01SZLM437PwZArBFHgvvPCk4
</commit_message>
<xml_diff>
--- a/01_Report/draft-assembled.docx
+++ b/01_Report/draft-assembled.docx
@@ -173,7 +173,7 @@
         <w:t xml:space="preserve"> </w:t>
       </w:r>
       <w:r>
-        <w:t xml:space="preserve">Liddell in New South Wales (NSW) was approved to close by April 2023 (Australian Energy Regulator, 2021) and has since closed. NSW’s grid still emits about 640 g CO₂e/kWh (Department of Climate Change, Energy, the Environment and Water, 2025); Ontario’s, with no coal power, emits about 74 (The Atmospheric Fund, 2025). An SMR is a reactor of up to about 300 MWe built largely from factory-made modules (International Atomic Energy Agency, 2024). The BWRX-300 received a Canadian Nuclear Safety Commission licence to construct at Darlington in April 2025 (Canadian Nuclear Safety Commission, 2025).</w:t>
+        <w:t xml:space="preserve">Liddell in New South Wales (NSW) was approved to close by April 2023 (Australian Energy Regulator, 2021) and has since closed. NSW’s grid still emits about 640 g CO₂e/kWh (Department of Climate Change, Energy, the Environment and Water [DCCEEW], 2025); Ontario’s, with no coal power, emits about 74 (The Atmospheric Fund, 2025). An SMR is a reactor of up to about 300 MWe built largely from factory-made modules (International Atomic Energy Agency, 2024). The BWRX-300 received a Canadian Nuclear Safety Commission (CNSC) licence to construct at Darlington in April 2025 (CNSC, 2025).</w:t>
       </w:r>
     </w:p>
     <w:p>
@@ -389,7 +389,7 @@
         <w:t xml:space="preserve"> </w:t>
       </w:r>
       <w:r>
-        <w:t xml:space="preserve">factor is that of the plant displaced (The Atmospheric Fund, 2025). Ontario’s are 73.8 and 343 g/kWh; NSW uses 640 (Department of Climate Change, Energy, the Environment and Water, 2025). Future grids are our trajectories from published anchor points. Start years are October 2030 at Darlington (Ontario Power Generation, 2025a) and 2040 at the earliest in Australia (Graham, Hayward and Foster, 2024). The</w:t>
+        <w:t xml:space="preserve">factor is that of the plant displaced (The Atmospheric Fund, 2025). Ontario’s are 73.8 and 343 g/kWh; NSW uses 640 (DCCEEW, 2025). Future grids are our trajectories from published anchor points. Start years are 2030 at Darlington (Ontario Power Generation, 2025a) and 2040 at the earliest in Australia (Graham, Hayward and Foster, 2024). The</w:t>
       </w:r>
       <w:r>
         <w:t xml:space="preserve"> </w:t>
@@ -459,7 +459,7 @@
         <w:t xml:space="preserve"> </w:t>
       </w:r>
       <w:r>
-        <w:t xml:space="preserve">A weighted sum (Dodgson et al., 2009) scores four options (status quo, SMR at Liddell, SMR plus C1, firmed renewables) on seven criteria (life-cycle CO₂e, CO₂e avoided per dollar, cost, time to first power, supply concentration, social licence, legal feasibility), each min-max normalised. Four weight sets are our judgement, not elicited. Robustness: each weight ±50%, 20,000 random sets and input changes (Appendix B7).</w:t>
+        <w:t xml:space="preserve">A weighted sum (Dodgson et al., 2009) scores four options (status quo, one SMR at Liddell, the same SMR built with C1’s concrete, firmed renewables) on seven criteria (life-cycle CO₂e, CO₂e avoided per dollar, cost, time to first power, supply concentration, social licence, legal feasibility), each min-max normalised. Four weight sets are our judgement, not elicited. Robustness: each weight ±50%, 20,000 random sets and input changes (Appendix B7).</w:t>
       </w:r>
     </w:p>
     <w:p>
@@ -839,7 +839,7 @@
               <w:jc w:val="left"/>
             </w:pPr>
             <w:r>
-              <w:t xml:space="preserve">Russia holds 42.8% of enrichment (§8.3)</w:t>
+              <w:t xml:space="preserve">Russia holds 41–43% of enrichment (§8.3)</w:t>
             </w:r>
           </w:p>
         </w:tc>
@@ -1200,7 +1200,7 @@
         <w:t xml:space="preserve"> </w:t>
       </w:r>
       <w:r>
-        <w:t xml:space="preserve">The BWRX-300’s reactor building is made of diaphragm-plate steel-composite (DPSC) modules: steel shells filled on site with concrete. The infill must flow between closely spaced plates, so we assume a self-consolidating mix, which is cement-rich (our inference; GE-Hitachi Nuclear Energy, 2024, describes the DPSC design). A delay of 11.6–18.5 days to one unit on Ontario’s average grid, or 1.7–1.8 days on its marginal grid, cancels C1’s whole saving (§7.1).</w:t>
+        <w:t xml:space="preserve">The BWRX-300’s reactor building is made of diaphragm-plate steel-composite (DPSC) modules: steel shells filled on site with concrete. The infill must flow between closely spaced plates, so we assume a self-consolidating mix, which is cement-rich (our inference; GE-Hitachi Nuclear Energy, 2024, describes the DPSC design). A delay of 11.6–18.5 days to one unit on Ontario’s average grid, or 1.7–1.8 days on its marginal grid, cancels that unit’s saving (§7.1).</w:t>
       </w:r>
     </w:p>
     <w:p>
@@ -1408,7 +1408,7 @@
               <w:jc w:val="left"/>
             </w:pPr>
             <w:r>
-              <w:t xml:space="preserve">2,200 t per unit (1,100–3,300); 6,600 t for Units 2–4; about 0.4% of a unit’s life cycle</w:t>
+              <w:t xml:space="preserve">2,200 t per unit (1,100–3,300); 6,600 t for Units 2–4; about 0.37% of a unit’s life cycle</w:t>
             </w:r>
           </w:p>
         </w:tc>
@@ -1434,7 +1434,7 @@
               <w:jc w:val="left"/>
             </w:pPr>
             <w:r>
-              <w:t xml:space="preserve">Schedule-neutral. Infill qualified under the topical report NEDO-33926, which rests on AISC N690 and ASME rather than mainly CSA N287 (GE-Hitachi Nuclear Energy, 2024; US Nuclear Regulatory Commission and Canadian Nuclear Safety Commission, 2025); otherwise slag or the current mix</w:t>
+              <w:t xml:space="preserve">Schedule-neutral. Infill qualified under the topical report NEDO-33926, which rests on AISC N690 and ASME rather than mainly CSA N287 (GE-Hitachi Nuclear Energy, 2024; US Nuclear Regulatory Commission and CNSC, 2025); otherwise slag or the current mix</w:t>
             </w:r>
           </w:p>
         </w:tc>
@@ -1455,7 +1455,7 @@
         <w:t xml:space="preserve"> </w:t>
       </w:r>
       <w:r>
-        <w:t xml:space="preserve">First, the infill problem is specific to modular construction: a mix that flows, stays cool in thick sections and still shields has to be developed (§10). Second, C1’s value depends on timing rather than on the concrete: counted from when each plant could actually run, a Darlington unit avoids 1.0–6.8 Mt CO₂e to 2050 and a Liddell unit 0.67–3.9 Mt, the same order of magnitude (§7), and Darlington is where a qualified mix can be built.</w:t>
+        <w:t xml:space="preserve">First, the infill problem is specific to modular construction: a mix that flows, stays cool in thick sections and still shields has to be developed (§10). Second, C1’s value is set by schedule, not by the concrete: under three weeks of delay to a unit cancels its saving (§7.1), so C1 is a qualification programme timed to Unit 1 mock-ups rather than a binder swap. Third, its lever is financial: the Units 2–4 equity tranche can carry the condition (§8.6).</w:t>
       </w:r>
     </w:p>
     <w:p>
@@ -4185,7 +4185,7 @@
         <w:t xml:space="preserve"> </w:t>
       </w:r>
       <w:r>
-        <w:t xml:space="preserve">A one-month slip of Units 2–4 costs C$33–110 m in carrying cost and defers about C$88 m of output: 29–175 times the carbon value of C1’s whole saving. C1’s 2,200 t per unit (1,100–3,300; §6.3) is cancelled by 11.6–18.5 days of delay on Ontario’s average grid factor, or 1.7–1.8 days on its marginal factor. Timing also decides where an SMR helps the climate: a Darlington unit avoids about as much CO₂e to 2050 as one at Liddell, and firmed renewables beat both on the same money (Appendix B4–B6).</w:t>
+        <w:t xml:space="preserve">A one-month slip of Units 2–4 costs C$33–110 m in carrying cost alone, 29–175 times the carbon value of C1’s whole saving, and defers about C$88 m of output. C1’s 2,200 t per unit (1,100–3,300; §6.3) is cancelled by 11.6–18.5 days of delay on Ontario’s average grid factor, or 1.7–1.8 days on its marginal factor. Timing also decides where an SMR helps the climate: a Darlington unit avoids about as much CO₂e to 2050 as one at Liddell, and firmed renewables beat both on the same money (Appendix B4–B6).</w:t>
       </w:r>
     </w:p>
     <w:bookmarkStart w:id="48" w:name="the-value-of-schedule"/>
@@ -4489,7 +4489,7 @@
         <w:t xml:space="preserve"> </w:t>
       </w:r>
       <w:r>
-        <w:t xml:space="preserve">One unit avoids 1.50 Mt a year on the NSW average of 640 g/kWh (Department of Climate Change, Energy, the Environment and Water, 2025). On Ontario’s 2024 average of 73.8 g/kWh it avoids 0.165 Mt (9.1× less), and on Ontario’s marginal factor of 343 g/kWh it avoids 0.80 Mt (1.9× less) (The Atmospheric Fund, 2025).</w:t>
+        <w:t xml:space="preserve">One unit avoids 1.50 Mt a year on the NSW average of 640 g/kWh (DCCEEW, 2025). On Ontario’s 2024 average of 73.8 g/kWh it avoids 0.165 Mt (9.1× less), and on Ontario’s marginal factor of 343 g/kWh it avoids 0.80 Mt (1.9× less) (The Atmospheric Fund, 2025).</w:t>
       </w:r>
     </w:p>
     <w:p>
@@ -4542,7 +4542,7 @@
         <w:pStyle w:val="BodyText"/>
       </w:pPr>
       <w:r>
-        <w:t xml:space="preserve">The grid trajectory, start year and post-coal floor move these results tenfold; capacity factor, net output and our life-cycle interval move them by a few per cent (Appendix B4). Liddell was approved to close by April 2023 (Australian Energy Regulator, 2021) and has since closed, so an SMR there would displace the NEM mix, not Liddell’s coal.</w:t>
+        <w:t xml:space="preserve">The grid trajectory, start year and post-coal floor move these results tenfold; capacity factor, net output and our life-cycle interval move them by a few per cent (Appendix B4). An SMR at Liddell would displace the NEM mix, not Liddell’s coal (§1).</w:t>
       </w:r>
     </w:p>
     <w:p>
@@ -4661,7 +4661,7 @@
         <w:t xml:space="preserve"> </w:t>
       </w:r>
       <w:r>
-        <w:t xml:space="preserve">more CO₂e to 2050. They still avoid 5.7× more in the worst case we tested for them, and 4.9× if the SMR costs only A$198 (Appendix B6, Table B28). If A$387–641 is the 2030 range instead, the ratios become 5.0× and 19.1×.</w:t>
+        <w:t xml:space="preserve">more CO₂e to 2050. They still avoid 5.7× more in the worst case we tested for them (SMR A$230, renewables A$153), and 4.9× with the SMR at A$198 (Appendix B6, Table B28). If A$387–641 is the 2030 range instead, the ratios become 5.0× and 19.1×.</w:t>
       </w:r>
       <w:r>
         <w:t xml:space="preserve"> </w:t>
@@ -5307,7 +5307,7 @@
           <w:iCs/>
           <w:i/>
         </w:rPr>
-        <w:t xml:space="preserve">Source: this study, Appendix B6.3; Ontario Power Generation (2025a; 2026b); Graham, Hayward and Foster (2024); Steigerwald et al. (2023).</w:t>
+        <w:t xml:space="preserve">Source: this study, Appendix B6.3; Ontario Power Generation (2025a; 2026b); Graham, Hayward and Foster (2024); Rao, Kaffine and Hodge (2026); Steigerwald et al. (2023).</w:t>
       </w:r>
     </w:p>
     <w:tbl>
@@ -5646,7 +5646,7 @@
         <w:t xml:space="preserve"> </w:t>
       </w:r>
       <w:r>
-        <w:t xml:space="preserve">OPG’s announced Unit 1 fuel suppliers (Cameco, Urenco USA, Orano, GNF-A) include no Russian firm (Ontario Power Generation, 2023, as reported by Power Engineering, 2023). Four units need about 196 t of natural uranium and 138 thousand separative work units (SWU) a year, about 3.2% of Urenco USA’s output (assumed typical BWR fuel values; Appendix B2.6). Australia holds 28% of identified recoverable uranium resources (OECD NEA and IAEA, 2025; the 2026 edition gives 27–29%) but has no conversion or enrichment (World Nuclear Association, 2026). An Australian SMR would import enrichment and fabrication by law (EPBC s 140A; ARPANS s 10), and conversion because no plant exists (Parliamentary Library, 2024).</w:t>
+        <w:t xml:space="preserve">OPG’s announced Unit 1 fuel suppliers (Cameco, Urenco USA, Orano, GNF-A) include no Russian firm (Ontario Power Generation, 2023, as reported by Power Engineering, 2023). Four units need about 196 t of natural uranium and 138 thousand separative work units (SWU) a year, about 3.2% of Urenco USA’s output (assumed typical BWR fuel values; Appendix B2.6). Australia holds 28% of identified recoverable uranium resources (OECD Nuclear Energy Agency and International Atomic Energy Agency, 2025; the 2026 edition gives 27–29%) but has no conversion or enrichment (World Nuclear Association, 2026). An Australian SMR would import enrichment and fabrication by law (EPBC s 140A; ARPANS s 10), and conversion because no plant exists (Parliamentary Library, 2024).</w:t>
       </w:r>
     </w:p>
     <w:p>
@@ -5664,7 +5664,7 @@
         <w:t xml:space="preserve"> </w:t>
       </w:r>
       <w:r>
-        <w:t xml:space="preserve">C1 does not reduce fuel risk. Contracts with allied enrichers, as OPG uses, cut a buyer’s exposure but not concentration (§8.6). One Western option links back to Darlington: laser enrichment from Australia’s Silex Systems, commercialised in the US by Global Laser Enrichment (51% Silex, 49% Cameco, OPG’s uranium supplier). The NRC docketed its Paducah application in August 2025, as reported by Silex Systems Limited (2025), and Cameco has agreed to buy all its output (Silex Systems Limited, 2026, as reported). EPBC s 140A would bar such a plant in Australia (§10).</w:t>
+        <w:t xml:space="preserve">C1 does not reduce fuel risk. Contracts with allied enrichers, as OPG uses, cut a buyer’s exposure but not concentration (§8.6). One Western option links back to Darlington: laser enrichment from Australia’s Silex Systems, commercialised in the US by Global Laser Enrichment (51% Silex, 49% Cameco, OPG’s uranium supplier). The NRC docketed its Paducah application in August 2025, as reported by Silex Systems Limited (2025), and Cameco has agreed to buy all its output (Silex Systems Limited, 2026, as reported by World Nuclear News, 2026). EPBC s 140A would bar such a plant in Australia (§10).</w:t>
       </w:r>
     </w:p>
     <w:p>
@@ -6188,7 +6188,7 @@
         <w:t xml:space="preserve"> </w:t>
       </w:r>
       <w:r>
-        <w:t xml:space="preserve">At Darlington the Canadian Nuclear Safety Commission (CNSC) found the duty to consult met (CNSC, 2025). In June 2026 the seven Williams Treaties First Nations agreed to lend C$700 m to the project, converting to equity once all four units are complete, guaranteed half each by federal and Ontario programmes (Williams Treaties First Nations et al., 2026). Two of the seven told the CNSC in 2023–24 that their concerns had not been addressed, so equity is a means of consent, not a substitute for it. Australia’s precedent is a waste site chosen top-down and set aside by the Federal Court for apprehended bias (</w:t>
+        <w:t xml:space="preserve">At Darlington the CNSC found the duty to consult met (CNSC, 2025). In June 2026 the seven Williams Treaties First Nations agreed to lend C$700 m to the project, converting to equity once all four units are complete, guaranteed half each by federal and Ontario programmes (Williams Treaties First Nations et al., 2026). Two of the seven told the CNSC in 2023–24 that their concerns had not been addressed, so equity is a means of consent, not a substitute for it. Australia’s precedent is a waste site chosen top-down and set aside by the Federal Court for apprehended bias (</w:t>
       </w:r>
       <w:r>
         <w:rPr>
@@ -7458,7 +7458,7 @@
         <w:t xml:space="preserve"> </w:t>
       </w:r>
       <w:r>
-        <w:t xml:space="preserve">The sequence is L1 now, L4 in 2027, then L2 at the 2028 tranche. A Canadian Nuclear Safety Commission licence condition is not a lever, because the CNSC does not set climate conditions; it only has to accept that the change is safe (our inference). Step 1, in 2027, develops slag and LC³ self-consolidating mixes (about 6 to 9 months). Step 2 is a full-scale mock-up trial off Unit 1’s critical path (about 6 months), funded by L4. Step 3 is the design-change evaluation, submitted with the Units 2–4 licensing package ahead of the approval expected in 2028, as reported (American Nuclear Society, 2026); it takes about 6 to 9 months (assumed). The steps total about 18 to 24 months (assumed), so they fit only if they start in 2027. We have not costed the programme; §9 tests an assumed C$1 m. If the evidence is not ready, Units 2–4 proceed with the current mix, the pilot continues in non-safety concrete, and the infill enters at a later unit. Doing nothing forgoes the saving at near-zero cost and is rejected.</w:t>
+        <w:t xml:space="preserve">The sequence is L1 now, L4 in 2027, then L2 at the 2028 tranche. A CNSC licence condition is not a lever, because the CNSC does not set climate conditions; it only has to accept that the change is safe (our inference). Step 1, in 2027, develops slag and LC³ self-consolidating mixes (about 6 to 9 months). Step 2 is a full-scale mock-up trial off Unit 1’s critical path (about 6 months), funded by L4. Step 3 is the design-change evaluation, submitted with the Units 2–4 licensing package ahead of the approval expected in 2028, as reported (American Nuclear Society, 2026); it takes about 6 to 9 months (assumed). The steps total about 18 to 24 months (assumed), so they fit only if they start in 2027. We have not costed the programme; §9 tests an assumed C$1 m. If the evidence is not ready, Units 2–4 proceed with the current mix, the pilot continues in non-safety concrete, and the infill enters at a later unit. Doing nothing forgoes the saving at near-zero cost and is rejected.</w:t>
       </w:r>
     </w:p>
     <w:p>
@@ -7707,7 +7707,7 @@
               <w:jc w:val="left"/>
             </w:pPr>
             <w:r>
-              <w:t xml:space="preserve">SMR A$230–382/MWh in 2030 against A$89–125 for firmed renewables. No private owner could finance a first unit.</w:t>
+              <w:t xml:space="preserve">SMR A$230–382/MWh in 2030 against A$89–125 for firmed renewables. A first unit would need Commonwealth ownership or underwriting (our inference, §8.2).</w:t>
             </w:r>
           </w:p>
         </w:tc>
@@ -8330,7 +8330,7 @@
         <w:t xml:space="preserve"> </w:t>
       </w:r>
       <w:r>
-        <w:t xml:space="preserve">At 2,200 t per unit (50,000 m³ of concrete, 40% eligible; BWRX-300 Ostrołęka sp. z o.o., 2023; Pillai et al., 2019), C1 moves the weighted score by under 0.005 point, and the ranking is unchanged. An 18.5-day slip would leave 15 times the saving unavoided (Appendix B7.5), so schedule neutrality decides whether C1 helps.</w:t>
+        <w:t xml:space="preserve">At 2,200 t per unit (50,000 m³ of concrete, 40% eligible; BWRX-300 Ostrołęka sp. z o.o., 2023; Pillai et al., 2019), C1 moves the weighted score by under 0.005 point, and the ranking is unchanged. At Liddell, an 18.5-day slip would forgo CO₂e equal to 15 times the saving (Appendix B7.5), so schedule neutrality decides whether C1 helps.</w:t>
       </w:r>
     </w:p>
     <w:p>
@@ -8516,7 +8516,7 @@
         <w:t xml:space="preserve"> </w:t>
       </w:r>
       <w:r>
-        <w:t xml:space="preserve">One BWRX-300 emits about 4 g CO₂e/kWh (§6), mostly from the fuel front end; conversion heat is the largest uncertainty.</w:t>
+        <w:t xml:space="preserve">One BWRX-300 emits about 4 g CO₂e/kWh, mostly from the fuel front end; conversion heat is the largest uncertainty.</w:t>
       </w:r>
       <w:r>
         <w:t xml:space="preserve"> </w:t>
@@ -8538,7 +8538,7 @@
         <w:t xml:space="preserve"> </w:t>
       </w:r>
       <w:r>
-        <w:t xml:space="preserve">It saves 2,200 t per unit (1,100–3,300 at 20–60% eligible; BWRX-300 Ostrołęka sp. z o.o., 2023; Pillai et al., 2019), about 0.37% of the life cycle; a delay of 11.6–18.5 days cancels it (1.7–1.8 days on the marginal grid factor).</w:t>
+        <w:t xml:space="preserve">It saves 2,200 t per unit (1,100–3,300; §4.3), about 0.37% of the life cycle; a delay of 11.6–18.5 days cancels it (1.7–1.8 days on the marginal grid factor).</w:t>
       </w:r>
       <w:r>
         <w:t xml:space="preserve"> </w:t>
@@ -8560,7 +8560,7 @@
         <w:t xml:space="preserve"> </w:t>
       </w:r>
       <w:r>
-        <w:t xml:space="preserve">A Darlington unit avoids 1.0–6.8 Mt CO₂e to 2050 and a Liddell unit 0.67–3.9 Mt; firmed renewables avoid 10.9 times more per dollar.</w:t>
+        <w:t xml:space="preserve">Darlington Unit 1 avoids 1.0–6.8 Mt CO₂e to 2050 and a Liddell unit 0.67–3.9 Mt; firmed renewables avoid 10.9 times more per dollar.</w:t>
       </w:r>
       <w:r>
         <w:t xml:space="preserve"> </w:t>
@@ -8582,7 +8582,7 @@
         <w:t xml:space="preserve"> </w:t>
       </w:r>
       <w:r>
-        <w:t xml:space="preserve">Renewables rank first under all four weight sets (equal weights: 80 against 30 for an SMR, with or without C1).</w:t>
+        <w:t xml:space="preserve">Law (three bans), cost (C$149–198/MWh) and time (2040 at the earliest) decide; firmed renewables rank first under all four weight sets (80 against 30 with equal weights).</w:t>
       </w:r>
     </w:p>
     <w:p>
@@ -8616,7 +8616,7 @@
         <w:t xml:space="preserve"> </w:t>
       </w:r>
       <w:r>
-        <w:t xml:space="preserve">a month’s slip to Units 2–4 costs 20–175 times C1’s carbon value (§7).</w:t>
+        <w:t xml:space="preserve">a month’s slip to Units 2–4 costs 29–175 times C1’s carbon value (§7).</w:t>
       </w:r>
       <w:r>
         <w:t xml:space="preserve"> </w:t>
@@ -8716,7 +8716,7 @@
       </w:r>
     </w:p>
     <w:bookmarkEnd w:id="73"/>
-    <w:bookmarkStart w:id="75" w:name="references"/>
+    <w:bookmarkStart w:id="76" w:name="references"/>
     <w:p>
       <w:pPr>
         <w:pStyle w:val="Heading2"/>
@@ -9551,7 +9551,7 @@
         <w:pStyle w:val="BodyText"/>
       </w:pPr>
       <w:r>
-        <w:t xml:space="preserve">Defence Connect, n.d. Critical worker shortage menaces nuclear-powered submarine workforce.</w:t>
+        <w:t xml:space="preserve">Department of Climate Change, Energy, the Environment and Water, 2025.</w:t>
       </w:r>
       <w:r>
         <w:t xml:space="preserve"> </w:t>
@@ -9561,10 +9561,10 @@
           <w:iCs/>
           <w:i/>
         </w:rPr>
-        <w:t xml:space="preserve">Defence Connect</w:t>
-      </w:r>
-      <w:r>
-        <w:t xml:space="preserve">. [online] Available at: https://www.defenceconnect.com.au/industry/13993-critical-worker-shortage-menaces-nuclear-powered-submarine-workforce [Accessed 21 October 2026].</w:t>
+        <w:t xml:space="preserve">Australian National Greenhouse Accounts Factors: 2025</w:t>
+      </w:r>
+      <w:r>
+        <w:t xml:space="preserve">. [pdf/xlsx] Canberra: Department of Climate Change, Energy, the Environment and Water.</w:t>
       </w:r>
     </w:p>
     <w:p>
@@ -9572,7 +9572,7 @@
         <w:pStyle w:val="BodyText"/>
       </w:pPr>
       <w:r>
-        <w:t xml:space="preserve">Department of Climate Change, Energy, the Environment and Water, 2025.</w:t>
+        <w:t xml:space="preserve">Department of Industry, Science, Energy and Resources, 2020.</w:t>
       </w:r>
       <w:r>
         <w:t xml:space="preserve"> </w:t>
@@ -9582,10 +9582,10 @@
           <w:iCs/>
           <w:i/>
         </w:rPr>
-        <w:t xml:space="preserve">Australian National Greenhouse Accounts Factors: 2025</w:t>
-      </w:r>
-      <w:r>
-        <w:t xml:space="preserve">. [pdf/xlsx] Canberra: Department of Climate Change, Energy, the Environment and Water.</w:t>
+        <w:t xml:space="preserve">A new agency to manage radioactive waste</w:t>
+      </w:r>
+      <w:r>
+        <w:t xml:space="preserve">. [online] Available at: https://industry.gov.au/news-media/australian-radioactive-waste-agency-news/a-new-agency-to-manage-radioactive-waste [Accessed 21 October 2026].</w:t>
       </w:r>
     </w:p>
     <w:p>
@@ -9593,7 +9593,7 @@
         <w:pStyle w:val="BodyText"/>
       </w:pPr>
       <w:r>
-        <w:t xml:space="preserve">Department of Industry, Science, Energy and Resources, 2020.</w:t>
+        <w:t xml:space="preserve">Development Alternatives, n.d.</w:t>
       </w:r>
       <w:r>
         <w:t xml:space="preserve"> </w:t>
@@ -9603,10 +9603,13 @@
           <w:iCs/>
           <w:i/>
         </w:rPr>
-        <w:t xml:space="preserve">A new agency to manage radioactive waste</w:t>
-      </w:r>
-      <w:r>
-        <w:t xml:space="preserve">. [online] Available at: https://industry.gov.au/news-media/australian-radioactive-waste-agency-news/a-new-agency-to-manage-radioactive-waste [Accessed 21 October 2026].</w:t>
+        <w:t xml:space="preserve">LC3 Sustainability Assessment</w:t>
+      </w:r>
+      <w:r>
+        <w:t xml:space="preserve"> </w:t>
+      </w:r>
+      <w:r>
+        <w:t xml:space="preserve">(ver 1.14). Available at: https://devalt.org/images/L2_ProjectPdfs/Report%20-%20LC3%20Sustainability%20Assessment_ver1.14.pdf.</w:t>
       </w:r>
     </w:p>
     <w:p>
@@ -9614,7 +9617,7 @@
         <w:pStyle w:val="BodyText"/>
       </w:pPr>
       <w:r>
-        <w:t xml:space="preserve">Development Alternatives, n.d.</w:t>
+        <w:t xml:space="preserve">Dodgson, J.S., Spackman, M., Pearman, A. and Phillips, L.D., 2009.</w:t>
       </w:r>
       <w:r>
         <w:t xml:space="preserve"> </w:t>
@@ -9624,13 +9627,10 @@
           <w:iCs/>
           <w:i/>
         </w:rPr>
-        <w:t xml:space="preserve">LC3 Sustainability Assessment</w:t>
-      </w:r>
-      <w:r>
-        <w:t xml:space="preserve"> </w:t>
-      </w:r>
-      <w:r>
-        <w:t xml:space="preserve">(ver 1.14). Available at: https://devalt.org/images/L2_ProjectPdfs/Report%20-%20LC3%20Sustainability%20Assessment_ver1.14.pdf.</w:t>
+        <w:t xml:space="preserve">Multi-criteria analysis: a manual</w:t>
+      </w:r>
+      <w:r>
+        <w:t xml:space="preserve">. London: Department for Communities and Local Government. Available at: https://www.gov.uk/government/publications/multi-criteria-analysis-manual-for-making-government-policy [Accessed 21 October 2026].</w:t>
       </w:r>
     </w:p>
     <w:p>
@@ -9638,7 +9638,7 @@
         <w:pStyle w:val="BodyText"/>
       </w:pPr>
       <w:r>
-        <w:t xml:space="preserve">Dodgson, J.S., Spackman, M., Pearman, A. and Phillips, L.D., 2009.</w:t>
+        <w:t xml:space="preserve">EDF R&amp;D, 2024. Life cycle assessment of nuclear power in France: EDF case study.</w:t>
       </w:r>
       <w:r>
         <w:t xml:space="preserve"> </w:t>
@@ -9648,10 +9648,10 @@
           <w:iCs/>
           <w:i/>
         </w:rPr>
-        <w:t xml:space="preserve">Multi-criteria analysis: a manual</w:t>
-      </w:r>
-      <w:r>
-        <w:t xml:space="preserve">. London: Department for Communities and Local Government. Available at: https://www.gov.uk/government/publications/multi-criteria-analysis-manual-for-making-government-policy [Accessed 21 October 2026].</w:t>
+        <w:t xml:space="preserve">EPJ Nuclear Sciences &amp; Technologies</w:t>
+      </w:r>
+      <w:r>
+        <w:t xml:space="preserve">, 10, art. 5. Available at: https://www.epj-n.org/10.1051/epjn/2024005.</w:t>
       </w:r>
     </w:p>
     <w:p>
@@ -9659,7 +9659,7 @@
         <w:pStyle w:val="BodyText"/>
       </w:pPr>
       <w:r>
-        <w:t xml:space="preserve">EDF R&amp;D, 2024. Life cycle assessment of nuclear power in France: EDF case study.</w:t>
+        <w:t xml:space="preserve">EFNARC, 2005.</w:t>
       </w:r>
       <w:r>
         <w:t xml:space="preserve"> </w:t>
@@ -9669,10 +9669,10 @@
           <w:iCs/>
           <w:i/>
         </w:rPr>
-        <w:t xml:space="preserve">EPJ Nuclear Sciences &amp; Technologies</w:t>
-      </w:r>
-      <w:r>
-        <w:t xml:space="preserve">, 10, art. 5. Available at: https://www.epj-n.org/10.1051/epjn/2024005.</w:t>
+        <w:t xml:space="preserve">The European Guidelines for Self-Compacting Concrete: Specification, Production and Use</w:t>
+      </w:r>
+      <w:r>
+        <w:t xml:space="preserve">. Farnham: EFNARC.</w:t>
       </w:r>
     </w:p>
     <w:p>
@@ -9680,7 +9680,7 @@
         <w:pStyle w:val="BodyText"/>
       </w:pPr>
       <w:r>
-        <w:t xml:space="preserve">EFNARC, 2005.</w:t>
+        <w:t xml:space="preserve">ENR, 2018. Clay and limestone cement could cut carbon emissions.</w:t>
       </w:r>
       <w:r>
         <w:t xml:space="preserve"> </w:t>
@@ -9690,10 +9690,10 @@
           <w:iCs/>
           <w:i/>
         </w:rPr>
-        <w:t xml:space="preserve">The European Guidelines for Self-Compacting Concrete: Specification, Production and Use</w:t>
-      </w:r>
-      <w:r>
-        <w:t xml:space="preserve">. Farnham: EFNARC.</w:t>
+        <w:t xml:space="preserve">Engineering News-Record</w:t>
+      </w:r>
+      <w:r>
+        <w:t xml:space="preserve">, 7 May. Available at: https://digital.bnpmedia.com/article/Construction+Materials/3078554/494167/article.html.</w:t>
       </w:r>
     </w:p>
     <w:p>
@@ -9701,7 +9701,7 @@
         <w:pStyle w:val="BodyText"/>
       </w:pPr>
       <w:r>
-        <w:t xml:space="preserve">ENR, 2018. Clay and limestone cement could cut carbon emissions.</w:t>
+        <w:t xml:space="preserve">Environment and Climate Change Canada, 2026.</w:t>
       </w:r>
       <w:r>
         <w:t xml:space="preserve"> </w:t>
@@ -9711,10 +9711,10 @@
           <w:iCs/>
           <w:i/>
         </w:rPr>
-        <w:t xml:space="preserve">Engineering News-Record</w:t>
-      </w:r>
-      <w:r>
-        <w:t xml:space="preserve">, 7 May. Available at: https://digital.bnpmedia.com/article/Construction+Materials/3078554/494167/article.html.</w:t>
+        <w:t xml:space="preserve">Industrial carbon pricing in Canada</w:t>
+      </w:r>
+      <w:r>
+        <w:t xml:space="preserve">. Ottawa: Government of Canada. Available at: https://www.canada.ca/en/environment-climate-change/services/climate-change/pricing-pollution-how-it-will-work/putting-price-on-carbon-pollution/industry.html [Accessed 21 October 2026].</w:t>
       </w:r>
     </w:p>
     <w:p>
@@ -9722,7 +9722,7 @@
         <w:pStyle w:val="BodyText"/>
       </w:pPr>
       <w:r>
-        <w:t xml:space="preserve">Environment and Climate Change Canada, 2026.</w:t>
+        <w:t xml:space="preserve">GE-Hitachi Nuclear Energy, 2024.</w:t>
       </w:r>
       <w:r>
         <w:t xml:space="preserve"> </w:t>
@@ -9732,10 +9732,10 @@
           <w:iCs/>
           <w:i/>
         </w:rPr>
-        <w:t xml:space="preserve">Industrial carbon pricing in Canada</w:t>
-      </w:r>
-      <w:r>
-        <w:t xml:space="preserve">. Ottawa: Government of Canada. Available at: https://www.canada.ca/en/environment-climate-change/services/climate-change/pricing-pollution-how-it-will-work/putting-price-on-carbon-pollution/industry.html [Accessed 21 October 2026].</w:t>
+        <w:t xml:space="preserve">BWRX-300 Steel-Plate Composite Containment Vessel (SCCV) and Reactor Building Structural Design</w:t>
+      </w:r>
+      <w:r>
+        <w:t xml:space="preserve">, NEDO-33926, Revision 2 (non-proprietary), 16 August. [pdf] US NRC ADAMS ML24110A134. Available at: https://www.nrc.gov/docs/ML2411/ML24110A134.pdf [Accessed 20 October 2026].</w:t>
       </w:r>
     </w:p>
     <w:p>
@@ -9743,7 +9743,7 @@
         <w:pStyle w:val="BodyText"/>
       </w:pPr>
       <w:r>
-        <w:t xml:space="preserve">GE-Hitachi Nuclear Energy, 2024.</w:t>
+        <w:t xml:space="preserve">GE Vernova, n.d.</w:t>
       </w:r>
       <w:r>
         <w:t xml:space="preserve"> </w:t>
@@ -9753,10 +9753,10 @@
           <w:iCs/>
           <w:i/>
         </w:rPr>
-        <w:t xml:space="preserve">BWRX-300 Steel-Plate Composite Containment Vessel (SCCV) and Reactor Building Structural Design</w:t>
-      </w:r>
-      <w:r>
-        <w:t xml:space="preserve">, NEDO-33926, Revision 2 (non-proprietary), 16 August. [pdf] US NRC ADAMS ML24110A134. Available at: https://www.nrc.gov/docs/ML2411/ML24110A134.pdf [Accessed 20 October 2026].</w:t>
+        <w:t xml:space="preserve">BWRX-300 Small Modular Reactor</w:t>
+      </w:r>
+      <w:r>
+        <w:t xml:space="preserve">. [online] Available at: https://www.gevernova.com/nuclear/carbon-free-power/bwrx-300-small-modular-reactor.</w:t>
       </w:r>
     </w:p>
     <w:p>
@@ -9764,7 +9764,7 @@
         <w:pStyle w:val="BodyText"/>
       </w:pPr>
       <w:r>
-        <w:t xml:space="preserve">GE Vernova, n.d.</w:t>
+        <w:t xml:space="preserve">GE Vernova Hitachi Nuclear Energy, n.d.</w:t>
       </w:r>
       <w:r>
         <w:t xml:space="preserve"> </w:t>
@@ -9774,10 +9774,13 @@
           <w:iCs/>
           <w:i/>
         </w:rPr>
-        <w:t xml:space="preserve">BWRX-300 Small Modular Reactor</w:t>
-      </w:r>
-      <w:r>
-        <w:t xml:space="preserve">. [online] Available at: https://www.gevernova.com/nuclear/carbon-free-power/bwrx-300-small-modular-reactor.</w:t>
+        <w:t xml:space="preserve">BWRX-300 General Description</w:t>
+      </w:r>
+      <w:r>
+        <w:t xml:space="preserve"> </w:t>
+      </w:r>
+      <w:r>
+        <w:t xml:space="preserve">(005N9751). [pdf] Wilmington, NC: GE Vernova. Available at: https://www.gevernova.com/content/dam/gevernova-nuclear/global/en_us/documents/carbon-free-power/005N9751-BWRX-300-General-Description.pdf.</w:t>
       </w:r>
     </w:p>
     <w:p>
@@ -9785,7 +9788,7 @@
         <w:pStyle w:val="BodyText"/>
       </w:pPr>
       <w:r>
-        <w:t xml:space="preserve">GE Vernova Hitachi Nuclear Energy, n.d.</w:t>
+        <w:t xml:space="preserve">Geneski, N., McKellar, J.M. and Atkinson, K.D., n.d. Life cycle environmental impacts of small modular reactors: BWRX-300 Darlington project.</w:t>
       </w:r>
       <w:r>
         <w:t xml:space="preserve"> </w:t>
@@ -9795,13 +9798,10 @@
           <w:iCs/>
           <w:i/>
         </w:rPr>
-        <w:t xml:space="preserve">BWRX-300 General Description</w:t>
-      </w:r>
-      <w:r>
-        <w:t xml:space="preserve"> </w:t>
-      </w:r>
-      <w:r>
-        <w:t xml:space="preserve">(005N9751). [pdf] Wilmington, NC: GE Vernova. Available at: https://www.gevernova.com/content/dam/gevernova-nuclear/global/en_us/documents/carbon-free-power/005N9751-BWRX-300-General-Description.pdf.</w:t>
+        <w:t xml:space="preserve">Proceedings of the Canadian Nuclear Society</w:t>
+      </w:r>
+      <w:r>
+        <w:t xml:space="preserve">. Available at: https://proceedings.cns-snc.ca/index.php/pcns/article/view/7692.</w:t>
       </w:r>
     </w:p>
     <w:p>
@@ -9809,7 +9809,7 @@
         <w:pStyle w:val="BodyText"/>
       </w:pPr>
       <w:r>
-        <w:t xml:space="preserve">Geneski, N., McKellar, J.M. and Atkinson, K.D., n.d. Life cycle environmental impacts of small modular reactors: BWRX-300 Darlington project.</w:t>
+        <w:t xml:space="preserve">Gibon, T. and Hahn Menacho, Á., 2023. Parametric life cycle assessment of nuclear power for simplified models.</w:t>
       </w:r>
       <w:r>
         <w:t xml:space="preserve"> </w:t>
@@ -9819,10 +9819,10 @@
           <w:iCs/>
           <w:i/>
         </w:rPr>
-        <w:t xml:space="preserve">Proceedings of the Canadian Nuclear Society</w:t>
-      </w:r>
-      <w:r>
-        <w:t xml:space="preserve">. Available at: https://proceedings.cns-snc.ca/index.php/pcns/article/view/7692.</w:t>
+        <w:t xml:space="preserve">Environmental Science &amp; Technology</w:t>
+      </w:r>
+      <w:r>
+        <w:t xml:space="preserve">, 57(38), pp.14194–14205. Available at: https://doi.org/10.1021/acs.est.3c03190.</w:t>
       </w:r>
     </w:p>
     <w:p>
@@ -9830,7 +9830,7 @@
         <w:pStyle w:val="BodyText"/>
       </w:pPr>
       <w:r>
-        <w:t xml:space="preserve">Gibon, T. and Hahn Menacho, Á., 2023. Parametric life cycle assessment of nuclear power for simplified models.</w:t>
+        <w:t xml:space="preserve">Government of Ontario, 2025.</w:t>
       </w:r>
       <w:r>
         <w:t xml:space="preserve"> </w:t>
@@ -9840,10 +9840,10 @@
           <w:iCs/>
           <w:i/>
         </w:rPr>
-        <w:t xml:space="preserve">Environmental Science &amp; Technology</w:t>
-      </w:r>
-      <w:r>
-        <w:t xml:space="preserve">, 57(38), pp.14194–14205. Available at: https://doi.org/10.1021/acs.est.3c03190.</w:t>
+        <w:t xml:space="preserve">Ontario Leads the G7 by Building First Small Modular Reactor</w:t>
+      </w:r>
+      <w:r>
+        <w:t xml:space="preserve">. [news release] 8 May. Toronto: Government of Ontario.</w:t>
       </w:r>
     </w:p>
     <w:p>
@@ -9851,7 +9851,7 @@
         <w:pStyle w:val="BodyText"/>
       </w:pPr>
       <w:r>
-        <w:t xml:space="preserve">Government of Ontario, 2025.</w:t>
+        <w:t xml:space="preserve">Government of Ontario, n.d.</w:t>
       </w:r>
       <w:r>
         <w:t xml:space="preserve"> </w:t>
@@ -9861,10 +9861,10 @@
           <w:iCs/>
           <w:i/>
         </w:rPr>
-        <w:t xml:space="preserve">Ontario Leads the G7 by Building First Small Modular Reactor</w:t>
-      </w:r>
-      <w:r>
-        <w:t xml:space="preserve">. [news release] 8 May. Toronto: Government of Ontario.</w:t>
+        <w:t xml:space="preserve">Ontario energy snapshot</w:t>
+      </w:r>
+      <w:r>
+        <w:t xml:space="preserve">. [online] Available at: https://www.ontario.ca/page/ontario-energy-snapshot.</w:t>
       </w:r>
     </w:p>
     <w:p>
@@ -9872,7 +9872,7 @@
         <w:pStyle w:val="BodyText"/>
       </w:pPr>
       <w:r>
-        <w:t xml:space="preserve">Government of Ontario, n.d.</w:t>
+        <w:t xml:space="preserve">Graham, P. and Hayward, J., 2026.</w:t>
       </w:r>
       <w:r>
         <w:t xml:space="preserve"> </w:t>
@@ -9882,10 +9882,10 @@
           <w:iCs/>
           <w:i/>
         </w:rPr>
-        <w:t xml:space="preserve">Ontario energy snapshot</w:t>
-      </w:r>
-      <w:r>
-        <w:t xml:space="preserve">. [online] Available at: https://www.ontario.ca/page/ontario-energy-snapshot.</w:t>
+        <w:t xml:space="preserve">GenCost 2025-26: Final report</w:t>
+      </w:r>
+      <w:r>
+        <w:t xml:space="preserve">. [pdf] Australia: CSIRO. Available at: https://www.csiro.au/-/media/Energy/GenCost-2025-26-Final/GenCost_2025-26_Final_Report_20260715.pdf.</w:t>
       </w:r>
     </w:p>
     <w:p>
@@ -9893,7 +9893,7 @@
         <w:pStyle w:val="BodyText"/>
       </w:pPr>
       <w:r>
-        <w:t xml:space="preserve">Graham, P. and Hayward, J., 2026.</w:t>
+        <w:t xml:space="preserve">Graham, P., Hayward, J. and Foster, J., 2024.</w:t>
       </w:r>
       <w:r>
         <w:t xml:space="preserve"> </w:t>
@@ -9903,10 +9903,10 @@
           <w:iCs/>
           <w:i/>
         </w:rPr>
-        <w:t xml:space="preserve">GenCost 2025-26: Final report</w:t>
-      </w:r>
-      <w:r>
-        <w:t xml:space="preserve">. [pdf] Australia: CSIRO. Available at: https://www.csiro.au/-/media/Energy/GenCost-2025-26-Final/GenCost_2025-26_Final_Report_20260715.pdf.</w:t>
+        <w:t xml:space="preserve">GenCost 2023-24: Final report</w:t>
+      </w:r>
+      <w:r>
+        <w:t xml:space="preserve">. [pdf] Australia: CSIRO. Available at: https://www.csiro.au/-/media/Energy/GenCost/GenCost2023-24Final_20240522.pdf.</w:t>
       </w:r>
     </w:p>
     <w:p>
@@ -9914,7 +9914,7 @@
         <w:pStyle w:val="BodyText"/>
       </w:pPr>
       <w:r>
-        <w:t xml:space="preserve">Graham, P., Hayward, J. and Foster, J., 2024.</w:t>
+        <w:t xml:space="preserve">Graham, P., Hayward, J. and Foster, J., 2025.</w:t>
       </w:r>
       <w:r>
         <w:t xml:space="preserve"> </w:t>
@@ -9924,10 +9924,10 @@
           <w:iCs/>
           <w:i/>
         </w:rPr>
-        <w:t xml:space="preserve">GenCost 2023-24: Final report</w:t>
-      </w:r>
-      <w:r>
-        <w:t xml:space="preserve">. [pdf] Australia: CSIRO. Available at: https://www.csiro.au/-/media/Energy/GenCost/GenCost2023-24Final_20240522.pdf.</w:t>
+        <w:t xml:space="preserve">GenCost 2024-25: Final report</w:t>
+      </w:r>
+      <w:r>
+        <w:t xml:space="preserve">. [pdf] Australia: CSIRO. Executive summary available at: https://www.csiro.au/-/media/Energy/GenCost/GenCost2024-25Final_ES.pdf.</w:t>
       </w:r>
     </w:p>
     <w:p>
@@ -9935,7 +9935,7 @@
         <w:pStyle w:val="BodyText"/>
       </w:pPr>
       <w:r>
-        <w:t xml:space="preserve">Graham, P., Hayward, J. and Foster, J., 2025.</w:t>
+        <w:t xml:space="preserve">Griffith University Climate Action Beacon and Monash Climate Change Communication Research Hub, 2025.</w:t>
       </w:r>
       <w:r>
         <w:t xml:space="preserve"> </w:t>
@@ -9945,10 +9945,10 @@
           <w:iCs/>
           <w:i/>
         </w:rPr>
-        <w:t xml:space="preserve">GenCost 2024-25: Final report</w:t>
-      </w:r>
-      <w:r>
-        <w:t xml:space="preserve">. [pdf] Australia: CSIRO. Executive summary available at: https://www.csiro.au/-/media/Energy/GenCost/GenCost2024-25Final_ES.pdf.</w:t>
+        <w:t xml:space="preserve">What Australians really think of nuclear power</w:t>
+      </w:r>
+      <w:r>
+        <w:t xml:space="preserve">. [news release] 2 May. Available at: https://news.griffith.edu.au/2025/05/02/what-australians-really-think-of-nuclear-power/ [Accessed 21 October 2026].</w:t>
       </w:r>
     </w:p>
     <w:p>
@@ -9956,7 +9956,15 @@
         <w:pStyle w:val="BodyText"/>
       </w:pPr>
       <w:r>
-        <w:t xml:space="preserve">Griffith University Climate Action Beacon and Monash Climate Change Communication Research Hub, 2025.</w:t>
+        <w:t xml:space="preserve">Hooton, R.D., 2023. [Webinar slides on changes to ASTM cement and concrete standards]. ACI Fall 2023 webinar slides. [pdf] Farmington Hills: American Concrete Institute. Available at: https://www.concrete.org/portals/0/files/pdf/webinars/ws_F23_NEU_DouglasHooton.pdf [Accessed 20 October 2026].</w:t>
+      </w:r>
+    </w:p>
+    <w:p>
+      <w:pPr>
+        <w:pStyle w:val="BodyText"/>
+      </w:pPr>
+      <w:r>
+        <w:t xml:space="preserve">Independent Electricity System Operator, 2024.</w:t>
       </w:r>
       <w:r>
         <w:t xml:space="preserve"> </w:t>
@@ -9966,10 +9974,10 @@
           <w:iCs/>
           <w:i/>
         </w:rPr>
-        <w:t xml:space="preserve">What Australians really think of nuclear power</w:t>
-      </w:r>
-      <w:r>
-        <w:t xml:space="preserve">. [news release] 2 May. Available at: https://news.griffith.edu.au/2025/05/02/what-australians-really-think-of-nuclear-power/ [Accessed 21 October 2026].</w:t>
+        <w:t xml:space="preserve">Ontario’s Energy Future: Spring 2024 Update</w:t>
+      </w:r>
+      <w:r>
+        <w:t xml:space="preserve">. [pdf] Toronto: Independent Electricity System Operator. Available at: https://www.ieso.ca/-/media/Files/IESO/Document-Library/Decarbonization-Hub/IESO-Ontarios-Energy-Future-Spring-2024.pdf.</w:t>
       </w:r>
     </w:p>
     <w:p>
@@ -9977,7 +9985,7 @@
         <w:pStyle w:val="BodyText"/>
       </w:pPr>
       <w:r>
-        <w:t xml:space="preserve">Hooton, R.D., 2023.</w:t>
+        <w:t xml:space="preserve">International Atomic Energy Agency, 2024.</w:t>
       </w:r>
       <w:r>
         <w:t xml:space="preserve"> </w:t>
@@ -9987,13 +9995,10 @@
           <w:iCs/>
           <w:i/>
         </w:rPr>
-        <w:t xml:space="preserve">Changes to ASTM cement and concrete standards to…</w:t>
-      </w:r>
-      <w:r>
-        <w:t xml:space="preserve"> </w:t>
-      </w:r>
-      <w:r>
-        <w:t xml:space="preserve">[title truncated in source entry]. ACI Fall 2023 webinar slides. [pdf] Farmington Hills: American Concrete Institute. Available at: https://www.concrete.org/portals/0/files/pdf/webinars/ws_F23_NEU_DouglasHooton.pdf [Accessed 20 October 2026].</w:t>
+        <w:t xml:space="preserve">Small Modular Reactors: Advances in SMR Developments 2024</w:t>
+      </w:r>
+      <w:r>
+        <w:t xml:space="preserve">. Vienna: International Atomic Energy Agency.</w:t>
       </w:r>
     </w:p>
     <w:p>
@@ -10001,7 +10006,7 @@
         <w:pStyle w:val="BodyText"/>
       </w:pPr>
       <w:r>
-        <w:t xml:space="preserve">Independent Electricity System Operator, 2024.</w:t>
+        <w:t xml:space="preserve">International Energy Agency, 2022.</w:t>
       </w:r>
       <w:r>
         <w:t xml:space="preserve"> </w:t>
@@ -10011,10 +10016,10 @@
           <w:iCs/>
           <w:i/>
         </w:rPr>
-        <w:t xml:space="preserve">Ontario’s Energy Future: Spring 2024 Update</w:t>
-      </w:r>
-      <w:r>
-        <w:t xml:space="preserve">. [pdf] Toronto: Independent Electricity System Operator. Available at: https://www.ieso.ca/-/media/Files/IESO/Document-Library/Decarbonization-Hub/IESO-Ontarios-Energy-Future-Spring-2024.pdf.</w:t>
+        <w:t xml:space="preserve">Solar PV Global Supply Chains</w:t>
+      </w:r>
+      <w:r>
+        <w:t xml:space="preserve">. Paris: International Energy Agency. Available at: https://www.iea.org/reports/solar-pv-global-supply-chains [Accessed 21 October 2026].</w:t>
       </w:r>
     </w:p>
     <w:p>
@@ -10022,7 +10027,7 @@
         <w:pStyle w:val="BodyText"/>
       </w:pPr>
       <w:r>
-        <w:t xml:space="preserve">International Atomic Energy Agency, 2015.</w:t>
+        <w:t xml:space="preserve">International Organization for Standardization, 2006a.</w:t>
       </w:r>
       <w:r>
         <w:t xml:space="preserve"> </w:t>
@@ -10032,10 +10037,10 @@
           <w:iCs/>
           <w:i/>
         </w:rPr>
-        <w:t xml:space="preserve">Milestones in the Development of a National Infrastructure for Nuclear Power</w:t>
-      </w:r>
-      <w:r>
-        <w:t xml:space="preserve">. IAEA Nuclear Energy Series No. NG-G-3.1. [pdf] Vienna: International Atomic Energy Agency. Available at: https://www-pub.iaea.org/MTCD/Publications/PDF/Pub1704_web.pdf [Accessed 20 October 2026].</w:t>
+        <w:t xml:space="preserve">ISO 14040:2006 Environmental management — Life cycle assessment — Principles and framework</w:t>
+      </w:r>
+      <w:r>
+        <w:t xml:space="preserve">. Geneva: International Organization for Standardization.</w:t>
       </w:r>
     </w:p>
     <w:p>
@@ -10043,7 +10048,7 @@
         <w:pStyle w:val="BodyText"/>
       </w:pPr>
       <w:r>
-        <w:t xml:space="preserve">International Atomic Energy Agency, 2024.</w:t>
+        <w:t xml:space="preserve">International Organization for Standardization, 2006b.</w:t>
       </w:r>
       <w:r>
         <w:t xml:space="preserve"> </w:t>
@@ -10053,10 +10058,10 @@
           <w:iCs/>
           <w:i/>
         </w:rPr>
-        <w:t xml:space="preserve">Small Modular Reactors: Advances in SMR Developments 2024</w:t>
-      </w:r>
-      <w:r>
-        <w:t xml:space="preserve">. Vienna: International Atomic Energy Agency.</w:t>
+        <w:t xml:space="preserve">ISO 14044:2006 Environmental management — Life cycle assessment — Requirements and guidelines</w:t>
+      </w:r>
+      <w:r>
+        <w:t xml:space="preserve">. Geneva: International Organization for Standardization. Available at: https://www.iso.org/standard/38498.html.</w:t>
       </w:r>
     </w:p>
     <w:p>
@@ -10064,7 +10069,7 @@
         <w:pStyle w:val="BodyText"/>
       </w:pPr>
       <w:r>
-        <w:t xml:space="preserve">International Energy Agency, 2022.</w:t>
+        <w:t xml:space="preserve">IPCC, 2006.</w:t>
       </w:r>
       <w:r>
         <w:t xml:space="preserve"> </w:t>
@@ -10074,10 +10079,10 @@
           <w:iCs/>
           <w:i/>
         </w:rPr>
-        <w:t xml:space="preserve">Solar PV Global Supply Chains</w:t>
-      </w:r>
-      <w:r>
-        <w:t xml:space="preserve">. Paris: International Energy Agency. Available at: https://www.iea.org/reports/solar-pv-global-supply-chains [Accessed 21 October 2026].</w:t>
+        <w:t xml:space="preserve">2006 IPCC Guidelines for National Greenhouse Gas Inventories</w:t>
+      </w:r>
+      <w:r>
+        <w:t xml:space="preserve">, Vol. 2 Energy, Ch. 2, Table 2.2. Hayama: Institute for Global Environmental Strategies.</w:t>
       </w:r>
     </w:p>
     <w:p>
@@ -10085,7 +10090,7 @@
         <w:pStyle w:val="BodyText"/>
       </w:pPr>
       <w:r>
-        <w:t xml:space="preserve">International Organization for Standardization, 2006a.</w:t>
+        <w:t xml:space="preserve">Joint Standing Committee on Treaties, 2024.</w:t>
       </w:r>
       <w:r>
         <w:t xml:space="preserve"> </w:t>
@@ -10095,10 +10100,25 @@
           <w:iCs/>
           <w:i/>
         </w:rPr>
-        <w:t xml:space="preserve">ISO 14040:2006 Environmental management — Life cycle assessment — Principles and framework</w:t>
-      </w:r>
-      <w:r>
-        <w:t xml:space="preserve">. Geneva: International Organization for Standardization.</w:t>
+        <w:t xml:space="preserve">Report 224: Agreement among Australia, the UK and the US for cooperation related to naval nuclear propulsion</w:t>
+      </w:r>
+      <w:r>
+        <w:t xml:space="preserve">, Chapter 6,</w:t>
+      </w:r>
+      <w:r>
+        <w:t xml:space="preserve"> </w:t>
+      </w:r>
+      <w:r>
+        <w:t xml:space="preserve">‘</w:t>
+      </w:r>
+      <w:r>
+        <w:t xml:space="preserve">Employment and education impacts</w:t>
+      </w:r>
+      <w:r>
+        <w:t xml:space="preserve">’</w:t>
+      </w:r>
+      <w:r>
+        <w:t xml:space="preserve">. Canberra: Parliament of Australia. Available at: https://www.aph.gov.au/Parliamentary_Business/Committees/Joint/Treaties/NuclearPropulsion/Report/Chapter_6_-_Employment_and_education_impacts [Accessed 21 October 2026].</w:t>
       </w:r>
     </w:p>
     <w:p>
@@ -10106,7 +10126,7 @@
         <w:pStyle w:val="BodyText"/>
       </w:pPr>
       <w:r>
-        <w:t xml:space="preserve">International Organization for Standardization, 2006b.</w:t>
+        <w:t xml:space="preserve">Kazatomprom, 2025.</w:t>
       </w:r>
       <w:r>
         <w:t xml:space="preserve"> </w:t>
@@ -10116,10 +10136,10 @@
           <w:iCs/>
           <w:i/>
         </w:rPr>
-        <w:t xml:space="preserve">ISO 14044:2006 Environmental management — Life cycle assessment — Requirements and guidelines</w:t>
-      </w:r>
-      <w:r>
-        <w:t xml:space="preserve">. Geneva: International Organization for Standardization. Available at: https://www.iso.org/standard/38498.html.</w:t>
+        <w:t xml:space="preserve">Integrated Annual Report 2024</w:t>
+      </w:r>
+      <w:r>
+        <w:t xml:space="preserve">. [pdf] Astana: NAC Kazatomprom JSC. Available at: https://www.kazatomprom.kz/storage/59/kap_iar_2024_eng_0205__clean.pdf [Accessed 20 October 2026].</w:t>
       </w:r>
     </w:p>
     <w:p>
@@ -10127,7 +10147,7 @@
         <w:pStyle w:val="BodyText"/>
       </w:pPr>
       <w:r>
-        <w:t xml:space="preserve">IPCC, 2006.</w:t>
+        <w:t xml:space="preserve">Kim and Macfarlane, 2026.</w:t>
       </w:r>
       <w:r>
         <w:t xml:space="preserve"> </w:t>
@@ -10137,10 +10157,10 @@
           <w:iCs/>
           <w:i/>
         </w:rPr>
-        <w:t xml:space="preserve">2006 IPCC Guidelines for National Greenhouse Gas Inventories</w:t>
-      </w:r>
-      <w:r>
-        <w:t xml:space="preserve">, Vol. 2 Energy, Ch. 2, Table 2.2. Hayama: Institute for Global Environmental Strategies.</w:t>
+        <w:t xml:space="preserve">Challenges of small modular reactors: a comprehensive exploration</w:t>
+      </w:r>
+      <w:r>
+        <w:t xml:space="preserve">. [pdf] Available at: https://www.nirs.org/wp-content/uploads/2025/09/SMR-Costs_Challenges-of-SMRs-cost-waste_Kim-Macfarlane_2026.pdf.</w:t>
       </w:r>
     </w:p>
     <w:p>
@@ -10148,7 +10168,7 @@
         <w:pStyle w:val="BodyText"/>
       </w:pPr>
       <w:r>
-        <w:t xml:space="preserve">Joint Standing Committee on Treaties, 2024.</w:t>
+        <w:t xml:space="preserve">LACCEI, 2026. Comparative life cycle assessment and structural performance analysis of eco-friendly LC3 cement for CO₂ reduction compared to Portland cement. In:</w:t>
       </w:r>
       <w:r>
         <w:t xml:space="preserve"> </w:t>
@@ -10158,25 +10178,10 @@
           <w:iCs/>
           <w:i/>
         </w:rPr>
-        <w:t xml:space="preserve">Report 224: Agreement among Australia, the UK and the US for cooperation related to naval nuclear propulsion</w:t>
-      </w:r>
-      <w:r>
-        <w:t xml:space="preserve">, Chapter 6,</w:t>
-      </w:r>
-      <w:r>
-        <w:t xml:space="preserve"> </w:t>
-      </w:r>
-      <w:r>
-        <w:t xml:space="preserve">‘</w:t>
-      </w:r>
-      <w:r>
-        <w:t xml:space="preserve">Employment and education impacts</w:t>
-      </w:r>
-      <w:r>
-        <w:t xml:space="preserve">’</w:t>
-      </w:r>
-      <w:r>
-        <w:t xml:space="preserve">. Canberra: Parliament of Australia. Available at: https://www.aph.gov.au/Parliamentary_Business/Committees/Joint/Treaties/NuclearPropulsion/Report/Chapter_6_-_Employment_and_education_impacts [Accessed 21 October 2026].</w:t>
+        <w:t xml:space="preserve">Proceedings of the 24th LACCEI International Multi-Conference for Engineering, Education and Technology</w:t>
+      </w:r>
+      <w:r>
+        <w:t xml:space="preserve">, Santiago, Chile, 15–17 July 2026. Contribution 2661. Available at: https://laccei.org/LACCEI2026-Chile/full-papers/Contribution_2661_final_a.pdf.</w:t>
       </w:r>
     </w:p>
     <w:p>
@@ -10184,7 +10189,7 @@
         <w:pStyle w:val="BodyText"/>
       </w:pPr>
       <w:r>
-        <w:t xml:space="preserve">Kazatomprom, 2025.</w:t>
+        <w:t xml:space="preserve">LC3 Project, 2015.</w:t>
       </w:r>
       <w:r>
         <w:t xml:space="preserve"> </w:t>
@@ -10194,10 +10199,13 @@
           <w:iCs/>
           <w:i/>
         </w:rPr>
-        <w:t xml:space="preserve">Integrated Annual Report 2024</w:t>
-      </w:r>
-      <w:r>
-        <w:t xml:space="preserve">. [pdf] Astana: NAC Kazatomprom JSC. Available at: https://www.kazatomprom.kz/storage/59/kap_iar_2024_eng_0205__clean.pdf [Accessed 20 October 2026].</w:t>
+        <w:t xml:space="preserve">LCA of LC3: India team progress</w:t>
+      </w:r>
+      <w:r>
+        <w:t xml:space="preserve"> </w:t>
+      </w:r>
+      <w:r>
+        <w:t xml:space="preserve">(industry meeting, September 2015). Available at: https://lc3.ch/wp-content/uploads/2023/03/LCA-of-LC3-India-team-progress-Industry-meeting-Sep-2015.pdf.</w:t>
       </w:r>
     </w:p>
     <w:p>
@@ -10205,7 +10213,7 @@
         <w:pStyle w:val="BodyText"/>
       </w:pPr>
       <w:r>
-        <w:t xml:space="preserve">Kim and Macfarlane, 2026.</w:t>
+        <w:t xml:space="preserve">Liberal Party of Australia, 2026.</w:t>
       </w:r>
       <w:r>
         <w:t xml:space="preserve"> </w:t>
@@ -10215,10 +10223,10 @@
           <w:iCs/>
           <w:i/>
         </w:rPr>
-        <w:t xml:space="preserve">Challenges of small modular reactors: a comprehensive exploration</w:t>
-      </w:r>
-      <w:r>
-        <w:t xml:space="preserve">. [pdf] Available at: https://www.nirs.org/wp-content/uploads/2025/09/SMR-Costs_Challenges-of-SMRs-cost-waste_Kim-Macfarlane_2026.pdf.</w:t>
+        <w:t xml:space="preserve">Our Plan for Cheaper Power</w:t>
+      </w:r>
+      <w:r>
+        <w:t xml:space="preserve">. [online] Available at: https://www.liberal.org.au/our-plan/energy [Accessed 20 October 2026].</w:t>
       </w:r>
     </w:p>
     <w:p>
@@ -10226,7 +10234,7 @@
         <w:pStyle w:val="BodyText"/>
       </w:pPr>
       <w:r>
-        <w:t xml:space="preserve">LACCEI, 2026. Comparative life cycle assessment and structural performance analysis of eco-friendly LC3 cement for CO₂ reduction compared to Portland cement. In:</w:t>
+        <w:t xml:space="preserve">Markandya, A. and Wilkinson, P., 2007. Electricity generation and health.</w:t>
       </w:r>
       <w:r>
         <w:t xml:space="preserve"> </w:t>
@@ -10236,10 +10244,10 @@
           <w:iCs/>
           <w:i/>
         </w:rPr>
-        <w:t xml:space="preserve">Proceedings of the 24th LACCEI International Multi-Conference for Engineering, Education and Technology</w:t>
-      </w:r>
-      <w:r>
-        <w:t xml:space="preserve">, Santiago, Chile, 15–17 July 2026. Contribution 2661. Available at: https://laccei.org/LACCEI2026-Chile/full-papers/Contribution_2661_final_a.pdf.</w:t>
+        <w:t xml:space="preserve">The Lancet</w:t>
+      </w:r>
+      <w:r>
+        <w:t xml:space="preserve">, 370(9591), pp.979–990. Available at: https://doi.org/10.1016/S0140-6736(07)61253-7 [Accessed 20 October 2026].</w:t>
       </w:r>
     </w:p>
     <w:p>
@@ -10247,7 +10255,7 @@
         <w:pStyle w:val="BodyText"/>
       </w:pPr>
       <w:r>
-        <w:t xml:space="preserve">LC3 Project, 2015.</w:t>
+        <w:t xml:space="preserve">Minister for Defence, 2025.</w:t>
       </w:r>
       <w:r>
         <w:t xml:space="preserve"> </w:t>
@@ -10257,13 +10265,10 @@
           <w:iCs/>
           <w:i/>
         </w:rPr>
-        <w:t xml:space="preserve">LCA of LC3: India team progress</w:t>
-      </w:r>
-      <w:r>
-        <w:t xml:space="preserve"> </w:t>
-      </w:r>
-      <w:r>
-        <w:t xml:space="preserve">(industry meeting, September 2015). Available at: https://lc3.ch/wp-content/uploads/2023/03/LCA-of-LC3-India-team-progress-Industry-meeting-Sep-2015.pdf.</w:t>
+        <w:t xml:space="preserve">An AUKUS milestone – launch of the Australian Naval Nuclear Power Safety Regulator</w:t>
+      </w:r>
+      <w:r>
+        <w:t xml:space="preserve">. [media release] 1 November. Available at: https://www.minister.defence.gov.au/media-releases/2025-11-01/aukus-milestone-launch-australian-naval-nuclear-power-safety-regulator [Accessed 20 October 2026].</w:t>
       </w:r>
     </w:p>
     <w:p>
@@ -10271,7 +10276,23 @@
         <w:pStyle w:val="BodyText"/>
       </w:pPr>
       <w:r>
-        <w:t xml:space="preserve">Liberal Party of Australia, 2026.</w:t>
+        <w:t xml:space="preserve">Mississaugas of Scugog Island First Nation, 2023. Written submissions to the CNSC: CMD 23-H9.18A (Darlington Waste Management Facility, January 2023); CMD 24-H2.26 (November 2023); CMD 24-H3.81 (November 2024). Available at: https://api.cnsc-ccsn.gc.ca/dms/digital-medias/CMD23-H9-18A.pdf/object [Accessed 21 October 2026].</w:t>
+      </w:r>
+    </w:p>
+    <w:p>
+      <w:pPr>
+        <w:pStyle w:val="BodyText"/>
+      </w:pPr>
+      <w:r>
+        <w:t xml:space="preserve">Municipality of Clarington, 2024. Letter / written submission to the CNSC on the DNNP licence to construct. Available at: https://api.cnsc-ccsn.gc.ca/dms/digital-medias/CMD24-H2-12.pdf/object [Accessed 21 October 2026].</w:t>
+      </w:r>
+    </w:p>
+    <w:p>
+      <w:pPr>
+        <w:pStyle w:val="BodyText"/>
+      </w:pPr>
+      <w:r>
+        <w:t xml:space="preserve">Neelam, R., 2024.</w:t>
       </w:r>
       <w:r>
         <w:t xml:space="preserve"> </w:t>
@@ -10281,10 +10302,10 @@
           <w:iCs/>
           <w:i/>
         </w:rPr>
-        <w:t xml:space="preserve">Our Plan for Cheaper Power</w:t>
-      </w:r>
-      <w:r>
-        <w:t xml:space="preserve">. [online] Available at: https://www.liberal.org.au/our-plan/energy [Accessed 20 October 2026].</w:t>
+        <w:t xml:space="preserve">Lowy Institute Poll 2024</w:t>
+      </w:r>
+      <w:r>
+        <w:t xml:space="preserve">. Sydney: Lowy Institute. Available at: https://poll.lowyinstitute.org/report/2024/ [Accessed 20 October 2026].</w:t>
       </w:r>
     </w:p>
     <w:p>
@@ -10292,7 +10313,7 @@
         <w:pStyle w:val="BodyText"/>
       </w:pPr>
       <w:r>
-        <w:t xml:space="preserve">Markandya, A. and Wilkinson, P., 2007. Electricity generation and health.</w:t>
+        <w:t xml:space="preserve">Newcastle Herald, 2024a. AGL says Liddell site will not be used for nuclear power.</w:t>
       </w:r>
       <w:r>
         <w:t xml:space="preserve"> </w:t>
@@ -10302,10 +10323,10 @@
           <w:iCs/>
           <w:i/>
         </w:rPr>
-        <w:t xml:space="preserve">The Lancet</w:t>
-      </w:r>
-      <w:r>
-        <w:t xml:space="preserve">, 370(9591), pp.979–990. Available at: https://doi.org/10.1016/S0140-6736(07)61253-7 [Accessed 20 October 2026].</w:t>
+        <w:t xml:space="preserve">Newcastle Herald</w:t>
+      </w:r>
+      <w:r>
+        <w:t xml:space="preserve">. [online] Available at: https://www.newcastleherald.com.au/story/8557276/agl-says-liddell-site-will-not-be-used-for-nuclear-power [Accessed 20 October 2026].</w:t>
       </w:r>
     </w:p>
     <w:p>
@@ -10313,7 +10334,7 @@
         <w:pStyle w:val="BodyText"/>
       </w:pPr>
       <w:r>
-        <w:t xml:space="preserve">Minister for Defence, 2025.</w:t>
+        <w:t xml:space="preserve">Newcastle Herald, 2024b. Coalition government could seize Liddell for nuclear power plant; Dutton’s nuclear energy plan divides opinion in the Hunter.</w:t>
       </w:r>
       <w:r>
         <w:t xml:space="preserve"> </w:t>
@@ -10323,10 +10344,10 @@
           <w:iCs/>
           <w:i/>
         </w:rPr>
-        <w:t xml:space="preserve">An AUKUS milestone – launch of the Australian Naval Nuclear Power Safety Regulator</w:t>
-      </w:r>
-      <w:r>
-        <w:t xml:space="preserve">. [media release] 1 November. Available at: https://www.minister.defence.gov.au/media-releases/2025-11-01/aukus-milestone-launch-australian-naval-nuclear-power-safety-regulator [Accessed 20 October 2026].</w:t>
+        <w:t xml:space="preserve">Newcastle Herald</w:t>
+      </w:r>
+      <w:r>
+        <w:t xml:space="preserve">. [online] Available at: https://newcastleherald.com.au/story/8670020/ and https://newcastleherald.com.au/story/8668177/ [Accessed 21 October 2026].</w:t>
       </w:r>
     </w:p>
     <w:p>
@@ -10334,23 +10355,7 @@
         <w:pStyle w:val="BodyText"/>
       </w:pPr>
       <w:r>
-        <w:t xml:space="preserve">Mississaugas of Scugog Island First Nation, 2023. Written submissions to the CNSC: CMD 23-H9.18A (Darlington Waste Management Facility, January 2023); CMD 24-H2.26 (November 2023); CMD 24-H3.81 (November 2024). Available at: https://api.cnsc-ccsn.gc.ca/dms/digital-medias/CMD23-H9-18A.pdf/object [Accessed 21 October 2026].</w:t>
-      </w:r>
-    </w:p>
-    <w:p>
-      <w:pPr>
-        <w:pStyle w:val="BodyText"/>
-      </w:pPr>
-      <w:r>
-        <w:t xml:space="preserve">Municipality of Clarington, 2024. Letter / written submission to the CNSC on the DNNP licence to construct. Available at: https://api.cnsc-ccsn.gc.ca/dms/digital-medias/CMD24-H2-12.pdf/object [Accessed 21 October 2026].</w:t>
-      </w:r>
-    </w:p>
-    <w:p>
-      <w:pPr>
-        <w:pStyle w:val="BodyText"/>
-      </w:pPr>
-      <w:r>
-        <w:t xml:space="preserve">Neelam, R., 2024.</w:t>
+        <w:t xml:space="preserve">Newspoll, 2007. National survey on nuclear power, 2–4 March 2007 (n ≈ 1,200). Published in</w:t>
       </w:r>
       <w:r>
         <w:t xml:space="preserve"> </w:t>
@@ -10360,10 +10365,10 @@
           <w:iCs/>
           <w:i/>
         </w:rPr>
-        <w:t xml:space="preserve">Lowy Institute Poll 2024</w:t>
-      </w:r>
-      <w:r>
-        <w:t xml:space="preserve">. Sydney: Lowy Institute. Available at: https://poll.lowyinstitute.org/report/2024/ [Accessed 20 October 2026].</w:t>
+        <w:t xml:space="preserve">The Australian</w:t>
+      </w:r>
+      <w:r>
+        <w:t xml:space="preserve">.</w:t>
       </w:r>
     </w:p>
     <w:p>
@@ -10371,7 +10376,7 @@
         <w:pStyle w:val="BodyText"/>
       </w:pPr>
       <w:r>
-        <w:t xml:space="preserve">Newcastle Herald, 2024a. AGL says Liddell site will not be used for nuclear power.</w:t>
+        <w:t xml:space="preserve">Ng, J.H.C., Vyawahare, P., Benavides, P.T., Gan, Y., Sun, P., Boardman, R., Marcinkoski, J. and Elgowainy, A., 2025. Life-cycle greenhouse gas emissions associated with nuclear power generation in the United States.</w:t>
       </w:r>
       <w:r>
         <w:t xml:space="preserve"> </w:t>
@@ -10381,10 +10386,10 @@
           <w:iCs/>
           <w:i/>
         </w:rPr>
-        <w:t xml:space="preserve">Newcastle Herald</w:t>
-      </w:r>
-      <w:r>
-        <w:t xml:space="preserve">. [online] Available at: https://www.newcastleherald.com.au/story/8557276/agl-says-liddell-site-will-not-be-used-for-nuclear-power [Accessed 20 October 2026].</w:t>
+        <w:t xml:space="preserve">Journal of Industrial Ecology</w:t>
+      </w:r>
+      <w:r>
+        <w:t xml:space="preserve">, 29(3), pp.719–732. Available at: https://doi.org/10.1111/jiec.70008.</w:t>
       </w:r>
     </w:p>
     <w:p>
@@ -10392,7 +10397,7 @@
         <w:pStyle w:val="BodyText"/>
       </w:pPr>
       <w:r>
-        <w:t xml:space="preserve">Newcastle Herald, 2024b. Coalition government could seize Liddell for nuclear power plant; Dutton’s nuclear energy plan divides opinion in the Hunter.</w:t>
+        <w:t xml:space="preserve">Norton Rose Fulbright, 2025.</w:t>
       </w:r>
       <w:r>
         <w:t xml:space="preserve"> </w:t>
@@ -10402,10 +10407,10 @@
           <w:iCs/>
           <w:i/>
         </w:rPr>
-        <w:t xml:space="preserve">Newcastle Herald</w:t>
-      </w:r>
-      <w:r>
-        <w:t xml:space="preserve">. [online] Available at: https://newcastleherald.com.au/story/8670020/ and https://newcastleherald.com.au/story/8668177/ [Accessed 21 October 2026].</w:t>
+        <w:t xml:space="preserve">Key amendments to the Environment Protection Reform Act 2025 and their implications for the EPBC Act</w:t>
+      </w:r>
+      <w:r>
+        <w:t xml:space="preserve">. [online] Available at: https://www.nortonrosefulbright.com/en-au/knowledge/publications/df336551/key-amendments-to-the-environment-protection-reform-act-2025-and-their-implications-for-the-epbc-act [Accessed 20 October 2026].</w:t>
       </w:r>
     </w:p>
     <w:p>
@@ -10413,7 +10418,7 @@
         <w:pStyle w:val="BodyText"/>
       </w:pPr>
       <w:r>
-        <w:t xml:space="preserve">Newspoll, 2007. National survey on nuclear power, 2–4 March 2007 (n ≈ 1,200). Published in</w:t>
+        <w:t xml:space="preserve">NRMCA, 2021.</w:t>
       </w:r>
       <w:r>
         <w:t xml:space="preserve"> </w:t>
@@ -10423,10 +10428,10 @@
           <w:iCs/>
           <w:i/>
         </w:rPr>
-        <w:t xml:space="preserve">The Australian</w:t>
-      </w:r>
-      <w:r>
-        <w:t xml:space="preserve">.</w:t>
+        <w:t xml:space="preserve">Environmental Product Declaration EPD 20046: St Marys Cement, Bowmanville plant</w:t>
+      </w:r>
+      <w:r>
+        <w:t xml:space="preserve">. [pdf] Available at: https://www.nrmca.org/wp-content/uploads/2021/09/NRMCA_EPD20046StMarys_EPD_BOW_Sep2021.pdf.</w:t>
       </w:r>
     </w:p>
     <w:p>
@@ -10434,7 +10439,7 @@
         <w:pStyle w:val="BodyText"/>
       </w:pPr>
       <w:r>
-        <w:t xml:space="preserve">Ng, J.H.C., Vyawahare, P., Benavides, P.T., Gan, Y., Sun, P., Boardman, R., Marcinkoski, J. and Elgowainy, A., 2025. Life-cycle greenhouse gas emissions associated with nuclear power generation in the United States.</w:t>
+        <w:t xml:space="preserve">Nuclear Waste Management Organization, 2024a.</w:t>
       </w:r>
       <w:r>
         <w:t xml:space="preserve"> </w:t>
@@ -10444,10 +10449,10 @@
           <w:iCs/>
           <w:i/>
         </w:rPr>
-        <w:t xml:space="preserve">Journal of Industrial Ecology</w:t>
-      </w:r>
-      <w:r>
-        <w:t xml:space="preserve">, 29(3), pp.719–732. Available at: https://doi.org/10.1111/jiec.70008.</w:t>
+        <w:t xml:space="preserve">The Nuclear Waste Management Organization selects site for Canada’s deep geological repository for used nuclear fuel</w:t>
+      </w:r>
+      <w:r>
+        <w:t xml:space="preserve">. [news release] 28 November. Toronto: Nuclear Waste Management Organization. Available at: https://www.nwmo.ca/News/The-Nuclear-Waste-Management-Organization-selects-site-for-Canadas-deep-geological-repository [Accessed 21 October 2026].</w:t>
       </w:r>
     </w:p>
     <w:p>
@@ -10455,7 +10460,7 @@
         <w:pStyle w:val="BodyText"/>
       </w:pPr>
       <w:r>
-        <w:t xml:space="preserve">Norton Rose Fulbright, 2025.</w:t>
+        <w:t xml:space="preserve">Nuclear Waste Management Organization, 2024b.</w:t>
       </w:r>
       <w:r>
         <w:t xml:space="preserve"> </w:t>
@@ -10465,10 +10470,10 @@
           <w:iCs/>
           <w:i/>
         </w:rPr>
-        <w:t xml:space="preserve">Key amendments to the Environment Protection Reform Act 2025 and their implications for the EPBC Act</w:t>
-      </w:r>
-      <w:r>
-        <w:t xml:space="preserve">. [online] Available at: https://www.nortonrosefulbright.com/en-au/knowledge/publications/df336551/key-amendments-to-the-environment-protection-reform-act-2025-and-their-implications-for-the-epbc-act [Accessed 20 October 2026].</w:t>
+        <w:t xml:space="preserve">Implementing Adaptive Phased Management 2024–28: Selecting a site</w:t>
+      </w:r>
+      <w:r>
+        <w:t xml:space="preserve">. Available at: https://implementationplan.nwmo.ca/2024_28/selecting-a-site/ [Accessed 21 October 2026].</w:t>
       </w:r>
     </w:p>
     <w:p>
@@ -10476,7 +10481,7 @@
         <w:pStyle w:val="BodyText"/>
       </w:pPr>
       <w:r>
-        <w:t xml:space="preserve">NRMCA, 2021.</w:t>
+        <w:t xml:space="preserve">Nuclear Waste Management Organization, 2024c.</w:t>
       </w:r>
       <w:r>
         <w:t xml:space="preserve"> </w:t>
@@ -10486,10 +10491,10 @@
           <w:iCs/>
           <w:i/>
         </w:rPr>
-        <w:t xml:space="preserve">Environmental Product Declaration EPD 20046: St Marys Cement, Bowmanville plant</w:t>
-      </w:r>
-      <w:r>
-        <w:t xml:space="preserve">. [pdf] Available at: https://www.nrmca.org/wp-content/uploads/2021/09/NRMCA_EPD20046StMarys_EPD_BOW_Sep2021.pdf.</w:t>
+        <w:t xml:space="preserve">Mayor and Council of the Township of Ignace sign historic potential hosting agreement with the NWMO</w:t>
+      </w:r>
+      <w:r>
+        <w:t xml:space="preserve">. [news release] March. Available at: https://www.nwmo.ca/news/mayor-and-council-of-the-township-of-ignace-sign-historic–potential-hosting-agreement-with-the-nwmo [Accessed 21 October 2026].</w:t>
       </w:r>
     </w:p>
     <w:p>
@@ -10497,7 +10502,7 @@
         <w:pStyle w:val="BodyText"/>
       </w:pPr>
       <w:r>
-        <w:t xml:space="preserve">Nuclear Waste Management Organization, 2024a.</w:t>
+        <w:t xml:space="preserve">Nuclear Waste Management Organization, n.d.</w:t>
       </w:r>
       <w:r>
         <w:t xml:space="preserve"> </w:t>
@@ -10507,10 +10512,10 @@
           <w:iCs/>
           <w:i/>
         </w:rPr>
-        <w:t xml:space="preserve">The Nuclear Waste Management Organization selects site for Canada’s deep geological repository for used nuclear fuel</w:t>
-      </w:r>
-      <w:r>
-        <w:t xml:space="preserve">. [news release] 28 November. Toronto: Nuclear Waste Management Organization. Available at: https://www.nwmo.ca/News/The-Nuclear-Waste-Management-Organization-selects-site-for-Canadas-deep-geological-repository [Accessed 21 October 2026].</w:t>
+        <w:t xml:space="preserve">Project costs</w:t>
+      </w:r>
+      <w:r>
+        <w:t xml:space="preserve">. [online] Available at: https://www.nwmo.ca/Who-we-are/Funding/Project-Costs [Accessed 21 October 2026].</w:t>
       </w:r>
     </w:p>
     <w:p>
@@ -10518,7 +10523,7 @@
         <w:pStyle w:val="BodyText"/>
       </w:pPr>
       <w:r>
-        <w:t xml:space="preserve">Nuclear Waste Management Organization, 2024b.</w:t>
+        <w:t xml:space="preserve">NuScale Power Corporation, 2023.</w:t>
       </w:r>
       <w:r>
         <w:t xml:space="preserve"> </w:t>
@@ -10528,10 +10533,13 @@
           <w:iCs/>
           <w:i/>
         </w:rPr>
-        <w:t xml:space="preserve">Implementing Adaptive Phased Management 2024–28: Selecting a site</w:t>
-      </w:r>
-      <w:r>
-        <w:t xml:space="preserve">. Available at: https://implementationplan.nwmo.ca/2024_28/selecting-a-site/ [Accessed 21 October 2026].</w:t>
+        <w:t xml:space="preserve">Amendment No. 3 to Development Cost Reimbursement Agreement</w:t>
+      </w:r>
+      <w:r>
+        <w:t xml:space="preserve"> </w:t>
+      </w:r>
+      <w:r>
+        <w:t xml:space="preserve">[exhibit to Form 10-Q / 424B3]. Washington, DC: US Securities and Exchange Commission. Available at: https://www.sec.gov/Archives/edgar/data/1822966/000182296623000092/a101dcraamendment3execut.htm [Accessed 20 October 2026].</w:t>
       </w:r>
     </w:p>
     <w:p>
@@ -10539,7 +10547,7 @@
         <w:pStyle w:val="BodyText"/>
       </w:pPr>
       <w:r>
-        <w:t xml:space="preserve">Nuclear Waste Management Organization, 2024c.</w:t>
+        <w:t xml:space="preserve">NuScale Power Corporation, 2026.</w:t>
       </w:r>
       <w:r>
         <w:t xml:space="preserve"> </w:t>
@@ -10549,10 +10557,10 @@
           <w:iCs/>
           <w:i/>
         </w:rPr>
-        <w:t xml:space="preserve">Mayor and Council of the Township of Ignace sign historic potential hosting agreement with the NWMO</w:t>
-      </w:r>
-      <w:r>
-        <w:t xml:space="preserve">. [news release] March. Available at: https://www.nwmo.ca/news/mayor-and-council-of-the-township-of-ignace-sign-historic–potential-hosting-agreement-with-the-nwmo [Accessed 21 October 2026].</w:t>
+        <w:t xml:space="preserve">Form 10-K for the fiscal year ended 31 December 2025</w:t>
+      </w:r>
+      <w:r>
+        <w:t xml:space="preserve">. Washington, DC: US Securities and Exchange Commission. Available at: https://www.sec.gov/Archives/edgar/data/1822966/000182296626000018/smr-20251231.htm.</w:t>
       </w:r>
     </w:p>
     <w:p>
@@ -10560,7 +10568,7 @@
         <w:pStyle w:val="BodyText"/>
       </w:pPr>
       <w:r>
-        <w:t xml:space="preserve">Nuclear Waste Management Organization, n.d.</w:t>
+        <w:t xml:space="preserve">NuScale Power Corporation and Utah Associated Municipal Power Systems, 2023.</w:t>
       </w:r>
       <w:r>
         <w:t xml:space="preserve"> </w:t>
@@ -10570,10 +10578,13 @@
           <w:iCs/>
           <w:i/>
         </w:rPr>
-        <w:t xml:space="preserve">Project costs</w:t>
-      </w:r>
-      <w:r>
-        <w:t xml:space="preserve">. [online] Available at: https://www.nwmo.ca/Who-we-are/Funding/Project-Costs [Accessed 21 October 2026].</w:t>
+        <w:t xml:space="preserve">UAMPS and NuScale Power agree to terminate the Carbon Free Power Project</w:t>
+      </w:r>
+      <w:r>
+        <w:t xml:space="preserve"> </w:t>
+      </w:r>
+      <w:r>
+        <w:t xml:space="preserve">[joint press release, 8 November 2023]. Exhibit to NuScale Power Corporation Form 8-K. Washington, DC: US Securities and Exchange Commission. Available at: https://www.sec.gov/Archives/edgar/data/1822966/000182296623000256/uampsnuscalejointpressre.htm [Accessed 20 October 2026].</w:t>
       </w:r>
     </w:p>
     <w:p>
@@ -10581,7 +10592,7 @@
         <w:pStyle w:val="BodyText"/>
       </w:pPr>
       <w:r>
-        <w:t xml:space="preserve">NuScale Power Corporation, 2023.</w:t>
+        <w:t xml:space="preserve">OECD Nuclear Energy Agency and International Atomic Energy Agency, 2025.</w:t>
       </w:r>
       <w:r>
         <w:t xml:space="preserve"> </w:t>
@@ -10591,13 +10602,10 @@
           <w:iCs/>
           <w:i/>
         </w:rPr>
-        <w:t xml:space="preserve">Amendment No. 3 to Development Cost Reimbursement Agreement</w:t>
-      </w:r>
-      <w:r>
-        <w:t xml:space="preserve"> </w:t>
-      </w:r>
-      <w:r>
-        <w:t xml:space="preserve">[exhibit to Form 10-Q / 424B3]. Washington, DC: US Securities and Exchange Commission. Available at: https://www.sec.gov/Archives/edgar/data/1822966/000182296623000092/a101dcraamendment3execut.htm [Accessed 20 October 2026].</w:t>
+        <w:t xml:space="preserve">Uranium 2024: Resources, Production and Demand</w:t>
+      </w:r>
+      <w:r>
+        <w:t xml:space="preserve">. [pdf] Paris: OECD Publishing. Available at: https://www.oecd-nea.org/jcms/pl_103179/uranium-2024-resources-production-and-demand [Accessed 20 October 2026].</w:t>
       </w:r>
     </w:p>
     <w:p>
@@ -10605,7 +10613,7 @@
         <w:pStyle w:val="BodyText"/>
       </w:pPr>
       <w:r>
-        <w:t xml:space="preserve">NuScale Power Corporation, 2026.</w:t>
+        <w:t xml:space="preserve">OECD Nuclear Energy Agency and International Atomic Energy Agency, 2026.</w:t>
       </w:r>
       <w:r>
         <w:t xml:space="preserve"> </w:t>
@@ -10615,10 +10623,10 @@
           <w:iCs/>
           <w:i/>
         </w:rPr>
-        <w:t xml:space="preserve">Form 10-K for the fiscal year ended 31 December 2025</w:t>
-      </w:r>
-      <w:r>
-        <w:t xml:space="preserve">. Washington, DC: US Securities and Exchange Commission. Available at: https://www.sec.gov/Archives/edgar/data/1822966/000182296626000018/smr-20251231.htm.</w:t>
+        <w:t xml:space="preserve">Uranium 2026: Resources, Production and Demand</w:t>
+      </w:r>
+      <w:r>
+        <w:t xml:space="preserve">. [pdf] Paris: OECD Publishing. Available at: https://www.oecd-nea.org/jcms/pl_121658/uranium-2026-resources-production-and-demand [Accessed 20 October 2026].</w:t>
       </w:r>
     </w:p>
     <w:p>
@@ -10626,7 +10634,15 @@
         <w:pStyle w:val="BodyText"/>
       </w:pPr>
       <w:r>
-        <w:t xml:space="preserve">NuScale Power Corporation and Utah Associated Municipal Power Systems, 2023.</w:t>
+        <w:t xml:space="preserve">Ontario Power Generation, 2023. OPG selects first fuel suppliers for its small modular reactor. [press release] Toronto: Ontario Power Generation.</w:t>
+      </w:r>
+    </w:p>
+    <w:p>
+      <w:pPr>
+        <w:pStyle w:val="BodyText"/>
+      </w:pPr>
+      <w:r>
+        <w:t xml:space="preserve">Ontario Power Generation, 2025a.</w:t>
       </w:r>
       <w:r>
         <w:t xml:space="preserve"> </w:t>
@@ -10636,13 +10652,10 @@
           <w:iCs/>
           <w:i/>
         </w:rPr>
-        <w:t xml:space="preserve">UAMPS and NuScale Power agree to terminate the Carbon Free Power Project</w:t>
-      </w:r>
-      <w:r>
-        <w:t xml:space="preserve"> </w:t>
-      </w:r>
-      <w:r>
-        <w:t xml:space="preserve">[joint press release, 8 November 2023]. Exhibit to NuScale Power Corporation Form 8-K. Washington, DC: US Securities and Exchange Commission. Available at: https://www.sec.gov/Archives/edgar/data/1822966/000182296623000256/uampsnuscalejointpressre.htm [Accessed 20 October 2026].</w:t>
+        <w:t xml:space="preserve">OPG reports 2025 first quarter financial results</w:t>
+      </w:r>
+      <w:r>
+        <w:t xml:space="preserve">. [online] News release, 13 May. Toronto: Ontario Power Generation. Available at: https://www.opg.com/news-resources/newsroom/release/opg-reports-2025-first-quarter-financial-results/ [Accessed 20 October 2026].</w:t>
       </w:r>
     </w:p>
     <w:p>
@@ -10650,7 +10663,7 @@
         <w:pStyle w:val="BodyText"/>
       </w:pPr>
       <w:r>
-        <w:t xml:space="preserve">OECD Nuclear Energy Agency and International Atomic Energy Agency, 2025.</w:t>
+        <w:t xml:space="preserve">Ontario Power Generation, 2025b.</w:t>
       </w:r>
       <w:r>
         <w:t xml:space="preserve"> </w:t>
@@ -10660,10 +10673,13 @@
           <w:iCs/>
           <w:i/>
         </w:rPr>
-        <w:t xml:space="preserve">Uranium 2024: Resources, Production and Demand</w:t>
-      </w:r>
-      <w:r>
-        <w:t xml:space="preserve">. [pdf] Paris: OECD Publishing. Available at: https://www.oecd-nea.org/jcms/pl_103179/uranium-2024-resources-production-and-demand [Accessed 20 October 2026].</w:t>
+        <w:t xml:space="preserve">EB-2025-0297, Exhibit D2, Tab 4, Schedule 1: Darlington New Nuclear Project overview</w:t>
+      </w:r>
+      <w:r>
+        <w:t xml:space="preserve"> </w:t>
+      </w:r>
+      <w:r>
+        <w:t xml:space="preserve">(updated 21 May 2026). [pdf] Filed with the Ontario Energy Board. Available at: https://files.opg.com/wp-content/uploads/2026/05/D2-04-01-Darlington-New-Nuclear-Project-Overview_Updated_20260521_260522_191835.pdf [Accessed 20 October 2026].</w:t>
       </w:r>
     </w:p>
     <w:p>
@@ -10671,15 +10687,7 @@
         <w:pStyle w:val="BodyText"/>
       </w:pPr>
       <w:r>
-        <w:t xml:space="preserve">Ontario Power Generation, 2023. OPG selects first fuel suppliers for its small modular reactor. [press release] Toronto: Ontario Power Generation.</w:t>
-      </w:r>
-    </w:p>
-    <w:p>
-      <w:pPr>
-        <w:pStyle w:val="BodyText"/>
-      </w:pPr>
-      <w:r>
-        <w:t xml:space="preserve">Ontario Power Generation, 2025a.</w:t>
+        <w:t xml:space="preserve">Ontario Power Generation, 2025c.</w:t>
       </w:r>
       <w:r>
         <w:t xml:space="preserve"> </w:t>
@@ -10689,10 +10697,10 @@
           <w:iCs/>
           <w:i/>
         </w:rPr>
-        <w:t xml:space="preserve">OPG reports 2025 first quarter financial results</w:t>
-      </w:r>
-      <w:r>
-        <w:t xml:space="preserve">. [online] News release, 13 May. Toronto: Ontario Power Generation. Available at: https://www.opg.com/news-resources/newsroom/release/opg-reports-2025-first-quarter-financial-results/ [Accessed 20 October 2026].</w:t>
+        <w:t xml:space="preserve">Darlington New Nuclear Project construction update</w:t>
+      </w:r>
+      <w:r>
+        <w:t xml:space="preserve">. [online] Available at: https://www.opg.com/projects-services/projects/nuclear/smr/darlington-smr/.</w:t>
       </w:r>
     </w:p>
     <w:p>
@@ -10700,7 +10708,7 @@
         <w:pStyle w:val="BodyText"/>
       </w:pPr>
       <w:r>
-        <w:t xml:space="preserve">Ontario Power Generation, 2025b.</w:t>
+        <w:t xml:space="preserve">Ontario Power Generation, 2026a.</w:t>
       </w:r>
       <w:r>
         <w:t xml:space="preserve"> </w:t>
@@ -10710,13 +10718,10 @@
           <w:iCs/>
           <w:i/>
         </w:rPr>
-        <w:t xml:space="preserve">EB-2025-0297, Exhibit D2, Tab 4, Schedule 1: Darlington New Nuclear Project overview</w:t>
-      </w:r>
-      <w:r>
-        <w:t xml:space="preserve"> </w:t>
-      </w:r>
-      <w:r>
-        <w:t xml:space="preserve">(updated 21 May 2026). [pdf] Filed with the Ontario Energy Board. Available at: https://files.opg.com/wp-content/uploads/2026/05/D2-04-01-Darlington-New-Nuclear-Project-Overview_Updated_20260521_260522_191835.pdf [Accessed 20 October 2026].</w:t>
+        <w:t xml:space="preserve">OPG reports 2026 first quarter financial results</w:t>
+      </w:r>
+      <w:r>
+        <w:t xml:space="preserve">. [online] Available at: https://www.opg.com/news-resources/newsroom/release/opg-reports-2026-first-quarter-financial-results/ [Accessed 20 October 2026].</w:t>
       </w:r>
     </w:p>
     <w:p>
@@ -10724,7 +10729,15 @@
         <w:pStyle w:val="BodyText"/>
       </w:pPr>
       <w:r>
-        <w:t xml:space="preserve">Ontario Power Generation, 2025c.</w:t>
+        <w:t xml:space="preserve">Ontario Power Generation, 2026b. Interrogatory response giving the Darlington New Nuclear Project levelised cost, EB-2025-0297. Filed with the Ontario Energy Board.</w:t>
+      </w:r>
+    </w:p>
+    <w:p>
+      <w:pPr>
+        <w:pStyle w:val="BodyText"/>
+      </w:pPr>
+      <w:r>
+        <w:t xml:space="preserve">Parker, D.J., McNaughton, C.S. and Sparrow, G.A., 2016. Life cycle greenhouse gas emissions from uranium mining and milling in Canada.</w:t>
       </w:r>
       <w:r>
         <w:t xml:space="preserve"> </w:t>
@@ -10734,10 +10747,10 @@
           <w:iCs/>
           <w:i/>
         </w:rPr>
-        <w:t xml:space="preserve">Darlington New Nuclear Project construction update</w:t>
-      </w:r>
-      <w:r>
-        <w:t xml:space="preserve">. [online] Available at: https://www.opg.com/projects-services/projects/nuclear/smr/darlington-smr/.</w:t>
+        <w:t xml:space="preserve">Environmental Science &amp; Technology</w:t>
+      </w:r>
+      <w:r>
+        <w:t xml:space="preserve">, 50(17), pp.9746–9753. Available at: https://pubs.acs.org/doi/10.1021/acs.est.5b06072.</w:t>
       </w:r>
     </w:p>
     <w:p>
@@ -10745,7 +10758,7 @@
         <w:pStyle w:val="BodyText"/>
       </w:pPr>
       <w:r>
-        <w:t xml:space="preserve">Ontario Power Generation, 2026a.</w:t>
+        <w:t xml:space="preserve">Parliament of Australia, 2026.</w:t>
       </w:r>
       <w:r>
         <w:t xml:space="preserve"> </w:t>
@@ -10755,10 +10768,10 @@
           <w:iCs/>
           <w:i/>
         </w:rPr>
-        <w:t xml:space="preserve">OPG reports 2026 first quarter financial results</w:t>
-      </w:r>
-      <w:r>
-        <w:t xml:space="preserve">. [online] Available at: https://www.opg.com/news-resources/newsroom/release/opg-reports-2026-first-quarter-financial-results/ [Accessed 20 October 2026].</w:t>
+        <w:t xml:space="preserve">Senate composition</w:t>
+      </w:r>
+      <w:r>
+        <w:t xml:space="preserve">. [online] Available at: https://www.aph.gov.au/Senators_and_Members/Senators/Senate_composition [Accessed 20 October 2026].</w:t>
       </w:r>
     </w:p>
     <w:p>
@@ -10766,15 +10779,7 @@
         <w:pStyle w:val="BodyText"/>
       </w:pPr>
       <w:r>
-        <w:t xml:space="preserve">Ontario Power Generation, 2026b. Interrogatory response giving the Darlington New Nuclear Project levelised cost, EB-2025-0297. Filed with the Ontario Energy Board.</w:t>
-      </w:r>
-    </w:p>
-    <w:p>
-      <w:pPr>
-        <w:pStyle w:val="BodyText"/>
-      </w:pPr>
-      <w:r>
-        <w:t xml:space="preserve">Parker, D.J., McNaughton, C.S. and Sparrow, G.A., 2016. Life cycle greenhouse gas emissions from uranium mining and milling in Canada.</w:t>
+        <w:t xml:space="preserve">Parliament of New South Wales, 2025.</w:t>
       </w:r>
       <w:r>
         <w:t xml:space="preserve"> </w:t>
@@ -10784,10 +10789,10 @@
           <w:iCs/>
           <w:i/>
         </w:rPr>
-        <w:t xml:space="preserve">Environmental Science &amp; Technology</w:t>
-      </w:r>
-      <w:r>
-        <w:t xml:space="preserve">, 50(17), pp.9746–9753. Available at: https://pubs.acs.org/doi/10.1021/acs.est.5b06072.</w:t>
+        <w:t xml:space="preserve">Uranium Mining and Nuclear Facilities (Prohibitions) Repeal Bill 2025</w:t>
+      </w:r>
+      <w:r>
+        <w:t xml:space="preserve">: bill details. [online] Available at: https://www.parliament.nsw.gov.au/bills/Pages/bill-details.aspx?pk=18833 [Accessed 20 October 2026].</w:t>
       </w:r>
     </w:p>
     <w:p>
@@ -10795,7 +10800,7 @@
         <w:pStyle w:val="BodyText"/>
       </w:pPr>
       <w:r>
-        <w:t xml:space="preserve">Parliament of Australia, 2026.</w:t>
+        <w:t xml:space="preserve">Parliament of New South Wales, 2026.</w:t>
       </w:r>
       <w:r>
         <w:t xml:space="preserve"> </w:t>
@@ -10805,10 +10810,10 @@
           <w:iCs/>
           <w:i/>
         </w:rPr>
-        <w:t xml:space="preserve">Senate composition</w:t>
-      </w:r>
-      <w:r>
-        <w:t xml:space="preserve">. [online] Available at: https://www.aph.gov.au/Senators_and_Members/Senators/Senate_composition [Accessed 20 October 2026].</w:t>
+        <w:t xml:space="preserve">Legislative Assembly Notice Paper</w:t>
+      </w:r>
+      <w:r>
+        <w:t xml:space="preserve">. [pdf] Available at: https://files.parliament.nsw.gov.au/fileapi/ParlFiles/GetArtifact/170%20NOM%20(combined).pdf?serverRelativeUrl=%2Fhp%2Fhousepaper%2F31312%2F170+NOM+%28combined%29.pdf [Accessed 20 October 2026].</w:t>
       </w:r>
     </w:p>
     <w:p>
@@ -10816,7 +10821,7 @@
         <w:pStyle w:val="BodyText"/>
       </w:pPr>
       <w:r>
-        <w:t xml:space="preserve">Parliament of New South Wales, 2025.</w:t>
+        <w:t xml:space="preserve">Parliamentary Library, 2024.</w:t>
       </w:r>
       <w:r>
         <w:t xml:space="preserve"> </w:t>
@@ -10826,10 +10831,10 @@
           <w:iCs/>
           <w:i/>
         </w:rPr>
-        <w:t xml:space="preserve">Uranium Mining and Nuclear Facilities (Prohibitions) Repeal Bill 2025</w:t>
-      </w:r>
-      <w:r>
-        <w:t xml:space="preserve">: bill details. [online] Available at: https://www.parliament.nsw.gov.au/bills/Pages/bill-details.aspx?pk=18833 [Accessed 20 October 2026].</w:t>
+        <w:t xml:space="preserve">Current prohibitions on nuclear activities in Australia: a quick guide</w:t>
+      </w:r>
+      <w:r>
+        <w:t xml:space="preserve">. Research Paper Series 2023–24, Quick Guide. [online] Canberra: Parliamentary Library, Parliament of Australia, 30 May. Available at: https://www.aph.gov.au/About_Parliament/Parliamentary_departments/Parliamentary_Library/Research/Quick_Guides/2023-24/NuclearActivitiesProhibitions [Accessed 21 October 2026].</w:t>
       </w:r>
     </w:p>
     <w:p>
@@ -10837,7 +10842,7 @@
         <w:pStyle w:val="BodyText"/>
       </w:pPr>
       <w:r>
-        <w:t xml:space="preserve">Parliament of New South Wales, Legislative Assembly, 2026.</w:t>
+        <w:t xml:space="preserve">Peterson, P.F., Zhao, H. and Petroski, R., 2005.</w:t>
       </w:r>
       <w:r>
         <w:t xml:space="preserve"> </w:t>
@@ -10847,10 +10852,13 @@
           <w:iCs/>
           <w:i/>
         </w:rPr>
-        <w:t xml:space="preserve">Notice Paper</w:t>
-      </w:r>
-      <w:r>
-        <w:t xml:space="preserve">. [pdf] Available at: https://files.parliament.nsw.gov.au/fileapi/ParlFiles/GetArtifact/170%20NOM%20(combined).pdf?serverRelativeUrl=%2Fhp%2Fhousepaper%2F31312%2F170+NOM+%28combined%29.pdf [Accessed 20 October 2026].</w:t>
+        <w:t xml:space="preserve">Metal and concrete inputs for several nuclear power plants</w:t>
+      </w:r>
+      <w:r>
+        <w:t xml:space="preserve"> </w:t>
+      </w:r>
+      <w:r>
+        <w:t xml:space="preserve">(UCBTH-05-001). [pdf] Berkeley: University of California, Berkeley. Available at: https://fhr.nuc.berkeley.edu/wp-content/uploads/2014/10/05-001-A_Material_input.pdf.</w:t>
       </w:r>
     </w:p>
     <w:p>
@@ -10858,7 +10866,7 @@
         <w:pStyle w:val="BodyText"/>
       </w:pPr>
       <w:r>
-        <w:t xml:space="preserve">Parliamentary Library, 2023.</w:t>
+        <w:t xml:space="preserve">Pillai, R.G. et al., 2019. Service life and life cycle assessment of reinforced concrete systems with limestone calcined clay cement (LC³).</w:t>
       </w:r>
       <w:r>
         <w:t xml:space="preserve"> </w:t>
@@ -10868,13 +10876,10 @@
           <w:iCs/>
           <w:i/>
         </w:rPr>
-        <w:t xml:space="preserve">Australian Naval Nuclear Power Safety Bill 2023</w:t>
-      </w:r>
-      <w:r>
-        <w:t xml:space="preserve"> </w:t>
-      </w:r>
-      <w:r>
-        <w:t xml:space="preserve">[and related bill], Bills Digest No. 32, 2023–24. [online] Canberra: Parliament of Australia. Available at: https://aph.gov.au/Parliamentary_Business/Bills_Legislation/bd/bd2324a/24bd32 [Accessed 20 October 2026].</w:t>
+        <w:t xml:space="preserve">Cement and Concrete Research</w:t>
+      </w:r>
+      <w:r>
+        <w:t xml:space="preserve">, 118, pp.111–119. Available at: https://doi.org/10.1016/j.cemconres.2018.11.019.</w:t>
       </w:r>
     </w:p>
     <w:p>
@@ -10882,7 +10887,7 @@
         <w:pStyle w:val="BodyText"/>
       </w:pPr>
       <w:r>
-        <w:t xml:space="preserve">Parliamentary Library, 2024.</w:t>
+        <w:t xml:space="preserve">Power Engineering, 2023. OPG selects first fuel suppliers for its small modular reactors.</w:t>
       </w:r>
       <w:r>
         <w:t xml:space="preserve"> </w:t>
@@ -10892,10 +10897,10 @@
           <w:iCs/>
           <w:i/>
         </w:rPr>
-        <w:t xml:space="preserve">Current prohibitions on nuclear activities in Australia: a quick guide</w:t>
-      </w:r>
-      <w:r>
-        <w:t xml:space="preserve">. Research Paper Series 2023–24, Quick Guide. [online] Canberra: Parliamentary Library, Parliament of Australia, 30 May. Available at: https://www.aph.gov.au/About_Parliament/Parliamentary_departments/Parliamentary_Library/Research/Quick_Guides/2023-24/NuclearActivitiesProhibitions [Accessed 21 October 2026].</w:t>
+        <w:t xml:space="preserve">Power Engineering</w:t>
+      </w:r>
+      <w:r>
+        <w:t xml:space="preserve">. [online] Available at: https://www.power-eng.com/nuclear/smrs/opg-selects-first-fuel-suppliers-for-its-small-modular-reactors/.</w:t>
       </w:r>
     </w:p>
     <w:p>
@@ -10903,7 +10908,7 @@
         <w:pStyle w:val="BodyText"/>
       </w:pPr>
       <w:r>
-        <w:t xml:space="preserve">Peterson, P.F., Zhao, H. and Petroski, R., 2005.</w:t>
+        <w:t xml:space="preserve">Power Workers’ Union, 2021.</w:t>
       </w:r>
       <w:r>
         <w:t xml:space="preserve"> </w:t>
@@ -10913,13 +10918,10 @@
           <w:iCs/>
           <w:i/>
         </w:rPr>
-        <w:t xml:space="preserve">Metal and concrete inputs for several nuclear power plants</w:t>
-      </w:r>
-      <w:r>
-        <w:t xml:space="preserve"> </w:t>
-      </w:r>
-      <w:r>
-        <w:t xml:space="preserve">(UCBTH-05-001). [pdf] Berkeley: University of California, Berkeley. Available at: https://fhr.nuc.berkeley.edu/wp-content/uploads/2014/10/05-001-A_Material_input.pdf.</w:t>
+        <w:t xml:space="preserve">Written submission in support of OPG’s application to renew the Darlington power reactor operating licence</w:t>
+      </w:r>
+      <w:r>
+        <w:t xml:space="preserve">, CMD 21-H4.38. Available at: https://api.cnsc-ccsn.gc.ca/dms/digital-medias/CMD21-H4-38.pdf/object [Accessed 21 October 2026].</w:t>
       </w:r>
     </w:p>
     <w:p>
@@ -10927,7 +10929,7 @@
         <w:pStyle w:val="BodyText"/>
       </w:pPr>
       <w:r>
-        <w:t xml:space="preserve">Pillai, R.G. et al., 2019. Service life and life cycle assessment of reinforced concrete systems with limestone calcined clay cement (LC³).</w:t>
+        <w:t xml:space="preserve">Rao, P., Kaffine, D.T. and Hodge, B.-M., 2026.</w:t>
       </w:r>
       <w:r>
         <w:t xml:space="preserve"> </w:t>
@@ -10937,10 +10939,10 @@
           <w:iCs/>
           <w:i/>
         </w:rPr>
-        <w:t xml:space="preserve">Cement and Concrete Research</w:t>
-      </w:r>
-      <w:r>
-        <w:t xml:space="preserve">, 118, pp.111–119. Available at: https://doi.org/10.1016/j.cemconres.2018.11.019.</w:t>
+        <w:t xml:space="preserve">The consequences of high SMR operating costs in electricity markets</w:t>
+      </w:r>
+      <w:r>
+        <w:t xml:space="preserve">. arXiv preprint 2609.08929. Available at: https://arxiv.org/pdf/2609.08929.</w:t>
       </w:r>
     </w:p>
     <w:p>
@@ -10948,7 +10950,7 @@
         <w:pStyle w:val="BodyText"/>
       </w:pPr>
       <w:r>
-        <w:t xml:space="preserve">Power Workers’ Union, 2021.</w:t>
+        <w:t xml:space="preserve">Reserve Bank of Australia, 2025.</w:t>
       </w:r>
       <w:r>
         <w:t xml:space="preserve"> </w:t>
@@ -10958,10 +10960,10 @@
           <w:iCs/>
           <w:i/>
         </w:rPr>
-        <w:t xml:space="preserve">Written submission in support of OPG’s application to renew the Darlington power reactor operating licence</w:t>
-      </w:r>
-      <w:r>
-        <w:t xml:space="preserve">, CMD 21-H4.38. Available at: https://api.cnsc-ccsn.gc.ca/dms/digital-medias/CMD21-H4-38.pdf/object [Accessed 21 October 2026].</w:t>
+        <w:t xml:space="preserve">Historical Data: Exchange Rates (F11)</w:t>
+      </w:r>
+      <w:r>
+        <w:t xml:space="preserve">. [online] Sydney: Reserve Bank of Australia.</w:t>
       </w:r>
     </w:p>
     <w:p>
@@ -10969,7 +10971,7 @@
         <w:pStyle w:val="BodyText"/>
       </w:pPr>
       <w:r>
-        <w:t xml:space="preserve">Rao, P., Kaffine, D.T. and Hodge, B.-M., 2026.</w:t>
+        <w:t xml:space="preserve">Ritchie, H., 2020.</w:t>
       </w:r>
       <w:r>
         <w:t xml:space="preserve"> </w:t>
@@ -10979,10 +10981,13 @@
           <w:iCs/>
           <w:i/>
         </w:rPr>
-        <w:t xml:space="preserve">The consequences of high SMR operating costs in electricity markets</w:t>
-      </w:r>
-      <w:r>
-        <w:t xml:space="preserve">. arXiv preprint 2609.08929. Available at: https://arxiv.org/pdf/2609.08929.</w:t>
+        <w:t xml:space="preserve">What are the safest and cleanest sources of energy?</w:t>
+      </w:r>
+      <w:r>
+        <w:t xml:space="preserve"> </w:t>
+      </w:r>
+      <w:r>
+        <w:t xml:space="preserve">[online] Our World in Data. Available at: https://ourworldindata.org/safest-sources-of-energy [Accessed 20 October 2026].</w:t>
       </w:r>
     </w:p>
     <w:p>
@@ -10990,7 +10995,7 @@
         <w:pStyle w:val="BodyText"/>
       </w:pPr>
       <w:r>
-        <w:t xml:space="preserve">Reserve Bank of Australia, 2025.</w:t>
+        <w:t xml:space="preserve">Schlissel, D., 2023.</w:t>
       </w:r>
       <w:r>
         <w:t xml:space="preserve"> </w:t>
@@ -11000,10 +11005,10 @@
           <w:iCs/>
           <w:i/>
         </w:rPr>
-        <w:t xml:space="preserve">Historical Data: Exchange Rates (F11)</w:t>
-      </w:r>
-      <w:r>
-        <w:t xml:space="preserve">. [online] Sydney: Reserve Bank of Australia.</w:t>
+        <w:t xml:space="preserve">Eye-popping new cost estimates released for NuScale small modular reactor</w:t>
+      </w:r>
+      <w:r>
+        <w:t xml:space="preserve">. Institute for Energy Economics and Financial Analysis. Available at: https://ieefa.org/resources/eye-popping-new-cost-estimates-released-nuscale-small-modular-reactor.</w:t>
       </w:r>
     </w:p>
     <w:p>
@@ -11011,7 +11016,7 @@
         <w:pStyle w:val="BodyText"/>
       </w:pPr>
       <w:r>
-        <w:t xml:space="preserve">Ritchie, H., 2020.</w:t>
+        <w:t xml:space="preserve">Schlömer, S. et al., 2014. Annex III: Technology-specific cost and performance parameters. In:</w:t>
       </w:r>
       <w:r>
         <w:t xml:space="preserve"> </w:t>
@@ -11021,13 +11026,10 @@
           <w:iCs/>
           <w:i/>
         </w:rPr>
-        <w:t xml:space="preserve">What are the safest and cleanest sources of energy?</w:t>
-      </w:r>
-      <w:r>
-        <w:t xml:space="preserve"> </w:t>
-      </w:r>
-      <w:r>
-        <w:t xml:space="preserve">[online] Our World in Data. Available at: https://ourworldindata.org/safest-sources-of-energy [Accessed 20 October 2026].</w:t>
+        <w:t xml:space="preserve">Climate Change 2014: Mitigation of Climate Change. Contribution of Working Group III to the Fifth Assessment Report of the Intergovernmental Panel on Climate Change</w:t>
+      </w:r>
+      <w:r>
+        <w:t xml:space="preserve">. Cambridge: Cambridge University Press.</w:t>
       </w:r>
     </w:p>
     <w:p>
@@ -11035,7 +11037,7 @@
         <w:pStyle w:val="BodyText"/>
       </w:pPr>
       <w:r>
-        <w:t xml:space="preserve">Schlissel, D., 2023.</w:t>
+        <w:t xml:space="preserve">Scrivener, K., Martirena, F., Bishnoi, S. and Maity, S., 2018. Calcined clay limestone cements (LC3).</w:t>
       </w:r>
       <w:r>
         <w:t xml:space="preserve"> </w:t>
@@ -11045,10 +11047,10 @@
           <w:iCs/>
           <w:i/>
         </w:rPr>
-        <w:t xml:space="preserve">Eye-popping new cost estimates released for NuScale small modular reactor</w:t>
-      </w:r>
-      <w:r>
-        <w:t xml:space="preserve">. Institute for Energy Economics and Financial Analysis. Available at: https://ieefa.org/resources/eye-popping-new-cost-estimates-released-nuscale-small-modular-reactor.</w:t>
+        <w:t xml:space="preserve">Cement and Concrete Research</w:t>
+      </w:r>
+      <w:r>
+        <w:t xml:space="preserve">, 114, pp.49–56. Available at: https://doi.org/10.1016/j.cemconres.2017.08.017.</w:t>
       </w:r>
     </w:p>
     <w:p>
@@ -11056,7 +11058,7 @@
         <w:pStyle w:val="BodyText"/>
       </w:pPr>
       <w:r>
-        <w:t xml:space="preserve">Schlömer, S. et al., 2014. Annex III: Technology-specific cost and performance parameters. In:</w:t>
+        <w:t xml:space="preserve">Senate Environment and Communications Legislation Committee, 2023.</w:t>
       </w:r>
       <w:r>
         <w:t xml:space="preserve"> </w:t>
@@ -11066,10 +11068,10 @@
           <w:iCs/>
           <w:i/>
         </w:rPr>
-        <w:t xml:space="preserve">Climate Change 2014: Mitigation of Climate Change. Contribution of Working Group III to the Fifth Assessment Report of the Intergovernmental Panel on Climate Change</w:t>
-      </w:r>
-      <w:r>
-        <w:t xml:space="preserve">. Cambridge: Cambridge University Press.</w:t>
+        <w:t xml:space="preserve">Environment and Other Legislation Amendment (Removing Nuclear Energy Prohibitions) Bill 2022 [Provisions]</w:t>
+      </w:r>
+      <w:r>
+        <w:t xml:space="preserve">. [online] Canberra: Parliament of Australia. Available at: https://www.aph.gov.au/Parliamentary_Business/Committees/Senate/Environment_and_Communications/Nuclearprohibitions [Accessed 20 October 2026].</w:t>
       </w:r>
     </w:p>
     <w:p>
@@ -11077,7 +11079,23 @@
         <w:pStyle w:val="BodyText"/>
       </w:pPr>
       <w:r>
-        <w:t xml:space="preserve">Scrivener, K., Martirena, F., Bishnoi, S. and Maity, S., 2018. Calcined clay limestone cements (LC3).</w:t>
+        <w:t xml:space="preserve">Silex Systems Limited, 2025. [ASX announcement on the NRC’s acceptance of GLE’s Paducah licence application], 6 August. Sydney: ASX. Available at: https://announcements.asx.com.au/asxpdf/20250806/pdf/06mkwks19y2zck.pdf.</w:t>
+      </w:r>
+    </w:p>
+    <w:p>
+      <w:pPr>
+        <w:pStyle w:val="BodyText"/>
+      </w:pPr>
+      <w:r>
+        <w:t xml:space="preserve">Silex Systems Limited, 2026. [ASX announcement on Cameco’s offtake agreement for the Paducah Laser Enrichment Facility], 16 September. Sydney: ASX.</w:t>
+      </w:r>
+    </w:p>
+    <w:p>
+      <w:pPr>
+        <w:pStyle w:val="BodyText"/>
+      </w:pPr>
+      <w:r>
+        <w:t xml:space="preserve">Slag Cement Association, n.d.</w:t>
       </w:r>
       <w:r>
         <w:t xml:space="preserve"> </w:t>
@@ -11087,10 +11105,13 @@
           <w:iCs/>
           <w:i/>
         </w:rPr>
-        <w:t xml:space="preserve">Cement and Concrete Research</w:t>
-      </w:r>
-      <w:r>
-        <w:t xml:space="preserve">, 114, pp.49–56. Available at: https://doi.org/10.1016/j.cemconres.2017.08.017.</w:t>
+        <w:t xml:space="preserve">Industry-average EPD for slag cement</w:t>
+      </w:r>
+      <w:r>
+        <w:t xml:space="preserve"> </w:t>
+      </w:r>
+      <w:r>
+        <w:t xml:space="preserve">(USA and Canada). [pdf] Available at: https://www.lafarge.ca/sites/canada/files/images/sca_epd_for_slag_cement.pdf.</w:t>
       </w:r>
     </w:p>
     <w:p>
@@ -11098,7 +11119,7 @@
         <w:pStyle w:val="BodyText"/>
       </w:pPr>
       <w:r>
-        <w:t xml:space="preserve">Senate Environment and Communications Legislation Committee, 2023.</w:t>
+        <w:t xml:space="preserve">Slovic, P., 1987. Perception of risk.</w:t>
       </w:r>
       <w:r>
         <w:t xml:space="preserve"> </w:t>
@@ -11108,10 +11129,10 @@
           <w:iCs/>
           <w:i/>
         </w:rPr>
-        <w:t xml:space="preserve">Environment and Other Legislation Amendment (Removing Nuclear Energy Prohibitions) Bill 2022 [Provisions]</w:t>
-      </w:r>
-      <w:r>
-        <w:t xml:space="preserve">. [online] Canberra: Parliament of Australia. Available at: https://www.aph.gov.au/Parliamentary_Business/Committees/Senate/Environment_and_Communications/Nuclearprohibitions [Accessed 20 October 2026].</w:t>
+        <w:t xml:space="preserve">Science</w:t>
+      </w:r>
+      <w:r>
+        <w:t xml:space="preserve">, 236(4799), pp.280–285.</w:t>
       </w:r>
     </w:p>
     <w:p>
@@ -11119,7 +11140,7 @@
         <w:pStyle w:val="BodyText"/>
       </w:pPr>
       <w:r>
-        <w:t xml:space="preserve">Slag Cement Association, n.d.</w:t>
+        <w:t xml:space="preserve">Steigerwald, B., Weibezahn, J., Slowik, M. and von Hirschhausen, C., 2023. Uncertainties in estimating production costs of future nuclear technologies: a model-based analysis of small modular reactors.</w:t>
       </w:r>
       <w:r>
         <w:t xml:space="preserve"> </w:t>
@@ -11129,13 +11150,10 @@
           <w:iCs/>
           <w:i/>
         </w:rPr>
-        <w:t xml:space="preserve">Industry-average EPD for slag cement</w:t>
-      </w:r>
-      <w:r>
-        <w:t xml:space="preserve"> </w:t>
-      </w:r>
-      <w:r>
-        <w:t xml:space="preserve">(USA and Canada). [pdf] Available at: https://www.lafarge.ca/sites/canada/files/images/sca_epd_for_slag_cement.pdf.</w:t>
+        <w:t xml:space="preserve">Energy</w:t>
+      </w:r>
+      <w:r>
+        <w:t xml:space="preserve">, 281, 128204.</w:t>
       </w:r>
     </w:p>
     <w:p>
@@ -11143,7 +11161,7 @@
         <w:pStyle w:val="BodyText"/>
       </w:pPr>
       <w:r>
-        <w:t xml:space="preserve">Slovic, P., 1987. Perception of risk.</w:t>
+        <w:t xml:space="preserve">Sun, Y. and Kurosaki, K., 2025.</w:t>
       </w:r>
       <w:r>
         <w:t xml:space="preserve"> </w:t>
@@ -11153,10 +11171,10 @@
           <w:iCs/>
           <w:i/>
         </w:rPr>
-        <w:t xml:space="preserve">Science</w:t>
-      </w:r>
-      <w:r>
-        <w:t xml:space="preserve">, 236(4799), pp.280–285.</w:t>
+        <w:t xml:space="preserve">Technical overview of recent developments in small modular reactors in the United States</w:t>
+      </w:r>
+      <w:r>
+        <w:t xml:space="preserve">. arXiv:2504.02599 [physics.soc-ph]. Available at: https://arxiv.org/abs/2504.02599.</w:t>
       </w:r>
     </w:p>
     <w:p>
@@ -11164,7 +11182,7 @@
         <w:pStyle w:val="BodyText"/>
       </w:pPr>
       <w:r>
-        <w:t xml:space="preserve">Steigerwald, B., Weibezahn, J., Slowik, M. and von Hirschhausen, C., 2023. Uncertainties in estimating production costs of future nuclear technologies: a model-based analysis of small modular reactors.</w:t>
+        <w:t xml:space="preserve">Treasury Board of Canada Secretariat, 2022.</w:t>
       </w:r>
       <w:r>
         <w:t xml:space="preserve"> </w:t>
@@ -11174,10 +11192,13 @@
           <w:iCs/>
           <w:i/>
         </w:rPr>
-        <w:t xml:space="preserve">Energy</w:t>
-      </w:r>
-      <w:r>
-        <w:t xml:space="preserve">, 281, 128204.</w:t>
+        <w:t xml:space="preserve">Standard on Embodied Carbon in Construction</w:t>
+      </w:r>
+      <w:r>
+        <w:t xml:space="preserve"> </w:t>
+      </w:r>
+      <w:r>
+        <w:t xml:space="preserve">(amended 20 March 2025). [online] Ottawa: Treasury Board of Canada Secretariat. Available at: https://www.tbs-sct.canada.ca/pol/doc-eng.aspx?id=32814 [Accessed 20 October 2026].</w:t>
       </w:r>
     </w:p>
     <w:p>
@@ -11185,7 +11206,7 @@
         <w:pStyle w:val="BodyText"/>
       </w:pPr>
       <w:r>
-        <w:t xml:space="preserve">Sun, Y. and Kurosaki, K., 2025.</w:t>
+        <w:t xml:space="preserve">United Nations Economic Commission for Europe, 2021.</w:t>
       </w:r>
       <w:r>
         <w:t xml:space="preserve"> </w:t>
@@ -11195,10 +11216,10 @@
           <w:iCs/>
           <w:i/>
         </w:rPr>
-        <w:t xml:space="preserve">Technical overview of recent developments in small modular reactors in the United States</w:t>
-      </w:r>
-      <w:r>
-        <w:t xml:space="preserve">. arXiv:2504.02599 [physics.soc-ph]. Available at: https://arxiv.org/abs/2504.02599.</w:t>
+        <w:t xml:space="preserve">Carbon Neutrality in the UNECE Region: Integrated Life-cycle Assessment of Electricity Sources</w:t>
+      </w:r>
+      <w:r>
+        <w:t xml:space="preserve">. ECE/ENERGY/141. Geneva: United Nations. Available at: https://unece.org/sites/default/files/2021-10/LCA-2.pdf [Accessed 20 October 2026].</w:t>
       </w:r>
     </w:p>
     <w:p>
@@ -11206,7 +11227,7 @@
         <w:pStyle w:val="BodyText"/>
       </w:pPr>
       <w:r>
-        <w:t xml:space="preserve">Treasury Board of Canada Secretariat, 2022.</w:t>
+        <w:t xml:space="preserve">United States Congress, 2024.</w:t>
       </w:r>
       <w:r>
         <w:t xml:space="preserve"> </w:t>
@@ -11216,13 +11237,10 @@
           <w:iCs/>
           <w:i/>
         </w:rPr>
-        <w:t xml:space="preserve">Standard on Embodied Carbon in Construction</w:t>
-      </w:r>
-      <w:r>
-        <w:t xml:space="preserve"> </w:t>
-      </w:r>
-      <w:r>
-        <w:t xml:space="preserve">(amended 20 March 2025). [online] Ottawa: Treasury Board of Canada Secretariat. Available at: https://www.tbs-sct.canada.ca/pol/doc-eng.aspx?id=32814 [Accessed 20 October 2026].</w:t>
+        <w:t xml:space="preserve">Prohibiting Russian Uranium Imports Act</w:t>
+      </w:r>
+      <w:r>
+        <w:t xml:space="preserve">, Public Law 118-62, 13 May 2024. [pdf] Washington, DC: US Government Publishing Office. Available at: https://www.govinfo.gov/content/pkg/PLAW-118publ62/pdf/PLAW-118publ62.pdf [Accessed 20 October 2026].</w:t>
       </w:r>
     </w:p>
     <w:p>
@@ -11230,7 +11248,7 @@
         <w:pStyle w:val="BodyText"/>
       </w:pPr>
       <w:r>
-        <w:t xml:space="preserve">Treasury Board of Canada Secretariat, 2025.</w:t>
+        <w:t xml:space="preserve">US Department of Energy, 2025.</w:t>
       </w:r>
       <w:r>
         <w:t xml:space="preserve"> </w:t>
@@ -11240,10 +11258,10 @@
           <w:iCs/>
           <w:i/>
         </w:rPr>
-        <w:t xml:space="preserve">Progress on greening procurement: Other procurement</w:t>
-      </w:r>
-      <w:r>
-        <w:t xml:space="preserve">. [online] Available at: https://www.canada.ca/en/treasury-board-secretariat/services/innovation/greening-government/government-canada-progress-greening-procurement/other-procurement.html [Accessed 20 October 2026].</w:t>
+        <w:t xml:space="preserve">Energy Department Selects TVA and Holtec to Advance Deployment of U.S. Small Modular Reactors</w:t>
+      </w:r>
+      <w:r>
+        <w:t xml:space="preserve">. Washington, DC: US Department of Energy. Available at: https://www.energy.gov/articles/energy-department-selects-tva-and-holtec-advance-deployment-us-small-modular-reactors.</w:t>
       </w:r>
     </w:p>
     <w:p>
@@ -11251,7 +11269,7 @@
         <w:pStyle w:val="BodyText"/>
       </w:pPr>
       <w:r>
-        <w:t xml:space="preserve">United Nations Economic Commission for Europe, 2021.</w:t>
+        <w:t xml:space="preserve">US Department of Justice and Federal Trade Commission, 2010.</w:t>
       </w:r>
       <w:r>
         <w:t xml:space="preserve"> </w:t>
@@ -11261,10 +11279,10 @@
           <w:iCs/>
           <w:i/>
         </w:rPr>
-        <w:t xml:space="preserve">Carbon Neutrality in the UNECE Region: Integrated Life-cycle Assessment of Electricity Sources</w:t>
-      </w:r>
-      <w:r>
-        <w:t xml:space="preserve">. ECE/ENERGY/141. Geneva: United Nations. Available at: https://unece.org/sites/default/files/2021-10/LCA-2.pdf [Accessed 20 October 2026].</w:t>
+        <w:t xml:space="preserve">Horizontal Merger Guidelines</w:t>
+      </w:r>
+      <w:r>
+        <w:t xml:space="preserve">. [online] Washington, DC: US Department of Justice and Federal Trade Commission, 19 August. Available at: https://www.justice.gov/atr/horizontal-merger-guidelines-08192010 [Accessed 20 October 2026].</w:t>
       </w:r>
     </w:p>
     <w:p>
@@ -11272,7 +11290,7 @@
         <w:pStyle w:val="BodyText"/>
       </w:pPr>
       <w:r>
-        <w:t xml:space="preserve">United States Congress, 2024.</w:t>
+        <w:t xml:space="preserve">US Department of Justice and Federal Trade Commission, 2023.</w:t>
       </w:r>
       <w:r>
         <w:t xml:space="preserve"> </w:t>
@@ -11282,10 +11300,10 @@
           <w:iCs/>
           <w:i/>
         </w:rPr>
-        <w:t xml:space="preserve">Prohibiting Russian Uranium Imports Act</w:t>
-      </w:r>
-      <w:r>
-        <w:t xml:space="preserve">, Public Law 118-62, 13 May 2024. [pdf] Washington, DC: US Government Publishing Office. Available at: https://www.govinfo.gov/content/pkg/PLAW-118publ62/pdf/PLAW-118publ62.pdf [Accessed 20 October 2026].</w:t>
+        <w:t xml:space="preserve">Merger Guidelines</w:t>
+      </w:r>
+      <w:r>
+        <w:t xml:space="preserve">. [pdf] Washington, DC: US Department of Justice and Federal Trade Commission, 18 December. Available at: https://www.justice.gov/d9/2023-12/2023%20Merger%20Guidelines.pdf [Accessed 20 October 2026].</w:t>
       </w:r>
     </w:p>
     <w:p>
@@ -11293,7 +11311,7 @@
         <w:pStyle w:val="BodyText"/>
       </w:pPr>
       <w:r>
-        <w:t xml:space="preserve">US Department of Energy, 2025.</w:t>
+        <w:t xml:space="preserve">US EPA, 2024.</w:t>
       </w:r>
       <w:r>
         <w:t xml:space="preserve"> </w:t>
@@ -11303,10 +11321,10 @@
           <w:iCs/>
           <w:i/>
         </w:rPr>
-        <w:t xml:space="preserve">Energy Department Selects TVA and Holtec to Advance Deployment of U.S. Small Modular Reactors</w:t>
-      </w:r>
-      <w:r>
-        <w:t xml:space="preserve">. Washington, DC: US Department of Energy. Available at: https://www.energy.gov/articles/energy-department-selects-tva-and-holtec-advance-deployment-us-small-modular-reactors.</w:t>
+        <w:t xml:space="preserve">Power Profiler: terms, calculations and data sources</w:t>
+      </w:r>
+      <w:r>
+        <w:t xml:space="preserve">. [pdf] Available at: https://www.epa.gov/system/files/documents/2024-04/power-profiler-terms-calculations-and-data-sources.pdf.</w:t>
       </w:r>
     </w:p>
     <w:p>
@@ -11314,7 +11332,7 @@
         <w:pStyle w:val="BodyText"/>
       </w:pPr>
       <w:r>
-        <w:t xml:space="preserve">US Department of Justice and Federal Trade Commission, 2010.</w:t>
+        <w:t xml:space="preserve">US Nuclear Regulatory Commission and Canadian Nuclear Safety Commission, 2025.</w:t>
       </w:r>
       <w:r>
         <w:t xml:space="preserve"> </w:t>
@@ -11324,10 +11342,10 @@
           <w:iCs/>
           <w:i/>
         </w:rPr>
-        <w:t xml:space="preserve">Horizontal Merger Guidelines</w:t>
-      </w:r>
-      <w:r>
-        <w:t xml:space="preserve">. [online] Washington, DC: US Department of Justice and Federal Trade Commission, 19 August. Available at: https://www.justice.gov/atr/horizontal-merger-guidelines-08192010 [Accessed 20 October 2026].</w:t>
+        <w:t xml:space="preserve">CNSC–NRC Joint Report on GEH BWRX-300 Steel-Plate Composite Containment Vessel and Reactor Building Structural Design Topical Report</w:t>
+      </w:r>
+      <w:r>
+        <w:t xml:space="preserve">. ADAMS ML25325A075. [pdf] Available at: https://www.nrc.gov/docs/ML2532/ML25325A075.pdf [Accessed 20 October 2026].</w:t>
       </w:r>
     </w:p>
     <w:p>
@@ -11335,7 +11353,7 @@
         <w:pStyle w:val="BodyText"/>
       </w:pPr>
       <w:r>
-        <w:t xml:space="preserve">US Department of Justice and Federal Trade Commission, 2023.</w:t>
+        <w:t xml:space="preserve">Warner, E.S. and Heath, G.A., 2012. Life cycle greenhouse gas emissions of nuclear electricity generation: systematic review and harmonization.</w:t>
       </w:r>
       <w:r>
         <w:t xml:space="preserve"> </w:t>
@@ -11345,10 +11363,10 @@
           <w:iCs/>
           <w:i/>
         </w:rPr>
-        <w:t xml:space="preserve">Merger Guidelines</w:t>
-      </w:r>
-      <w:r>
-        <w:t xml:space="preserve">. [pdf] Washington, DC: US Department of Justice and Federal Trade Commission, 18 December. Available at: https://www.justice.gov/d9/2023-12/2023%20Merger%20Guidelines.pdf [Accessed 20 October 2026].</w:t>
+        <w:t xml:space="preserve">Journal of Industrial Ecology</w:t>
+      </w:r>
+      <w:r>
+        <w:t xml:space="preserve">, 16(S1), pp.S73–S92. Available at: https://doi.org/10.1111/j.1530-9290.2012.00472.x.</w:t>
       </w:r>
     </w:p>
     <w:p>
@@ -11356,7 +11374,7 @@
         <w:pStyle w:val="BodyText"/>
       </w:pPr>
       <w:r>
-        <w:t xml:space="preserve">US EPA, 2024.</w:t>
+        <w:t xml:space="preserve">Williams Treaties First Nations, Ontario Power Generation, Government of Ontario and Government of Canada, 2026.</w:t>
       </w:r>
       <w:r>
         <w:t xml:space="preserve"> </w:t>
@@ -11366,10 +11384,10 @@
           <w:iCs/>
           <w:i/>
         </w:rPr>
-        <w:t xml:space="preserve">Power Profiler: terms, calculations and data sources</w:t>
-      </w:r>
-      <w:r>
-        <w:t xml:space="preserve">. [pdf] Available at: https://www.epa.gov/system/files/documents/2024-04/power-profiler-terms-calculations-and-data-sources.pdf.</w:t>
+        <w:t xml:space="preserve">Williams Treaties First Nations announce historic $700 million investment in Darlington New Nuclear Project</w:t>
+      </w:r>
+      <w:r>
+        <w:t xml:space="preserve">. [press release] 23 June. Available at: https://www.bnnbloomberg.ca/press-releases/2026/06/23/williams-treaties-first-nations-announce-historic-700-million-investment-in-darlington-new-nuclear-project/ [Accessed 21 October 2026].</w:t>
       </w:r>
     </w:p>
     <w:p>
@@ -11377,7 +11395,7 @@
         <w:pStyle w:val="BodyText"/>
       </w:pPr>
       <w:r>
-        <w:t xml:space="preserve">US Nuclear Regulatory Commission, n.d.</w:t>
+        <w:t xml:space="preserve">World Nuclear Association, 2024.</w:t>
       </w:r>
       <w:r>
         <w:t xml:space="preserve"> </w:t>
@@ -11387,10 +11405,10 @@
           <w:iCs/>
           <w:i/>
         </w:rPr>
-        <w:t xml:space="preserve">Global Laser Enrichment, LLC (Paducah Laser Enrichment Facility)</w:t>
-      </w:r>
-      <w:r>
-        <w:t xml:space="preserve">. [facility page] Rockville, MD: US Nuclear Regulatory Commission. Available at: https://www.nrc.gov/facilities-safety/facility-finder/fc/global-laser-enrichment-nc-lc [Accessed 20 October 2026].</w:t>
+        <w:t xml:space="preserve">Conversion and Deconversion</w:t>
+      </w:r>
+      <w:r>
+        <w:t xml:space="preserve">. [online] London: World Nuclear Association. Available at: https://world-nuclear.org/information-library/nuclear-fuel-cycle/conversion-enrichment-and-fabrication/conversion-and-deconversion [Accessed 20 October 2026].</w:t>
       </w:r>
     </w:p>
     <w:p>
@@ -11398,7 +11416,7 @@
         <w:pStyle w:val="BodyText"/>
       </w:pPr>
       <w:r>
-        <w:t xml:space="preserve">US Nuclear Regulatory Commission and Canadian Nuclear Safety Commission, 2025.</w:t>
+        <w:t xml:space="preserve">World Nuclear Association, 2025.</w:t>
       </w:r>
       <w:r>
         <w:t xml:space="preserve"> </w:t>
@@ -11408,10 +11426,10 @@
           <w:iCs/>
           <w:i/>
         </w:rPr>
-        <w:t xml:space="preserve">CNSC–NRC Joint Report on GEH BWRX-300 Steel-Plate Composite Containment Vessel and Reactor Building Structural Design Topical Report</w:t>
-      </w:r>
-      <w:r>
-        <w:t xml:space="preserve">. ADAMS ML25325A075. [pdf] Available at: https://www.nrc.gov/docs/ML2532/ML25325A075.pdf [Accessed 20 October 2026].</w:t>
+        <w:t xml:space="preserve">Uranium Enrichment</w:t>
+      </w:r>
+      <w:r>
+        <w:t xml:space="preserve">. [online] London: World Nuclear Association. Available at: https://world-nuclear.org/information-library/nuclear-fuel-cycle/conversion-enrichment-and-fabrication/uranium-enrichment [Accessed 20 October 2026].</w:t>
       </w:r>
     </w:p>
     <w:p>
@@ -11419,7 +11437,7 @@
         <w:pStyle w:val="BodyText"/>
       </w:pPr>
       <w:r>
-        <w:t xml:space="preserve">Warner, E.S. and Heath, G.A., 2012. Life cycle greenhouse gas emissions of nuclear electricity generation: systematic review and harmonization.</w:t>
+        <w:t xml:space="preserve">World Nuclear Association, 2026.</w:t>
       </w:r>
       <w:r>
         <w:t xml:space="preserve"> </w:t>
@@ -11429,10 +11447,10 @@
           <w:iCs/>
           <w:i/>
         </w:rPr>
-        <w:t xml:space="preserve">Journal of Industrial Ecology</w:t>
-      </w:r>
-      <w:r>
-        <w:t xml:space="preserve">, 16(S1), pp.S73–S92. Available at: https://doi.org/10.1111/j.1530-9290.2012.00472.x.</w:t>
+        <w:t xml:space="preserve">World Uranium Mining Production</w:t>
+      </w:r>
+      <w:r>
+        <w:t xml:space="preserve">. [online] London: World Nuclear Association. Available at: https://world-nuclear.org/information-library/nuclear-fuel-cycle/mining-of-uranium/world-uranium-mining-production [Accessed 20 October 2026].</w:t>
       </w:r>
     </w:p>
     <w:p>
@@ -11440,7 +11458,7 @@
         <w:pStyle w:val="BodyText"/>
       </w:pPr>
       <w:r>
-        <w:t xml:space="preserve">Williams Treaties First Nations, Ontario Power Generation, Government of Ontario and Government of Canada, 2026.</w:t>
+        <w:t xml:space="preserve">World Nuclear News, 2026. Cameco in offtake agreement for US laser enrichment plant.</w:t>
       </w:r>
       <w:r>
         <w:t xml:space="preserve"> </w:t>
@@ -11450,10 +11468,10 @@
           <w:iCs/>
           <w:i/>
         </w:rPr>
-        <w:t xml:space="preserve">Williams Treaties First Nations announce historic $700 million investment in Darlington New Nuclear Project</w:t>
-      </w:r>
-      <w:r>
-        <w:t xml:space="preserve">. [press release] 23 June. Available at: https://www.bnnbloomberg.ca/press-releases/2026/06/23/williams-treaties-first-nations-announce-historic-700-million-investment-in-darlington-new-nuclear-project/ [Accessed 21 October 2026].</w:t>
+        <w:t xml:space="preserve">World Nuclear News</w:t>
+      </w:r>
+      <w:r>
+        <w:t xml:space="preserve">. [online] Available at: https://www.world-nuclear-news.org/articles/cameco-in-offtake-agreement-for-us-laser-enrichment-plant.</w:t>
       </w:r>
     </w:p>
     <w:p>
@@ -11461,71 +11479,80 @@
         <w:pStyle w:val="BodyText"/>
       </w:pPr>
       <w:r>
-        <w:t xml:space="preserve">World Nuclear Association, 2024.</w:t>
-      </w:r>
-      <w:r>
-        <w:t xml:space="preserve"> </w:t>
-      </w:r>
+        <w:t xml:space="preserve">World Nuclear University, 2025. [Enrichment: WNU Summer Institute presentation slides], 17 June. Available at: https://world-nuclear-university.org/SummerInsituteFiles/2025-06-17_WNU_Enrichment_Platov_final_62a48c29.pdf.</w:t>
+      </w:r>
+    </w:p>
+    <w:bookmarkStart w:id="74" w:name="legislation"/>
+    <w:p>
+      <w:pPr>
+        <w:pStyle w:val="Heading3"/>
+      </w:pPr>
+      <w:r>
+        <w:t xml:space="preserve">Legislation</w:t>
+      </w:r>
+    </w:p>
+    <w:p>
+      <w:pPr>
+        <w:pStyle w:val="FirstParagraph"/>
+      </w:pPr>
       <w:r>
         <w:rPr>
           <w:iCs/>
           <w:i/>
         </w:rPr>
-        <w:t xml:space="preserve">Conversion and Deconversion</w:t>
-      </w:r>
-      <w:r>
-        <w:t xml:space="preserve">. [online] London: World Nuclear Association. Available at: https://world-nuclear.org/information-library/nuclear-fuel-cycle/conversion-enrichment-and-fabrication/conversion-and-deconversion [Accessed 20 October 2026].</w:t>
+        <w:t xml:space="preserve">Environment Protection and Biodiversity Conservation Act 1999</w:t>
+      </w:r>
+      <w:r>
+        <w:t xml:space="preserve"> </w:t>
+      </w:r>
+      <w:r>
+        <w:t xml:space="preserve">(Cth), s 140A. [online] Federal Register of Legislation, C2004A00485. Available at: https://www.legislation.gov.au/C2004A00485/latest/text [Accessed 20 October 2026].</w:t>
       </w:r>
     </w:p>
     <w:p>
       <w:pPr>
         <w:pStyle w:val="BodyText"/>
       </w:pPr>
-      <w:r>
-        <w:t xml:space="preserve">World Nuclear Association, 2025.</w:t>
-      </w:r>
-      <w:r>
-        <w:t xml:space="preserve"> </w:t>
-      </w:r>
       <w:r>
         <w:rPr>
           <w:iCs/>
           <w:i/>
         </w:rPr>
-        <w:t xml:space="preserve">Uranium Enrichment</w:t>
-      </w:r>
-      <w:r>
-        <w:t xml:space="preserve">. [online] London: World Nuclear Association. Available at: https://world-nuclear.org/information-library/nuclear-fuel-cycle/conversion-enrichment-and-fabrication/uranium-enrichment [Accessed 20 October 2026].</w:t>
+        <w:t xml:space="preserve">Australian Radiation Protection and Nuclear Safety Act 1998</w:t>
+      </w:r>
+      <w:r>
+        <w:t xml:space="preserve"> </w:t>
+      </w:r>
+      <w:r>
+        <w:t xml:space="preserve">(Cth), s 10. [online] Federal Register of Legislation, C2004A00383. Available at: https://www.legislation.gov.au/C2004A00383/latest/text [Accessed 20 October 2026].</w:t>
       </w:r>
     </w:p>
     <w:p>
       <w:pPr>
         <w:pStyle w:val="BodyText"/>
       </w:pPr>
-      <w:r>
-        <w:t xml:space="preserve">World Nuclear Association, 2026.</w:t>
-      </w:r>
-      <w:r>
-        <w:t xml:space="preserve"> </w:t>
-      </w:r>
       <w:r>
         <w:rPr>
           <w:iCs/>
           <w:i/>
         </w:rPr>
-        <w:t xml:space="preserve">World Uranium Mining Production</w:t>
-      </w:r>
-      <w:r>
-        <w:t xml:space="preserve">. [online] London: World Nuclear Association. Available at: https://world-nuclear.org/information-library/nuclear-fuel-cycle/mining-of-uranium/world-uranium-mining-production [Accessed 20 October 2026].</w:t>
-      </w:r>
-    </w:p>
-    <w:bookmarkStart w:id="74" w:name="legislation"/>
+        <w:t xml:space="preserve">Uranium Mining and Nuclear Facilities (Prohibitions) Act 1986</w:t>
+      </w:r>
+      <w:r>
+        <w:t xml:space="preserve"> </w:t>
+      </w:r>
+      <w:r>
+        <w:t xml:space="preserve">(NSW), No 194, ss 8–9. [online] NSW Legislation. Available at: https://legislation.nsw.gov.au/view/whole/html/inforce/current/act-1986-194 [Accessed 20 October 2026].</w:t>
+      </w:r>
+    </w:p>
+    <w:bookmarkEnd w:id="74"/>
+    <w:bookmarkStart w:id="75" w:name="cases"/>
     <w:p>
       <w:pPr>
         <w:pStyle w:val="Heading3"/>
       </w:pPr>
       <w:r>
-        <w:t xml:space="preserve">Legislation</w:t>
+        <w:t xml:space="preserve">Cases</w:t>
       </w:r>
     </w:p>
     <w:p>
@@ -11537,54 +11564,18 @@
           <w:iCs/>
           <w:i/>
         </w:rPr>
-        <w:t xml:space="preserve">Environment Protection and Biodiversity Conservation Act 1999</w:t>
-      </w:r>
-      <w:r>
-        <w:t xml:space="preserve"> </w:t>
-      </w:r>
-      <w:r>
-        <w:t xml:space="preserve">(Cth), s 140A. [online] Federal Register of Legislation, C2004A00485. Available at: https://www.legislation.gov.au/C2004A00485/latest/text [Accessed 20 October 2026].</w:t>
-      </w:r>
-    </w:p>
-    <w:p>
-      <w:pPr>
-        <w:pStyle w:val="BodyText"/>
-      </w:pPr>
-      <w:r>
-        <w:rPr>
-          <w:iCs/>
-          <w:i/>
-        </w:rPr>
-        <w:t xml:space="preserve">Australian Radiation Protection and Nuclear Safety Act 1998</w:t>
-      </w:r>
-      <w:r>
-        <w:t xml:space="preserve"> </w:t>
-      </w:r>
-      <w:r>
-        <w:t xml:space="preserve">(Cth), s 10. [online] Federal Register of Legislation, C2004A00383. Available at: https://www.legislation.gov.au/C2004A00383/latest/text [Accessed 20 October 2026].</w:t>
-      </w:r>
-    </w:p>
-    <w:p>
-      <w:pPr>
-        <w:pStyle w:val="BodyText"/>
-      </w:pPr>
-      <w:r>
-        <w:rPr>
-          <w:iCs/>
-          <w:i/>
-        </w:rPr>
-        <w:t xml:space="preserve">Uranium Mining and Nuclear Facilities (Prohibitions) Act 1986</w:t>
-      </w:r>
-      <w:r>
-        <w:t xml:space="preserve"> </w:t>
-      </w:r>
-      <w:r>
-        <w:t xml:space="preserve">(NSW), No 194, ss 8–9. [online] NSW Legislation. Available at: https://legislation.nsw.gov.au/view/whole/html/inforce/current/act-1986-194 [Accessed 20 October 2026].</w:t>
-      </w:r>
-    </w:p>
-    <w:bookmarkEnd w:id="74"/>
+        <w:t xml:space="preserve">Barngarla Determination Aboriginal Corporation RNTBC v Minister for Resources</w:t>
+      </w:r>
+      <w:r>
+        <w:t xml:space="preserve"> </w:t>
+      </w:r>
+      <w:r>
+        <w:t xml:space="preserve">[2023] FCA 809 (Federal Court of Australia, Charlesworth J, 18 July 2023). Available at: https://www.judgments.fedcourt.gov.au/judgments/Judgments/fca/single/2023/2023fca0809 [Accessed 21 October 2026].</w:t>
+      </w:r>
+    </w:p>
     <w:bookmarkEnd w:id="75"/>
-    <w:bookmarkStart w:id="76" w:name="declaration-of-generative-ai-use"/>
+    <w:bookmarkEnd w:id="76"/>
+    <w:bookmarkStart w:id="77" w:name="declaration-of-generative-ai-use"/>
     <w:p>
       <w:pPr>
         <w:pStyle w:val="Heading2"/>
@@ -11606,8 +11597,8 @@
         <w:br w:type="page"/>
       </w:r>
     </w:p>
-    <w:bookmarkEnd w:id="76"/>
-    <w:bookmarkStart w:id="139" w:name="appendices"/>
+    <w:bookmarkEnd w:id="77"/>
+    <w:bookmarkStart w:id="138" w:name="appendices"/>
     <w:p>
       <w:pPr>
         <w:pStyle w:val="Heading1"/>
@@ -11616,7 +11607,7 @@
         <w:t xml:space="preserve">Appendices</w:t>
       </w:r>
     </w:p>
-    <w:bookmarkStart w:id="86" w:name="Xddcc31d2d3503f687b8b233cd4a745104a63a5c"/>
+    <w:bookmarkStart w:id="87" w:name="Xddcc31d2d3503f687b8b233cd4a745104a63a5c"/>
     <w:p>
       <w:pPr>
         <w:pStyle w:val="Heading2"/>
@@ -11726,7 +11717,7 @@
         <w:t xml:space="preserve">), so every number here is provisional.</w:t>
       </w:r>
     </w:p>
-    <w:bookmarkStart w:id="77" w:name="a1.-reproducing-the-results"/>
+    <w:bookmarkStart w:id="78" w:name="a1.-reproducing-the-results"/>
     <w:p>
       <w:pPr>
         <w:pStyle w:val="Heading3"/>
@@ -12113,8 +12104,8 @@
         <w:t xml:space="preserve">(59 parameters, each with a value, range, distribution, source key and status).</w:t>
       </w:r>
     </w:p>
-    <w:bookmarkEnd w:id="77"/>
-    <w:bookmarkStart w:id="78" w:name="a2.-functional-unit-and-lifetime-output"/>
+    <w:bookmarkEnd w:id="78"/>
+    <w:bookmarkStart w:id="79" w:name="a2.-functional-unit-and-lifetime-output"/>
     <w:p>
       <w:pPr>
         <w:pStyle w:val="Heading3"/>
@@ -12226,8 +12217,8 @@
         <w:t xml:space="preserve">Inputs: P_net 300 MWe (GE Vernova Hitachi Nuclear Energy, n.d.) [placeholder; 315 MW net in an OPG filing, TO VERIFY]; CF 0.90 [placeholder, assumption shared with §7]; L 60 years (Canadian Nuclear Safety Commission, 2024) [TO VERIFY; 65 years reported elsewhere].</w:t>
       </w:r>
     </w:p>
-    <w:bookmarkEnd w:id="78"/>
-    <w:bookmarkStart w:id="79" w:name="a3.-material-quantities-per-unit"/>
+    <w:bookmarkEnd w:id="79"/>
+    <w:bookmarkStart w:id="80" w:name="a3.-material-quantities-per-unit"/>
     <w:p>
       <w:pPr>
         <w:pStyle w:val="Heading3"/>
@@ -12889,8 +12880,8 @@
         <w:t xml:space="preserve">In 3.5% of Monte Carlo draws (706 of 20,000) the scaled plant fell below the target volume, and the plant volume was then set equal to the target (Appendix C1).</w:t>
       </w:r>
     </w:p>
-    <w:bookmarkEnd w:id="79"/>
-    <w:bookmarkStart w:id="80" w:name="Xd0e381ee713afec2acbbb80d77e863c2dda17b7"/>
+    <w:bookmarkEnd w:id="80"/>
+    <w:bookmarkStart w:id="81" w:name="Xd0e381ee713afec2acbbb80d77e863c2dda17b7"/>
     <w:p>
       <w:pPr>
         <w:pStyle w:val="Heading3"/>
@@ -13905,8 +13896,8 @@
         <w:t xml:space="preserve">header is replaced by a source column; rebar uses a recycled-content (electric-arc furnace) factor, not virgin steel; construction electricity is not assumed renewable (the uplift covers site energy on the Ontario grid). Still unresolved: what preprint 202505.1533 in the team notes is [TODO].</w:t>
       </w:r>
     </w:p>
-    <w:bookmarkEnd w:id="80"/>
-    <w:bookmarkStart w:id="81" w:name="a5.-emission-factors"/>
+    <w:bookmarkEnd w:id="81"/>
+    <w:bookmarkStart w:id="82" w:name="a5.-emission-factors"/>
     <w:p>
       <w:pPr>
         <w:pStyle w:val="Heading3"/>
@@ -15209,8 +15200,8 @@
         <w:t xml:space="preserve">At 350 kg/m³ the model gives 328.9 kg CO₂e/m³ for S0 concrete, close to the Ontario industry baseline of 334 kg CO₂e/m³ for 35 MPa concrete and below the 417 kg CO₂e/m³ industry benchmark mix (Canadian Ready-Mixed Concrete Association, 2022) [TO VERIFY].</w:t>
       </w:r>
     </w:p>
-    <w:bookmarkEnd w:id="81"/>
-    <w:bookmarkStart w:id="82" w:name="a6.-concrete-and-the-c1-scenarios"/>
+    <w:bookmarkEnd w:id="82"/>
+    <w:bookmarkStart w:id="83" w:name="a6.-concrete-and-the-c1-scenarios"/>
     <w:p>
       <w:pPr>
         <w:pStyle w:val="Heading3"/>
@@ -16692,8 +16683,8 @@
         <w:t xml:space="preserve">Clinker avoided by LC3 = 2,304 t / 1.419 × 10⁸ MWh = 0.016 kg/MWh (7.7 t/MWe). Concrete: 20,700 m³ × 2.4 t/m³ / 1.419 × 10⁸ MWh = 0.35 kg/MWh. Steel: 9,900 t / 1.419 × 10⁸ MWh = 0.070 kg/MWh.</w:t>
       </w:r>
     </w:p>
-    <w:bookmarkEnd w:id="82"/>
-    <w:bookmarkStart w:id="83" w:name="X62dd5352b338ee668e2c8600a16d3b918435b38"/>
+    <w:bookmarkEnd w:id="83"/>
+    <w:bookmarkStart w:id="84" w:name="X62dd5352b338ee668e2c8600a16d3b918435b38"/>
     <w:p>
       <w:pPr>
         <w:pStyle w:val="Heading3"/>
@@ -17475,8 +17466,8 @@
         </w:tc>
       </w:tr>
     </w:tbl>
-    <w:bookmarkEnd w:id="83"/>
-    <w:bookmarkStart w:id="84" w:name="a8.-fuel-cycle-and-life-cycle-total"/>
+    <w:bookmarkEnd w:id="84"/>
+    <w:bookmarkStart w:id="85" w:name="a8.-fuel-cycle-and-life-cycle-total"/>
     <w:p>
       <w:pPr>
         <w:pStyle w:val="Heading3"/>
@@ -18796,8 +18787,8 @@
         <w:t xml:space="preserve">Grouped (mode case): fuel front end 1.458 g/kWh (54.0%); back end and decommissioning 0.670 (24.8%); O&amp;M 0.330 (12.2%); construction 0.242 (9.0%).</w:t>
       </w:r>
     </w:p>
-    <w:bookmarkEnd w:id="84"/>
-    <w:bookmarkStart w:id="85" w:name="Xcbf3e6739bbfec93458e6285538cb024706ce2d"/>
+    <w:bookmarkEnd w:id="85"/>
+    <w:bookmarkStart w:id="86" w:name="Xcbf3e6739bbfec93458e6285538cb024706ce2d"/>
     <w:p>
       <w:pPr>
         <w:pStyle w:val="Heading3"/>
@@ -19506,9 +19497,9 @@
         </w:pict>
       </w:r>
     </w:p>
-    <w:bookmarkEnd w:id="85"/>
     <w:bookmarkEnd w:id="86"/>
-    <w:bookmarkStart w:id="131" w:name="X7e33b522909f8daae3037d2691d3cd94d9b7c55"/>
+    <w:bookmarkEnd w:id="87"/>
+    <w:bookmarkStart w:id="130" w:name="X7e33b522909f8daae3037d2691d3cd94d9b7c55"/>
     <w:p>
       <w:pPr>
         <w:pStyle w:val="Heading2"/>
@@ -20182,7 +20173,7 @@
         </w:pict>
       </w:r>
     </w:p>
-    <w:bookmarkStart w:id="91" w:name="b1.-legal-and-political-pathway"/>
+    <w:bookmarkStart w:id="92" w:name="b1.-legal-and-political-pathway"/>
     <w:p>
       <w:pPr>
         <w:pStyle w:val="Heading3"/>
@@ -20209,7 +20200,7 @@
         <w:t xml:space="preserve">Three laws bar an SMR at Liddell, and each has a different veto holder. On current party positions, the federal repeal is about 7 Senate votes short (2–3 short even with every other crossbencher: about 39 votes are needed and at most 37 are available), and the NSW repeal bill is stalled. For comparison, Darlington’s licence to construct took about 29 months, 17.9 years after its environmental assessment began.</w:t>
       </w:r>
     </w:p>
-    <w:bookmarkStart w:id="87" w:name="X3978bcd65168dfde624f3a3e20dbe906af3d815"/>
+    <w:bookmarkStart w:id="88" w:name="X3978bcd65168dfde624f3a3e20dbe906af3d815"/>
     <w:p>
       <w:pPr>
         <w:pStyle w:val="Heading4"/>
@@ -20734,8 +20725,8 @@
         <w:t xml:space="preserve">Order of removal: federal repeal (1 and 2) → choice of regulator → state repeal or override (3) → site (4) → environmental assessment → licensing. Each step has a different veto holder, so all must agree.</w:t>
       </w:r>
     </w:p>
-    <w:bookmarkEnd w:id="87"/>
-    <w:bookmarkStart w:id="88" w:name="X52641d6a275743723c641fbdfc2158d68a6cd0a"/>
+    <w:bookmarkEnd w:id="88"/>
+    <w:bookmarkStart w:id="89" w:name="X52641d6a275743723c641fbdfc2158d68a6cd0a"/>
     <w:p>
       <w:pPr>
         <w:pStyle w:val="Heading4"/>
@@ -21622,8 +21613,8 @@
         <w:t xml:space="preserve">Result 4 makes the conclusion independent of the One Nation and Babet assumption (it holds on either count of seats). In the House, Labor holds 94 of 150 seats (Australian Electoral Commission, 2025), so a repeal bill would also need the Government’s support there.</w:t>
       </w:r>
     </w:p>
-    <w:bookmarkEnd w:id="88"/>
-    <w:bookmarkStart w:id="89" w:name="b1.3-nsw-repeal-bill-status"/>
+    <w:bookmarkEnd w:id="89"/>
+    <w:bookmarkStart w:id="90" w:name="b1.3-nsw-repeal-bill-status"/>
     <w:p>
       <w:pPr>
         <w:pStyle w:val="Heading4"/>
@@ -21882,8 +21873,8 @@
         </w:tc>
       </w:tr>
     </w:tbl>
-    <w:bookmarkEnd w:id="89"/>
-    <w:bookmarkStart w:id="90" w:name="X1a74a4ec34d97d2cc7de09de2586d1d2b22092c"/>
+    <w:bookmarkEnd w:id="90"/>
+    <w:bookmarkStart w:id="91" w:name="X1a74a4ec34d97d2cc7de09de2586d1d2b22092c"/>
     <w:p>
       <w:pPr>
         <w:pStyle w:val="Heading4"/>
@@ -22771,9 +22762,9 @@
         </w:pict>
       </w:r>
     </w:p>
-    <w:bookmarkEnd w:id="90"/>
     <w:bookmarkEnd w:id="91"/>
-    <w:bookmarkStart w:id="98" w:name="X372cadb88b67a633233203304eb4ef38d3c0c77"/>
+    <w:bookmarkEnd w:id="92"/>
+    <w:bookmarkStart w:id="99" w:name="X372cadb88b67a633233203304eb4ef38d3c0c77"/>
     <w:p>
       <w:pPr>
         <w:pStyle w:val="Heading3"/>
@@ -22830,7 +22821,7 @@
         <w:t xml:space="preserve">. Removing Russia raises the HHI at every stage. Removing Russia and China leaves enrichment as a Urenco–Orano duopoly (5,621). The one case below 1,800 is mining by company (about 850–1,400, from the top three firms only; midpoint 1,118), so mining concentration is a country (geopolitical) risk rather than a market-power risk.</w:t>
       </w:r>
     </w:p>
-    <w:bookmarkStart w:id="92" w:name="b2.1-method"/>
+    <w:bookmarkStart w:id="93" w:name="b2.1-method"/>
     <w:p>
       <w:pPr>
         <w:pStyle w:val="Heading4"/>
@@ -23343,8 +23334,8 @@
         <w:t xml:space="preserve">(N_eq = 1.8).</w:t>
       </w:r>
     </w:p>
-    <w:bookmarkEnd w:id="92"/>
-    <w:bookmarkStart w:id="93" w:name="b2.2-inputs-and-shares"/>
+    <w:bookmarkEnd w:id="93"/>
+    <w:bookmarkStart w:id="94" w:name="b2.2-inputs-and-shares"/>
     <w:p>
       <w:pPr>
         <w:pStyle w:val="Heading4"/>
@@ -26428,8 +26419,8 @@
         <w:t xml:space="preserve">Russia’s enrichment share is 43.3% in 2022 and 38.3% in the 2030 plans (World Nuclear Association, 2025). It is 42.8% on WNA’s 2025 capacity and 41.0% on World Nuclear University’s (2025) figures, which gives the range quoted in §8.3.</w:t>
       </w:r>
     </w:p>
-    <w:bookmarkEnd w:id="93"/>
-    <w:bookmarkStart w:id="94" w:name="b2.3-headline-results"/>
+    <w:bookmarkEnd w:id="94"/>
+    <w:bookmarkStart w:id="95" w:name="b2.3-headline-results"/>
     <w:p>
       <w:pPr>
         <w:pStyle w:val="Heading4"/>
@@ -26941,11 +26932,11 @@
         <w:pStyle w:val="BodyText"/>
       </w:pPr>
       <w:r>
-        <w:t xml:space="preserve">Shares for the two producer countries in the comparison: Canada mined 23.8% of world uranium in 2024 and holds 20.2% of world conversion capacity (36.2% of the capacity open to a Western buyer), with no enrichment. Australia mined 7.6% (4,598 tU) and has no conversion or enrichment capacity. Australia holds 28% of identified recoverable resources at &lt; USD 130/kgU in the 2024 Red Book edition we use (OECD NEA and IAEA, 2025); two tabulations of the 2026 edition give 29% and 27%.</w:t>
-      </w:r>
-    </w:p>
-    <w:bookmarkEnd w:id="94"/>
-    <w:bookmarkStart w:id="95" w:name="b2.4-sensitivity"/>
+        <w:t xml:space="preserve">Shares for the two producer countries in the comparison: Canada mined 23.8% of world uranium in 2024 and holds 20.2% of world conversion capacity (36.2% of the capacity open to a Western buyer), with no enrichment. Australia mined 7.6% (4,598 tU) and has no conversion or enrichment capacity. Australia holds 28% of identified recoverable resources at &lt; USD 130/kgU in the 2024 Red Book edition we use (OECD Nuclear Energy Agency and International Atomic Energy Agency, 2025); two tabulations of the 2026 edition give 29% and 27%.</w:t>
+      </w:r>
+    </w:p>
+    <w:bookmarkEnd w:id="95"/>
+    <w:bookmarkStart w:id="96" w:name="b2.4-sensitivity"/>
     <w:p>
       <w:pPr>
         <w:pStyle w:val="Heading4"/>
@@ -29664,8 +29655,8 @@
         <w:t xml:space="preserve">Both bounds are below 1,500, so firms are not concentrated even though countries are. Kazakhstan’s 38.6% country share includes joint ventures with foreign partners, whose ownership was not assessed.</w:t>
       </w:r>
     </w:p>
-    <w:bookmarkEnd w:id="95"/>
-    <w:bookmarkStart w:id="96" w:name="b2.5-limitations"/>
+    <w:bookmarkEnd w:id="96"/>
+    <w:bookmarkStart w:id="97" w:name="b2.5-limitations"/>
     <w:p>
       <w:pPr>
         <w:pStyle w:val="Heading4"/>
@@ -29677,228 +29668,218 @@
     <w:p>
       <w:pPr>
         <w:pStyle w:val="FirstParagraph"/>
+      </w:pPr>
+      <w:r>
+        <w:t xml:space="preserve">“</w:t>
+      </w:r>
+      <w:r>
+        <w:t xml:space="preserve">High</w:t>
+      </w:r>
+      <w:r>
+        <w:t xml:space="preserve">”</w:t>
+      </w:r>
+      <w:r>
+        <w:t xml:space="preserve"> </w:t>
+      </w:r>
+      <w:r>
+        <w:t xml:space="preserve">is above 1,800 on the 2023 guidelines and above 2,500 on the 2010 guidelines;</w:t>
+      </w:r>
+      <w:r>
+        <w:t xml:space="preserve"> </w:t>
+      </w:r>
+      <w:r>
+        <w:t xml:space="preserve">“</w:t>
+      </w:r>
+      <w:r>
+        <w:t xml:space="preserve">Moderate</w:t>
+      </w:r>
+      <w:r>
+        <w:t xml:space="preserve">”</w:t>
+      </w:r>
+      <w:r>
+        <w:t xml:space="preserve"> </w:t>
+      </w:r>
+      <w:r>
+        <w:t xml:space="preserve">is 1,500–2,500 (2010). Without Russia, all three stages are high on both scales. Sensitivity: enrichment 2,724–3,065 (2030 plans to 2022); mining by country 2,246–2,370 (2022–2024); conversion 2,015 with the higher ConverDyn capacity; all country-level and capacity-based cases stay above 1,800. Mining by company is about 850–1,400 (midpoint 1,118; top three firms only), mostly below the threshold. Russia’s enrichment share is 42.8% on WNA capacity and 41.0% on World Nuclear University’s. Australia’s resource share is 28% in the 2024 Red Book edition we use; two tabulations of the 2026 edition give 29% and 27%.</w:t>
+      </w:r>
+    </w:p>
+    <w:p>
+      <w:pPr>
+        <w:pStyle w:val="BodyText"/>
+      </w:pPr>
+      <w:r>
+        <w:t xml:space="preserve">Limits:</w:t>
+      </w:r>
+      <w:r>
+        <w:t xml:space="preserve"> </w:t>
+      </w:r>
+      <w:r>
+        <w:t xml:space="preserve">- Capacity is not supply. Nameplate SWU includes capacity Rosatom uses for underfeeding and tails re-enrichment, and CNNC’s figures are WNA estimates.</w:t>
+      </w:r>
+      <w:r>
+        <w:t xml:space="preserve"> </w:t>
+      </w:r>
+      <w:r>
+        <w:t xml:space="preserve">- Secondary supply (inventories, down-blending, re-enriched tails) is excluded. Mine output in 2024 (60,213 tU) met about 93% of reactor requirements (64,500 tU at 1 January 2025; OECD Nuclear Energy Agency and International Atomic Energy Agency, 2026).</w:t>
+      </w:r>
+      <w:r>
+        <w:t xml:space="preserve"> </w:t>
+      </w:r>
+      <w:r>
+        <w:t xml:space="preserve">- Company-level enrichment shares hide plant location: Urenco operates in the UK, Germany, the Netherlands and the USA; Orano only in France.</w:t>
+      </w:r>
+      <w:r>
+        <w:t xml:space="preserve"> </w:t>
+      </w:r>
+      <w:r>
+        <w:t xml:space="preserve">- Mining by country ignores ownership and the transport routes for Kazakh exports, which were not assessed, so Russia’s 4.5% of mining may understate its reach. The company-level bound only partly addresses ownership.</w:t>
+      </w:r>
+      <w:r>
+        <w:t xml:space="preserve"> </w:t>
+      </w:r>
+      <w:r>
+        <w:t xml:space="preserve">- Fuel fabrication, where BWR fuel is thought to have few suppliers, was not assessed (§11).</w:t>
+      </w:r>
+      <w:r>
+        <w:t xml:space="preserve"> </w:t>
+      </w:r>
+      <w:r>
+        <w:t xml:space="preserve">- The HHI is a world-market measure. Darlington’s own demand is sized against it in B2.6.</w:t>
+      </w:r>
+    </w:p>
+    <w:bookmarkEnd w:id="97"/>
+    <w:bookmarkStart w:id="98" w:name="X38b76fede8e58c0e5d473d8915656eae0265e01"/>
+    <w:p>
+      <w:pPr>
+        <w:pStyle w:val="Heading4"/>
+      </w:pPr>
+      <w:r>
+        <w:t xml:space="preserve">B2.6 Darlington’s fuel demand against supplier capacity</w:t>
+      </w:r>
+    </w:p>
+    <w:p>
+      <w:pPr>
+        <w:pStyle w:val="FirstParagraph"/>
+      </w:pPr>
+      <w:r>
+        <w:rPr>
+          <w:bCs/>
+          <w:b/>
+        </w:rPr>
+        <w:t xml:space="preserve">Result.</w:t>
+      </w:r>
+      <w:r>
+        <w:t xml:space="preserve"> </w:t>
+      </w:r>
+      <w:r>
+        <w:t xml:space="preserve">Four BWRX-300s need about 196 t of natural uranium and 138 thousand separative work units (tSWU) a year:</w:t>
+      </w:r>
+      <w:r>
+        <w:t xml:space="preserve"> </w:t>
+      </w:r>
+      <w:r>
+        <w:rPr>
+          <w:bCs/>
+          <w:b/>
+        </w:rPr>
+        <w:t xml:space="preserve">3.2% of Urenco USA’s current capacity</w:t>
+      </w:r>
+      <w:r>
+        <w:t xml:space="preserve"> </w:t>
+      </w:r>
+      <w:r>
+        <w:t xml:space="preserve">and 0.56% of the Western (Urenco and Orano) enrichment market. The project is too small to move the HHI. Its exposure is to price and contract terms in a duopoly, not to physical shortage. The inputs are assumed typical BWR reload values (3.8% enrichment, 45 GWd/t burnup).</w:t>
+      </w:r>
+    </w:p>
+    <w:p>
+      <w:pPr>
+        <w:pStyle w:val="BodyText"/>
+      </w:pPr>
+      <w:r>
+        <w:t xml:space="preserve">Working (one unit;</w:t>
+      </w:r>
+      <w:r>
+        <w:t xml:space="preserve"> </w:t>
+      </w:r>
+      <w:r>
+        <w:rPr>
+          <w:rStyle w:val="VerbatimChar"/>
+        </w:rPr>
+        <w:t xml:space="preserve">hhi.md</w:t>
+      </w:r>
+      <w:r>
+        <w:t xml:space="preserve"> </w:t>
+      </w:r>
+      <w:r>
+        <w:t xml:space="preserve">§6):</w:t>
+      </w:r>
+      <w:r>
+        <w:t xml:space="preserve"> </w:t>
+      </w:r>
+      <w:r>
+        <w:t xml:space="preserve">1. Net generation: 300 MWe × 8,760 h × 0.9 = 2,365,200 MWh. Thermal power 870 MWt gives efficiency η = 300 / 870 = 0.3448.</w:t>
+      </w:r>
+      <w:r>
+        <w:t xml:space="preserve"> </w:t>
+      </w:r>
+      <w:r>
+        <w:t xml:space="preserve">2. Energy per kg of enriched uranium (3.8% U-235, burnup 45 GWd/t) = 45 × 24,000 kWh × η = 372,414 kWh. Enriched uranium needed = 2,365,200,000 kWh / 372,414 = 6.35 t a year.</w:t>
+      </w:r>
+      <w:r>
+        <w:t xml:space="preserve"> </w:t>
+      </w:r>
+      <w:r>
+        <w:t xml:space="preserve">3. Natural uranium feed factor 7.701 (tails 0.25%): 6.35 × 7.701 = 48.9 t U. Separative work: 5.422 SWU per kg, so 34.4 tSWU.</w:t>
+      </w:r>
+      <w:r>
+        <w:t xml:space="preserve"> </w:t>
+      </w:r>
+      <w:r>
+        <w:t xml:space="preserve">4. Four units: 25.4 t enriched,</w:t>
+      </w:r>
+      <w:r>
+        <w:t xml:space="preserve"> </w:t>
+      </w:r>
+      <w:r>
+        <w:rPr>
+          <w:bCs/>
+          <w:b/>
+        </w:rPr>
+        <w:t xml:space="preserve">195.6 t U</w:t>
+      </w:r>
+      <w:r>
+        <w:t xml:space="preserve"> </w:t>
+      </w:r>
+      <w:r>
+        <w:t xml:space="preserve">and</w:t>
+      </w:r>
+      <w:r>
+        <w:t xml:space="preserve"> </w:t>
+      </w:r>
+      <w:r>
+        <w:rPr>
+          <w:bCs/>
+          <w:b/>
+        </w:rPr>
+        <w:t xml:space="preserve">137.7 tSWU</w:t>
+      </w:r>
+      <w:r>
+        <w:t xml:space="preserve"> </w:t>
+      </w:r>
+      <w:r>
+        <w:t xml:space="preserve">a year.</w:t>
+      </w:r>
+    </w:p>
+    <w:p>
+      <w:pPr>
+        <w:pStyle w:val="BodyText"/>
       </w:pPr>
       <w:r>
         <w:rPr>
           <w:iCs/>
           <w:i/>
         </w:rPr>
-        <w:t xml:space="preserve">Note moved from §8.3 (Table T9).</w:t>
-      </w:r>
-      <w:r>
-        <w:t xml:space="preserve"> </w:t>
-      </w:r>
-      <w:r>
-        <w:t xml:space="preserve">“</w:t>
-      </w:r>
-      <w:r>
-        <w:t xml:space="preserve">High</w:t>
-      </w:r>
-      <w:r>
-        <w:t xml:space="preserve">”</w:t>
-      </w:r>
-      <w:r>
-        <w:t xml:space="preserve"> </w:t>
-      </w:r>
-      <w:r>
-        <w:t xml:space="preserve">is above 1,800 on the 2023 guidelines and above 2,500 on the 2010 guidelines;</w:t>
-      </w:r>
-      <w:r>
-        <w:t xml:space="preserve"> </w:t>
-      </w:r>
-      <w:r>
-        <w:t xml:space="preserve">“</w:t>
-      </w:r>
-      <w:r>
-        <w:t xml:space="preserve">Moderate</w:t>
-      </w:r>
-      <w:r>
-        <w:t xml:space="preserve">”</w:t>
-      </w:r>
-      <w:r>
-        <w:t xml:space="preserve"> </w:t>
-      </w:r>
-      <w:r>
-        <w:t xml:space="preserve">is 1,500–2,500 (2010). Without Russia, all three stages are high on both scales. Sensitivity: enrichment 2,724–3,065 (2030 plans to 2022); mining by country 2,246–2,370 (2022–2024); conversion 2,015 with the higher ConverDyn capacity; all country-level and capacity-based cases stay above 1,800. Mining by company is about 850–1,400 (midpoint 1,118; top three firms only), mostly below the threshold. Russia’s enrichment share is 42.8% on WNA capacity and 41.0% on World Nuclear University’s. Australia’s resource share is 28% in the 2024 Red Book edition we use; two tabulations of the 2026 edition give 29% and 27%.</w:t>
-      </w:r>
-    </w:p>
-    <w:p>
-      <w:pPr>
-        <w:pStyle w:val="BodyText"/>
-      </w:pPr>
-      <w:r>
-        <w:t xml:space="preserve">Limits:</w:t>
-      </w:r>
-      <w:r>
-        <w:t xml:space="preserve"> </w:t>
-      </w:r>
-      <w:r>
-        <w:t xml:space="preserve">- Capacity is not supply. Nameplate SWU includes capacity Rosatom uses for underfeeding and tails re-enrichment, and CNNC’s figures are WNA estimates.</w:t>
-      </w:r>
-      <w:r>
-        <w:t xml:space="preserve"> </w:t>
-      </w:r>
-      <w:r>
-        <w:t xml:space="preserve">- Secondary supply (inventories, down-blending, re-enriched tails) is excluded. Mine output in 2024 (60,213 tU) met about 93% of reactor requirements (64,500 tU at 1 January 2025; OECD NEA and IAEA, 2026).</w:t>
-      </w:r>
-      <w:r>
-        <w:t xml:space="preserve"> </w:t>
-      </w:r>
-      <w:r>
-        <w:t xml:space="preserve">- Company-level enrichment shares hide plant location: Urenco operates in the UK, Germany, the Netherlands and the USA; Orano only in France.</w:t>
-      </w:r>
-      <w:r>
-        <w:t xml:space="preserve"> </w:t>
-      </w:r>
-      <w:r>
-        <w:t xml:space="preserve">- Mining by country ignores ownership and the transport routes for Kazakh exports, which were not assessed, so Russia’s 4.5% of mining may understate its reach. The company-level bound only partly addresses ownership.</w:t>
-      </w:r>
-      <w:r>
-        <w:t xml:space="preserve"> </w:t>
-      </w:r>
-      <w:r>
-        <w:t xml:space="preserve">- Fuel fabrication, where BWR fuel is thought to have few suppliers, was not assessed (§11).</w:t>
-      </w:r>
-      <w:r>
-        <w:t xml:space="preserve"> </w:t>
-      </w:r>
-      <w:r>
-        <w:t xml:space="preserve">- The HHI is a world-market measure. Darlington’s own demand is sized against it in B2.6.</w:t>
-      </w:r>
-    </w:p>
-    <w:bookmarkEnd w:id="96"/>
-    <w:bookmarkStart w:id="97" w:name="X38b76fede8e58c0e5d473d8915656eae0265e01"/>
-    <w:p>
-      <w:pPr>
-        <w:pStyle w:val="Heading4"/>
-      </w:pPr>
-      <w:r>
-        <w:t xml:space="preserve">B2.6 Darlington’s fuel demand against supplier capacity</w:t>
-      </w:r>
-    </w:p>
-    <w:p>
-      <w:pPr>
-        <w:pStyle w:val="FirstParagraph"/>
-      </w:pPr>
-      <w:r>
-        <w:rPr>
-          <w:bCs/>
-          <w:b/>
-        </w:rPr>
-        <w:t xml:space="preserve">Result.</w:t>
-      </w:r>
-      <w:r>
-        <w:t xml:space="preserve"> </w:t>
-      </w:r>
-      <w:r>
-        <w:t xml:space="preserve">Four BWRX-300s need about 196 t of natural uranium and 138 thousand separative work units (tSWU) a year:</w:t>
-      </w:r>
-      <w:r>
-        <w:t xml:space="preserve"> </w:t>
-      </w:r>
-      <w:r>
-        <w:rPr>
-          <w:bCs/>
-          <w:b/>
-        </w:rPr>
-        <w:t xml:space="preserve">3.2% of Urenco USA’s current capacity</w:t>
-      </w:r>
-      <w:r>
-        <w:t xml:space="preserve"> </w:t>
-      </w:r>
-      <w:r>
-        <w:t xml:space="preserve">and 0.56% of the Western (Urenco and Orano) enrichment market. The project is too small to move the HHI. Its exposure is to price and contract terms in a duopoly, not to physical shortage. The inputs are assumed typical BWR reload values (3.8% enrichment, 45 GWd/t burnup).</w:t>
-      </w:r>
-    </w:p>
-    <w:p>
-      <w:pPr>
-        <w:pStyle w:val="BodyText"/>
-      </w:pPr>
-      <w:r>
-        <w:t xml:space="preserve">Working (one unit;</w:t>
-      </w:r>
-      <w:r>
-        <w:t xml:space="preserve"> </w:t>
-      </w:r>
-      <w:r>
-        <w:rPr>
-          <w:rStyle w:val="VerbatimChar"/>
-        </w:rPr>
-        <w:t xml:space="preserve">hhi.md</w:t>
-      </w:r>
-      <w:r>
-        <w:t xml:space="preserve"> </w:t>
-      </w:r>
-      <w:r>
-        <w:t xml:space="preserve">§6):</w:t>
-      </w:r>
-      <w:r>
-        <w:t xml:space="preserve"> </w:t>
-      </w:r>
-      <w:r>
-        <w:t xml:space="preserve">1. Net generation: 300 MWe × 8,760 h × 0.9 = 2,365,200 MWh. Thermal power 870 MWt gives efficiency η = 300 / 870 = 0.3448.</w:t>
-      </w:r>
-      <w:r>
-        <w:t xml:space="preserve"> </w:t>
-      </w:r>
-      <w:r>
-        <w:t xml:space="preserve">2. Energy per kg of enriched uranium (3.8% U-235, burnup 45 GWd/t) = 45 × 24,000 kWh × η = 372,414 kWh. Enriched uranium needed = 2,365,200,000 kWh / 372,414 = 6.35 t a year.</w:t>
-      </w:r>
-      <w:r>
-        <w:t xml:space="preserve"> </w:t>
-      </w:r>
-      <w:r>
-        <w:t xml:space="preserve">3. Natural uranium feed factor 7.701 (tails 0.25%): 6.35 × 7.701 = 48.9 t U. Separative work: 5.422 SWU per kg, so 34.4 tSWU.</w:t>
-      </w:r>
-      <w:r>
-        <w:t xml:space="preserve"> </w:t>
-      </w:r>
-      <w:r>
-        <w:t xml:space="preserve">4. Four units: 25.4 t enriched,</w:t>
-      </w:r>
-      <w:r>
-        <w:t xml:space="preserve"> </w:t>
-      </w:r>
-      <w:r>
-        <w:rPr>
-          <w:bCs/>
-          <w:b/>
-        </w:rPr>
-        <w:t xml:space="preserve">195.6 t U</w:t>
-      </w:r>
-      <w:r>
-        <w:t xml:space="preserve"> </w:t>
-      </w:r>
-      <w:r>
-        <w:t xml:space="preserve">and</w:t>
-      </w:r>
-      <w:r>
-        <w:t xml:space="preserve"> </w:t>
-      </w:r>
-      <w:r>
-        <w:rPr>
-          <w:bCs/>
-          <w:b/>
-        </w:rPr>
-        <w:t xml:space="preserve">137.7 tSWU</w:t>
-      </w:r>
-      <w:r>
-        <w:t xml:space="preserve"> </w:t>
-      </w:r>
-      <w:r>
-        <w:t xml:space="preserve">a year.</w:t>
-      </w:r>
-    </w:p>
-    <w:p>
-      <w:pPr>
-        <w:pStyle w:val="BodyText"/>
-      </w:pPr>
-      <w:r>
-        <w:rPr>
-          <w:iCs/>
-          <w:i/>
-        </w:rPr>
-        <w:t xml:space="preserve">Table B35. Four-unit demand set against supplier capacity.</w:t>
+        <w:t xml:space="preserve">Table B12a. Four-unit demand set against supplier capacity.</w:t>
       </w:r>
       <w:r>
         <w:t xml:space="preserve"> </w:t>
@@ -30219,9 +30200,9 @@
         </w:pict>
       </w:r>
     </w:p>
-    <w:bookmarkEnd w:id="97"/>
     <w:bookmarkEnd w:id="98"/>
-    <w:bookmarkStart w:id="100" w:name="X4d39e6569850789c0bc5244e03826205e394972"/>
+    <w:bookmarkEnd w:id="99"/>
+    <w:bookmarkStart w:id="101" w:name="X4d39e6569850789c0bc5244e03826205e394972"/>
     <w:p>
       <w:pPr>
         <w:pStyle w:val="Heading3"/>
@@ -30301,7 +30282,7 @@
           <w:iCs/>
           <w:i/>
         </w:rPr>
-        <w:t xml:space="preserve">Source: our qualitative judgement (law brief §5), from the evidence cited in the table.</w:t>
+        <w:t xml:space="preserve">Source: our qualitative judgement, from the evidence cited in the table.</w:t>
       </w:r>
     </w:p>
     <w:tbl>
@@ -30798,7 +30779,7 @@
           <w:iCs/>
           <w:i/>
         </w:rPr>
-        <w:t xml:space="preserve">Source: calculated from Table B13 (law brief §5).</w:t>
+        <w:t xml:space="preserve">Source: calculated from Table B13.</w:t>
       </w:r>
     </w:p>
     <w:tbl>
@@ -31105,13 +31086,13 @@
         <w:t xml:space="preserve">Reading: route B ranks last under all three weightings tested, and C is never behind A. Valuing regulator readiness more only closes the gap, to a tie with A. The choice between A and C is a choice between speed (an existing regulator) and durability (both levels of government committed). That is a political judgement, not a technical one. Whichever route is assumed, an Australian SMR scores lowest on time to first power in the §9 MCDA.</w:t>
       </w:r>
     </w:p>
-    <w:bookmarkStart w:id="99" w:name="Xabe5d379df5afcb6bee3a55f8b7b15cd506d36e"/>
+    <w:bookmarkStart w:id="100" w:name="X0217c3edb9f1194b9fccb10b42373507355a848"/>
     <w:p>
       <w:pPr>
         <w:pStyle w:val="Heading4"/>
       </w:pPr>
       <w:r>
-        <w:t xml:space="preserve">B3.1 Implementation levers for C1 (Table T12 in §8.6): scores and weight test</w:t>
+        <w:t xml:space="preserve">B3.1 Implementation levers for C1 (the §8.6 lever table): scores and weight test</w:t>
       </w:r>
     </w:p>
     <w:p>
@@ -31119,7 +31100,7 @@
         <w:pStyle w:val="FirstParagraph"/>
       </w:pPr>
       <w:r>
-        <w:t xml:space="preserve">Each lever is scored 1 (poor) to 3 (good) on enforceability, speed and low schedule risk. The scores are our judgement (route brief §5), not sourced; the totals are hand calculations.</w:t>
+        <w:t xml:space="preserve">Each lever is scored 1 (poor) to 3 (good) on enforceability, speed and low schedule risk. The scores are our judgement, not sourced; the totals are hand calculations.</w:t>
       </w:r>
     </w:p>
     <w:p>
@@ -31131,7 +31112,7 @@
           <w:iCs/>
           <w:i/>
         </w:rPr>
-        <w:t xml:space="preserve">Table B14a. T16 lever scores and weight test.</w:t>
+        <w:t xml:space="preserve">Table B14a. Lever scores and weight test for the §8.6 lever table.</w:t>
       </w:r>
       <w:r>
         <w:t xml:space="preserve"> </w:t>
@@ -31141,7 +31122,7 @@
           <w:iCs/>
           <w:i/>
         </w:rPr>
-        <w:t xml:space="preserve">Source: our judgement and hand calculation (route brief §5).</w:t>
+        <w:t xml:space="preserve">Source: our judgement and hand calculation.</w:t>
       </w:r>
     </w:p>
     <w:tbl>
@@ -31551,9 +31532,9 @@
         </w:pict>
       </w:r>
     </w:p>
-    <w:bookmarkEnd w:id="99"/>
     <w:bookmarkEnd w:id="100"/>
-    <w:bookmarkStart w:id="104" w:name="X6942ef6bc025069590c0c205010015835f1b9ab"/>
+    <w:bookmarkEnd w:id="101"/>
+    <w:bookmarkStart w:id="105" w:name="X6942ef6bc025069590c0c205010015835f1b9ab"/>
     <w:p>
       <w:pPr>
         <w:pStyle w:val="Heading3"/>
@@ -31671,7 +31652,7 @@
         <w:t xml:space="preserve">.</w:t>
       </w:r>
     </w:p>
-    <w:bookmarkStart w:id="101" w:name="b4.1-method"/>
+    <w:bookmarkStart w:id="102" w:name="b4.1-method"/>
     <w:p>
       <w:pPr>
         <w:pStyle w:val="Heading4"/>
@@ -32341,7 +32322,7 @@
               <w:jc w:val="left"/>
             </w:pPr>
             <w:r>
-              <w:t xml:space="preserve">Assumption (the deck’s value; an OPG filing gives 315)</w:t>
+              <w:t xml:space="preserve">Assumption (an OPG filing gives 315)</w:t>
             </w:r>
           </w:p>
         </w:tc>
@@ -33009,8 +32990,8 @@
         </w:tc>
       </w:tr>
     </w:tbl>
-    <w:bookmarkEnd w:id="101"/>
-    <w:bookmarkStart w:id="102" w:name="b4.2-results"/>
+    <w:bookmarkEnd w:id="102"/>
+    <w:bookmarkStart w:id="103" w:name="b4.2-results"/>
     <w:p>
       <w:pPr>
         <w:pStyle w:val="Heading4"/>
@@ -33195,7 +33176,7 @@
               <w:jc w:val="left"/>
             </w:pPr>
             <w:r>
-              <w:t xml:space="preserve">Ontario average 2023 (energy snapshot; the deck’s value)</w:t>
+              <w:t xml:space="preserve">Ontario average 2023 (energy snapshot)</w:t>
             </w:r>
           </w:p>
         </w:tc>
@@ -36052,8 +36033,8 @@
         <w:t xml:space="preserve">Only in the 110 g/kWh stress case, or on a near-zero floor, where the result turns negative.</w:t>
       </w:r>
     </w:p>
-    <w:bookmarkEnd w:id="102"/>
-    <w:bookmarkStart w:id="103" w:name="b4.3-limitations"/>
+    <w:bookmarkEnd w:id="103"/>
+    <w:bookmarkStart w:id="104" w:name="b4.3-limitations"/>
     <w:p>
       <w:pPr>
         <w:pStyle w:val="Heading4"/>
@@ -36179,9 +36160,9 @@
         </w:pict>
       </w:r>
     </w:p>
-    <w:bookmarkEnd w:id="103"/>
     <w:bookmarkEnd w:id="104"/>
-    <w:bookmarkStart w:id="111" w:name="X66860b851f2e133f81978e30598e738689cf6de"/>
+    <w:bookmarkEnd w:id="105"/>
+    <w:bookmarkStart w:id="112" w:name="X66860b851f2e133f81978e30598e738689cf6de"/>
     <w:p>
       <w:pPr>
         <w:pStyle w:val="Heading3"/>
@@ -36304,7 +36285,7 @@
         <w:t xml:space="preserve">.</w:t>
       </w:r>
     </w:p>
-    <w:bookmarkStart w:id="105" w:name="b5.1-method"/>
+    <w:bookmarkStart w:id="106" w:name="b5.1-method"/>
     <w:p>
       <w:pPr>
         <w:pStyle w:val="Heading4"/>
@@ -36504,8 +36485,8 @@
         <w:t xml:space="preserve">.</w:t>
       </w:r>
     </w:p>
-    <w:bookmarkEnd w:id="105"/>
-    <w:bookmarkStart w:id="106" w:name="b5.2-co₂e-lost-per-month-of-delay"/>
+    <w:bookmarkEnd w:id="106"/>
+    <w:bookmarkStart w:id="107" w:name="b5.2-co₂e-lost-per-month-of-delay"/>
     <w:p>
       <w:pPr>
         <w:pStyle w:val="Heading4"/>
@@ -37905,8 +37886,8 @@
         <w:t xml:space="preserve">§5).</w:t>
       </w:r>
     </w:p>
-    <w:bookmarkEnd w:id="106"/>
-    <w:bookmarkStart w:id="107" w:name="b5.3-break-even-delay-for-c1"/>
+    <w:bookmarkEnd w:id="107"/>
+    <w:bookmarkStart w:id="108" w:name="b5.3-break-even-delay-for-c1"/>
     <w:p>
       <w:pPr>
         <w:pStyle w:val="Heading4"/>
@@ -38508,8 +38489,8 @@
         <w:t xml:space="preserve">Its saving of 1,734 t per unit (5,201 t for Units 2–4; Monte Carlo 90% interval 1,387–2,153 t) gives break-evens of 9.2–14.6 days on the average factor and 1.3–1.4 days on the marginal factor. The deck case lengthens them by about 27% (2,200 / 1,734).</w:t>
       </w:r>
     </w:p>
-    <w:bookmarkEnd w:id="107"/>
-    <w:bookmarkStart w:id="108" w:name="Xaea02f89b8298bc8af300b41fdf9ad8acb92793"/>
+    <w:bookmarkEnd w:id="108"/>
+    <w:bookmarkStart w:id="109" w:name="Xaea02f89b8298bc8af300b41fdf9ad8acb92793"/>
     <w:p>
       <w:pPr>
         <w:pStyle w:val="Heading4"/>
@@ -39149,8 +39130,8 @@
         <w:t xml:space="preserve">§5), against C1’s total carbon value of C$0.63–0.76 m (C$1.14 m at 60% eligibility and C$115/t).</w:t>
       </w:r>
     </w:p>
-    <w:bookmarkEnd w:id="108"/>
-    <w:bookmarkStart w:id="109" w:name="b5.5-year-scale-delays"/>
+    <w:bookmarkEnd w:id="109"/>
+    <w:bookmarkStart w:id="110" w:name="b5.5-year-scale-delays"/>
     <w:p>
       <w:pPr>
         <w:pStyle w:val="Heading4"/>
@@ -39917,8 +39898,8 @@
         </w:tc>
       </w:tr>
     </w:tbl>
-    <w:bookmarkEnd w:id="109"/>
-    <w:bookmarkStart w:id="110" w:name="b5.6-limitations"/>
+    <w:bookmarkEnd w:id="110"/>
+    <w:bookmarkStart w:id="111" w:name="b5.6-limitations"/>
     <w:p>
       <w:pPr>
         <w:pStyle w:val="Heading4"/>
@@ -39994,9 +39975,9 @@
         </w:pict>
       </w:r>
     </w:p>
-    <w:bookmarkEnd w:id="110"/>
     <w:bookmarkEnd w:id="111"/>
-    <w:bookmarkStart w:id="116" w:name="Xe9bf8aa20110d892414618c9830b1120addc14d"/>
+    <w:bookmarkEnd w:id="112"/>
+    <w:bookmarkStart w:id="117" w:name="Xe9bf8aa20110d892414618c9830b1120addc14d"/>
     <w:p>
       <w:pPr>
         <w:pStyle w:val="Heading3"/>
@@ -40190,7 +40171,7 @@
         <w:t xml:space="preserve">and re-run; every table here regenerates.</w:t>
       </w:r>
     </w:p>
-    <w:bookmarkStart w:id="112" w:name="b6.1-inputs-and-method"/>
+    <w:bookmarkStart w:id="113" w:name="b6.1-inputs-and-method"/>
     <w:p>
       <w:pPr>
         <w:pStyle w:val="Heading4"/>
@@ -40887,8 +40868,8 @@
         <w:t xml:space="preserve">3. Cumulative comparison: the annual spend = SMR output × SMR LCOE, and the renewables bought with it = spend / renewables LCOE, from 2028. Each technology’s avoided CO₂e is summed on the same trajectory (B4.1), net of its own life-cycle intensity (4.2 or 30 g/kWh).</w:t>
       </w:r>
     </w:p>
-    <w:bookmarkEnd w:id="112"/>
-    <w:bookmarkStart w:id="113" w:name="b6.2-results"/>
+    <w:bookmarkEnd w:id="113"/>
+    <w:bookmarkStart w:id="114" w:name="b6.2-results"/>
     <w:p>
       <w:pPr>
         <w:pStyle w:val="Heading4"/>
@@ -43276,8 +43257,8 @@
         </w:tc>
       </w:tr>
     </w:tbl>
-    <w:bookmarkEnd w:id="113"/>
-    <w:bookmarkStart w:id="114" w:name="Xd3c3cf27c12f2b6068bf203352ac12d45dd7cd3"/>
+    <w:bookmarkEnd w:id="114"/>
+    <w:bookmarkStart w:id="115" w:name="Xd3c3cf27c12f2b6068bf203352ac12d45dd7cd3"/>
     <w:p>
       <w:pPr>
         <w:pStyle w:val="Heading4"/>
@@ -43340,7 +43321,10 @@
         <w:t xml:space="preserve"> </w:t>
       </w:r>
       <w:r>
-        <w:t xml:space="preserve">A$221 at 7% sits just below GenCost 2023-24’s 2030 SMR range (A$230–382). Two reasons it should sit low: Darlington is a four-unit site with shared infrastructure, whereas GenCost prices a generic single Australian SMR; and GenCost 2025-26 reports revising Darlington’s capital downwards for interest during construction (Graham and Hayward, 2026, as reported). At 10% (A$313) our figure falls in the upper half of GenCost’s range. GenCost 2024-25 gives an SMR value of up to A$487 (</w:t>
+        <w:t xml:space="preserve">A$221 at 7% sits just below GenCost 2023-24’s 2030 SMR range (A$230–382). Two reasons it should sit low: Darlington is a four-unit site with shared infrastructure, whereas GenCost prices a generic single Australian SMR; and GenCost 2025-26 reports revising Darlington’s capital downwards for interest during construction (Graham and Hayward, 2026, as reported). At 10% (A$313) our figure falls in the upper half of GenCost’s range. GenCost 2024-25 gives an SMR value of up to A$487 (Graham, Hayward and Foster, 2025;</w:t>
+      </w:r>
+      <w:r>
+        <w:t xml:space="preserve"> </w:t>
       </w:r>
       <w:r>
         <w:rPr>
@@ -43489,8 +43473,8 @@
         <w:t xml:space="preserve">.</w:t>
       </w:r>
     </w:p>
-    <w:bookmarkEnd w:id="114"/>
-    <w:bookmarkStart w:id="115" w:name="b6.4-limitations"/>
+    <w:bookmarkEnd w:id="115"/>
+    <w:bookmarkStart w:id="116" w:name="b6.4-limitations"/>
     <w:p>
       <w:pPr>
         <w:pStyle w:val="Heading4"/>
@@ -43566,9 +43550,9 @@
         </w:pict>
       </w:r>
     </w:p>
-    <w:bookmarkEnd w:id="115"/>
     <w:bookmarkEnd w:id="116"/>
-    <w:bookmarkStart w:id="123" w:name="Xc131c5b7da9b849e6bc37677db63fd4f3349dcd"/>
+    <w:bookmarkEnd w:id="117"/>
+    <w:bookmarkStart w:id="124" w:name="Xc131c5b7da9b849e6bc37677db63fd4f3349dcd"/>
     <w:p>
       <w:pPr>
         <w:pStyle w:val="Heading3"/>
@@ -43608,7 +43592,7 @@
         <w:t xml:space="preserve"> </w:t>
       </w:r>
       <w:r>
-        <w:t xml:space="preserve">the social, legal and renewables-supply scores and the weights are our judgement. The main-text summary is §9 (Tables T13 and T14). Source:</w:t>
+        <w:t xml:space="preserve">the social, legal and renewables-supply scores and the weights are our judgement. The main-text summary is §9 (the §9 tables). Source:</w:t>
       </w:r>
       <w:r>
         <w:t xml:space="preserve"> </w:t>
@@ -43665,7 +43649,7 @@
         <w:t xml:space="preserve">, which holds every raw score, normalised score, weight set and perturbation (593 rows).</w:t>
       </w:r>
     </w:p>
-    <w:bookmarkStart w:id="117" w:name="b7.1-options-criteria-and-inputs"/>
+    <w:bookmarkStart w:id="118" w:name="b7.1-options-criteria-and-inputs"/>
     <w:p>
       <w:pPr>
         <w:pStyle w:val="Heading4"/>
@@ -44347,7 +44331,7 @@
               <w:jc w:val="left"/>
             </w:pPr>
             <w:r>
-              <w:t xml:space="preserve">B3, best SMR route under equal weights (route C, 8); route A rescored to 6 after fact-check M2, which leaves this input unchanged (our judgement)</w:t>
+              <w:t xml:space="preserve">B3, best SMR route under equal weights (route C, 8); route A scores 6, which leaves this input unchanged (our judgement)</w:t>
             </w:r>
           </w:p>
         </w:tc>
@@ -44407,8 +44391,8 @@
         <w:t xml:space="preserve">Technology readiness level (TRL) is not scored. Schedule risk enters through the first-power year (tested at 2035 and 2045) and the C1 delay case.</w:t>
       </w:r>
     </w:p>
-    <w:bookmarkEnd w:id="117"/>
-    <w:bookmarkStart w:id="118" w:name="b7.2-method"/>
+    <w:bookmarkEnd w:id="118"/>
+    <w:bookmarkStart w:id="119" w:name="b7.2-method"/>
     <w:p>
       <w:pPr>
         <w:pStyle w:val="Heading4"/>
@@ -45152,8 +45136,8 @@
         </w:tc>
       </w:tr>
     </w:tbl>
-    <w:bookmarkEnd w:id="118"/>
-    <w:bookmarkStart w:id="119" w:name="b7.3-weights-and-results"/>
+    <w:bookmarkEnd w:id="119"/>
+    <w:bookmarkStart w:id="120" w:name="b7.3-weights-and-results"/>
     <w:p>
       <w:pPr>
         <w:pStyle w:val="Heading4"/>
@@ -46192,8 +46176,8 @@
         </w:tc>
       </w:tr>
     </w:tbl>
-    <w:bookmarkEnd w:id="119"/>
-    <w:bookmarkStart w:id="120" w:name="b7.4-rank-reversal-and-input-sensitivity"/>
+    <w:bookmarkEnd w:id="120"/>
+    <w:bookmarkStart w:id="121" w:name="b7.4-rank-reversal-and-input-sensitivity"/>
     <w:p>
       <w:pPr>
         <w:pStyle w:val="Heading4"/>
@@ -46848,8 +46832,8 @@
         <w:t xml:space="preserve">it comes from the four-option scale, where doing nothing scores full marks on cost, supply and legal feasibility.</w:t>
       </w:r>
     </w:p>
-    <w:bookmarkEnd w:id="120"/>
-    <w:bookmarkStart w:id="121" w:name="X655acef3214253160cddaea55a74ab651fff5b4"/>
+    <w:bookmarkEnd w:id="121"/>
+    <w:bookmarkStart w:id="122" w:name="X655acef3214253160cddaea55a74ab651fff5b4"/>
     <w:p>
       <w:pPr>
         <w:pStyle w:val="Heading4"/>
@@ -47326,8 +47310,8 @@
         <w:t xml:space="preserve">If C1 slips the unit by 18.5 days (the whole-life break-even of Table B21, used as an illustration), the CO₂e not avoided at Liddell during the delay is 32.3 kt, which is 15 times the 2,200 t saving. SMR + C1 then avoids less than the plain SMR, so the schedule-neutral condition decides the sign. The percentages are of the 4.2 g/kWh median.</w:t>
       </w:r>
     </w:p>
-    <w:bookmarkEnd w:id="121"/>
-    <w:bookmarkStart w:id="122" w:name="b7.6-limitations"/>
+    <w:bookmarkEnd w:id="122"/>
+    <w:bookmarkStart w:id="123" w:name="b7.6-limitations"/>
     <w:p>
       <w:pPr>
         <w:pStyle w:val="Heading4"/>
@@ -47535,9 +47519,9 @@
         </w:pict>
       </w:r>
     </w:p>
-    <w:bookmarkEnd w:id="122"/>
     <w:bookmarkEnd w:id="123"/>
-    <w:bookmarkStart w:id="128" w:name="Xdcb2f35f44111e0f453c2a475e1a576da286c83"/>
+    <w:bookmarkEnd w:id="124"/>
+    <w:bookmarkStart w:id="129" w:name="Xdcb2f35f44111e0f453c2a475e1a576da286c83"/>
     <w:p>
       <w:pPr>
         <w:pStyle w:val="Heading3"/>
@@ -47616,7 +47600,31 @@
         <w:t xml:space="preserve">).</w:t>
       </w:r>
     </w:p>
-    <w:bookmarkStart w:id="124" w:name="X8871295422bcc52b42d843e419a224e284f0009"/>
+    <w:p>
+      <w:pPr>
+        <w:pStyle w:val="BodyText"/>
+      </w:pPr>
+      <w:r>
+        <w:t xml:space="preserve">Sources for the §8.4 social-licence table (Darlington and Liddell): Neelam (2024); Griffith University Climate Action Beacon and Monash Climate Change Communication Research Hub (2025); Newspoll (2007); Ritchie (2020); Markandya and Wilkinson (2007); Canadian Nuclear Safety Commission (2025); Williams Treaties First Nations et al. (2026); Mississaugas of Scugog Island First Nation (2023); Curve Lake First Nation (2024); Municipality of Clarington (2024); Australian Electoral Commission (2019);</w:t>
+      </w:r>
+      <w:r>
+        <w:t xml:space="preserve"> </w:t>
+      </w:r>
+      <w:r>
+        <w:rPr>
+          <w:iCs/>
+          <w:i/>
+        </w:rPr>
+        <w:t xml:space="preserve">Barngarla</w:t>
+      </w:r>
+      <w:r>
+        <w:t xml:space="preserve"> </w:t>
+      </w:r>
+      <w:r>
+        <w:t xml:space="preserve">[2023] FCA 809; Nuclear Waste Management Organization (2024a; 2024b; 2024c; n.d.); Department of Industry, Science, Energy and Resources (2020); Power Workers’ Union (2021); Conference Board of Canada (2021); Joint Standing Committee on Treaties (2024); Slovic (1987).</w:t>
+      </w:r>
+    </w:p>
+    <w:bookmarkStart w:id="125" w:name="X8871295422bcc52b42d843e419a224e284f0009"/>
     <w:p>
       <w:pPr>
         <w:pStyle w:val="Heading4"/>
@@ -48108,14 +48116,14 @@
         <w:t xml:space="preserve">The unit’s own output carries 0.07 statistical deaths a year at the nuclear rate (one per 14 years), a rate that includes Chernobyl and Fukushima. The fossil rates are for European plants with pollution controls, so they are conservative. Against wind or solar the difference lies within the uncertainty of the rates.</w:t>
       </w:r>
     </w:p>
-    <w:bookmarkEnd w:id="124"/>
-    <w:bookmarkStart w:id="125" w:name="Xfaf948de050b31a2ed3f21030d68b74a2859c70"/>
+    <w:bookmarkEnd w:id="125"/>
+    <w:bookmarkStart w:id="126" w:name="X92849018d318b05d1619841a208001b9b5d443e"/>
     <w:p>
       <w:pPr>
         <w:pStyle w:val="Heading4"/>
       </w:pPr>
       <w:r>
-        <w:t xml:space="preserve">B8.2 Stakeholder power, interest and stance (Figure 8)</w:t>
+        <w:t xml:space="preserve">B8.2 Stakeholder power, interest and stance (Figure F8)</w:t>
       </w:r>
     </w:p>
     <w:p>
@@ -49873,14 +49881,14 @@
         <w:t xml:space="preserve">. Four actors have high power and three are opposed. Scoring the Wonnarua people at −2 or +2 would move the Liddell result by −0.17 or +0.17 (3 × 2 / 36), which does not change its sign.</w:t>
       </w:r>
     </w:p>
-    <w:bookmarkEnd w:id="125"/>
-    <w:bookmarkStart w:id="126" w:name="Xd5df1698768aea18553bcc1433b5699130c12c4"/>
+    <w:bookmarkEnd w:id="126"/>
+    <w:bookmarkStart w:id="127" w:name="X896d2bfe54b9a94cdd26775c3af798143bf33da"/>
     <w:p>
       <w:pPr>
         <w:pStyle w:val="Heading4"/>
       </w:pPr>
       <w:r>
-        <w:t xml:space="preserve">B8.3 Social-licence routes for an SMR at Liddell (Table T13)</w:t>
+        <w:t xml:space="preserve">B8.3 Social-licence routes for an SMR at Liddell</w:t>
       </w:r>
     </w:p>
     <w:p>
@@ -49947,7 +49955,7 @@
           <w:iCs/>
           <w:i/>
         </w:rPr>
-        <w:t xml:space="preserve">.</w:t>
+        <w:t xml:space="preserve">; route models from Newcastle Herald (2024b), NWMO (2024a; 2024c) and Williams Treaties First Nations et al. (2026).</w:t>
       </w:r>
     </w:p>
     <w:tbl>
@@ -50649,17 +50657,17 @@
         <w:pStyle w:val="BodyText"/>
       </w:pPr>
       <w:r>
-        <w:t xml:space="preserve">Reading: R1 beats R3 only on speed (2 against 1) and public cost (2 against 1), and R2 only on speed (2 against 1). Even so, R2 and R3 lead R1 by 3 to 6 points under every weighting. R3 wins outright only when fairness is doubled.</w:t>
-      </w:r>
-    </w:p>
-    <w:bookmarkEnd w:id="126"/>
-    <w:bookmarkStart w:id="127" w:name="Xcff10869c6c2e2d735b2e04ff49aafde5f3bf8b"/>
+        <w:t xml:space="preserve">Reading: R1 beats R3 only on speed (2 against 1) and public cost (2 against 1), and R2 only on speed (2 against 1). Even so, R2 and R3 lead R1 by 3 to 6 points under every weighting. R3 wins outright only when fairness is doubled. R4 (no SMR) scores highest under every weighting, so on social licence alone the Australian SMR case is weaker than the alternative (§9).</w:t>
+      </w:r>
+    </w:p>
+    <w:bookmarkEnd w:id="127"/>
+    <w:bookmarkStart w:id="128" w:name="X7094c050e1e3614f8863513705ad571ff5d7276"/>
     <w:p>
       <w:pPr>
         <w:pStyle w:val="Heading4"/>
       </w:pPr>
       <w:r>
-        <w:t xml:space="preserve">B8.4 Who finances the Darlington New Nuclear Project (Table T11)</w:t>
+        <w:t xml:space="preserve">B8.4 Who finances the Darlington New Nuclear Project</w:t>
       </w:r>
     </w:p>
     <w:p>
@@ -50992,7 +51000,7 @@
         <w:t xml:space="preserve"> </w:t>
       </w:r>
       <w:r>
-        <w:t xml:space="preserve">All scores are judgements from secondary summaries. Local min–max scaling and the MCDA use of these scores are in B7. Job and waste figures in T12 (CBoC, NWMO) are taken from the briefs and are not recomputed here, except the Ignace hosting payment (C$170 m over 81 years, about C$2.1 m a year; the C$170 m in total is 0.65% of the C$26 bn lifecycle cost, nominal against 2020 dollars).</w:t>
+        <w:t xml:space="preserve">All scores are judgements from secondary summaries. Local min–max scaling and the MCDA use of these scores are in B7. Job and waste figures in the §8.4 social-licence table (Conference Board of Canada, 2021; NWMO, n.d.) are taken from those sources and are not recomputed here, except the Ignace hosting payment (C$170 m over 81 years, about C$2.1 m a year; the C$170 m in total is 0.65% of the C$26 bn lifecycle cost, nominal against 2020 dollars).</w:t>
       </w:r>
     </w:p>
     <w:p>
@@ -51002,64 +51010,52 @@
         </w:pict>
       </w:r>
     </w:p>
+    <w:bookmarkEnd w:id="128"/>
+    <w:bookmarkEnd w:id="129"/>
+    <w:bookmarkEnd w:id="130"/>
+    <w:bookmarkStart w:id="137" w:name="X2538f2b2fc20c8063ffc88885f2cb513202a3b3"/>
+    <w:p>
+      <w:pPr>
+        <w:pStyle w:val="Heading2"/>
+      </w:pPr>
+      <w:r>
+        <w:t xml:space="preserve">Appendix C. Sensitivity: tornado and Monte Carlo set-up and results</w:t>
+      </w:r>
+    </w:p>
     <w:p>
       <w:pPr>
         <w:pStyle w:val="FirstParagraph"/>
       </w:pPr>
       <w:r>
-        <w:t xml:space="preserve">Coordinator: merge into Appendix B under the headings named below. The text is moved verbatim from §8.4 (final cut, 25/10/2026). The body points to</w:t>
-      </w:r>
-      <w:r>
-        <w:t xml:space="preserve"> </w:t>
-      </w:r>
-      <w:r>
-        <w:t xml:space="preserve">“</w:t>
-      </w:r>
-      <w:r>
-        <w:t xml:space="preserve">Appendix B8.3</w:t>
-      </w:r>
-      <w:r>
-        <w:t xml:space="preserve">”</w:t>
-      </w:r>
-      <w:r>
-        <w:t xml:space="preserve"> </w:t>
-      </w:r>
-      <w:r>
-        <w:t xml:space="preserve">and</w:t>
-      </w:r>
-      <w:r>
-        <w:t xml:space="preserve"> </w:t>
-      </w:r>
-      <w:r>
-        <w:t xml:space="preserve">“</w:t>
-      </w:r>
-      <w:r>
-        <w:t xml:space="preserve">Appendix B8</w:t>
-      </w:r>
-      <w:r>
-        <w:t xml:space="preserve">”</w:t>
-      </w:r>
-      <w:r>
-        <w:t xml:space="preserve">. Nothing from §8.5 or §8.6 needed moving (T11 is merged into T16 in the body; the deleted §8.6 fuel-supply paragraph is already covered in §8.3).</w:t>
-      </w:r>
-    </w:p>
-    <w:bookmarkEnd w:id="127"/>
-    <w:bookmarkEnd w:id="128"/>
-    <w:bookmarkStart w:id="129" w:name="X89260dd1f36e5418c1426fefbca9dfddf3e86ea"/>
-    <w:p>
-      <w:pPr>
-        <w:pStyle w:val="Heading3"/>
-      </w:pPr>
-      <w:r>
-        <w:t xml:space="preserve">B8 (head of subsection): sources for Table T10</w:t>
-      </w:r>
-    </w:p>
-    <w:p>
-      <w:pPr>
-        <w:pStyle w:val="FirstParagraph"/>
-      </w:pPr>
-      <w:r>
-        <w:t xml:space="preserve">Sources for Table T10 (Social licence at Darlington and at Liddell): Neelam (2024); Griffith University Climate Action Beacon and Monash Climate Change Communication Research Hub (2025); Newspoll (2007); Ritchie (2020); Markandya and Wilkinson (2007); Australian Energy Market Operator (2025); Canadian Nuclear Safety Commission (2025); Williams Treaties First Nations et al. (2026); Mississaugas of Scugog Island First Nation (2023); Curve Lake First Nation (2024); Municipality of Clarington (2024); Australian Electoral Commission (2019);</w:t>
+        <w:t xml:space="preserve">This appendix shows how uncertain the §6 results are and which inputs drive them.</w:t>
+      </w:r>
+      <w:r>
+        <w:t xml:space="preserve"> </w:t>
+      </w:r>
+      <w:r>
+        <w:rPr>
+          <w:bCs/>
+          <w:b/>
+        </w:rPr>
+        <w:t xml:space="preserve">The life-cycle intensity is uncertain mainly through the fuel inputs (conversion heat, mining, back end, burnup, enrichment); the LC3 saving is uncertain mainly through the LC3 emission cut, the DPSC geometry and the infill mix.</w:t>
+      </w:r>
+      <w:r>
+        <w:t xml:space="preserve"> </w:t>
+      </w:r>
+      <w:r>
+        <w:t xml:space="preserve">All ranges come from</w:t>
+      </w:r>
+      <w:r>
+        <w:t xml:space="preserve"> </w:t>
+      </w:r>
+      <w:r>
+        <w:rPr>
+          <w:rStyle w:val="VerbatimChar"/>
+        </w:rPr>
+        <w:t xml:space="preserve">parameters_lca.yaml</w:t>
+      </w:r>
+      <w:r>
+        <w:t xml:space="preserve">; every input is [TO VERIFY], an assumption or a placeholder, so the intervals describe the uncertainty in our</w:t>
       </w:r>
       <w:r>
         <w:t xml:space="preserve"> </w:t>
@@ -51069,614 +51065,13 @@
           <w:iCs/>
           <w:i/>
         </w:rPr>
-        <w:t xml:space="preserve">Barngarla</w:t>
-      </w:r>
-      <w:r>
-        <w:t xml:space="preserve"> </w:t>
-      </w:r>
-      <w:r>
-        <w:t xml:space="preserve">[2023] FCA 809; Nuclear Waste Management Organization (2024a; 2024b; 2024c; n.d.); Department of Industry, Science, Energy and Resources (2020); Power Workers’ Union (2021); Conference Board of Canada (2021); Joint Standing Committee on Treaties (2024); Slovic (1987). Deaths avoided are calculated in</w:t>
-      </w:r>
-      <w:r>
-        <w:t xml:space="preserve"> </w:t>
-      </w:r>
-      <w:r>
-        <w:rPr>
-          <w:rStyle w:val="VerbatimChar"/>
-        </w:rPr>
-        <w:t xml:space="preserve">social_licence.py</w:t>
-      </w:r>
-      <w:r>
-        <w:t xml:space="preserve"> </w:t>
-      </w:r>
-      <w:r>
-        <w:t xml:space="preserve">(B8.1). Two T12 items shortened in the body: the</w:t>
-      </w:r>
-      <w:r>
-        <w:t xml:space="preserve"> </w:t>
-      </w:r>
-      <w:r>
-        <w:t xml:space="preserve">“</w:t>
-      </w:r>
-      <w:r>
-        <w:t xml:space="preserve">Public view</w:t>
-      </w:r>
-      <w:r>
-        <w:t xml:space="preserve">”</w:t>
-      </w:r>
-      <w:r>
-        <w:t xml:space="preserve"> </w:t>
-      </w:r>
-      <w:r>
-        <w:t xml:space="preserve">row (host municipality</w:t>
-      </w:r>
-      <w:r>
-        <w:t xml:space="preserve"> </w:t>
-      </w:r>
-      <w:r>
-        <w:t xml:space="preserve">“</w:t>
-      </w:r>
-      <w:r>
-        <w:t xml:space="preserve">very supportive</w:t>
-      </w:r>
-      <w:r>
-        <w:t xml:space="preserve">”</w:t>
-      </w:r>
-      <w:r>
-        <w:t xml:space="preserve">; national 61% support against 59% keeping the ban; older polls found local support 16–20 points lower), and the unions’ position in Australia (the Australian Council of Trade Unions and the Electrical Trades Union oppose).</w:t>
-      </w:r>
-    </w:p>
-    <w:bookmarkEnd w:id="129"/>
-    <w:bookmarkStart w:id="130" w:name="Xbd0a7ab0f2430cf42b9305871973ba68b4929bd"/>
-    <w:p>
-      <w:pPr>
-        <w:pStyle w:val="Heading3"/>
-      </w:pPr>
-      <w:r>
-        <w:t xml:space="preserve">B8.3 Social-licence routes for an SMR at Liddell (Table B41)</w:t>
-      </w:r>
-    </w:p>
-    <w:p>
-      <w:pPr>
-        <w:pStyle w:val="FirstParagraph"/>
-      </w:pPr>
-      <w:r>
-        <w:rPr>
-          <w:iCs/>
-          <w:i/>
-        </w:rPr>
-        <w:t xml:space="preserve">Table B41. Social-licence routes for an SMR at Liddell: total score (criteria scored 1–3 on legitimacy, legal risk, speed, public cost and fairness; one criterion doubled in each weighted column).</w:t>
-      </w:r>
-      <w:r>
-        <w:t xml:space="preserve"> </w:t>
-      </w:r>
-      <w:r>
-        <w:rPr>
-          <w:iCs/>
-          <w:i/>
-        </w:rPr>
-        <w:t xml:space="preserve">Source: our judgement from the evidence in T12, calculated in</w:t>
-      </w:r>
-      <w:r>
-        <w:rPr>
-          <w:iCs/>
-          <w:i/>
-        </w:rPr>
-        <w:t xml:space="preserve"> </w:t>
-      </w:r>
-      <w:r>
-        <w:rPr>
-          <w:rStyle w:val="VerbatimChar"/>
-          <w:iCs/>
-          <w:i/>
-        </w:rPr>
-        <w:t xml:space="preserve">social_licence.py</w:t>
-      </w:r>
-      <w:r>
-        <w:rPr>
-          <w:iCs/>
-          <w:i/>
-        </w:rPr>
-        <w:t xml:space="preserve"> </w:t>
-      </w:r>
-      <w:r>
-        <w:rPr>
-          <w:iCs/>
-          <w:i/>
-        </w:rPr>
-        <w:t xml:space="preserve">(Appendix B8.3); route models from Newcastle Herald (2024b), NWMO (2024a; 2024c) and Williams Treaties First Nations et al. (2026). Scores are our judgement and depend on the evidence cited.</w:t>
-      </w:r>
-    </w:p>
-    <w:tbl>
-      <w:tblPr>
-        <w:tblStyle w:val="Table"/>
-        <w:tblW w:type="auto" w:w="0"/>
-        <w:tblLook w:firstRow="1" w:lastRow="0" w:firstColumn="0" w:lastColumn="0" w:noHBand="0" w:noVBand="0" w:val="0020"/>
-        <w:jc w:val="start"/>
-      </w:tblPr>
-      <w:tblGrid>
-        <w:gridCol w:w="1320"/>
-        <w:gridCol w:w="1320"/>
-        <w:gridCol w:w="1320"/>
-        <w:gridCol w:w="1320"/>
-        <w:gridCol w:w="1320"/>
-        <w:gridCol w:w="1320"/>
-      </w:tblGrid>
-      <w:tr>
-        <w:trPr>
-          <w:tblHeader w:val="true"/>
-        </w:trPr>
-        <w:tc>
-          <w:tcPr/>
-          <w:p>
-            <w:pPr>
-              <w:pStyle w:val="Compact"/>
-              <w:jc w:val="left"/>
-            </w:pPr>
-            <w:r>
-              <w:t xml:space="preserve">Route</w:t>
-            </w:r>
-          </w:p>
-        </w:tc>
-        <w:tc>
-          <w:tcPr/>
-          <w:p>
-            <w:pPr>
-              <w:pStyle w:val="Compact"/>
-              <w:jc w:val="right"/>
-            </w:pPr>
-            <w:r>
-              <w:t xml:space="preserve">Equal weights</w:t>
-            </w:r>
-          </w:p>
-        </w:tc>
-        <w:tc>
-          <w:tcPr/>
-          <w:p>
-            <w:pPr>
-              <w:pStyle w:val="Compact"/>
-              <w:jc w:val="right"/>
-            </w:pPr>
-            <w:r>
-              <w:t xml:space="preserve">Legitimacy ×2</w:t>
-            </w:r>
-          </w:p>
-        </w:tc>
-        <w:tc>
-          <w:tcPr/>
-          <w:p>
-            <w:pPr>
-              <w:pStyle w:val="Compact"/>
-              <w:jc w:val="right"/>
-            </w:pPr>
-            <w:r>
-              <w:t xml:space="preserve">Speed ×2</w:t>
-            </w:r>
-          </w:p>
-        </w:tc>
-        <w:tc>
-          <w:tcPr/>
-          <w:p>
-            <w:pPr>
-              <w:pStyle w:val="Compact"/>
-              <w:jc w:val="right"/>
-            </w:pPr>
-            <w:r>
-              <w:t xml:space="preserve">Fairness ×2</w:t>
-            </w:r>
-          </w:p>
-        </w:tc>
-        <w:tc>
-          <w:tcPr/>
-          <w:p>
-            <w:pPr>
-              <w:pStyle w:val="Compact"/>
-              <w:jc w:val="right"/>
-            </w:pPr>
-            <w:r>
-              <w:t xml:space="preserve">Public cost ×2</w:t>
-            </w:r>
-          </w:p>
-        </w:tc>
-      </w:tr>
-      <w:tr>
-        <w:tc>
-          <w:tcPr/>
-          <w:p>
-            <w:pPr>
-              <w:pStyle w:val="Compact"/>
-              <w:jc w:val="left"/>
-            </w:pPr>
-            <w:r>
-              <w:t xml:space="preserve">R1. Commonwealth-led siting, with compulsory acquisition if needed (2024 Coalition model)</w:t>
-            </w:r>
-          </w:p>
-        </w:tc>
-        <w:tc>
-          <w:tcPr/>
-          <w:p>
-            <w:pPr>
-              <w:pStyle w:val="Compact"/>
-              <w:jc w:val="right"/>
-            </w:pPr>
-            <w:r>
-              <w:t xml:space="preserve">7</w:t>
-            </w:r>
-          </w:p>
-        </w:tc>
-        <w:tc>
-          <w:tcPr/>
-          <w:p>
-            <w:pPr>
-              <w:pStyle w:val="Compact"/>
-              <w:jc w:val="right"/>
-            </w:pPr>
-            <w:r>
-              <w:t xml:space="preserve">8</w:t>
-            </w:r>
-          </w:p>
-        </w:tc>
-        <w:tc>
-          <w:tcPr/>
-          <w:p>
-            <w:pPr>
-              <w:pStyle w:val="Compact"/>
-              <w:jc w:val="right"/>
-            </w:pPr>
-            <w:r>
-              <w:t xml:space="preserve">9</w:t>
-            </w:r>
-          </w:p>
-        </w:tc>
-        <w:tc>
-          <w:tcPr/>
-          <w:p>
-            <w:pPr>
-              <w:pStyle w:val="Compact"/>
-              <w:jc w:val="right"/>
-            </w:pPr>
-            <w:r>
-              <w:t xml:space="preserve">8</w:t>
-            </w:r>
-          </w:p>
-        </w:tc>
-        <w:tc>
-          <w:tcPr/>
-          <w:p>
-            <w:pPr>
-              <w:pStyle w:val="Compact"/>
-              <w:jc w:val="right"/>
-            </w:pPr>
-            <w:r>
-              <w:t xml:space="preserve">9</w:t>
-            </w:r>
-          </w:p>
-        </w:tc>
-      </w:tr>
-      <w:tr>
-        <w:tc>
-          <w:tcPr/>
-          <w:p>
-            <w:pPr>
-              <w:pStyle w:val="Compact"/>
-              <w:jc w:val="left"/>
-            </w:pPr>
-            <w:r>
-              <w:t xml:space="preserve">R2. Volunteer host with a willingness test that includes Traditional Owners, plus a hosting agreement (NWMO model)</w:t>
-            </w:r>
-          </w:p>
-        </w:tc>
-        <w:tc>
-          <w:tcPr/>
-          <w:p>
-            <w:pPr>
-              <w:pStyle w:val="Compact"/>
-              <w:jc w:val="right"/>
-            </w:pPr>
-            <w:r>
-              <w:t xml:space="preserve">11</w:t>
-            </w:r>
-          </w:p>
-        </w:tc>
-        <w:tc>
-          <w:tcPr/>
-          <w:p>
-            <w:pPr>
-              <w:pStyle w:val="Compact"/>
-              <w:jc w:val="right"/>
-            </w:pPr>
-            <w:r>
-              <w:t xml:space="preserve">14</w:t>
-            </w:r>
-          </w:p>
-        </w:tc>
-        <w:tc>
-          <w:tcPr/>
-          <w:p>
-            <w:pPr>
-              <w:pStyle w:val="Compact"/>
-              <w:jc w:val="right"/>
-            </w:pPr>
-            <w:r>
-              <w:t xml:space="preserve">12</w:t>
-            </w:r>
-          </w:p>
-        </w:tc>
-        <w:tc>
-          <w:tcPr/>
-          <w:p>
-            <w:pPr>
-              <w:pStyle w:val="Compact"/>
-              <w:jc w:val="right"/>
-            </w:pPr>
-            <w:r>
-              <w:t xml:space="preserve">13</w:t>
-            </w:r>
-          </w:p>
-        </w:tc>
-        <w:tc>
-          <w:tcPr/>
-          <w:p>
-            <w:pPr>
-              <w:pStyle w:val="Compact"/>
-              <w:jc w:val="right"/>
-            </w:pPr>
-            <w:r>
-              <w:rPr>
-                <w:bCs/>
-                <w:b/>
-              </w:rPr>
-              <w:t xml:space="preserve">13</w:t>
-            </w:r>
-          </w:p>
-        </w:tc>
-      </w:tr>
-      <w:tr>
-        <w:tc>
-          <w:tcPr/>
-          <w:p>
-            <w:pPr>
-              <w:pStyle w:val="Compact"/>
-              <w:jc w:val="left"/>
-            </w:pPr>
-            <w:r>
-              <w:t xml:space="preserve">R3. R2 plus First Nations equity with a government loan guarantee (Williams Treaties model)</w:t>
-            </w:r>
-          </w:p>
-        </w:tc>
-        <w:tc>
-          <w:tcPr/>
-          <w:p>
-            <w:pPr>
-              <w:pStyle w:val="Compact"/>
-              <w:jc w:val="right"/>
-            </w:pPr>
-            <w:r>
-              <w:t xml:space="preserve">11</w:t>
-            </w:r>
-          </w:p>
-        </w:tc>
-        <w:tc>
-          <w:tcPr/>
-          <w:p>
-            <w:pPr>
-              <w:pStyle w:val="Compact"/>
-              <w:jc w:val="right"/>
-            </w:pPr>
-            <w:r>
-              <w:t xml:space="preserve">14</w:t>
-            </w:r>
-          </w:p>
-        </w:tc>
-        <w:tc>
-          <w:tcPr/>
-          <w:p>
-            <w:pPr>
-              <w:pStyle w:val="Compact"/>
-              <w:jc w:val="right"/>
-            </w:pPr>
-            <w:r>
-              <w:t xml:space="preserve">12</w:t>
-            </w:r>
-          </w:p>
-        </w:tc>
-        <w:tc>
-          <w:tcPr/>
-          <w:p>
-            <w:pPr>
-              <w:pStyle w:val="Compact"/>
-              <w:jc w:val="right"/>
-            </w:pPr>
-            <w:r>
-              <w:rPr>
-                <w:bCs/>
-                <w:b/>
-              </w:rPr>
-              <w:t xml:space="preserve">14</w:t>
-            </w:r>
-          </w:p>
-        </w:tc>
-        <w:tc>
-          <w:tcPr/>
-          <w:p>
-            <w:pPr>
-              <w:pStyle w:val="Compact"/>
-              <w:jc w:val="right"/>
-            </w:pPr>
-            <w:r>
-              <w:t xml:space="preserve">12</w:t>
-            </w:r>
-          </w:p>
-        </w:tc>
-      </w:tr>
-      <w:tr>
-        <w:tc>
-          <w:tcPr/>
-          <w:p>
-            <w:pPr>
-              <w:pStyle w:val="Compact"/>
-              <w:jc w:val="left"/>
-            </w:pPr>
-            <w:r>
-              <w:t xml:space="preserve">R4. No SMR: firmed renewables at Liddell (AGL’s plan)</w:t>
-            </w:r>
-          </w:p>
-        </w:tc>
-        <w:tc>
-          <w:tcPr/>
-          <w:p>
-            <w:pPr>
-              <w:pStyle w:val="Compact"/>
-              <w:jc w:val="right"/>
-            </w:pPr>
-            <w:r>
-              <w:t xml:space="preserve">14</w:t>
-            </w:r>
-          </w:p>
-        </w:tc>
-        <w:tc>
-          <w:tcPr/>
-          <w:p>
-            <w:pPr>
-              <w:pStyle w:val="Compact"/>
-              <w:jc w:val="right"/>
-            </w:pPr>
-            <w:r>
-              <w:t xml:space="preserve">17</w:t>
-            </w:r>
-          </w:p>
-        </w:tc>
-        <w:tc>
-          <w:tcPr/>
-          <w:p>
-            <w:pPr>
-              <w:pStyle w:val="Compact"/>
-              <w:jc w:val="right"/>
-            </w:pPr>
-            <w:r>
-              <w:t xml:space="preserve">17</w:t>
-            </w:r>
-          </w:p>
-        </w:tc>
-        <w:tc>
-          <w:tcPr/>
-          <w:p>
-            <w:pPr>
-              <w:pStyle w:val="Compact"/>
-              <w:jc w:val="right"/>
-            </w:pPr>
-            <w:r>
-              <w:t xml:space="preserve">16</w:t>
-            </w:r>
-          </w:p>
-        </w:tc>
-        <w:tc>
-          <w:tcPr/>
-          <w:p>
-            <w:pPr>
-              <w:pStyle w:val="Compact"/>
-              <w:jc w:val="right"/>
-            </w:pPr>
-            <w:r>
-              <w:t xml:space="preserve">17</w:t>
-            </w:r>
-          </w:p>
-        </w:tc>
-      </w:tr>
-    </w:tbl>
-    <w:p>
-      <w:pPr>
-        <w:pStyle w:val="BodyText"/>
-      </w:pPr>
-      <w:r>
-        <w:rPr>
-          <w:iCs/>
-          <w:i/>
-        </w:rPr>
-        <w:t xml:space="preserve">Reading: consent-based routes (R2, R3) beat top-down siting (R1) by 3–6 points under every weighting, even with R1’s advantages (speed, and public cost against R3) doubled. R4 scores highest throughout, so on social licence alone the Australian SMR case is weaker than the alternative; §9 weighs this against carbon and cost.</w:t>
-      </w:r>
-    </w:p>
-    <w:p>
-      <w:pPr>
-        <w:pStyle w:val="BodyText"/>
-      </w:pPr>
-      <w:r>
-        <w:t xml:space="preserve">Moved sentence from §8.4 consent paragraph:</w:t>
-      </w:r>
-      <w:r>
-        <w:t xml:space="preserve"> </w:t>
-      </w:r>
-      <w:r>
-        <w:t xml:space="preserve">“</w:t>
-      </w:r>
-      <w:r>
-        <w:t xml:space="preserve">Not building an SMR at Liddell scores higher still, because it needs no change in law or consent.</w:t>
-      </w:r>
-      <w:r>
-        <w:t xml:space="preserve">”</w:t>
-      </w:r>
-    </w:p>
-    <w:bookmarkEnd w:id="130"/>
-    <w:bookmarkEnd w:id="131"/>
-    <w:bookmarkStart w:id="138" w:name="X2538f2b2fc20c8063ffc88885f2cb513202a3b3"/>
-    <w:p>
-      <w:pPr>
-        <w:pStyle w:val="Heading2"/>
-      </w:pPr>
-      <w:r>
-        <w:t xml:space="preserve">Appendix C. Sensitivity: tornado and Monte Carlo set-up and results</w:t>
-      </w:r>
-    </w:p>
-    <w:p>
-      <w:pPr>
-        <w:pStyle w:val="FirstParagraph"/>
-      </w:pPr>
-      <w:r>
-        <w:t xml:space="preserve">This appendix shows how uncertain the §6 results are and which inputs drive them.</w:t>
-      </w:r>
-      <w:r>
-        <w:t xml:space="preserve"> </w:t>
-      </w:r>
-      <w:r>
-        <w:rPr>
-          <w:bCs/>
-          <w:b/>
-        </w:rPr>
-        <w:t xml:space="preserve">The life-cycle intensity is uncertain mainly through the fuel inputs (conversion heat, mining, back end, burnup, enrichment); the LC3 saving is uncertain mainly through the LC3 emission cut, the DPSC geometry and the infill mix.</w:t>
-      </w:r>
-      <w:r>
-        <w:t xml:space="preserve"> </w:t>
-      </w:r>
-      <w:r>
-        <w:t xml:space="preserve">All ranges come from</w:t>
-      </w:r>
-      <w:r>
-        <w:t xml:space="preserve"> </w:t>
-      </w:r>
-      <w:r>
-        <w:rPr>
-          <w:rStyle w:val="VerbatimChar"/>
-        </w:rPr>
-        <w:t xml:space="preserve">parameters_lca.yaml</w:t>
-      </w:r>
-      <w:r>
-        <w:t xml:space="preserve">; every input is [TO VERIFY], an assumption or a placeholder, so the intervals describe the uncertainty in our</w:t>
-      </w:r>
-      <w:r>
-        <w:t xml:space="preserve"> </w:t>
-      </w:r>
-      <w:r>
-        <w:rPr>
-          <w:iCs/>
-          <w:i/>
-        </w:rPr>
         <w:t xml:space="preserve">inputs as found</w:t>
       </w:r>
       <w:r>
         <w:t xml:space="preserve">, not in verified data.</w:t>
       </w:r>
     </w:p>
-    <w:bookmarkStart w:id="132" w:name="c1.-set-up"/>
+    <w:bookmarkStart w:id="131" w:name="c1.-set-up"/>
     <w:p>
       <w:pPr>
         <w:pStyle w:val="Heading3"/>
@@ -51920,8 +51315,8 @@
         <w:t xml:space="preserve">and Figures F2–F5).</w:t>
       </w:r>
     </w:p>
-    <w:bookmarkEnd w:id="132"/>
-    <w:bookmarkStart w:id="133" w:name="c2.-ranged-inputs-and-tornado-results"/>
+    <w:bookmarkEnd w:id="131"/>
+    <w:bookmarkStart w:id="132" w:name="c2.-ranged-inputs-and-tornado-results"/>
     <w:p>
       <w:pPr>
         <w:pStyle w:val="Heading3"/>
@@ -55602,8 +54997,8 @@
         </w:tc>
       </w:tr>
     </w:tbl>
-    <w:bookmarkEnd w:id="133"/>
-    <w:bookmarkStart w:id="134" w:name="c3.-what-the-tornado-shows"/>
+    <w:bookmarkEnd w:id="132"/>
+    <w:bookmarkStart w:id="133" w:name="c3.-what-the-tornado-shows"/>
     <w:p>
       <w:pPr>
         <w:pStyle w:val="Heading3"/>
@@ -55664,8 +55059,8 @@
         <w:t xml:space="preserve">The saving depends on the LC3 emission cut (swing 609 t), DPSC wall thickness (532 t), infill binder content (430 t), basemat thickness (306 t), extra binder for flow (295 t), forebay volume (221 t) and the cement factor (207 t). The first two are the LC3 literature and OPG’s drawings. Of the next three, binder content and extra binder are mix design and basemat thickness is geometry. Even at the lowest single-input value (1,406 t), LC3 saves more than the largest geometric swing, so the saving is robust in sign but uncertain by about ±20–25%.</w:t>
       </w:r>
     </w:p>
-    <w:bookmarkEnd w:id="134"/>
-    <w:bookmarkStart w:id="135" w:name="c4.-monte-carlo-results"/>
+    <w:bookmarkEnd w:id="133"/>
+    <w:bookmarkStart w:id="134" w:name="c4.-monte-carlo-results"/>
     <w:p>
       <w:pPr>
         <w:pStyle w:val="Heading3"/>
@@ -58622,8 +58017,8 @@
         <w:t xml:space="preserve">Plate steel is total steel minus rebar, and rebar scales with plant concrete (capped at total steel; Appendix A3). Concrete intensity is right-skewed (34.5–69–138 m³/MWe), so expected rebar rises above its mode value, while steel intensity is slightly left-skewed (16.5–33–46 t/MWe). Expected plate steel is therefore below its mode value, even though expected total steel emissions (rebar plus plate) rise.</w:t>
       </w:r>
     </w:p>
-    <w:bookmarkEnd w:id="135"/>
-    <w:bookmarkStart w:id="136" w:name="X62d4c771b19bf733ac0046ab84ee2e69e047196"/>
+    <w:bookmarkEnd w:id="134"/>
+    <w:bookmarkStart w:id="135" w:name="X62d4c771b19bf733ac0046ab84ee2e69e047196"/>
     <w:p>
       <w:pPr>
         <w:pStyle w:val="Heading3"/>
@@ -58738,8 +58133,8 @@
         <w:t xml:space="preserve">. Conversion heat accounts for about 0.9 g/kWh of the median (4.18 − 3.31 = 0.87) and decides how skewed the result is, which makes a measured value the single most useful datum to find.</w:t>
       </w:r>
     </w:p>
-    <w:bookmarkEnd w:id="136"/>
-    <w:bookmarkStart w:id="137" w:name="X861311e05ca973e4ff92563d183b5e9367fe19f"/>
+    <w:bookmarkEnd w:id="135"/>
+    <w:bookmarkStart w:id="136" w:name="X861311e05ca973e4ff92563d183b5e9367fe19f"/>
     <w:p>
       <w:pPr>
         <w:pStyle w:val="Heading3"/>
@@ -58865,9 +58260,9 @@
         </w:pict>
       </w:r>
     </w:p>
+    <w:bookmarkEnd w:id="136"/>
     <w:bookmarkEnd w:id="137"/>
     <w:bookmarkEnd w:id="138"/>
-    <w:bookmarkEnd w:id="139"/>
     <w:sectPr>
       <w:headerReference r:id="rId9" w:type="default"/>
       <w:headerReference r:id="rId10" w:type="first"/>

</xml_diff>

<commit_message>
WIP: fact-check of Leroy fallback sections in progress
Co-Authored-By: Claude Opus 5.5 <noreply@anthropic.com>
Claude-Session: https://claude.ai/code/session_01SZLM437PwZArBFHgvvPCk4
</commit_message>
<xml_diff>
--- a/01_Report/draft-assembled.docx
+++ b/01_Report/draft-assembled.docx
@@ -2569,7 +2569,7 @@
         <w:t xml:space="preserve">50,000 m³ of concrete and 14,000 t of steel per unit</w:t>
       </w:r>
       <w:r>
-        <w:t xml:space="preserve">. This is a design proxy, not confirmed Darlington quantities, and we could not open either the Ostrołęka or the Pillai table. A bottom-up scaling from other reactors (20,700 m³; Peterson, Zhao and Petroski, 2005) is a cross-check (Appendix A3). Key inputs: Table A2b; all 45 ranged inputs: Table C1.</w:t>
+        <w:t xml:space="preserve">. This is a design proxy, not confirmed Darlington quantities, and we could not open either the Ostrołęka or the Pillai table. A bottom-up scaling from other reactors (20,700 m³; Peterson, Zhao and Petroski, 2005) is a cross-check (Appendix A3). Key inputs: Table A2b; all 45 ranged inputs: Appendix C2.</w:t>
       </w:r>
       <w:r>
         <w:t xml:space="preserve"> </w:t>
@@ -12664,7 +12664,7 @@
           <w:iCs/>
           <w:i/>
         </w:rPr>
-        <w:t xml:space="preserve">Table A2b. Key assumptions for one BWRX-300 at Darlington (all 45 ranged inputs in Appendix C, Table C1).</w:t>
+        <w:t xml:space="preserve">Table A2b. Key assumptions for one BWRX-300 at Darlington (all 45 ranged inputs in Appendix C, Table C2).</w:t>
       </w:r>
       <w:r>
         <w:t xml:space="preserve"> </w:t>
@@ -16116,7 +16116,7 @@
         <w:pStyle w:val="BodyText"/>
       </w:pPr>
       <w:r>
-        <w:t xml:space="preserve">Monte Carlo basis (median, with 5th–95th percentile; Table C4): LC³ on 40% with eligibility, cut and volumes all varying, 2,217 t per unit (1,375–3,294) and 6,651 t for Units 2–4 (4,124–9,881), 0.35% of the life cycle (0.19–0.61%); at fixed eligibility 0.18% (20%), 0.36% (40%) and 0.54% (60%). Slag 2,140 t (1,310–3,238), 0.34% (0.18–0.60%). LC³ beats slag in 55% of draws.</w:t>
+        <w:t xml:space="preserve">Monte Carlo basis (median, with 5th–95th percentile; Table C4b): LC³ on 40% with eligibility, cut and volumes all varying, 2,217 t per unit (1,375–3,294) and 6,651 t for Units 2–4 (4,124–9,881), 0.35% of the life cycle (0.19–0.61%); at fixed eligibility 0.18% (20%), 0.36% (40%) and 0.54% (60%). Slag 2,140 t (1,310–3,238), 0.34% (0.18–0.60%). LC³ beats slag in 55% of draws.</w:t>
       </w:r>
     </w:p>
     <w:p>

</xml_diff>

<commit_message>
Apply Leroy-fallback fact-check (hedging, patents, App E markers); final build of the report
Co-Authored-By: Claude Opus 5.5 <noreply@anthropic.com>
Claude-Session: https://claude.ai/code/session_01SZLM437PwZArBFHgvvPCk4
</commit_message>
<xml_diff>
--- a/01_Report/draft-assembled.docx
+++ b/01_Report/draft-assembled.docx
@@ -1150,7 +1150,7 @@
           <w:bCs/>
           <w:b/>
         </w:rPr>
-        <w:t xml:space="preserve">No light-water SMR is yet reported operating on land, and the BWRX-300 is the Western design closest to doing so.</w:t>
+        <w:t xml:space="preserve">No light-water SMR is yet reported operating on land; the BWRX-300 is the Western design closest to doing so, and China’s ACP100 (Linglong One) was still in commissioning, with no criticality reported, in May 2026.</w:t>
       </w:r>
       <w:r>
         <w:t xml:space="preserve"> </w:t>
@@ -1194,6 +1194,16 @@
           <w:i/>
         </w:rPr>
         <w:t xml:space="preserve">Source: Canadian Nuclear Safety Commission (2025); Ontario Power Generation (2025b); American Nuclear Society (2026); GE Vernova (2026); World Nuclear News (2023); US Nuclear Regulatory Commission (2025); NuScale Power Corporation (2023); TRL ratings: this study.</w:t>
+      </w:r>
+      <w:r>
+        <w:t xml:space="preserve"> </w:t>
+      </w:r>
+      <w:r>
+        <w:rPr>
+          <w:iCs/>
+          <w:i/>
+        </w:rPr>
+        <w:t xml:space="preserve">Status entries are as reported by regulators, vendors, utilities and trade press found by web search; we have not opened the primary documents.</w:t>
       </w:r>
     </w:p>
     <w:tbl>
@@ -1601,7 +1611,7 @@
         <w:t xml:space="preserve"> </w:t>
       </w:r>
       <w:r>
-        <w:t xml:space="preserve">Its design was approved in May 2025, yet the first plant was cancelled when the estimate reached US$9.24 bn, about US$20,000/kW (NuScale Power Corporation, 2023). Darlington’s C$20.9 bn for 1,200 MW is C$17,400/kW (Ontario Power Generation, 2025a; 2025b); both are first-of-a-kind, in different currencies. Licensing is quickening: Darlington’s construction licence took 29 months and Clinch River’s permit 14, probably helped by the joint CNSC–NRC review of the design’s composite building (US Nuclear Regulatory Commission and Canadian Nuclear Safety Commission, 2025).</w:t>
+        <w:t xml:space="preserve">Its design was approved in May 2025, yet the first plant was cancelled when the estimate reached US$9.24 bn as reported, about US$20,000/kW (NuScale Power Corporation, 2023). Darlington’s C$20.9 bn for 1,200 MW is C$17,400/kW (Ontario Power Generation, 2025a; 2025b); both are first-of-a-kind, in different currencies. Licensing is quickening: Darlington’s construction licence took about 29 months and Clinch River’s permit 14, probably helped by the joint CNSC–NRC review of the design’s composite building (US Nuclear Regulatory Commission and Canadian Nuclear Safety Commission, 2025).</w:t>
       </w:r>
     </w:p>
     <w:p>
@@ -1619,7 +1629,7 @@
         <w:t xml:space="preserve"> </w:t>
       </w:r>
       <w:r>
-        <w:t xml:space="preserve">Appendix E found GE-Hitachi’s isolation-condenser and shaft-construction systems in its own patent families, but no patent on the diaphragm-plate composite modules (from search summaries). LC³ appears in no core composition patent, while Sika and Construction Research &amp; Technology patent admixtures that improve its workability, so C1’s binder risk lies in qualification rather than freedom to operate (our inference).</w:t>
+        <w:t xml:space="preserve">Appendix E, from search summaries only, found isolation-condenser patents assigned to GE-Hitachi and a shaft-construction family that appears to be GE-Hitachi’s, but no patent on the diaphragm-plate composite modules. It found no core LC³ composition patent, while Sika and Construction Research &amp; Technology hold applications on LC³ workability and composition. This suggests, but does not establish, that C1’s binder risk lies in qualification rather than patents; no freedom-to-operate search was done.</w:t>
       </w:r>
     </w:p>
     <w:p>
@@ -1665,7 +1675,7 @@
         <w:t xml:space="preserve"> </w:t>
       </w:r>
       <w:r>
-        <w:t xml:space="preserve">The reactor is rated 300 MWe (GE Vernova Hitachi Nuclear Energy, n.d.; 315 MW net in Ontario Power Generation, 2025b), with a 60-year design life (Canadian Nuclear Safety Commission, 2024). The vendor-reported capacity factor is 95% (Fermi Energia, n.d.); we use 0.90 as a first-of-a-kind discount. Fuel is uranium dioxide enriched to 3.8% on average, 4.95% at most (Sun and Kurosaki, 2025). GE Hitachi states that isolation condensers cool the core passively for seven days without power or operator action (GE Hitachi Nuclear Energy, n.d.). It sits in a below-grade shaft of diaphragm-plate steel-composite (DP-SC) modules: two steel faceplates tied by diaphragm plates and filled with self-consolidating concrete (SCC) (GE-Hitachi Nuclear Energy, 2024).</w:t>
+        <w:t xml:space="preserve">The reactor is rated 300 MWe (GE Vernova Hitachi Nuclear Energy, n.d.; 315 MW net in Ontario Power Generation, 2025b), with a 60-year design life (Canadian Nuclear Safety Commission, 2024). The vendor-reported capacity factor is 95% (Fermi Energia, n.d.); we use 0.90 as a first-of-a-kind discount. Fuel is uranium dioxide, reported at 3.8% average and 4.95% maximum enrichment in a preprint review (Sun and Kurosaki, 2025). GE Hitachi states that isolation condensers cool the core passively for seven days without power or operator action (GE Hitachi Nuclear Energy, n.d.). The reactor building sits in a below-grade shaft of diaphragm-plate steel-composite (DP-SC) modules: two steel faceplates tied by diaphragm plates and filled with self-consolidating concrete (SCC) (GE-Hitachi Nuclear Energy, 2024).</w:t>
       </w:r>
     </w:p>
     <w:p>
@@ -8199,7 +8209,7 @@
               <w:jc w:val="left"/>
             </w:pPr>
             <w:r>
-              <w:t xml:space="preserve">Mock-up panels testing flow through diaphragm holes, temperature rise and shrinkage; qualification under NEDO-33926, which rests on AISC N690 (GE-Hitachi Nuclear Energy, 2024), before the approval expected in 2028 (American Nuclear Society, 2026)</w:t>
+              <w:t xml:space="preserve">Mock-up panels testing flow through diaphragm holes, temperature rise and shrinkage; qualification under NEDO-33926, which reportedly rests on a modified AISC N690 (GE-Hitachi Nuclear Energy, 2024), before the approval expected in 2028 (American Nuclear Society, 2026)</w:t>
             </w:r>
           </w:p>
         </w:tc>
@@ -56764,7 +56774,7 @@
         <w:t xml:space="preserve"> </w:t>
       </w:r>
       <w:r>
-        <w:t xml:space="preserve">column below counts the patent records found, not database hits. Assignees, dates and claims must be checked on the patent pages before the report relies on them.</w:t>
+        <w:t xml:space="preserve">column below counts the patent records found, not database hits. Assignees, dates and claims are as given in search summaries; the patent pages were not opened, so they are indicative only.</w:t>
       </w:r>
     </w:p>
     <w:bookmarkEnd w:id="141"/>
@@ -58034,19 +58044,19 @@
               <w:jc w:val="left"/>
             </w:pPr>
             <w:r>
-              <w:t xml:space="preserve">[TO VERIFY; inventors Hunt, Dahlgren and Marquino, as on GEH’s isolation-condenser family]</w:t>
-            </w:r>
-          </w:p>
-        </w:tc>
-        <w:tc>
-          <w:tcPr/>
-          <w:p>
-            <w:pPr>
-              <w:pStyle w:val="Compact"/>
-              <w:jc w:val="left"/>
-            </w:pPr>
-            <w:r>
-              <w:t xml:space="preserve">[TO VERIFY]</w:t>
+              <w:t xml:space="preserve">Not confirmed (search summary only); inventors named as Hunt, Dahlgren and Marquino</w:t>
+            </w:r>
+          </w:p>
+        </w:tc>
+        <w:tc>
+          <w:tcPr/>
+          <w:p>
+            <w:pPr>
+              <w:pStyle w:val="Compact"/>
+              <w:jc w:val="left"/>
+            </w:pPr>
+            <w:r>
+              <w:t xml:space="preserve">n.d.</w:t>
             </w:r>
           </w:p>
         </w:tc>
@@ -58108,7 +58118,7 @@
               <w:jc w:val="left"/>
             </w:pPr>
             <w:r>
-              <w:t xml:space="preserve">[TO VERIFY; inventors include Kirby and McDonald of GEH]</w:t>
+              <w:t xml:space="preserve">Not confirmed; inventors include Kirby and McDonald (GE-Hitachi staff)</w:t>
             </w:r>
           </w:p>
         </w:tc>
@@ -58182,31 +58192,31 @@
               <w:jc w:val="left"/>
             </w:pPr>
             <w:r>
-              <w:t xml:space="preserve">Outotec [TO VERIFY]</w:t>
-            </w:r>
-          </w:p>
-        </w:tc>
-        <w:tc>
-          <w:tcPr/>
-          <w:p>
-            <w:pPr>
-              <w:pStyle w:val="Compact"/>
-              <w:jc w:val="left"/>
-            </w:pPr>
-            <w:r>
-              <w:t xml:space="preserve">[TO VERIFY]</w:t>
-            </w:r>
-          </w:p>
-        </w:tc>
-        <w:tc>
-          <w:tcPr/>
-          <w:p>
-            <w:pPr>
-              <w:pStyle w:val="Compact"/>
-              <w:jc w:val="left"/>
-            </w:pPr>
-            <w:r>
-              <w:t xml:space="preserve">Calcining low-kaolinite (&lt;40%), iron-bearing clays at 600–1,000 °C widens the clay supply for LC³ (§5)</w:t>
+              <w:t xml:space="preserve">Outotec (as listed)</w:t>
+            </w:r>
+          </w:p>
+        </w:tc>
+        <w:tc>
+          <w:tcPr/>
+          <w:p>
+            <w:pPr>
+              <w:pStyle w:val="Compact"/>
+              <w:jc w:val="left"/>
+            </w:pPr>
+            <w:r>
+              <w:t xml:space="preserve">2014</w:t>
+            </w:r>
+          </w:p>
+        </w:tc>
+        <w:tc>
+          <w:tcPr/>
+          <w:p>
+            <w:pPr>
+              <w:pStyle w:val="Compact"/>
+              <w:jc w:val="left"/>
+            </w:pPr>
+            <w:r>
+              <w:t xml:space="preserve">Reported to cover calcined clays of lower kaolinite content (below 40%), which would widen the clay supply for LC³ (§5)</w:t>
             </w:r>
           </w:p>
         </w:tc>
@@ -58244,43 +58254,43 @@
               <w:jc w:val="left"/>
             </w:pPr>
             <w:r>
-              <w:t xml:space="preserve">[LC³ using low-temperature calcined clay; title TO VERIFY]</w:t>
-            </w:r>
-          </w:p>
-        </w:tc>
-        <w:tc>
-          <w:tcPr/>
-          <w:p>
-            <w:pPr>
-              <w:pStyle w:val="Compact"/>
-              <w:jc w:val="left"/>
-            </w:pPr>
-            <w:r>
-              <w:t xml:space="preserve">[TO VERIFY]</w:t>
-            </w:r>
-          </w:p>
-        </w:tc>
-        <w:tc>
-          <w:tcPr/>
-          <w:p>
-            <w:pPr>
-              <w:pStyle w:val="Compact"/>
-              <w:jc w:val="left"/>
-            </w:pPr>
-            <w:r>
-              <w:t xml:space="preserve">[TO VERIFY]</w:t>
-            </w:r>
-          </w:p>
-        </w:tc>
-        <w:tc>
-          <w:tcPr/>
-          <w:p>
-            <w:pPr>
-              <w:pStyle w:val="Compact"/>
-              <w:jc w:val="left"/>
-            </w:pPr>
-            <w:r>
-              <w:t xml:space="preserve">LC³ with ≥40% kaolin clay calcined at 700–800 °C: consistent with the LC³ project’s calcination window</w:t>
+              <w:t xml:space="preserve">Limestone calcined clay cement using low-temperature calcined clay (title as listed by ZKG)</w:t>
+            </w:r>
+          </w:p>
+        </w:tc>
+        <w:tc>
+          <w:tcPr/>
+          <w:p>
+            <w:pPr>
+              <w:pStyle w:val="Compact"/>
+              <w:jc w:val="left"/>
+            </w:pPr>
+            <w:r>
+              <w:t xml:space="preserve">Not confirmed</w:t>
+            </w:r>
+          </w:p>
+        </w:tc>
+        <w:tc>
+          <w:tcPr/>
+          <w:p>
+            <w:pPr>
+              <w:pStyle w:val="Compact"/>
+              <w:jc w:val="left"/>
+            </w:pPr>
+            <w:r>
+              <w:t xml:space="preserve">n.d.</w:t>
+            </w:r>
+          </w:p>
+        </w:tc>
+        <w:tc>
+          <w:tcPr/>
+          <w:p>
+            <w:pPr>
+              <w:pStyle w:val="Compact"/>
+              <w:jc w:val="left"/>
+            </w:pPr>
+            <w:r>
+              <w:t xml:space="preserve">Listed by ZKG as LC³ using low-temperature calcined clay; details not seen</w:t>
             </w:r>
           </w:p>
         </w:tc>
@@ -58330,7 +58340,7 @@
               <w:jc w:val="left"/>
             </w:pPr>
             <w:r>
-              <w:t xml:space="preserve">Construction Research &amp; Technology GmbH (Master Builders Solutions, formerly BASF)</w:t>
+              <w:t xml:space="preserve">Construction Research &amp; Technology GmbH</w:t>
             </w:r>
           </w:p>
         </w:tc>
@@ -58354,7 +58364,7 @@
               <w:jc w:val="left"/>
             </w:pPr>
             <w:r>
-              <w:t xml:space="preserve">Admixture-modified LC³ binder: the major admixture suppliers are commercialising LC³ (§10)</w:t>
+              <w:t xml:space="preserve">Admixture-modified LC³ binder: an admixture supplier is patenting LC³ compositions (§10)</w:t>
             </w:r>
           </w:p>
         </w:tc>
@@ -58473,7 +58483,7 @@
         <w:t xml:space="preserve"> </w:t>
       </w:r>
       <w:r>
-        <w:t xml:space="preserve">(Sika, BASF/CR&amp;T). So for C1 the freedom-to-operate risk is low for the binder, and the commercial interest lies exactly where our RB.7 gap is (SCC flow). That supports C1’s route: buy a commercial admixture system and qualify it, rather than develop a new binder (inference).</w:t>
+        <w:t xml:space="preserve">(Sika, BASF/CR&amp;T). So for C1 the patent risk for the binder looks low on these searches (no freedom-to-operate search was done), and the commercial interest lies exactly where our RB.7 gap is (SCC flow). That supports C1’s route: buy a commercial admixture system and qualify it, rather than develop a new binder (inference).</w:t>
       </w:r>
     </w:p>
     <w:bookmarkEnd w:id="143"/>
@@ -58647,7 +58657,7 @@
               <w:jc w:val="left"/>
             </w:pPr>
             <w:r>
-              <w:t xml:space="preserve">Greifswald shield study (HZDR); BR3 (EPJ-N 2020)</w:t>
+              <w:t xml:space="preserve">Greifswald shield study (HZDR); a Belgian BR3 decommissioning study</w:t>
             </w:r>
           </w:p>
         </w:tc>
@@ -58901,7 +58911,7 @@
               <w:jc w:val="left"/>
             </w:pPr>
             <w:r>
-              <w:t xml:space="preserve">Daehn et al. (2017), via a 2025 review</w:t>
+              <w:t xml:space="preserve">a 2025 review of copper in steel scrap</w:t>
             </w:r>
           </w:p>
         </w:tc>
@@ -59121,19 +59131,7 @@
         <w:pStyle w:val="BodyText"/>
       </w:pPr>
       <w:r>
-        <w:t xml:space="preserve">Full references:</w:t>
-      </w:r>
-      <w:r>
-        <w:t xml:space="preserve"> </w:t>
-      </w:r>
-      <w:r>
-        <w:rPr>
-          <w:rStyle w:val="VerbatimChar"/>
-        </w:rPr>
-        <w:t xml:space="preserve">02_Research/sources_run8.md</w:t>
-      </w:r>
-      <w:r>
-        <w:t xml:space="preserve">.</w:t>
+        <w:t xml:space="preserve">Literature sources are listed in the reference list.</w:t>
       </w:r>
     </w:p>
     <w:bookmarkEnd w:id="144"/>

</xml_diff>